<commit_message>
Updated reservation lookup, test plan, and backend files for Module 8
</commit_message>
<xml_diff>
--- a/MODULE-8/8.2 Assignment.docx
+++ b/MODULE-8/8.2 Assignment.docx
@@ -184,7 +184,7 @@
                 <w:sz w:val="20"/>
                 <w:szCs w:val="20"/>
               </w:rPr>
-              <w:t xml:space="preserve">&lt;Enter a description&gt; </w:t>
+              <w:t>This test plan evaluates the functionality of the Contact Us and Reservation Lookup features for the Moffat Bay Lodge system. It verifies that users can successfully submit contact information and retrieve reservation details using a reservation ID, while also ensuring the system properly handles invalid inputs and displays appropriate messages.</w:t>
             </w:r>
           </w:p>
         </w:tc>
@@ -336,12 +336,16 @@
               <w:rFonts w:ascii="Arial" w:hAnsi="Arial" w:cs="Arial"/>
               <w:b/>
               <w:bCs/>
+              <w:sz w:val="40"/>
+              <w:szCs w:val="40"/>
             </w:rPr>
           </w:pPr>
           <w:r>
             <w:rPr>
               <w:b/>
               <w:bCs/>
+              <w:sz w:val="40"/>
+              <w:szCs w:val="40"/>
             </w:rPr>
             <w:t>TABLE OF CONTENTS</w:t>
           </w:r>
@@ -355,240 +359,57 @@
             <w:rPr>
               <w:rFonts w:eastAsiaTheme="minorEastAsia"/>
               <w:noProof/>
+              <w:sz w:val="28"/>
+              <w:szCs w:val="28"/>
             </w:rPr>
           </w:pPr>
           <w:r>
             <w:rPr>
-              <w:rFonts w:ascii="Arial" w:hAnsi="Arial" w:cs="Arial"/>
+              <w:rFonts w:eastAsiaTheme="minorEastAsia"/>
+              <w:noProof/>
+              <w:sz w:val="28"/>
+              <w:szCs w:val="28"/>
             </w:rPr>
-            <w:fldChar w:fldCharType="begin"/>
+            <w:t>Reservation Lookup With Valid Reservation ID</w:t>
           </w:r>
           <w:r>
             <w:rPr>
-              <w:rFonts w:ascii="Arial" w:hAnsi="Arial" w:cs="Arial"/>
-            </w:rPr>
-            <w:instrText xml:space="preserve"> TOC \o "1-3" \h \z \u </w:instrText>
-          </w:r>
-          <w:r>
-            <w:rPr>
-              <w:rFonts w:ascii="Arial" w:hAnsi="Arial" w:cs="Arial"/>
-            </w:rPr>
-            <w:fldChar w:fldCharType="separate"/>
-          </w:r>
-          <w:hyperlink w:anchor="_Toc132718195" w:history="1">
-            <w:r>
-              <w:rPr>
-                <w:rStyle w:val="Hyperlink"/>
-                <w:rFonts w:ascii="Arial" w:hAnsi="Arial" w:cs="Arial"/>
-                <w:b/>
-                <w:bCs/>
-                <w:noProof/>
-              </w:rPr>
-              <w:t>&lt;DESCRIPTION&gt;</w:t>
-            </w:r>
-            <w:r>
-              <w:rPr>
-                <w:noProof/>
-                <w:webHidden/>
-              </w:rPr>
-              <w:tab/>
-            </w:r>
-            <w:r>
-              <w:rPr>
-                <w:noProof/>
-                <w:webHidden/>
-              </w:rPr>
-              <w:fldChar w:fldCharType="begin"/>
-            </w:r>
-            <w:r>
-              <w:rPr>
-                <w:noProof/>
-                <w:webHidden/>
-              </w:rPr>
-              <w:instrText xml:space="preserve"> PAGEREF _Toc132718195 \h </w:instrText>
-            </w:r>
-            <w:r>
-              <w:rPr>
-                <w:noProof/>
-                <w:webHidden/>
-              </w:rPr>
-            </w:r>
-            <w:r>
-              <w:rPr>
-                <w:noProof/>
-                <w:webHidden/>
-              </w:rPr>
-              <w:fldChar w:fldCharType="separate"/>
-            </w:r>
-            <w:r>
-              <w:rPr>
-                <w:noProof/>
-                <w:webHidden/>
-              </w:rPr>
-              <w:t>2</w:t>
-            </w:r>
-            <w:r>
-              <w:rPr>
-                <w:noProof/>
-                <w:webHidden/>
-              </w:rPr>
-              <w:fldChar w:fldCharType="end"/>
-            </w:r>
-          </w:hyperlink>
-        </w:p>
-        <w:p>
-          <w:pPr>
-            <w:pStyle w:val="TOC1"/>
-            <w:tabs>
-              <w:tab w:val="right" w:leader="dot" w:pos="12950"/>
-            </w:tabs>
-            <w:rPr>
               <w:rFonts w:eastAsiaTheme="minorEastAsia"/>
               <w:noProof/>
+              <w:sz w:val="28"/>
+              <w:szCs w:val="28"/>
             </w:rPr>
-          </w:pPr>
-          <w:hyperlink w:anchor="_Toc132718196" w:history="1">
-            <w:r>
-              <w:rPr>
-                <w:rStyle w:val="Hyperlink"/>
-                <w:rFonts w:ascii="Arial" w:hAnsi="Arial" w:cs="Arial"/>
-                <w:b/>
-                <w:bCs/>
-                <w:noProof/>
-              </w:rPr>
-              <w:t>&lt;DESCRIPTION&gt;</w:t>
-            </w:r>
-            <w:r>
-              <w:rPr>
-                <w:noProof/>
-                <w:webHidden/>
-              </w:rPr>
-              <w:tab/>
-            </w:r>
-            <w:r>
-              <w:rPr>
-                <w:noProof/>
-                <w:webHidden/>
-              </w:rPr>
-              <w:fldChar w:fldCharType="begin"/>
-            </w:r>
-            <w:r>
-              <w:rPr>
-                <w:noProof/>
-                <w:webHidden/>
-              </w:rPr>
-              <w:instrText xml:space="preserve"> PAGEREF _Toc132718196 \h </w:instrText>
-            </w:r>
-            <w:r>
-              <w:rPr>
-                <w:noProof/>
-                <w:webHidden/>
-              </w:rPr>
-            </w:r>
-            <w:r>
-              <w:rPr>
-                <w:noProof/>
-                <w:webHidden/>
-              </w:rPr>
-              <w:fldChar w:fldCharType="separate"/>
-            </w:r>
-            <w:r>
-              <w:rPr>
-                <w:noProof/>
-                <w:webHidden/>
-              </w:rPr>
-              <w:t>2</w:t>
-            </w:r>
-            <w:r>
-              <w:rPr>
-                <w:noProof/>
-                <w:webHidden/>
-              </w:rPr>
-              <w:fldChar w:fldCharType="end"/>
-            </w:r>
-          </w:hyperlink>
-        </w:p>
-        <w:p>
-          <w:pPr>
-            <w:pStyle w:val="TOC1"/>
-            <w:tabs>
-              <w:tab w:val="right" w:leader="dot" w:pos="12950"/>
-            </w:tabs>
-            <w:rPr>
-              <w:rFonts w:eastAsiaTheme="minorEastAsia"/>
-              <w:noProof/>
-            </w:rPr>
-          </w:pPr>
-          <w:hyperlink w:anchor="_Toc132718197" w:history="1">
-            <w:r>
-              <w:rPr>
-                <w:rStyle w:val="Hyperlink"/>
-                <w:rFonts w:ascii="Arial" w:hAnsi="Arial" w:cs="Arial"/>
-                <w:b/>
-                <w:bCs/>
-                <w:noProof/>
-              </w:rPr>
-              <w:t>&lt;DESCRIPTION&gt;</w:t>
-            </w:r>
-            <w:r>
-              <w:rPr>
-                <w:noProof/>
-                <w:webHidden/>
-              </w:rPr>
-              <w:tab/>
-            </w:r>
-            <w:r>
-              <w:rPr>
-                <w:noProof/>
-                <w:webHidden/>
-              </w:rPr>
-              <w:fldChar w:fldCharType="begin"/>
-            </w:r>
-            <w:r>
-              <w:rPr>
-                <w:noProof/>
-                <w:webHidden/>
-              </w:rPr>
-              <w:instrText xml:space="preserve"> PAGEREF _Toc132718197 \h </w:instrText>
-            </w:r>
-            <w:r>
-              <w:rPr>
-                <w:noProof/>
-                <w:webHidden/>
-              </w:rPr>
-            </w:r>
-            <w:r>
-              <w:rPr>
-                <w:noProof/>
-                <w:webHidden/>
-              </w:rPr>
-              <w:fldChar w:fldCharType="separate"/>
-            </w:r>
-            <w:r>
-              <w:rPr>
-                <w:noProof/>
-                <w:webHidden/>
-              </w:rPr>
-              <w:t>3</w:t>
-            </w:r>
-            <w:r>
-              <w:rPr>
-                <w:noProof/>
-                <w:webHidden/>
-              </w:rPr>
-              <w:fldChar w:fldCharType="end"/>
-            </w:r>
-          </w:hyperlink>
+            <w:t>……………………………………………………………………………………………………………………………………………..1</w:t>
+          </w:r>
         </w:p>
         <w:p>
           <w:r>
             <w:rPr>
-              <w:rFonts w:ascii="Arial" w:hAnsi="Arial" w:cs="Arial"/>
-              <w:b/>
-              <w:bCs/>
-              <w:noProof/>
+              <w:sz w:val="28"/>
+              <w:szCs w:val="28"/>
             </w:rPr>
-            <w:fldChar w:fldCharType="end"/>
+            <w:t xml:space="preserve">Reservation Lookup </w:t>
+          </w:r>
+          <w:r>
+            <w:rPr>
+              <w:sz w:val="28"/>
+              <w:szCs w:val="28"/>
+            </w:rPr>
+            <w:t>with</w:t>
+          </w:r>
+          <w:r>
+            <w:rPr>
+              <w:sz w:val="28"/>
+              <w:szCs w:val="28"/>
+            </w:rPr>
+            <w:t xml:space="preserve"> Invalid Reservation ID</w:t>
+          </w:r>
+          <w:r>
+            <w:rPr>
+              <w:sz w:val="28"/>
+              <w:szCs w:val="28"/>
+            </w:rPr>
+            <w:t>……………………………………………………………………………………………………………………………………………1-2</w:t>
           </w:r>
         </w:p>
       </w:sdtContent>
@@ -799,7 +620,6 @@
                 <w:sz w:val="24"/>
                 <w:szCs w:val="24"/>
               </w:rPr>
-              <w:lastRenderedPageBreak/>
               <w:t>Test 1</w:t>
             </w:r>
           </w:p>
@@ -818,7 +638,6 @@
                 <w:bCs/>
               </w:rPr>
             </w:pPr>
-            <w:bookmarkStart w:id="0" w:name="_Toc132718195"/>
             <w:r>
               <w:rPr>
                 <w:rFonts w:ascii="Arial" w:hAnsi="Arial" w:cs="Arial"/>
@@ -826,9 +645,28 @@
                 <w:bCs/>
                 <w:color w:val="auto"/>
               </w:rPr>
-              <w:t>&lt;DESCRIPTION&gt;</w:t>
-            </w:r>
-            <w:bookmarkEnd w:id="0"/>
+              <w:t xml:space="preserve">Reservation Lookup </w:t>
+            </w:r>
+            <w:proofErr w:type="gramStart"/>
+            <w:r>
+              <w:rPr>
+                <w:rFonts w:ascii="Arial" w:hAnsi="Arial" w:cs="Arial"/>
+                <w:b/>
+                <w:bCs/>
+                <w:color w:val="auto"/>
+              </w:rPr>
+              <w:t>With</w:t>
+            </w:r>
+            <w:proofErr w:type="gramEnd"/>
+            <w:r>
+              <w:rPr>
+                <w:rFonts w:ascii="Arial" w:hAnsi="Arial" w:cs="Arial"/>
+                <w:b/>
+                <w:bCs/>
+                <w:color w:val="auto"/>
+              </w:rPr>
+              <w:t xml:space="preserve"> Valid Reservation ID</w:t>
+            </w:r>
           </w:p>
         </w:tc>
       </w:tr>
@@ -891,7 +729,7 @@
                 <w:sz w:val="20"/>
                 <w:szCs w:val="20"/>
               </w:rPr>
-              <w:t xml:space="preserve">Verifies input data meets requirements </w:t>
+              <w:t>Verifies that a user can enter a valid reservation ID and view the correct reservation details from the database.</w:t>
             </w:r>
           </w:p>
         </w:tc>
@@ -909,6 +747,8 @@
                 <w:szCs w:val="20"/>
               </w:rPr>
             </w:pPr>
+            <w:proofErr w:type="spellStart"/>
+            <w:proofErr w:type="gramStart"/>
             <w:r>
               <w:rPr>
                 <w:rFonts w:ascii="Arial" w:hAnsi="Arial" w:cs="Arial"/>
@@ -919,6 +759,28 @@
               </w:rPr>
               <w:t>Developer:</w:t>
             </w:r>
+            <w:r>
+              <w:rPr>
+                <w:rFonts w:ascii="Arial" w:hAnsi="Arial" w:cs="Arial"/>
+                <w:b/>
+                <w:bCs/>
+                <w:sz w:val="20"/>
+                <w:szCs w:val="20"/>
+              </w:rPr>
+              <w:t>Angela</w:t>
+            </w:r>
+            <w:proofErr w:type="spellEnd"/>
+            <w:proofErr w:type="gramEnd"/>
+            <w:r>
+              <w:rPr>
+                <w:rFonts w:ascii="Arial" w:hAnsi="Arial" w:cs="Arial"/>
+                <w:b/>
+                <w:bCs/>
+                <w:sz w:val="20"/>
+                <w:szCs w:val="20"/>
+              </w:rPr>
+              <w:t xml:space="preserve"> V</w:t>
+            </w:r>
           </w:p>
           <w:p>
             <w:pPr>
@@ -953,7 +815,16 @@
                 <w:sz w:val="20"/>
                 <w:szCs w:val="20"/>
               </w:rPr>
-              <w:t xml:space="preserve">&lt;yyyy/mm/dd&gt; </w:t>
+              <w:t>04/29/2026</w:t>
+            </w:r>
+            <w:r>
+              <w:rPr>
+                <w:rFonts w:ascii="Arial" w:hAnsi="Arial" w:cs="Arial"/>
+                <w:color w:val="C00000"/>
+                <w:sz w:val="20"/>
+                <w:szCs w:val="20"/>
+              </w:rPr>
+              <w:t xml:space="preserve"> </w:t>
             </w:r>
           </w:p>
         </w:tc>
@@ -1016,7 +887,27 @@
                 <w:sz w:val="20"/>
                 <w:szCs w:val="20"/>
               </w:rPr>
-              <w:t>&lt;yyyy/mm/dd&gt;</w:t>
+              <w:t>&lt;</w:t>
+            </w:r>
+            <w:proofErr w:type="spellStart"/>
+            <w:r>
+              <w:rPr>
+                <w:rFonts w:ascii="Arial" w:hAnsi="Arial" w:cs="Arial"/>
+                <w:color w:val="C00000"/>
+                <w:sz w:val="20"/>
+                <w:szCs w:val="20"/>
+              </w:rPr>
+              <w:t>yyyy</w:t>
+            </w:r>
+            <w:proofErr w:type="spellEnd"/>
+            <w:r>
+              <w:rPr>
+                <w:rFonts w:ascii="Arial" w:hAnsi="Arial" w:cs="Arial"/>
+                <w:color w:val="C00000"/>
+                <w:sz w:val="20"/>
+                <w:szCs w:val="20"/>
+              </w:rPr>
+              <w:t>/mm/dd&gt;</w:t>
             </w:r>
           </w:p>
         </w:tc>
@@ -1231,7 +1122,7 @@
                 <w:sz w:val="20"/>
                 <w:szCs w:val="20"/>
               </w:rPr>
-              <w:t>&lt;Enter an action&gt;</w:t>
+              <w:t>Open the Reservation Lookup page.</w:t>
             </w:r>
           </w:p>
         </w:tc>
@@ -1256,7 +1147,7 @@
                 <w:sz w:val="20"/>
                 <w:szCs w:val="20"/>
               </w:rPr>
-              <w:t>&lt;Enter the expected results&gt;</w:t>
+              <w:t>The page loads successfully and displays a field to enter a reservation ID.</w:t>
             </w:r>
           </w:p>
         </w:tc>
@@ -1281,7 +1172,7 @@
                 <w:sz w:val="20"/>
                 <w:szCs w:val="20"/>
               </w:rPr>
-              <w:t>&lt;yes/no&gt;</w:t>
+              <w:t>Pass</w:t>
             </w:r>
           </w:p>
         </w:tc>
@@ -1359,7 +1250,7 @@
                 <w:sz w:val="20"/>
                 <w:szCs w:val="20"/>
               </w:rPr>
-              <w:t>&lt;Enter an action&gt;</w:t>
+              <w:t>Enter an existing reservation ID from the database.</w:t>
             </w:r>
           </w:p>
         </w:tc>
@@ -1384,7 +1275,7 @@
                 <w:sz w:val="20"/>
                 <w:szCs w:val="20"/>
               </w:rPr>
-              <w:t>&lt;Enter the expected results&gt;</w:t>
+              <w:t>The reservation ID is accepted in the input field.</w:t>
             </w:r>
           </w:p>
         </w:tc>
@@ -1409,7 +1300,7 @@
                 <w:sz w:val="20"/>
                 <w:szCs w:val="20"/>
               </w:rPr>
-              <w:t>&lt;yes/no&gt;</w:t>
+              <w:t>Pass</w:t>
             </w:r>
           </w:p>
         </w:tc>
@@ -1487,7 +1378,7 @@
                 <w:sz w:val="20"/>
                 <w:szCs w:val="20"/>
               </w:rPr>
-              <w:t>&lt;Enter an action&gt;</w:t>
+              <w:t>Click the Lookup/Search button.</w:t>
             </w:r>
           </w:p>
         </w:tc>
@@ -1512,7 +1403,7 @@
                 <w:sz w:val="20"/>
                 <w:szCs w:val="20"/>
               </w:rPr>
-              <w:t>&lt;Enter the expected results&gt;</w:t>
+              <w:t>The system searches the database for the entered reservation ID.</w:t>
             </w:r>
           </w:p>
         </w:tc>
@@ -1537,7 +1428,7 @@
                 <w:sz w:val="20"/>
                 <w:szCs w:val="20"/>
               </w:rPr>
-              <w:t>&lt;yes/no&gt;</w:t>
+              <w:t>Pass</w:t>
             </w:r>
           </w:p>
         </w:tc>
@@ -1615,7 +1506,7 @@
                 <w:sz w:val="20"/>
                 <w:szCs w:val="20"/>
               </w:rPr>
-              <w:t>&lt;Enter an action&gt;</w:t>
+              <w:t>Review the displayed reservation information.</w:t>
             </w:r>
           </w:p>
         </w:tc>
@@ -1640,7 +1531,7 @@
                 <w:sz w:val="20"/>
                 <w:szCs w:val="20"/>
               </w:rPr>
-              <w:t>&lt;Enter the expected results&gt;</w:t>
+              <w:t>The page displays the correct reservation details such as reservation ID, dates, room, guests, and total cost.</w:t>
             </w:r>
           </w:p>
         </w:tc>
@@ -1665,7 +1556,7 @@
                 <w:sz w:val="20"/>
                 <w:szCs w:val="20"/>
               </w:rPr>
-              <w:t>&lt;yes/no&gt;</w:t>
+              <w:t>Pass</w:t>
             </w:r>
           </w:p>
         </w:tc>
@@ -1743,7 +1634,7 @@
                 <w:sz w:val="20"/>
                 <w:szCs w:val="20"/>
               </w:rPr>
-              <w:t>&lt;Enter an action&gt;</w:t>
+              <w:t>Confirm the page stays accessible after lookup.</w:t>
             </w:r>
           </w:p>
         </w:tc>
@@ -1768,7 +1659,27 @@
                 <w:sz w:val="20"/>
                 <w:szCs w:val="20"/>
               </w:rPr>
-              <w:t>&lt;Enter the expected results&gt;</w:t>
+              <w:t xml:space="preserve">The user remains on the lookup page and can </w:t>
+            </w:r>
+            <w:proofErr w:type="gramStart"/>
+            <w:r>
+              <w:rPr>
+                <w:rFonts w:ascii="Arial" w:hAnsi="Arial" w:cs="Arial"/>
+                <w:color w:val="C00000"/>
+                <w:sz w:val="20"/>
+                <w:szCs w:val="20"/>
+              </w:rPr>
+              <w:t>search</w:t>
+            </w:r>
+            <w:proofErr w:type="gramEnd"/>
+            <w:r>
+              <w:rPr>
+                <w:rFonts w:ascii="Arial" w:hAnsi="Arial" w:cs="Arial"/>
+                <w:color w:val="C00000"/>
+                <w:sz w:val="20"/>
+                <w:szCs w:val="20"/>
+              </w:rPr>
+              <w:t xml:space="preserve"> another reservation if needed.</w:t>
             </w:r>
           </w:p>
         </w:tc>
@@ -1793,7 +1704,7 @@
                 <w:sz w:val="20"/>
                 <w:szCs w:val="20"/>
               </w:rPr>
-              <w:t>&lt;yes/no&gt;</w:t>
+              <w:t>Pass</w:t>
             </w:r>
           </w:p>
         </w:tc>
@@ -1876,7 +1787,7 @@
                 <w:sz w:val="20"/>
                 <w:szCs w:val="20"/>
               </w:rPr>
-              <w:t xml:space="preserve">Comments should be substantive; this means there should be at least 2-3 well-structured sentences with constructive feedback. </w:t>
+              <w:t>The valid reservation lookup test passed successfully. The page was able to accept an existing reservation ID and display the matching reservation information from the database. This confirms that the lookup page and backend connection are working correctly for valid reservation records.</w:t>
             </w:r>
           </w:p>
         </w:tc>
@@ -1955,7 +1866,6 @@
                 <w:bCs/>
               </w:rPr>
             </w:pPr>
-            <w:bookmarkStart w:id="1" w:name="_Toc132718196"/>
             <w:r>
               <w:rPr>
                 <w:rFonts w:ascii="Arial" w:hAnsi="Arial" w:cs="Arial"/>
@@ -1963,9 +1873,28 @@
                 <w:bCs/>
                 <w:color w:val="auto"/>
               </w:rPr>
-              <w:t>&lt;DESCRIPTION&gt;</w:t>
-            </w:r>
-            <w:bookmarkEnd w:id="1"/>
+              <w:t xml:space="preserve">Reservation Lookup </w:t>
+            </w:r>
+            <w:proofErr w:type="gramStart"/>
+            <w:r>
+              <w:rPr>
+                <w:rFonts w:ascii="Arial" w:hAnsi="Arial" w:cs="Arial"/>
+                <w:b/>
+                <w:bCs/>
+                <w:color w:val="auto"/>
+              </w:rPr>
+              <w:t>With</w:t>
+            </w:r>
+            <w:proofErr w:type="gramEnd"/>
+            <w:r>
+              <w:rPr>
+                <w:rFonts w:ascii="Arial" w:hAnsi="Arial" w:cs="Arial"/>
+                <w:b/>
+                <w:bCs/>
+                <w:color w:val="auto"/>
+              </w:rPr>
+              <w:t xml:space="preserve"> Invalid Reservation ID</w:t>
+            </w:r>
           </w:p>
         </w:tc>
       </w:tr>
@@ -2021,6 +1950,15 @@
               </w:rPr>
               <w:t xml:space="preserve">: </w:t>
             </w:r>
+            <w:r>
+              <w:rPr>
+                <w:rFonts w:ascii="Arial" w:hAnsi="Arial" w:cs="Arial"/>
+                <w:color w:val="EE0000"/>
+                <w:sz w:val="20"/>
+                <w:szCs w:val="20"/>
+              </w:rPr>
+              <w:t>Verifies that the system displays an error or not found message when a user enters a reservation ID that does not exist.</w:t>
+            </w:r>
           </w:p>
         </w:tc>
         <w:tc>
@@ -2037,6 +1975,8 @@
                 <w:szCs w:val="20"/>
               </w:rPr>
             </w:pPr>
+            <w:proofErr w:type="spellStart"/>
+            <w:proofErr w:type="gramStart"/>
             <w:r>
               <w:rPr>
                 <w:rFonts w:ascii="Arial" w:hAnsi="Arial" w:cs="Arial"/>
@@ -2047,6 +1987,28 @@
               </w:rPr>
               <w:t>Developer:</w:t>
             </w:r>
+            <w:r>
+              <w:rPr>
+                <w:rFonts w:ascii="Arial" w:hAnsi="Arial" w:cs="Arial"/>
+                <w:b/>
+                <w:bCs/>
+                <w:sz w:val="20"/>
+                <w:szCs w:val="20"/>
+              </w:rPr>
+              <w:t>Angela</w:t>
+            </w:r>
+            <w:proofErr w:type="spellEnd"/>
+            <w:proofErr w:type="gramEnd"/>
+            <w:r>
+              <w:rPr>
+                <w:rFonts w:ascii="Arial" w:hAnsi="Arial" w:cs="Arial"/>
+                <w:b/>
+                <w:bCs/>
+                <w:sz w:val="20"/>
+                <w:szCs w:val="20"/>
+              </w:rPr>
+              <w:t xml:space="preserve"> V</w:t>
+            </w:r>
           </w:p>
           <w:p>
             <w:pPr>
@@ -2081,7 +2043,16 @@
                 <w:sz w:val="20"/>
                 <w:szCs w:val="20"/>
               </w:rPr>
-              <w:t xml:space="preserve">&lt;yyyy/mm/dd&gt; </w:t>
+              <w:t>04/29/2026</w:t>
+            </w:r>
+            <w:r>
+              <w:rPr>
+                <w:rFonts w:ascii="Arial" w:hAnsi="Arial" w:cs="Arial"/>
+                <w:color w:val="C00000"/>
+                <w:sz w:val="20"/>
+                <w:szCs w:val="20"/>
+              </w:rPr>
+              <w:t xml:space="preserve"> </w:t>
             </w:r>
           </w:p>
         </w:tc>
@@ -2144,7 +2115,27 @@
                 <w:sz w:val="20"/>
                 <w:szCs w:val="20"/>
               </w:rPr>
-              <w:t>&lt;yyyy/mm/dd&gt;</w:t>
+              <w:t>&lt;</w:t>
+            </w:r>
+            <w:proofErr w:type="spellStart"/>
+            <w:r>
+              <w:rPr>
+                <w:rFonts w:ascii="Arial" w:hAnsi="Arial" w:cs="Arial"/>
+                <w:color w:val="C00000"/>
+                <w:sz w:val="20"/>
+                <w:szCs w:val="20"/>
+              </w:rPr>
+              <w:t>yyyy</w:t>
+            </w:r>
+            <w:proofErr w:type="spellEnd"/>
+            <w:r>
+              <w:rPr>
+                <w:rFonts w:ascii="Arial" w:hAnsi="Arial" w:cs="Arial"/>
+                <w:color w:val="C00000"/>
+                <w:sz w:val="20"/>
+                <w:szCs w:val="20"/>
+              </w:rPr>
+              <w:t>/mm/dd&gt;</w:t>
             </w:r>
           </w:p>
         </w:tc>
@@ -2337,7 +2328,7 @@
                 <w:sz w:val="20"/>
                 <w:szCs w:val="20"/>
               </w:rPr>
-              <w:t>&lt;Enter an action&gt;</w:t>
+              <w:t>Open the Reservation Lookup page.</w:t>
             </w:r>
           </w:p>
         </w:tc>
@@ -2362,7 +2353,7 @@
                 <w:sz w:val="20"/>
                 <w:szCs w:val="20"/>
               </w:rPr>
-              <w:t>&lt;Enter the expected results&gt;</w:t>
+              <w:t>The page loads successfully and displays the reservation ID input field.</w:t>
             </w:r>
           </w:p>
         </w:tc>
@@ -2387,7 +2378,7 @@
                 <w:sz w:val="20"/>
                 <w:szCs w:val="20"/>
               </w:rPr>
-              <w:t>&lt;yes/no&gt;</w:t>
+              <w:t>Pass</w:t>
             </w:r>
           </w:p>
         </w:tc>
@@ -2465,7 +2456,25 @@
                 <w:sz w:val="20"/>
                 <w:szCs w:val="20"/>
               </w:rPr>
-              <w:t>&lt;Enter an action&gt;</w:t>
+              <w:t xml:space="preserve">Enter an invalid reservation ID, such as </w:t>
+            </w:r>
+            <w:r>
+              <w:rPr>
+                <w:rFonts w:ascii="Arial" w:hAnsi="Arial" w:cs="Arial"/>
+                <w:color w:val="C00000"/>
+                <w:sz w:val="20"/>
+                <w:szCs w:val="20"/>
+              </w:rPr>
+              <w:t>0000</w:t>
+            </w:r>
+            <w:r>
+              <w:rPr>
+                <w:rFonts w:ascii="Arial" w:hAnsi="Arial" w:cs="Arial"/>
+                <w:color w:val="C00000"/>
+                <w:sz w:val="20"/>
+                <w:szCs w:val="20"/>
+              </w:rPr>
+              <w:t xml:space="preserve"> or another ID not in the database.</w:t>
             </w:r>
           </w:p>
         </w:tc>
@@ -2490,7 +2499,7 @@
                 <w:sz w:val="20"/>
                 <w:szCs w:val="20"/>
               </w:rPr>
-              <w:t>&lt;Enter the expected results&gt;</w:t>
+              <w:t>The invalid reservation ID is entered into the field.</w:t>
             </w:r>
           </w:p>
         </w:tc>
@@ -2515,7 +2524,7 @@
                 <w:sz w:val="20"/>
                 <w:szCs w:val="20"/>
               </w:rPr>
-              <w:t>&lt;yes/no&gt;</w:t>
+              <w:t>Pass</w:t>
             </w:r>
           </w:p>
         </w:tc>
@@ -2593,7 +2602,7 @@
                 <w:sz w:val="20"/>
                 <w:szCs w:val="20"/>
               </w:rPr>
-              <w:t>&lt;Enter an action&gt;</w:t>
+              <w:t>Click the Lookup/Search button.</w:t>
             </w:r>
           </w:p>
         </w:tc>
@@ -2618,7 +2627,7 @@
                 <w:sz w:val="20"/>
                 <w:szCs w:val="20"/>
               </w:rPr>
-              <w:t>&lt;Enter the expected results&gt;</w:t>
+              <w:t>The system searches the database for the reservation ID.</w:t>
             </w:r>
           </w:p>
         </w:tc>
@@ -2643,7 +2652,7 @@
                 <w:sz w:val="20"/>
                 <w:szCs w:val="20"/>
               </w:rPr>
-              <w:t>&lt;yes/no&gt;</w:t>
+              <w:t>Pass</w:t>
             </w:r>
           </w:p>
         </w:tc>
@@ -2721,7 +2730,7 @@
                 <w:sz w:val="20"/>
                 <w:szCs w:val="20"/>
               </w:rPr>
-              <w:t>&lt;Enter an action&gt;</w:t>
+              <w:t>Review the result message.</w:t>
             </w:r>
           </w:p>
         </w:tc>
@@ -2746,7 +2755,7 @@
                 <w:sz w:val="20"/>
                 <w:szCs w:val="20"/>
               </w:rPr>
-              <w:t>&lt;Enter the expected results&gt;</w:t>
+              <w:t>The page displays a message saying the reservation was not found.</w:t>
             </w:r>
           </w:p>
         </w:tc>
@@ -2771,7 +2780,7 @@
                 <w:sz w:val="20"/>
                 <w:szCs w:val="20"/>
               </w:rPr>
-              <w:t>&lt;yes/no&gt;</w:t>
+              <w:t>Pass</w:t>
             </w:r>
           </w:p>
         </w:tc>
@@ -2824,7 +2833,6 @@
                 <w:sz w:val="20"/>
                 <w:szCs w:val="20"/>
               </w:rPr>
-              <w:lastRenderedPageBreak/>
               <w:t>5</w:t>
             </w:r>
           </w:p>
@@ -2850,7 +2858,7 @@
                 <w:sz w:val="20"/>
                 <w:szCs w:val="20"/>
               </w:rPr>
-              <w:t>&lt;Enter an action&gt;</w:t>
+              <w:t>Enter another reservation ID to test again.</w:t>
             </w:r>
           </w:p>
         </w:tc>
@@ -2875,7 +2883,7 @@
                 <w:sz w:val="20"/>
                 <w:szCs w:val="20"/>
               </w:rPr>
-              <w:t>&lt;Enter the expected results&gt;</w:t>
+              <w:t>The page allows another lookup without crashing or redirecting incorrectly.</w:t>
             </w:r>
           </w:p>
         </w:tc>
@@ -2900,7 +2908,7 @@
                 <w:sz w:val="20"/>
                 <w:szCs w:val="20"/>
               </w:rPr>
-              <w:t>&lt;yes/no&gt;</w:t>
+              <w:t>Pass</w:t>
             </w:r>
           </w:p>
         </w:tc>
@@ -2983,7 +2991,7 @@
                 <w:sz w:val="20"/>
                 <w:szCs w:val="20"/>
               </w:rPr>
-              <w:t>Comments should be substantive; this means there should be at least 2-3 well-structured sentences with constructive feedback.</w:t>
+              <w:t>The invalid reservation lookup test passed successfully. When a reservation ID that does not exist was entered, the system did not display incorrect reservation information. Instead, it showed a clear not found message, which helps the user understand that the reservation could not be located.</w:t>
             </w:r>
           </w:p>
         </w:tc>
@@ -3062,7 +3070,7 @@
                 <w:bCs/>
               </w:rPr>
             </w:pPr>
-            <w:bookmarkStart w:id="2" w:name="_Toc132718197"/>
+            <w:bookmarkStart w:id="0" w:name="_Toc132718197"/>
             <w:r>
               <w:rPr>
                 <w:rFonts w:ascii="Arial" w:hAnsi="Arial" w:cs="Arial"/>
@@ -3072,7 +3080,7 @@
               </w:rPr>
               <w:t>&lt;DESCRIPTION&gt;</w:t>
             </w:r>
-            <w:bookmarkEnd w:id="2"/>
+            <w:bookmarkEnd w:id="0"/>
           </w:p>
         </w:tc>
       </w:tr>
@@ -3188,7 +3196,27 @@
                 <w:sz w:val="20"/>
                 <w:szCs w:val="20"/>
               </w:rPr>
-              <w:t xml:space="preserve">&lt;yyyy/mm/dd&gt; </w:t>
+              <w:t>&lt;</w:t>
+            </w:r>
+            <w:proofErr w:type="spellStart"/>
+            <w:r>
+              <w:rPr>
+                <w:rFonts w:ascii="Arial" w:hAnsi="Arial" w:cs="Arial"/>
+                <w:color w:val="C00000"/>
+                <w:sz w:val="20"/>
+                <w:szCs w:val="20"/>
+              </w:rPr>
+              <w:t>yyyy</w:t>
+            </w:r>
+            <w:proofErr w:type="spellEnd"/>
+            <w:r>
+              <w:rPr>
+                <w:rFonts w:ascii="Arial" w:hAnsi="Arial" w:cs="Arial"/>
+                <w:color w:val="C00000"/>
+                <w:sz w:val="20"/>
+                <w:szCs w:val="20"/>
+              </w:rPr>
+              <w:t xml:space="preserve">/mm/dd&gt; </w:t>
             </w:r>
           </w:p>
         </w:tc>
@@ -3251,7 +3279,27 @@
                 <w:sz w:val="20"/>
                 <w:szCs w:val="20"/>
               </w:rPr>
-              <w:t>&lt;yyyy/mm/dd&gt;</w:t>
+              <w:t>&lt;</w:t>
+            </w:r>
+            <w:proofErr w:type="spellStart"/>
+            <w:r>
+              <w:rPr>
+                <w:rFonts w:ascii="Arial" w:hAnsi="Arial" w:cs="Arial"/>
+                <w:color w:val="C00000"/>
+                <w:sz w:val="20"/>
+                <w:szCs w:val="20"/>
+              </w:rPr>
+              <w:t>yyyy</w:t>
+            </w:r>
+            <w:proofErr w:type="spellEnd"/>
+            <w:r>
+              <w:rPr>
+                <w:rFonts w:ascii="Arial" w:hAnsi="Arial" w:cs="Arial"/>
+                <w:color w:val="C00000"/>
+                <w:sz w:val="20"/>
+                <w:szCs w:val="20"/>
+              </w:rPr>
+              <w:t>/mm/dd&gt;</w:t>
             </w:r>
           </w:p>
         </w:tc>
@@ -3931,6 +3979,7 @@
                 <w:sz w:val="20"/>
                 <w:szCs w:val="20"/>
               </w:rPr>
+              <w:lastRenderedPageBreak/>
               <w:t>5</w:t>
             </w:r>
           </w:p>
@@ -4142,15 +4191,7 @@
                 <w:sz w:val="24"/>
                 <w:szCs w:val="24"/>
               </w:rPr>
-              <w:t xml:space="preserve">Test </w:t>
-            </w:r>
-            <w:r>
-              <w:rPr>
-                <w:rFonts w:ascii="Arial" w:hAnsi="Arial" w:cs="Arial"/>
-                <w:sz w:val="24"/>
-                <w:szCs w:val="24"/>
-              </w:rPr>
-              <w:t>4</w:t>
+              <w:t>Test 4</w:t>
             </w:r>
           </w:p>
         </w:tc>
@@ -4292,7 +4333,27 @@
                 <w:sz w:val="20"/>
                 <w:szCs w:val="20"/>
               </w:rPr>
-              <w:t xml:space="preserve">&lt;yyyy/mm/dd&gt; </w:t>
+              <w:t>&lt;</w:t>
+            </w:r>
+            <w:proofErr w:type="spellStart"/>
+            <w:r>
+              <w:rPr>
+                <w:rFonts w:ascii="Arial" w:hAnsi="Arial" w:cs="Arial"/>
+                <w:color w:val="C00000"/>
+                <w:sz w:val="20"/>
+                <w:szCs w:val="20"/>
+              </w:rPr>
+              <w:t>yyyy</w:t>
+            </w:r>
+            <w:proofErr w:type="spellEnd"/>
+            <w:r>
+              <w:rPr>
+                <w:rFonts w:ascii="Arial" w:hAnsi="Arial" w:cs="Arial"/>
+                <w:color w:val="C00000"/>
+                <w:sz w:val="20"/>
+                <w:szCs w:val="20"/>
+              </w:rPr>
+              <w:t xml:space="preserve">/mm/dd&gt; </w:t>
             </w:r>
           </w:p>
         </w:tc>
@@ -4355,7 +4416,27 @@
                 <w:sz w:val="20"/>
                 <w:szCs w:val="20"/>
               </w:rPr>
-              <w:t>&lt;yyyy/mm/dd&gt;</w:t>
+              <w:t>&lt;</w:t>
+            </w:r>
+            <w:proofErr w:type="spellStart"/>
+            <w:r>
+              <w:rPr>
+                <w:rFonts w:ascii="Arial" w:hAnsi="Arial" w:cs="Arial"/>
+                <w:color w:val="C00000"/>
+                <w:sz w:val="20"/>
+                <w:szCs w:val="20"/>
+              </w:rPr>
+              <w:t>yyyy</w:t>
+            </w:r>
+            <w:proofErr w:type="spellEnd"/>
+            <w:r>
+              <w:rPr>
+                <w:rFonts w:ascii="Arial" w:hAnsi="Arial" w:cs="Arial"/>
+                <w:color w:val="C00000"/>
+                <w:sz w:val="20"/>
+                <w:szCs w:val="20"/>
+              </w:rPr>
+              <w:t>/mm/dd&gt;</w:t>
             </w:r>
           </w:p>
         </w:tc>
@@ -5167,7 +5248,6 @@
                 <w:sz w:val="20"/>
                 <w:szCs w:val="20"/>
               </w:rPr>
-              <w:lastRenderedPageBreak/>
               <w:t>Comments</w:t>
             </w:r>
           </w:p>
@@ -5856,7 +5936,6 @@
   <w:style w:type="character" w:default="1" w:styleId="DefaultParagraphFont">
     <w:name w:val="Default Paragraph Font"/>
     <w:uiPriority w:val="1"/>
-    <w:semiHidden/>
     <w:unhideWhenUsed/>
   </w:style>
   <w:style w:type="table" w:default="1" w:styleId="TableNormal">

</xml_diff>

<commit_message>
Pushing assignment changes & 8.2 Assignment. -Anderson 5/1/26
</commit_message>
<xml_diff>
--- a/MODULE-8/8.2 Assignment.docx
+++ b/MODULE-8/8.2 Assignment.docx
@@ -184,7 +184,7 @@
                 <w:sz w:val="20"/>
                 <w:szCs w:val="20"/>
               </w:rPr>
-              <w:t>This test plan evaluates the functionality of the Contact Us and Reservation Lookup features for the Moffat Bay Lodge system. It verifies that users can successfully submit contact information and retrieve reservation details using a reservation ID, while also ensuring the system properly handles invalid inputs and displays appropriate messages.</w:t>
+              <w:t xml:space="preserve">&lt;Enter a description&gt; </w:t>
             </w:r>
           </w:p>
         </w:tc>
@@ -336,16 +336,12 @@
               <w:rFonts w:ascii="Arial" w:hAnsi="Arial" w:cs="Arial"/>
               <w:b/>
               <w:bCs/>
-              <w:sz w:val="40"/>
-              <w:szCs w:val="40"/>
             </w:rPr>
           </w:pPr>
           <w:r>
             <w:rPr>
               <w:b/>
               <w:bCs/>
-              <w:sz w:val="40"/>
-              <w:szCs w:val="40"/>
             </w:rPr>
             <w:t>TABLE OF CONTENTS</w:t>
           </w:r>
@@ -359,57 +355,240 @@
             <w:rPr>
               <w:rFonts w:eastAsiaTheme="minorEastAsia"/>
               <w:noProof/>
-              <w:sz w:val="28"/>
-              <w:szCs w:val="28"/>
             </w:rPr>
           </w:pPr>
           <w:r>
             <w:rPr>
-              <w:rFonts w:eastAsiaTheme="minorEastAsia"/>
-              <w:noProof/>
-              <w:sz w:val="28"/>
-              <w:szCs w:val="28"/>
+              <w:rFonts w:ascii="Arial" w:hAnsi="Arial" w:cs="Arial"/>
             </w:rPr>
-            <w:t>Reservation Lookup With Valid Reservation ID</w:t>
+            <w:fldChar w:fldCharType="begin"/>
           </w:r>
           <w:r>
             <w:rPr>
+              <w:rFonts w:ascii="Arial" w:hAnsi="Arial" w:cs="Arial"/>
+            </w:rPr>
+            <w:instrText xml:space="preserve"> TOC \o "1-3" \h \z \u </w:instrText>
+          </w:r>
+          <w:r>
+            <w:rPr>
+              <w:rFonts w:ascii="Arial" w:hAnsi="Arial" w:cs="Arial"/>
+            </w:rPr>
+            <w:fldChar w:fldCharType="separate"/>
+          </w:r>
+          <w:hyperlink w:anchor="_Toc132718195" w:history="1">
+            <w:r>
+              <w:rPr>
+                <w:rStyle w:val="Hyperlink"/>
+                <w:rFonts w:ascii="Arial" w:hAnsi="Arial" w:cs="Arial"/>
+                <w:b/>
+                <w:bCs/>
+                <w:noProof/>
+              </w:rPr>
+              <w:t>&lt;DESCRIPTION&gt;</w:t>
+            </w:r>
+            <w:r>
+              <w:rPr>
+                <w:noProof/>
+                <w:webHidden/>
+              </w:rPr>
+              <w:tab/>
+            </w:r>
+            <w:r>
+              <w:rPr>
+                <w:noProof/>
+                <w:webHidden/>
+              </w:rPr>
+              <w:fldChar w:fldCharType="begin"/>
+            </w:r>
+            <w:r>
+              <w:rPr>
+                <w:noProof/>
+                <w:webHidden/>
+              </w:rPr>
+              <w:instrText xml:space="preserve"> PAGEREF _Toc132718195 \h </w:instrText>
+            </w:r>
+            <w:r>
+              <w:rPr>
+                <w:noProof/>
+                <w:webHidden/>
+              </w:rPr>
+            </w:r>
+            <w:r>
+              <w:rPr>
+                <w:noProof/>
+                <w:webHidden/>
+              </w:rPr>
+              <w:fldChar w:fldCharType="separate"/>
+            </w:r>
+            <w:r>
+              <w:rPr>
+                <w:noProof/>
+                <w:webHidden/>
+              </w:rPr>
+              <w:t>2</w:t>
+            </w:r>
+            <w:r>
+              <w:rPr>
+                <w:noProof/>
+                <w:webHidden/>
+              </w:rPr>
+              <w:fldChar w:fldCharType="end"/>
+            </w:r>
+          </w:hyperlink>
+        </w:p>
+        <w:p>
+          <w:pPr>
+            <w:pStyle w:val="TOC1"/>
+            <w:tabs>
+              <w:tab w:val="right" w:leader="dot" w:pos="12950"/>
+            </w:tabs>
+            <w:rPr>
               <w:rFonts w:eastAsiaTheme="minorEastAsia"/>
               <w:noProof/>
-              <w:sz w:val="28"/>
-              <w:szCs w:val="28"/>
             </w:rPr>
-            <w:t>……………………………………………………………………………………………………………………………………………..1</w:t>
-          </w:r>
+          </w:pPr>
+          <w:hyperlink w:anchor="_Toc132718196" w:history="1">
+            <w:r>
+              <w:rPr>
+                <w:rStyle w:val="Hyperlink"/>
+                <w:rFonts w:ascii="Arial" w:hAnsi="Arial" w:cs="Arial"/>
+                <w:b/>
+                <w:bCs/>
+                <w:noProof/>
+              </w:rPr>
+              <w:t>&lt;DESCRIPTION&gt;</w:t>
+            </w:r>
+            <w:r>
+              <w:rPr>
+                <w:noProof/>
+                <w:webHidden/>
+              </w:rPr>
+              <w:tab/>
+            </w:r>
+            <w:r>
+              <w:rPr>
+                <w:noProof/>
+                <w:webHidden/>
+              </w:rPr>
+              <w:fldChar w:fldCharType="begin"/>
+            </w:r>
+            <w:r>
+              <w:rPr>
+                <w:noProof/>
+                <w:webHidden/>
+              </w:rPr>
+              <w:instrText xml:space="preserve"> PAGEREF _Toc132718196 \h </w:instrText>
+            </w:r>
+            <w:r>
+              <w:rPr>
+                <w:noProof/>
+                <w:webHidden/>
+              </w:rPr>
+            </w:r>
+            <w:r>
+              <w:rPr>
+                <w:noProof/>
+                <w:webHidden/>
+              </w:rPr>
+              <w:fldChar w:fldCharType="separate"/>
+            </w:r>
+            <w:r>
+              <w:rPr>
+                <w:noProof/>
+                <w:webHidden/>
+              </w:rPr>
+              <w:t>2</w:t>
+            </w:r>
+            <w:r>
+              <w:rPr>
+                <w:noProof/>
+                <w:webHidden/>
+              </w:rPr>
+              <w:fldChar w:fldCharType="end"/>
+            </w:r>
+          </w:hyperlink>
+        </w:p>
+        <w:p>
+          <w:pPr>
+            <w:pStyle w:val="TOC1"/>
+            <w:tabs>
+              <w:tab w:val="right" w:leader="dot" w:pos="12950"/>
+            </w:tabs>
+            <w:rPr>
+              <w:rFonts w:eastAsiaTheme="minorEastAsia"/>
+              <w:noProof/>
+            </w:rPr>
+          </w:pPr>
+          <w:hyperlink w:anchor="_Toc132718197" w:history="1">
+            <w:r>
+              <w:rPr>
+                <w:rStyle w:val="Hyperlink"/>
+                <w:rFonts w:ascii="Arial" w:hAnsi="Arial" w:cs="Arial"/>
+                <w:b/>
+                <w:bCs/>
+                <w:noProof/>
+              </w:rPr>
+              <w:t>&lt;DESCRIPTION&gt;</w:t>
+            </w:r>
+            <w:r>
+              <w:rPr>
+                <w:noProof/>
+                <w:webHidden/>
+              </w:rPr>
+              <w:tab/>
+            </w:r>
+            <w:r>
+              <w:rPr>
+                <w:noProof/>
+                <w:webHidden/>
+              </w:rPr>
+              <w:fldChar w:fldCharType="begin"/>
+            </w:r>
+            <w:r>
+              <w:rPr>
+                <w:noProof/>
+                <w:webHidden/>
+              </w:rPr>
+              <w:instrText xml:space="preserve"> PAGEREF _Toc132718197 \h </w:instrText>
+            </w:r>
+            <w:r>
+              <w:rPr>
+                <w:noProof/>
+                <w:webHidden/>
+              </w:rPr>
+            </w:r>
+            <w:r>
+              <w:rPr>
+                <w:noProof/>
+                <w:webHidden/>
+              </w:rPr>
+              <w:fldChar w:fldCharType="separate"/>
+            </w:r>
+            <w:r>
+              <w:rPr>
+                <w:noProof/>
+                <w:webHidden/>
+              </w:rPr>
+              <w:t>3</w:t>
+            </w:r>
+            <w:r>
+              <w:rPr>
+                <w:noProof/>
+                <w:webHidden/>
+              </w:rPr>
+              <w:fldChar w:fldCharType="end"/>
+            </w:r>
+          </w:hyperlink>
         </w:p>
         <w:p>
           <w:r>
             <w:rPr>
-              <w:sz w:val="28"/>
-              <w:szCs w:val="28"/>
+              <w:rFonts w:ascii="Arial" w:hAnsi="Arial" w:cs="Arial"/>
+              <w:b/>
+              <w:bCs/>
+              <w:noProof/>
             </w:rPr>
-            <w:t xml:space="preserve">Reservation Lookup </w:t>
-          </w:r>
-          <w:r>
-            <w:rPr>
-              <w:sz w:val="28"/>
-              <w:szCs w:val="28"/>
-            </w:rPr>
-            <w:t>with</w:t>
-          </w:r>
-          <w:r>
-            <w:rPr>
-              <w:sz w:val="28"/>
-              <w:szCs w:val="28"/>
-            </w:rPr>
-            <w:t xml:space="preserve"> Invalid Reservation ID</w:t>
-          </w:r>
-          <w:r>
-            <w:rPr>
-              <w:sz w:val="28"/>
-              <w:szCs w:val="28"/>
-            </w:rPr>
-            <w:t>……………………………………………………………………………………………………………………………………………1-2</w:t>
+            <w:fldChar w:fldCharType="end"/>
           </w:r>
         </w:p>
       </w:sdtContent>
@@ -620,6 +799,7 @@
                 <w:sz w:val="24"/>
                 <w:szCs w:val="24"/>
               </w:rPr>
+              <w:lastRenderedPageBreak/>
               <w:t>Test 1</w:t>
             </w:r>
           </w:p>
@@ -638,6 +818,7 @@
                 <w:bCs/>
               </w:rPr>
             </w:pPr>
+            <w:bookmarkStart w:id="0" w:name="_Toc132718195"/>
             <w:r>
               <w:rPr>
                 <w:rFonts w:ascii="Arial" w:hAnsi="Arial" w:cs="Arial"/>
@@ -645,28 +826,9 @@
                 <w:bCs/>
                 <w:color w:val="auto"/>
               </w:rPr>
-              <w:t xml:space="preserve">Reservation Lookup </w:t>
-            </w:r>
-            <w:proofErr w:type="gramStart"/>
-            <w:r>
-              <w:rPr>
-                <w:rFonts w:ascii="Arial" w:hAnsi="Arial" w:cs="Arial"/>
-                <w:b/>
-                <w:bCs/>
-                <w:color w:val="auto"/>
-              </w:rPr>
-              <w:t>With</w:t>
-            </w:r>
-            <w:proofErr w:type="gramEnd"/>
-            <w:r>
-              <w:rPr>
-                <w:rFonts w:ascii="Arial" w:hAnsi="Arial" w:cs="Arial"/>
-                <w:b/>
-                <w:bCs/>
-                <w:color w:val="auto"/>
-              </w:rPr>
-              <w:t xml:space="preserve"> Valid Reservation ID</w:t>
-            </w:r>
+              <w:t>&lt;DESCRIPTION&gt;</w:t>
+            </w:r>
+            <w:bookmarkEnd w:id="0"/>
           </w:p>
         </w:tc>
       </w:tr>
@@ -729,7 +891,7 @@
                 <w:sz w:val="20"/>
                 <w:szCs w:val="20"/>
               </w:rPr>
-              <w:t>Verifies that a user can enter a valid reservation ID and view the correct reservation details from the database.</w:t>
+              <w:t xml:space="preserve">Verifies input data meets requirements </w:t>
             </w:r>
           </w:p>
         </w:tc>
@@ -747,8 +909,6 @@
                 <w:szCs w:val="20"/>
               </w:rPr>
             </w:pPr>
-            <w:proofErr w:type="spellStart"/>
-            <w:proofErr w:type="gramStart"/>
             <w:r>
               <w:rPr>
                 <w:rFonts w:ascii="Arial" w:hAnsi="Arial" w:cs="Arial"/>
@@ -759,28 +919,6 @@
               </w:rPr>
               <w:t>Developer:</w:t>
             </w:r>
-            <w:r>
-              <w:rPr>
-                <w:rFonts w:ascii="Arial" w:hAnsi="Arial" w:cs="Arial"/>
-                <w:b/>
-                <w:bCs/>
-                <w:sz w:val="20"/>
-                <w:szCs w:val="20"/>
-              </w:rPr>
-              <w:t>Angela</w:t>
-            </w:r>
-            <w:proofErr w:type="spellEnd"/>
-            <w:proofErr w:type="gramEnd"/>
-            <w:r>
-              <w:rPr>
-                <w:rFonts w:ascii="Arial" w:hAnsi="Arial" w:cs="Arial"/>
-                <w:b/>
-                <w:bCs/>
-                <w:sz w:val="20"/>
-                <w:szCs w:val="20"/>
-              </w:rPr>
-              <w:t xml:space="preserve"> V</w:t>
-            </w:r>
           </w:p>
           <w:p>
             <w:pPr>
@@ -815,16 +953,7 @@
                 <w:sz w:val="20"/>
                 <w:szCs w:val="20"/>
               </w:rPr>
-              <w:t>04/29/2026</w:t>
-            </w:r>
-            <w:r>
-              <w:rPr>
-                <w:rFonts w:ascii="Arial" w:hAnsi="Arial" w:cs="Arial"/>
-                <w:color w:val="C00000"/>
-                <w:sz w:val="20"/>
-                <w:szCs w:val="20"/>
-              </w:rPr>
-              <w:t xml:space="preserve"> </w:t>
+              <w:t xml:space="preserve">&lt;yyyy/mm/dd&gt; </w:t>
             </w:r>
           </w:p>
         </w:tc>
@@ -887,27 +1016,7 @@
                 <w:sz w:val="20"/>
                 <w:szCs w:val="20"/>
               </w:rPr>
-              <w:t>&lt;</w:t>
-            </w:r>
-            <w:proofErr w:type="spellStart"/>
-            <w:r>
-              <w:rPr>
-                <w:rFonts w:ascii="Arial" w:hAnsi="Arial" w:cs="Arial"/>
-                <w:color w:val="C00000"/>
-                <w:sz w:val="20"/>
-                <w:szCs w:val="20"/>
-              </w:rPr>
-              <w:t>yyyy</w:t>
-            </w:r>
-            <w:proofErr w:type="spellEnd"/>
-            <w:r>
-              <w:rPr>
-                <w:rFonts w:ascii="Arial" w:hAnsi="Arial" w:cs="Arial"/>
-                <w:color w:val="C00000"/>
-                <w:sz w:val="20"/>
-                <w:szCs w:val="20"/>
-              </w:rPr>
-              <w:t>/mm/dd&gt;</w:t>
+              <w:t>&lt;yyyy/mm/dd&gt;</w:t>
             </w:r>
           </w:p>
         </w:tc>
@@ -1122,7 +1231,7 @@
                 <w:sz w:val="20"/>
                 <w:szCs w:val="20"/>
               </w:rPr>
-              <w:t>Open the Reservation Lookup page.</w:t>
+              <w:t>&lt;Enter an action&gt;</w:t>
             </w:r>
           </w:p>
         </w:tc>
@@ -1147,7 +1256,7 @@
                 <w:sz w:val="20"/>
                 <w:szCs w:val="20"/>
               </w:rPr>
-              <w:t>The page loads successfully and displays a field to enter a reservation ID.</w:t>
+              <w:t>&lt;Enter the expected results&gt;</w:t>
             </w:r>
           </w:p>
         </w:tc>
@@ -1172,7 +1281,7 @@
                 <w:sz w:val="20"/>
                 <w:szCs w:val="20"/>
               </w:rPr>
-              <w:t>Pass</w:t>
+              <w:t>&lt;yes/no&gt;</w:t>
             </w:r>
           </w:p>
         </w:tc>
@@ -1250,7 +1359,7 @@
                 <w:sz w:val="20"/>
                 <w:szCs w:val="20"/>
               </w:rPr>
-              <w:t>Enter an existing reservation ID from the database.</w:t>
+              <w:t>&lt;Enter an action&gt;</w:t>
             </w:r>
           </w:p>
         </w:tc>
@@ -1275,7 +1384,7 @@
                 <w:sz w:val="20"/>
                 <w:szCs w:val="20"/>
               </w:rPr>
-              <w:t>The reservation ID is accepted in the input field.</w:t>
+              <w:t>&lt;Enter the expected results&gt;</w:t>
             </w:r>
           </w:p>
         </w:tc>
@@ -1300,7 +1409,7 @@
                 <w:sz w:val="20"/>
                 <w:szCs w:val="20"/>
               </w:rPr>
-              <w:t>Pass</w:t>
+              <w:t>&lt;yes/no&gt;</w:t>
             </w:r>
           </w:p>
         </w:tc>
@@ -1378,7 +1487,7 @@
                 <w:sz w:val="20"/>
                 <w:szCs w:val="20"/>
               </w:rPr>
-              <w:t>Click the Lookup/Search button.</w:t>
+              <w:t>&lt;Enter an action&gt;</w:t>
             </w:r>
           </w:p>
         </w:tc>
@@ -1403,7 +1512,7 @@
                 <w:sz w:val="20"/>
                 <w:szCs w:val="20"/>
               </w:rPr>
-              <w:t>The system searches the database for the entered reservation ID.</w:t>
+              <w:t>&lt;Enter the expected results&gt;</w:t>
             </w:r>
           </w:p>
         </w:tc>
@@ -1428,7 +1537,7 @@
                 <w:sz w:val="20"/>
                 <w:szCs w:val="20"/>
               </w:rPr>
-              <w:t>Pass</w:t>
+              <w:t>&lt;yes/no&gt;</w:t>
             </w:r>
           </w:p>
         </w:tc>
@@ -1506,7 +1615,7 @@
                 <w:sz w:val="20"/>
                 <w:szCs w:val="20"/>
               </w:rPr>
-              <w:t>Review the displayed reservation information.</w:t>
+              <w:t>&lt;Enter an action&gt;</w:t>
             </w:r>
           </w:p>
         </w:tc>
@@ -1531,7 +1640,7 @@
                 <w:sz w:val="20"/>
                 <w:szCs w:val="20"/>
               </w:rPr>
-              <w:t>The page displays the correct reservation details such as reservation ID, dates, room, guests, and total cost.</w:t>
+              <w:t>&lt;Enter the expected results&gt;</w:t>
             </w:r>
           </w:p>
         </w:tc>
@@ -1556,7 +1665,7 @@
                 <w:sz w:val="20"/>
                 <w:szCs w:val="20"/>
               </w:rPr>
-              <w:t>Pass</w:t>
+              <w:t>&lt;yes/no&gt;</w:t>
             </w:r>
           </w:p>
         </w:tc>
@@ -1634,7 +1743,7 @@
                 <w:sz w:val="20"/>
                 <w:szCs w:val="20"/>
               </w:rPr>
-              <w:t>Confirm the page stays accessible after lookup.</w:t>
+              <w:t>&lt;Enter an action&gt;</w:t>
             </w:r>
           </w:p>
         </w:tc>
@@ -1659,27 +1768,7 @@
                 <w:sz w:val="20"/>
                 <w:szCs w:val="20"/>
               </w:rPr>
-              <w:t xml:space="preserve">The user remains on the lookup page and can </w:t>
-            </w:r>
-            <w:proofErr w:type="gramStart"/>
-            <w:r>
-              <w:rPr>
-                <w:rFonts w:ascii="Arial" w:hAnsi="Arial" w:cs="Arial"/>
-                <w:color w:val="C00000"/>
-                <w:sz w:val="20"/>
-                <w:szCs w:val="20"/>
-              </w:rPr>
-              <w:t>search</w:t>
-            </w:r>
-            <w:proofErr w:type="gramEnd"/>
-            <w:r>
-              <w:rPr>
-                <w:rFonts w:ascii="Arial" w:hAnsi="Arial" w:cs="Arial"/>
-                <w:color w:val="C00000"/>
-                <w:sz w:val="20"/>
-                <w:szCs w:val="20"/>
-              </w:rPr>
-              <w:t xml:space="preserve"> another reservation if needed.</w:t>
+              <w:t>&lt;Enter the expected results&gt;</w:t>
             </w:r>
           </w:p>
         </w:tc>
@@ -1704,7 +1793,7 @@
                 <w:sz w:val="20"/>
                 <w:szCs w:val="20"/>
               </w:rPr>
-              <w:t>Pass</w:t>
+              <w:t>&lt;yes/no&gt;</w:t>
             </w:r>
           </w:p>
         </w:tc>
@@ -1787,7 +1876,7 @@
                 <w:sz w:val="20"/>
                 <w:szCs w:val="20"/>
               </w:rPr>
-              <w:t>The valid reservation lookup test passed successfully. The page was able to accept an existing reservation ID and display the matching reservation information from the database. This confirms that the lookup page and backend connection are working correctly for valid reservation records.</w:t>
+              <w:t xml:space="preserve">Comments should be substantive; this means there should be at least 2-3 well-structured sentences with constructive feedback. </w:t>
             </w:r>
           </w:p>
         </w:tc>
@@ -1866,6 +1955,7 @@
                 <w:bCs/>
               </w:rPr>
             </w:pPr>
+            <w:bookmarkStart w:id="1" w:name="_Toc132718196"/>
             <w:r>
               <w:rPr>
                 <w:rFonts w:ascii="Arial" w:hAnsi="Arial" w:cs="Arial"/>
@@ -1873,28 +1963,9 @@
                 <w:bCs/>
                 <w:color w:val="auto"/>
               </w:rPr>
-              <w:t xml:space="preserve">Reservation Lookup </w:t>
-            </w:r>
-            <w:proofErr w:type="gramStart"/>
-            <w:r>
-              <w:rPr>
-                <w:rFonts w:ascii="Arial" w:hAnsi="Arial" w:cs="Arial"/>
-                <w:b/>
-                <w:bCs/>
-                <w:color w:val="auto"/>
-              </w:rPr>
-              <w:t>With</w:t>
-            </w:r>
-            <w:proofErr w:type="gramEnd"/>
-            <w:r>
-              <w:rPr>
-                <w:rFonts w:ascii="Arial" w:hAnsi="Arial" w:cs="Arial"/>
-                <w:b/>
-                <w:bCs/>
-                <w:color w:val="auto"/>
-              </w:rPr>
-              <w:t xml:space="preserve"> Invalid Reservation ID</w:t>
-            </w:r>
+              <w:t>&lt;DESCRIPTION&gt;</w:t>
+            </w:r>
+            <w:bookmarkEnd w:id="1"/>
           </w:p>
         </w:tc>
       </w:tr>
@@ -1950,15 +2021,6 @@
               </w:rPr>
               <w:t xml:space="preserve">: </w:t>
             </w:r>
-            <w:r>
-              <w:rPr>
-                <w:rFonts w:ascii="Arial" w:hAnsi="Arial" w:cs="Arial"/>
-                <w:color w:val="EE0000"/>
-                <w:sz w:val="20"/>
-                <w:szCs w:val="20"/>
-              </w:rPr>
-              <w:t>Verifies that the system displays an error or not found message when a user enters a reservation ID that does not exist.</w:t>
-            </w:r>
           </w:p>
         </w:tc>
         <w:tc>
@@ -1975,8 +2037,6 @@
                 <w:szCs w:val="20"/>
               </w:rPr>
             </w:pPr>
-            <w:proofErr w:type="spellStart"/>
-            <w:proofErr w:type="gramStart"/>
             <w:r>
               <w:rPr>
                 <w:rFonts w:ascii="Arial" w:hAnsi="Arial" w:cs="Arial"/>
@@ -1987,28 +2047,6 @@
               </w:rPr>
               <w:t>Developer:</w:t>
             </w:r>
-            <w:r>
-              <w:rPr>
-                <w:rFonts w:ascii="Arial" w:hAnsi="Arial" w:cs="Arial"/>
-                <w:b/>
-                <w:bCs/>
-                <w:sz w:val="20"/>
-                <w:szCs w:val="20"/>
-              </w:rPr>
-              <w:t>Angela</w:t>
-            </w:r>
-            <w:proofErr w:type="spellEnd"/>
-            <w:proofErr w:type="gramEnd"/>
-            <w:r>
-              <w:rPr>
-                <w:rFonts w:ascii="Arial" w:hAnsi="Arial" w:cs="Arial"/>
-                <w:b/>
-                <w:bCs/>
-                <w:sz w:val="20"/>
-                <w:szCs w:val="20"/>
-              </w:rPr>
-              <w:t xml:space="preserve"> V</w:t>
-            </w:r>
           </w:p>
           <w:p>
             <w:pPr>
@@ -2043,16 +2081,7 @@
                 <w:sz w:val="20"/>
                 <w:szCs w:val="20"/>
               </w:rPr>
-              <w:t>04/29/2026</w:t>
-            </w:r>
-            <w:r>
-              <w:rPr>
-                <w:rFonts w:ascii="Arial" w:hAnsi="Arial" w:cs="Arial"/>
-                <w:color w:val="C00000"/>
-                <w:sz w:val="20"/>
-                <w:szCs w:val="20"/>
-              </w:rPr>
-              <w:t xml:space="preserve"> </w:t>
+              <w:t xml:space="preserve">&lt;yyyy/mm/dd&gt; </w:t>
             </w:r>
           </w:p>
         </w:tc>
@@ -2115,27 +2144,7 @@
                 <w:sz w:val="20"/>
                 <w:szCs w:val="20"/>
               </w:rPr>
-              <w:t>&lt;</w:t>
-            </w:r>
-            <w:proofErr w:type="spellStart"/>
-            <w:r>
-              <w:rPr>
-                <w:rFonts w:ascii="Arial" w:hAnsi="Arial" w:cs="Arial"/>
-                <w:color w:val="C00000"/>
-                <w:sz w:val="20"/>
-                <w:szCs w:val="20"/>
-              </w:rPr>
-              <w:t>yyyy</w:t>
-            </w:r>
-            <w:proofErr w:type="spellEnd"/>
-            <w:r>
-              <w:rPr>
-                <w:rFonts w:ascii="Arial" w:hAnsi="Arial" w:cs="Arial"/>
-                <w:color w:val="C00000"/>
-                <w:sz w:val="20"/>
-                <w:szCs w:val="20"/>
-              </w:rPr>
-              <w:t>/mm/dd&gt;</w:t>
+              <w:t>&lt;yyyy/mm/dd&gt;</w:t>
             </w:r>
           </w:p>
         </w:tc>
@@ -2328,7 +2337,7 @@
                 <w:sz w:val="20"/>
                 <w:szCs w:val="20"/>
               </w:rPr>
-              <w:t>Open the Reservation Lookup page.</w:t>
+              <w:t>&lt;Enter an action&gt;</w:t>
             </w:r>
           </w:p>
         </w:tc>
@@ -2353,7 +2362,7 @@
                 <w:sz w:val="20"/>
                 <w:szCs w:val="20"/>
               </w:rPr>
-              <w:t>The page loads successfully and displays the reservation ID input field.</w:t>
+              <w:t>&lt;Enter the expected results&gt;</w:t>
             </w:r>
           </w:p>
         </w:tc>
@@ -2378,7 +2387,7 @@
                 <w:sz w:val="20"/>
                 <w:szCs w:val="20"/>
               </w:rPr>
-              <w:t>Pass</w:t>
+              <w:t>&lt;yes/no&gt;</w:t>
             </w:r>
           </w:p>
         </w:tc>
@@ -2456,25 +2465,7 @@
                 <w:sz w:val="20"/>
                 <w:szCs w:val="20"/>
               </w:rPr>
-              <w:t xml:space="preserve">Enter an invalid reservation ID, such as </w:t>
-            </w:r>
-            <w:r>
-              <w:rPr>
-                <w:rFonts w:ascii="Arial" w:hAnsi="Arial" w:cs="Arial"/>
-                <w:color w:val="C00000"/>
-                <w:sz w:val="20"/>
-                <w:szCs w:val="20"/>
-              </w:rPr>
-              <w:t>0000</w:t>
-            </w:r>
-            <w:r>
-              <w:rPr>
-                <w:rFonts w:ascii="Arial" w:hAnsi="Arial" w:cs="Arial"/>
-                <w:color w:val="C00000"/>
-                <w:sz w:val="20"/>
-                <w:szCs w:val="20"/>
-              </w:rPr>
-              <w:t xml:space="preserve"> or another ID not in the database.</w:t>
+              <w:t>&lt;Enter an action&gt;</w:t>
             </w:r>
           </w:p>
         </w:tc>
@@ -2499,7 +2490,7 @@
                 <w:sz w:val="20"/>
                 <w:szCs w:val="20"/>
               </w:rPr>
-              <w:t>The invalid reservation ID is entered into the field.</w:t>
+              <w:t>&lt;Enter the expected results&gt;</w:t>
             </w:r>
           </w:p>
         </w:tc>
@@ -2524,7 +2515,7 @@
                 <w:sz w:val="20"/>
                 <w:szCs w:val="20"/>
               </w:rPr>
-              <w:t>Pass</w:t>
+              <w:t>&lt;yes/no&gt;</w:t>
             </w:r>
           </w:p>
         </w:tc>
@@ -2602,7 +2593,7 @@
                 <w:sz w:val="20"/>
                 <w:szCs w:val="20"/>
               </w:rPr>
-              <w:t>Click the Lookup/Search button.</w:t>
+              <w:t>&lt;Enter an action&gt;</w:t>
             </w:r>
           </w:p>
         </w:tc>
@@ -2627,7 +2618,7 @@
                 <w:sz w:val="20"/>
                 <w:szCs w:val="20"/>
               </w:rPr>
-              <w:t>The system searches the database for the reservation ID.</w:t>
+              <w:t>&lt;Enter the expected results&gt;</w:t>
             </w:r>
           </w:p>
         </w:tc>
@@ -2652,7 +2643,7 @@
                 <w:sz w:val="20"/>
                 <w:szCs w:val="20"/>
               </w:rPr>
-              <w:t>Pass</w:t>
+              <w:t>&lt;yes/no&gt;</w:t>
             </w:r>
           </w:p>
         </w:tc>
@@ -2730,7 +2721,7 @@
                 <w:sz w:val="20"/>
                 <w:szCs w:val="20"/>
               </w:rPr>
-              <w:t>Review the result message.</w:t>
+              <w:t>&lt;Enter an action&gt;</w:t>
             </w:r>
           </w:p>
         </w:tc>
@@ -2755,7 +2746,7 @@
                 <w:sz w:val="20"/>
                 <w:szCs w:val="20"/>
               </w:rPr>
-              <w:t>The page displays a message saying the reservation was not found.</w:t>
+              <w:t>&lt;Enter the expected results&gt;</w:t>
             </w:r>
           </w:p>
         </w:tc>
@@ -2780,7 +2771,7 @@
                 <w:sz w:val="20"/>
                 <w:szCs w:val="20"/>
               </w:rPr>
-              <w:t>Pass</w:t>
+              <w:t>&lt;yes/no&gt;</w:t>
             </w:r>
           </w:p>
         </w:tc>
@@ -2833,6 +2824,7 @@
                 <w:sz w:val="20"/>
                 <w:szCs w:val="20"/>
               </w:rPr>
+              <w:lastRenderedPageBreak/>
               <w:t>5</w:t>
             </w:r>
           </w:p>
@@ -2858,7 +2850,7 @@
                 <w:sz w:val="20"/>
                 <w:szCs w:val="20"/>
               </w:rPr>
-              <w:t>Enter another reservation ID to test again.</w:t>
+              <w:t>&lt;Enter an action&gt;</w:t>
             </w:r>
           </w:p>
         </w:tc>
@@ -2883,7 +2875,7 @@
                 <w:sz w:val="20"/>
                 <w:szCs w:val="20"/>
               </w:rPr>
-              <w:t>The page allows another lookup without crashing or redirecting incorrectly.</w:t>
+              <w:t>&lt;Enter the expected results&gt;</w:t>
             </w:r>
           </w:p>
         </w:tc>
@@ -2908,7 +2900,7 @@
                 <w:sz w:val="20"/>
                 <w:szCs w:val="20"/>
               </w:rPr>
-              <w:t>Pass</w:t>
+              <w:t>&lt;yes/no&gt;</w:t>
             </w:r>
           </w:p>
         </w:tc>
@@ -2991,7 +2983,7 @@
                 <w:sz w:val="20"/>
                 <w:szCs w:val="20"/>
               </w:rPr>
-              <w:t>The invalid reservation lookup test passed successfully. When a reservation ID that does not exist was entered, the system did not display incorrect reservation information. Instead, it showed a clear not found message, which helps the user understand that the reservation could not be located.</w:t>
+              <w:t>Comments should be substantive; this means there should be at least 2-3 well-structured sentences with constructive feedback.</w:t>
             </w:r>
           </w:p>
         </w:tc>
@@ -3070,7 +3062,7 @@
                 <w:bCs/>
               </w:rPr>
             </w:pPr>
-            <w:bookmarkStart w:id="0" w:name="_Toc132718197"/>
+            <w:bookmarkStart w:id="2" w:name="_Toc132718197"/>
             <w:r>
               <w:rPr>
                 <w:rFonts w:ascii="Arial" w:hAnsi="Arial" w:cs="Arial"/>
@@ -3080,7 +3072,7 @@
               </w:rPr>
               <w:t>&lt;DESCRIPTION&gt;</w:t>
             </w:r>
-            <w:bookmarkEnd w:id="0"/>
+            <w:bookmarkEnd w:id="2"/>
           </w:p>
         </w:tc>
       </w:tr>
@@ -3196,27 +3188,7 @@
                 <w:sz w:val="20"/>
                 <w:szCs w:val="20"/>
               </w:rPr>
-              <w:t>&lt;</w:t>
-            </w:r>
-            <w:proofErr w:type="spellStart"/>
-            <w:r>
-              <w:rPr>
-                <w:rFonts w:ascii="Arial" w:hAnsi="Arial" w:cs="Arial"/>
-                <w:color w:val="C00000"/>
-                <w:sz w:val="20"/>
-                <w:szCs w:val="20"/>
-              </w:rPr>
-              <w:t>yyyy</w:t>
-            </w:r>
-            <w:proofErr w:type="spellEnd"/>
-            <w:r>
-              <w:rPr>
-                <w:rFonts w:ascii="Arial" w:hAnsi="Arial" w:cs="Arial"/>
-                <w:color w:val="C00000"/>
-                <w:sz w:val="20"/>
-                <w:szCs w:val="20"/>
-              </w:rPr>
-              <w:t xml:space="preserve">/mm/dd&gt; </w:t>
+              <w:t xml:space="preserve">&lt;yyyy/mm/dd&gt; </w:t>
             </w:r>
           </w:p>
         </w:tc>
@@ -3279,27 +3251,7 @@
                 <w:sz w:val="20"/>
                 <w:szCs w:val="20"/>
               </w:rPr>
-              <w:t>&lt;</w:t>
-            </w:r>
-            <w:proofErr w:type="spellStart"/>
-            <w:r>
-              <w:rPr>
-                <w:rFonts w:ascii="Arial" w:hAnsi="Arial" w:cs="Arial"/>
-                <w:color w:val="C00000"/>
-                <w:sz w:val="20"/>
-                <w:szCs w:val="20"/>
-              </w:rPr>
-              <w:t>yyyy</w:t>
-            </w:r>
-            <w:proofErr w:type="spellEnd"/>
-            <w:r>
-              <w:rPr>
-                <w:rFonts w:ascii="Arial" w:hAnsi="Arial" w:cs="Arial"/>
-                <w:color w:val="C00000"/>
-                <w:sz w:val="20"/>
-                <w:szCs w:val="20"/>
-              </w:rPr>
-              <w:t>/mm/dd&gt;</w:t>
+              <w:t>&lt;yyyy/mm/dd&gt;</w:t>
             </w:r>
           </w:p>
         </w:tc>
@@ -3979,7 +3931,6 @@
                 <w:sz w:val="20"/>
                 <w:szCs w:val="20"/>
               </w:rPr>
-              <w:lastRenderedPageBreak/>
               <w:t>5</w:t>
             </w:r>
           </w:p>
@@ -4191,7 +4142,15 @@
                 <w:sz w:val="24"/>
                 <w:szCs w:val="24"/>
               </w:rPr>
-              <w:t>Test 4</w:t>
+              <w:t xml:space="preserve">Test </w:t>
+            </w:r>
+            <w:r>
+              <w:rPr>
+                <w:rFonts w:ascii="Arial" w:hAnsi="Arial" w:cs="Arial"/>
+                <w:sz w:val="24"/>
+                <w:szCs w:val="24"/>
+              </w:rPr>
+              <w:t>4</w:t>
             </w:r>
           </w:p>
         </w:tc>
@@ -4333,27 +4292,7 @@
                 <w:sz w:val="20"/>
                 <w:szCs w:val="20"/>
               </w:rPr>
-              <w:t>&lt;</w:t>
-            </w:r>
-            <w:proofErr w:type="spellStart"/>
-            <w:r>
-              <w:rPr>
-                <w:rFonts w:ascii="Arial" w:hAnsi="Arial" w:cs="Arial"/>
-                <w:color w:val="C00000"/>
-                <w:sz w:val="20"/>
-                <w:szCs w:val="20"/>
-              </w:rPr>
-              <w:t>yyyy</w:t>
-            </w:r>
-            <w:proofErr w:type="spellEnd"/>
-            <w:r>
-              <w:rPr>
-                <w:rFonts w:ascii="Arial" w:hAnsi="Arial" w:cs="Arial"/>
-                <w:color w:val="C00000"/>
-                <w:sz w:val="20"/>
-                <w:szCs w:val="20"/>
-              </w:rPr>
-              <w:t xml:space="preserve">/mm/dd&gt; </w:t>
+              <w:t xml:space="preserve">&lt;yyyy/mm/dd&gt; </w:t>
             </w:r>
           </w:p>
         </w:tc>
@@ -4416,27 +4355,7 @@
                 <w:sz w:val="20"/>
                 <w:szCs w:val="20"/>
               </w:rPr>
-              <w:t>&lt;</w:t>
-            </w:r>
-            <w:proofErr w:type="spellStart"/>
-            <w:r>
-              <w:rPr>
-                <w:rFonts w:ascii="Arial" w:hAnsi="Arial" w:cs="Arial"/>
-                <w:color w:val="C00000"/>
-                <w:sz w:val="20"/>
-                <w:szCs w:val="20"/>
-              </w:rPr>
-              <w:t>yyyy</w:t>
-            </w:r>
-            <w:proofErr w:type="spellEnd"/>
-            <w:r>
-              <w:rPr>
-                <w:rFonts w:ascii="Arial" w:hAnsi="Arial" w:cs="Arial"/>
-                <w:color w:val="C00000"/>
-                <w:sz w:val="20"/>
-                <w:szCs w:val="20"/>
-              </w:rPr>
-              <w:t>/mm/dd&gt;</w:t>
+              <w:t>&lt;yyyy/mm/dd&gt;</w:t>
             </w:r>
           </w:p>
         </w:tc>
@@ -5248,6 +5167,7 @@
                 <w:sz w:val="20"/>
                 <w:szCs w:val="20"/>
               </w:rPr>
+              <w:lastRenderedPageBreak/>
               <w:t>Comments</w:t>
             </w:r>
           </w:p>
@@ -5936,6 +5856,7 @@
   <w:style w:type="character" w:default="1" w:styleId="DefaultParagraphFont">
     <w:name w:val="Default Paragraph Font"/>
     <w:uiPriority w:val="1"/>
+    <w:semiHidden/>
     <w:unhideWhenUsed/>
   </w:style>
   <w:style w:type="table" w:default="1" w:styleId="TableNormal">

</xml_diff>

<commit_message>
Update to module-8 05/02/26
</commit_message>
<xml_diff>
--- a/MODULE-8/8.2 Assignment.docx
+++ b/MODULE-8/8.2 Assignment.docx
@@ -370,16 +370,7 @@
               <w:sz w:val="28"/>
               <w:szCs w:val="28"/>
             </w:rPr>
-            <w:t>Reservation Lookup With Valid Reservation ID</w:t>
-          </w:r>
-          <w:r>
-            <w:rPr>
-              <w:rFonts w:eastAsiaTheme="minorEastAsia"/>
-              <w:noProof/>
-              <w:sz w:val="28"/>
-              <w:szCs w:val="28"/>
-            </w:rPr>
-            <w:t>……………………………………………………………………………………………………………………………………………..1</w:t>
+            <w:t>Reservation Lookup With Valid Reservation ID……………………………………………………………………………………………………………………………………………..1</w:t>
           </w:r>
         </w:p>
         <w:p>
@@ -388,28 +379,7 @@
               <w:sz w:val="28"/>
               <w:szCs w:val="28"/>
             </w:rPr>
-            <w:t xml:space="preserve">Reservation Lookup </w:t>
-          </w:r>
-          <w:r>
-            <w:rPr>
-              <w:sz w:val="28"/>
-              <w:szCs w:val="28"/>
-            </w:rPr>
-            <w:t>with</w:t>
-          </w:r>
-          <w:r>
-            <w:rPr>
-              <w:sz w:val="28"/>
-              <w:szCs w:val="28"/>
-            </w:rPr>
-            <w:t xml:space="preserve"> Invalid Reservation ID</w:t>
-          </w:r>
-          <w:r>
-            <w:rPr>
-              <w:sz w:val="28"/>
-              <w:szCs w:val="28"/>
-            </w:rPr>
-            <w:t>……………………………………………………………………………………………………………………………………………1-2</w:t>
+            <w:t>Reservation Lookup with Invalid Reservation ID……………………………………………………………………………………………………………………………………………1-2</w:t>
           </w:r>
         </w:p>
       </w:sdtContent>
@@ -591,10 +561,10 @@
       </w:tblPr>
       <w:tblGrid>
         <w:gridCol w:w="1250"/>
-        <w:gridCol w:w="3571"/>
-        <w:gridCol w:w="3929"/>
-        <w:gridCol w:w="2148"/>
-        <w:gridCol w:w="2052"/>
+        <w:gridCol w:w="3218"/>
+        <w:gridCol w:w="3576"/>
+        <w:gridCol w:w="1979"/>
+        <w:gridCol w:w="2927"/>
       </w:tblGrid>
       <w:tr>
         <w:trPr>
@@ -645,27 +615,7 @@
                 <w:bCs/>
                 <w:color w:val="auto"/>
               </w:rPr>
-              <w:t xml:space="preserve">Reservation Lookup </w:t>
-            </w:r>
-            <w:proofErr w:type="gramStart"/>
-            <w:r>
-              <w:rPr>
-                <w:rFonts w:ascii="Arial" w:hAnsi="Arial" w:cs="Arial"/>
-                <w:b/>
-                <w:bCs/>
-                <w:color w:val="auto"/>
-              </w:rPr>
-              <w:t>With</w:t>
-            </w:r>
-            <w:proofErr w:type="gramEnd"/>
-            <w:r>
-              <w:rPr>
-                <w:rFonts w:ascii="Arial" w:hAnsi="Arial" w:cs="Arial"/>
-                <w:b/>
-                <w:bCs/>
-                <w:color w:val="auto"/>
-              </w:rPr>
-              <w:t xml:space="preserve"> Valid Reservation ID</w:t>
+              <w:t>Reservation Lookup With Valid Reservation ID</w:t>
             </w:r>
           </w:p>
         </w:tc>
@@ -747,8 +697,6 @@
                 <w:szCs w:val="20"/>
               </w:rPr>
             </w:pPr>
-            <w:proofErr w:type="spellStart"/>
-            <w:proofErr w:type="gramStart"/>
             <w:r>
               <w:rPr>
                 <w:rFonts w:ascii="Arial" w:hAnsi="Arial" w:cs="Arial"/>
@@ -767,19 +715,7 @@
                 <w:sz w:val="20"/>
                 <w:szCs w:val="20"/>
               </w:rPr>
-              <w:t>Angela</w:t>
-            </w:r>
-            <w:proofErr w:type="spellEnd"/>
-            <w:proofErr w:type="gramEnd"/>
-            <w:r>
-              <w:rPr>
-                <w:rFonts w:ascii="Arial" w:hAnsi="Arial" w:cs="Arial"/>
-                <w:b/>
-                <w:bCs/>
-                <w:sz w:val="20"/>
-                <w:szCs w:val="20"/>
-              </w:rPr>
-              <w:t xml:space="preserve"> V</w:t>
+              <w:t>Angela V</w:t>
             </w:r>
           </w:p>
           <w:p>
@@ -887,27 +823,7 @@
                 <w:sz w:val="20"/>
                 <w:szCs w:val="20"/>
               </w:rPr>
-              <w:t>&lt;</w:t>
-            </w:r>
-            <w:proofErr w:type="spellStart"/>
-            <w:r>
-              <w:rPr>
-                <w:rFonts w:ascii="Arial" w:hAnsi="Arial" w:cs="Arial"/>
-                <w:color w:val="C00000"/>
-                <w:sz w:val="20"/>
-                <w:szCs w:val="20"/>
-              </w:rPr>
-              <w:t>yyyy</w:t>
-            </w:r>
-            <w:proofErr w:type="spellEnd"/>
-            <w:r>
-              <w:rPr>
-                <w:rFonts w:ascii="Arial" w:hAnsi="Arial" w:cs="Arial"/>
-                <w:color w:val="C00000"/>
-                <w:sz w:val="20"/>
-                <w:szCs w:val="20"/>
-              </w:rPr>
-              <w:t>/mm/dd&gt;</w:t>
+              <w:t>&lt;yyyy/mm/dd&gt;</w:t>
             </w:r>
           </w:p>
         </w:tc>
@@ -1197,7 +1113,61 @@
                 <w:sz w:val="20"/>
                 <w:szCs w:val="20"/>
               </w:rPr>
-              <w:t>&lt;yes/no&gt;</w:t>
+              <w:t>Pass</w:t>
+            </w:r>
+          </w:p>
+          <w:p>
+            <w:pPr>
+              <w:spacing w:before="80" w:after="80"/>
+              <w:rPr>
+                <w:rFonts w:ascii="Arial" w:hAnsi="Arial" w:cs="Arial"/>
+                <w:color w:val="C00000"/>
+                <w:sz w:val="20"/>
+                <w:szCs w:val="20"/>
+              </w:rPr>
+            </w:pPr>
+            <w:r>
+              <w:rPr>
+                <w:rFonts w:ascii="Arial" w:hAnsi="Arial" w:cs="Arial"/>
+                <w:color w:val="C00000"/>
+                <w:sz w:val="20"/>
+                <w:szCs w:val="20"/>
+              </w:rPr>
+              <w:drawing>
+                <wp:inline distT="0" distB="0" distL="0" distR="0" wp14:anchorId="2397CF7F" wp14:editId="034EBC18">
+                  <wp:extent cx="1169470" cy="1150515"/>
+                  <wp:effectExtent l="0" t="0" r="0" b="0"/>
+                  <wp:docPr id="694224189" name="Picture 1"/>
+                  <wp:cNvGraphicFramePr>
+                    <a:graphicFrameLocks xmlns:a="http://schemas.openxmlformats.org/drawingml/2006/main" noChangeAspect="1"/>
+                  </wp:cNvGraphicFramePr>
+                  <a:graphic xmlns:a="http://schemas.openxmlformats.org/drawingml/2006/main">
+                    <a:graphicData uri="http://schemas.openxmlformats.org/drawingml/2006/picture">
+                      <pic:pic xmlns:pic="http://schemas.openxmlformats.org/drawingml/2006/picture">
+                        <pic:nvPicPr>
+                          <pic:cNvPr id="694224189" name=""/>
+                          <pic:cNvPicPr/>
+                        </pic:nvPicPr>
+                        <pic:blipFill>
+                          <a:blip r:embed="rId7"/>
+                          <a:stretch>
+                            <a:fillRect/>
+                          </a:stretch>
+                        </pic:blipFill>
+                        <pic:spPr>
+                          <a:xfrm>
+                            <a:off x="0" y="0"/>
+                            <a:ext cx="1180474" cy="1161341"/>
+                          </a:xfrm>
+                          <a:prstGeom prst="rect">
+                            <a:avLst/>
+                          </a:prstGeom>
+                        </pic:spPr>
+                      </pic:pic>
+                    </a:graphicData>
+                  </a:graphic>
+                </wp:inline>
+              </w:drawing>
             </w:r>
           </w:p>
         </w:tc>
@@ -1325,7 +1295,61 @@
                 <w:sz w:val="20"/>
                 <w:szCs w:val="20"/>
               </w:rPr>
-              <w:t>&lt;yes/no&gt;</w:t>
+              <w:t>Pass</w:t>
+            </w:r>
+          </w:p>
+          <w:p>
+            <w:pPr>
+              <w:spacing w:before="80" w:after="80"/>
+              <w:rPr>
+                <w:rFonts w:ascii="Arial" w:hAnsi="Arial" w:cs="Arial"/>
+                <w:color w:val="C00000"/>
+                <w:sz w:val="20"/>
+                <w:szCs w:val="20"/>
+              </w:rPr>
+            </w:pPr>
+            <w:r>
+              <w:rPr>
+                <w:rFonts w:ascii="Arial" w:hAnsi="Arial" w:cs="Arial"/>
+                <w:color w:val="C00000"/>
+                <w:sz w:val="20"/>
+                <w:szCs w:val="20"/>
+              </w:rPr>
+              <w:drawing>
+                <wp:inline distT="0" distB="0" distL="0" distR="0" wp14:anchorId="637AC95F" wp14:editId="59756024">
+                  <wp:extent cx="1308079" cy="1322070"/>
+                  <wp:effectExtent l="0" t="0" r="6985" b="0"/>
+                  <wp:docPr id="723966386" name="Picture 1"/>
+                  <wp:cNvGraphicFramePr>
+                    <a:graphicFrameLocks xmlns:a="http://schemas.openxmlformats.org/drawingml/2006/main" noChangeAspect="1"/>
+                  </wp:cNvGraphicFramePr>
+                  <a:graphic xmlns:a="http://schemas.openxmlformats.org/drawingml/2006/main">
+                    <a:graphicData uri="http://schemas.openxmlformats.org/drawingml/2006/picture">
+                      <pic:pic xmlns:pic="http://schemas.openxmlformats.org/drawingml/2006/picture">
+                        <pic:nvPicPr>
+                          <pic:cNvPr id="723966386" name=""/>
+                          <pic:cNvPicPr/>
+                        </pic:nvPicPr>
+                        <pic:blipFill>
+                          <a:blip r:embed="rId8"/>
+                          <a:stretch>
+                            <a:fillRect/>
+                          </a:stretch>
+                        </pic:blipFill>
+                        <pic:spPr>
+                          <a:xfrm>
+                            <a:off x="0" y="0"/>
+                            <a:ext cx="1316209" cy="1330287"/>
+                          </a:xfrm>
+                          <a:prstGeom prst="rect">
+                            <a:avLst/>
+                          </a:prstGeom>
+                        </pic:spPr>
+                      </pic:pic>
+                    </a:graphicData>
+                  </a:graphic>
+                </wp:inline>
+              </w:drawing>
             </w:r>
           </w:p>
         </w:tc>
@@ -1353,6 +1377,7 @@
                 <w:sz w:val="20"/>
                 <w:szCs w:val="20"/>
               </w:rPr>
+              <w:lastRenderedPageBreak/>
               <w:t>3</w:t>
             </w:r>
           </w:p>
@@ -1453,7 +1478,61 @@
                 <w:sz w:val="20"/>
                 <w:szCs w:val="20"/>
               </w:rPr>
-              <w:t>&lt;yes/no&gt;</w:t>
+              <w:t>Pass</w:t>
+            </w:r>
+          </w:p>
+          <w:p>
+            <w:pPr>
+              <w:spacing w:before="80" w:after="80"/>
+              <w:rPr>
+                <w:rFonts w:ascii="Arial" w:hAnsi="Arial" w:cs="Arial"/>
+                <w:color w:val="C00000"/>
+                <w:sz w:val="20"/>
+                <w:szCs w:val="20"/>
+              </w:rPr>
+            </w:pPr>
+            <w:r>
+              <w:rPr>
+                <w:rFonts w:ascii="Arial" w:hAnsi="Arial" w:cs="Arial"/>
+                <w:color w:val="C00000"/>
+                <w:sz w:val="20"/>
+                <w:szCs w:val="20"/>
+              </w:rPr>
+              <w:drawing>
+                <wp:inline distT="0" distB="0" distL="0" distR="0" wp14:anchorId="03FBA33E" wp14:editId="04D8BDE8">
+                  <wp:extent cx="1584960" cy="1192031"/>
+                  <wp:effectExtent l="0" t="0" r="0" b="8255"/>
+                  <wp:docPr id="658204685" name="Picture 1"/>
+                  <wp:cNvGraphicFramePr>
+                    <a:graphicFrameLocks xmlns:a="http://schemas.openxmlformats.org/drawingml/2006/main" noChangeAspect="1"/>
+                  </wp:cNvGraphicFramePr>
+                  <a:graphic xmlns:a="http://schemas.openxmlformats.org/drawingml/2006/main">
+                    <a:graphicData uri="http://schemas.openxmlformats.org/drawingml/2006/picture">
+                      <pic:pic xmlns:pic="http://schemas.openxmlformats.org/drawingml/2006/picture">
+                        <pic:nvPicPr>
+                          <pic:cNvPr id="658204685" name=""/>
+                          <pic:cNvPicPr/>
+                        </pic:nvPicPr>
+                        <pic:blipFill>
+                          <a:blip r:embed="rId9"/>
+                          <a:stretch>
+                            <a:fillRect/>
+                          </a:stretch>
+                        </pic:blipFill>
+                        <pic:spPr>
+                          <a:xfrm>
+                            <a:off x="0" y="0"/>
+                            <a:ext cx="1590324" cy="1196065"/>
+                          </a:xfrm>
+                          <a:prstGeom prst="rect">
+                            <a:avLst/>
+                          </a:prstGeom>
+                        </pic:spPr>
+                      </pic:pic>
+                    </a:graphicData>
+                  </a:graphic>
+                </wp:inline>
+              </w:drawing>
             </w:r>
           </w:p>
         </w:tc>
@@ -1584,6 +1663,60 @@
               <w:t>&lt;yes/no&gt;</w:t>
             </w:r>
           </w:p>
+          <w:p>
+            <w:pPr>
+              <w:spacing w:before="80" w:after="80"/>
+              <w:rPr>
+                <w:rFonts w:ascii="Arial" w:hAnsi="Arial" w:cs="Arial"/>
+                <w:color w:val="C00000"/>
+                <w:sz w:val="20"/>
+                <w:szCs w:val="20"/>
+              </w:rPr>
+            </w:pPr>
+            <w:r>
+              <w:rPr>
+                <w:rFonts w:ascii="Arial" w:hAnsi="Arial" w:cs="Arial"/>
+                <w:color w:val="C00000"/>
+                <w:sz w:val="20"/>
+                <w:szCs w:val="20"/>
+              </w:rPr>
+              <w:drawing>
+                <wp:inline distT="0" distB="0" distL="0" distR="0" wp14:anchorId="5AF013F3" wp14:editId="758C25E6">
+                  <wp:extent cx="1722038" cy="3916680"/>
+                  <wp:effectExtent l="0" t="0" r="0" b="7620"/>
+                  <wp:docPr id="1726783408" name="Picture 1"/>
+                  <wp:cNvGraphicFramePr>
+                    <a:graphicFrameLocks xmlns:a="http://schemas.openxmlformats.org/drawingml/2006/main" noChangeAspect="1"/>
+                  </wp:cNvGraphicFramePr>
+                  <a:graphic xmlns:a="http://schemas.openxmlformats.org/drawingml/2006/main">
+                    <a:graphicData uri="http://schemas.openxmlformats.org/drawingml/2006/picture">
+                      <pic:pic xmlns:pic="http://schemas.openxmlformats.org/drawingml/2006/picture">
+                        <pic:nvPicPr>
+                          <pic:cNvPr id="1726783408" name=""/>
+                          <pic:cNvPicPr/>
+                        </pic:nvPicPr>
+                        <pic:blipFill>
+                          <a:blip r:embed="rId10"/>
+                          <a:stretch>
+                            <a:fillRect/>
+                          </a:stretch>
+                        </pic:blipFill>
+                        <pic:spPr>
+                          <a:xfrm>
+                            <a:off x="0" y="0"/>
+                            <a:ext cx="1748571" cy="3977027"/>
+                          </a:xfrm>
+                          <a:prstGeom prst="rect">
+                            <a:avLst/>
+                          </a:prstGeom>
+                        </pic:spPr>
+                      </pic:pic>
+                    </a:graphicData>
+                  </a:graphic>
+                </wp:inline>
+              </w:drawing>
+            </w:r>
+          </w:p>
         </w:tc>
       </w:tr>
       <w:tr>
@@ -1609,6 +1742,7 @@
                 <w:sz w:val="20"/>
                 <w:szCs w:val="20"/>
               </w:rPr>
+              <w:lastRenderedPageBreak/>
               <w:t>5</w:t>
             </w:r>
           </w:p>
@@ -1659,27 +1793,7 @@
                 <w:sz w:val="20"/>
                 <w:szCs w:val="20"/>
               </w:rPr>
-              <w:t xml:space="preserve">The user remains on the lookup page and can </w:t>
-            </w:r>
-            <w:proofErr w:type="gramStart"/>
-            <w:r>
-              <w:rPr>
-                <w:rFonts w:ascii="Arial" w:hAnsi="Arial" w:cs="Arial"/>
-                <w:color w:val="C00000"/>
-                <w:sz w:val="20"/>
-                <w:szCs w:val="20"/>
-              </w:rPr>
-              <w:t>search</w:t>
-            </w:r>
-            <w:proofErr w:type="gramEnd"/>
-            <w:r>
-              <w:rPr>
-                <w:rFonts w:ascii="Arial" w:hAnsi="Arial" w:cs="Arial"/>
-                <w:color w:val="C00000"/>
-                <w:sz w:val="20"/>
-                <w:szCs w:val="20"/>
-              </w:rPr>
-              <w:t xml:space="preserve"> another reservation if needed.</w:t>
+              <w:t>The user remains on the lookup page and can search another reservation if needed.</w:t>
             </w:r>
           </w:p>
         </w:tc>
@@ -1729,7 +1843,7 @@
                 <w:sz w:val="20"/>
                 <w:szCs w:val="20"/>
               </w:rPr>
-              <w:t>&lt;yes/no&gt;</w:t>
+              <w:t>Pass</w:t>
             </w:r>
           </w:p>
         </w:tc>
@@ -1788,6 +1902,1429 @@
                 <w:szCs w:val="20"/>
               </w:rPr>
               <w:t>The valid reservation lookup test passed successfully. The page was able to accept an existing reservation ID and display the matching reservation information from the database. This confirms that the lookup page and backend connection are working correctly for valid reservation records.</w:t>
+            </w:r>
+          </w:p>
+        </w:tc>
+      </w:tr>
+    </w:tbl>
+    <w:p>
+      <w:pPr>
+        <w:pStyle w:val="NoSpacing"/>
+        <w:rPr>
+          <w:rFonts w:ascii="Arial" w:hAnsi="Arial" w:cs="Arial"/>
+          <w:sz w:val="24"/>
+          <w:szCs w:val="24"/>
+        </w:rPr>
+      </w:pPr>
+    </w:p>
+    <w:tbl>
+      <w:tblPr>
+        <w:tblStyle w:val="TableGrid"/>
+        <w:tblW w:w="0" w:type="auto"/>
+        <w:tblLook w:val="04A0" w:firstRow="1" w:lastRow="0" w:firstColumn="1" w:lastColumn="0" w:noHBand="0" w:noVBand="1"/>
+      </w:tblPr>
+      <w:tblGrid>
+        <w:gridCol w:w="1250"/>
+        <w:gridCol w:w="3391"/>
+        <w:gridCol w:w="3751"/>
+        <w:gridCol w:w="2062"/>
+        <w:gridCol w:w="2496"/>
+      </w:tblGrid>
+      <w:tr>
+        <w:trPr>
+          <w:trHeight w:val="710"/>
+        </w:trPr>
+        <w:tc>
+          <w:tcPr>
+            <w:tcW w:w="1250" w:type="dxa"/>
+          </w:tcPr>
+          <w:p>
+            <w:pPr>
+              <w:pStyle w:val="NoSpacing"/>
+              <w:spacing w:before="80" w:after="80"/>
+              <w:rPr>
+                <w:rFonts w:ascii="Arial" w:hAnsi="Arial" w:cs="Arial"/>
+                <w:sz w:val="24"/>
+                <w:szCs w:val="24"/>
+              </w:rPr>
+            </w:pPr>
+            <w:r>
+              <w:rPr>
+                <w:rFonts w:ascii="Arial" w:hAnsi="Arial" w:cs="Arial"/>
+                <w:sz w:val="24"/>
+                <w:szCs w:val="24"/>
+              </w:rPr>
+              <w:t xml:space="preserve">Test </w:t>
+            </w:r>
+            <w:r>
+              <w:rPr>
+                <w:rFonts w:ascii="Arial" w:hAnsi="Arial" w:cs="Arial"/>
+                <w:sz w:val="24"/>
+                <w:szCs w:val="24"/>
+              </w:rPr>
+              <w:t>2</w:t>
+            </w:r>
+          </w:p>
+        </w:tc>
+        <w:tc>
+          <w:tcPr>
+            <w:tcW w:w="11700" w:type="dxa"/>
+            <w:gridSpan w:val="4"/>
+          </w:tcPr>
+          <w:p>
+            <w:pPr>
+              <w:pStyle w:val="Heading1"/>
+              <w:rPr>
+                <w:rFonts w:ascii="Arial" w:hAnsi="Arial" w:cs="Arial"/>
+                <w:b/>
+                <w:bCs/>
+              </w:rPr>
+            </w:pPr>
+            <w:r>
+              <w:rPr>
+                <w:rFonts w:ascii="Arial" w:hAnsi="Arial" w:cs="Arial"/>
+                <w:b/>
+                <w:bCs/>
+                <w:color w:val="auto"/>
+              </w:rPr>
+              <w:t>Reservation Lookup With Invalid Reservation ID</w:t>
+            </w:r>
+          </w:p>
+        </w:tc>
+      </w:tr>
+      <w:tr>
+        <w:trPr>
+          <w:trHeight w:val="620"/>
+        </w:trPr>
+        <w:tc>
+          <w:tcPr>
+            <w:tcW w:w="1250" w:type="dxa"/>
+          </w:tcPr>
+          <w:p>
+            <w:pPr>
+              <w:pStyle w:val="NoSpacing"/>
+              <w:spacing w:before="80" w:after="80"/>
+              <w:rPr>
+                <w:rFonts w:ascii="Arial" w:hAnsi="Arial" w:cs="Arial"/>
+                <w:sz w:val="24"/>
+                <w:szCs w:val="24"/>
+              </w:rPr>
+            </w:pPr>
+          </w:p>
+        </w:tc>
+        <w:tc>
+          <w:tcPr>
+            <w:tcW w:w="3570" w:type="dxa"/>
+          </w:tcPr>
+          <w:p>
+            <w:pPr>
+              <w:rPr>
+                <w:rFonts w:ascii="Arial" w:hAnsi="Arial" w:cs="Arial"/>
+                <w:sz w:val="20"/>
+                <w:szCs w:val="20"/>
+              </w:rPr>
+            </w:pPr>
+            <w:r>
+              <w:rPr>
+                <w:rFonts w:ascii="Arial" w:hAnsi="Arial" w:cs="Arial"/>
+                <w:b/>
+                <w:bCs/>
+                <w:sz w:val="20"/>
+                <w:szCs w:val="20"/>
+              </w:rPr>
+              <w:t>Test Objective</w:t>
+            </w:r>
+            <w:r>
+              <w:rPr>
+                <w:rFonts w:ascii="Arial" w:hAnsi="Arial" w:cs="Arial"/>
+                <w:b/>
+                <w:bCs/>
+                <w:sz w:val="20"/>
+                <w:szCs w:val="20"/>
+              </w:rPr>
+              <w:t xml:space="preserve">: </w:t>
+            </w:r>
+            <w:r>
+              <w:rPr>
+                <w:rFonts w:ascii="Arial" w:hAnsi="Arial" w:cs="Arial"/>
+                <w:color w:val="EE0000"/>
+                <w:sz w:val="20"/>
+                <w:szCs w:val="20"/>
+              </w:rPr>
+              <w:t>Verifies that the system displays an error or not found message when a user enters a reservation ID that does not exist.</w:t>
+            </w:r>
+          </w:p>
+        </w:tc>
+        <w:tc>
+          <w:tcPr>
+            <w:tcW w:w="3930" w:type="dxa"/>
+          </w:tcPr>
+          <w:p>
+            <w:pPr>
+              <w:rPr>
+                <w:rFonts w:ascii="Arial" w:hAnsi="Arial" w:cs="Arial"/>
+                <w:b/>
+                <w:bCs/>
+                <w:sz w:val="20"/>
+                <w:szCs w:val="20"/>
+              </w:rPr>
+            </w:pPr>
+            <w:r>
+              <w:rPr>
+                <w:rFonts w:ascii="Arial" w:hAnsi="Arial" w:cs="Arial"/>
+                <w:b/>
+                <w:bCs/>
+                <w:sz w:val="20"/>
+                <w:szCs w:val="20"/>
+              </w:rPr>
+              <w:t>Developer:</w:t>
+            </w:r>
+            <w:r>
+              <w:rPr>
+                <w:rFonts w:ascii="Arial" w:hAnsi="Arial" w:cs="Arial"/>
+                <w:b/>
+                <w:bCs/>
+                <w:sz w:val="20"/>
+                <w:szCs w:val="20"/>
+              </w:rPr>
+              <w:t>Angela V</w:t>
+            </w:r>
+          </w:p>
+          <w:p>
+            <w:pPr>
+              <w:rPr>
+                <w:rFonts w:ascii="Arial" w:hAnsi="Arial" w:cs="Arial"/>
+                <w:sz w:val="20"/>
+                <w:szCs w:val="20"/>
+              </w:rPr>
+            </w:pPr>
+            <w:r>
+              <w:rPr>
+                <w:rFonts w:ascii="Arial" w:hAnsi="Arial" w:cs="Arial"/>
+                <w:b/>
+                <w:bCs/>
+                <w:sz w:val="20"/>
+                <w:szCs w:val="20"/>
+              </w:rPr>
+              <w:t>Date tested:</w:t>
+            </w:r>
+            <w:r>
+              <w:rPr>
+                <w:rFonts w:ascii="Arial" w:hAnsi="Arial" w:cs="Arial"/>
+                <w:sz w:val="20"/>
+                <w:szCs w:val="20"/>
+              </w:rPr>
+              <w:t xml:space="preserve"> </w:t>
+            </w:r>
+            <w:r>
+              <w:rPr>
+                <w:rFonts w:ascii="Arial" w:hAnsi="Arial" w:cs="Arial"/>
+                <w:color w:val="C00000"/>
+                <w:sz w:val="20"/>
+                <w:szCs w:val="20"/>
+              </w:rPr>
+              <w:t>04/29/2026</w:t>
+            </w:r>
+            <w:r>
+              <w:rPr>
+                <w:rFonts w:ascii="Arial" w:hAnsi="Arial" w:cs="Arial"/>
+                <w:color w:val="C00000"/>
+                <w:sz w:val="20"/>
+                <w:szCs w:val="20"/>
+              </w:rPr>
+              <w:t xml:space="preserve"> </w:t>
+            </w:r>
+          </w:p>
+        </w:tc>
+        <w:tc>
+          <w:tcPr>
+            <w:tcW w:w="4200" w:type="dxa"/>
+            <w:gridSpan w:val="2"/>
+          </w:tcPr>
+          <w:p>
+            <w:pPr>
+              <w:rPr>
+                <w:rFonts w:ascii="Arial" w:hAnsi="Arial" w:cs="Arial"/>
+                <w:b/>
+                <w:bCs/>
+                <w:sz w:val="20"/>
+                <w:szCs w:val="20"/>
+              </w:rPr>
+            </w:pPr>
+            <w:r>
+              <w:rPr>
+                <w:rFonts w:ascii="Arial" w:hAnsi="Arial" w:cs="Arial"/>
+                <w:b/>
+                <w:bCs/>
+                <w:sz w:val="20"/>
+                <w:szCs w:val="20"/>
+              </w:rPr>
+              <w:t xml:space="preserve">Peer tester: </w:t>
+            </w:r>
+          </w:p>
+          <w:p>
+            <w:pPr>
+              <w:rPr>
+                <w:rFonts w:ascii="Arial" w:hAnsi="Arial" w:cs="Arial"/>
+                <w:sz w:val="20"/>
+                <w:szCs w:val="20"/>
+              </w:rPr>
+            </w:pPr>
+            <w:r>
+              <w:rPr>
+                <w:rFonts w:ascii="Arial" w:hAnsi="Arial" w:cs="Arial"/>
+                <w:b/>
+                <w:bCs/>
+                <w:sz w:val="20"/>
+                <w:szCs w:val="20"/>
+              </w:rPr>
+              <w:t>Date tested:</w:t>
+            </w:r>
+            <w:r>
+              <w:rPr>
+                <w:rFonts w:ascii="Arial" w:hAnsi="Arial" w:cs="Arial"/>
+                <w:sz w:val="20"/>
+                <w:szCs w:val="20"/>
+              </w:rPr>
+              <w:t xml:space="preserve"> </w:t>
+            </w:r>
+            <w:r>
+              <w:rPr>
+                <w:rFonts w:ascii="Arial" w:hAnsi="Arial" w:cs="Arial"/>
+                <w:color w:val="C00000"/>
+                <w:sz w:val="20"/>
+                <w:szCs w:val="20"/>
+              </w:rPr>
+              <w:t>&lt;yyyy/mm/dd&gt;</w:t>
+            </w:r>
+          </w:p>
+        </w:tc>
+      </w:tr>
+      <w:tr>
+        <w:trPr>
+          <w:trHeight w:val="350"/>
+        </w:trPr>
+        <w:tc>
+          <w:tcPr>
+            <w:tcW w:w="1250" w:type="dxa"/>
+          </w:tcPr>
+          <w:p>
+            <w:pPr>
+              <w:spacing w:before="80" w:after="80"/>
+              <w:rPr>
+                <w:rFonts w:ascii="Arial" w:hAnsi="Arial" w:cs="Arial"/>
+                <w:b/>
+                <w:bCs/>
+                <w:sz w:val="20"/>
+                <w:szCs w:val="20"/>
+              </w:rPr>
+            </w:pPr>
+            <w:r>
+              <w:rPr>
+                <w:rFonts w:ascii="Arial" w:hAnsi="Arial" w:cs="Arial"/>
+                <w:b/>
+                <w:bCs/>
+                <w:sz w:val="20"/>
+                <w:szCs w:val="20"/>
+              </w:rPr>
+              <w:t>Step</w:t>
+            </w:r>
+          </w:p>
+        </w:tc>
+        <w:tc>
+          <w:tcPr>
+            <w:tcW w:w="3570" w:type="dxa"/>
+          </w:tcPr>
+          <w:p>
+            <w:pPr>
+              <w:spacing w:before="80" w:after="80"/>
+              <w:rPr>
+                <w:rFonts w:ascii="Arial" w:hAnsi="Arial" w:cs="Arial"/>
+                <w:b/>
+                <w:bCs/>
+                <w:sz w:val="20"/>
+                <w:szCs w:val="20"/>
+              </w:rPr>
+            </w:pPr>
+            <w:r>
+              <w:rPr>
+                <w:rFonts w:ascii="Arial" w:hAnsi="Arial" w:cs="Arial"/>
+                <w:b/>
+                <w:bCs/>
+                <w:sz w:val="20"/>
+                <w:szCs w:val="20"/>
+              </w:rPr>
+              <w:t>Action</w:t>
+            </w:r>
+          </w:p>
+        </w:tc>
+        <w:tc>
+          <w:tcPr>
+            <w:tcW w:w="3930" w:type="dxa"/>
+          </w:tcPr>
+          <w:p>
+            <w:pPr>
+              <w:spacing w:before="80" w:after="80"/>
+              <w:rPr>
+                <w:rFonts w:ascii="Arial" w:hAnsi="Arial" w:cs="Arial"/>
+                <w:b/>
+                <w:bCs/>
+                <w:sz w:val="20"/>
+                <w:szCs w:val="20"/>
+              </w:rPr>
+            </w:pPr>
+            <w:r>
+              <w:rPr>
+                <w:rFonts w:ascii="Arial" w:hAnsi="Arial" w:cs="Arial"/>
+                <w:b/>
+                <w:bCs/>
+                <w:sz w:val="20"/>
+                <w:szCs w:val="20"/>
+              </w:rPr>
+              <w:t>Expected results:</w:t>
+            </w:r>
+          </w:p>
+        </w:tc>
+        <w:tc>
+          <w:tcPr>
+            <w:tcW w:w="2148" w:type="dxa"/>
+          </w:tcPr>
+          <w:p>
+            <w:pPr>
+              <w:spacing w:before="80" w:after="80"/>
+              <w:rPr>
+                <w:rFonts w:ascii="Arial" w:hAnsi="Arial" w:cs="Arial"/>
+                <w:b/>
+                <w:bCs/>
+                <w:sz w:val="20"/>
+                <w:szCs w:val="20"/>
+              </w:rPr>
+            </w:pPr>
+            <w:r>
+              <w:rPr>
+                <w:rFonts w:ascii="Arial" w:hAnsi="Arial" w:cs="Arial"/>
+                <w:b/>
+                <w:bCs/>
+                <w:sz w:val="20"/>
+                <w:szCs w:val="20"/>
+              </w:rPr>
+              <w:t>Developer pass/fail</w:t>
+            </w:r>
+          </w:p>
+        </w:tc>
+        <w:tc>
+          <w:tcPr>
+            <w:tcW w:w="2052" w:type="dxa"/>
+          </w:tcPr>
+          <w:p>
+            <w:pPr>
+              <w:spacing w:before="80" w:after="80"/>
+              <w:rPr>
+                <w:rFonts w:ascii="Arial" w:hAnsi="Arial" w:cs="Arial"/>
+                <w:b/>
+                <w:bCs/>
+                <w:sz w:val="20"/>
+                <w:szCs w:val="20"/>
+              </w:rPr>
+            </w:pPr>
+            <w:r>
+              <w:rPr>
+                <w:rFonts w:ascii="Arial" w:hAnsi="Arial" w:cs="Arial"/>
+                <w:b/>
+                <w:bCs/>
+                <w:sz w:val="20"/>
+                <w:szCs w:val="20"/>
+              </w:rPr>
+              <w:t>Tester pass/fail</w:t>
+            </w:r>
+          </w:p>
+        </w:tc>
+      </w:tr>
+      <w:tr>
+        <w:trPr>
+          <w:trHeight w:val="350"/>
+        </w:trPr>
+        <w:tc>
+          <w:tcPr>
+            <w:tcW w:w="1250" w:type="dxa"/>
+          </w:tcPr>
+          <w:p>
+            <w:pPr>
+              <w:spacing w:before="80" w:after="80"/>
+              <w:rPr>
+                <w:rFonts w:ascii="Arial" w:hAnsi="Arial" w:cs="Arial"/>
+                <w:sz w:val="20"/>
+                <w:szCs w:val="20"/>
+              </w:rPr>
+            </w:pPr>
+            <w:r>
+              <w:rPr>
+                <w:rFonts w:ascii="Arial" w:hAnsi="Arial" w:cs="Arial"/>
+                <w:sz w:val="20"/>
+                <w:szCs w:val="20"/>
+              </w:rPr>
+              <w:t>1</w:t>
+            </w:r>
+          </w:p>
+        </w:tc>
+        <w:tc>
+          <w:tcPr>
+            <w:tcW w:w="3570" w:type="dxa"/>
+          </w:tcPr>
+          <w:p>
+            <w:pPr>
+              <w:spacing w:before="80" w:after="80"/>
+              <w:rPr>
+                <w:rFonts w:ascii="Arial" w:hAnsi="Arial" w:cs="Arial"/>
+                <w:color w:val="C00000"/>
+                <w:sz w:val="20"/>
+                <w:szCs w:val="20"/>
+              </w:rPr>
+            </w:pPr>
+            <w:r>
+              <w:rPr>
+                <w:rFonts w:ascii="Arial" w:hAnsi="Arial" w:cs="Arial"/>
+                <w:color w:val="C00000"/>
+                <w:sz w:val="20"/>
+                <w:szCs w:val="20"/>
+              </w:rPr>
+              <w:t>Open the Reservation Lookup page.</w:t>
+            </w:r>
+          </w:p>
+        </w:tc>
+        <w:tc>
+          <w:tcPr>
+            <w:tcW w:w="3930" w:type="dxa"/>
+          </w:tcPr>
+          <w:p>
+            <w:pPr>
+              <w:spacing w:before="80" w:after="80"/>
+              <w:rPr>
+                <w:rFonts w:ascii="Arial" w:hAnsi="Arial" w:cs="Arial"/>
+                <w:color w:val="C00000"/>
+                <w:sz w:val="20"/>
+                <w:szCs w:val="20"/>
+              </w:rPr>
+            </w:pPr>
+            <w:r>
+              <w:rPr>
+                <w:rFonts w:ascii="Arial" w:hAnsi="Arial" w:cs="Arial"/>
+                <w:color w:val="C00000"/>
+                <w:sz w:val="20"/>
+                <w:szCs w:val="20"/>
+              </w:rPr>
+              <w:t>The page loads successfully and displays the reservation ID input field.</w:t>
+            </w:r>
+          </w:p>
+        </w:tc>
+        <w:tc>
+          <w:tcPr>
+            <w:tcW w:w="2148" w:type="dxa"/>
+          </w:tcPr>
+          <w:p>
+            <w:pPr>
+              <w:spacing w:before="80" w:after="80"/>
+              <w:rPr>
+                <w:rFonts w:ascii="Arial" w:hAnsi="Arial" w:cs="Arial"/>
+                <w:color w:val="C00000"/>
+                <w:sz w:val="20"/>
+                <w:szCs w:val="20"/>
+              </w:rPr>
+            </w:pPr>
+            <w:r>
+              <w:rPr>
+                <w:rFonts w:ascii="Arial" w:hAnsi="Arial" w:cs="Arial"/>
+                <w:color w:val="C00000"/>
+                <w:sz w:val="20"/>
+                <w:szCs w:val="20"/>
+              </w:rPr>
+              <w:t>Pass</w:t>
+            </w:r>
+          </w:p>
+        </w:tc>
+        <w:tc>
+          <w:tcPr>
+            <w:tcW w:w="2052" w:type="dxa"/>
+          </w:tcPr>
+          <w:p>
+            <w:pPr>
+              <w:spacing w:before="80" w:after="80"/>
+              <w:rPr>
+                <w:rFonts w:ascii="Arial" w:hAnsi="Arial" w:cs="Arial"/>
+                <w:color w:val="C00000"/>
+                <w:sz w:val="20"/>
+                <w:szCs w:val="20"/>
+              </w:rPr>
+            </w:pPr>
+            <w:r>
+              <w:rPr>
+                <w:rFonts w:ascii="Arial" w:hAnsi="Arial" w:cs="Arial"/>
+                <w:color w:val="C00000"/>
+                <w:sz w:val="20"/>
+                <w:szCs w:val="20"/>
+              </w:rPr>
+              <w:t>Pass</w:t>
+            </w:r>
+          </w:p>
+          <w:p>
+            <w:pPr>
+              <w:spacing w:before="80" w:after="80"/>
+              <w:rPr>
+                <w:rFonts w:ascii="Arial" w:hAnsi="Arial" w:cs="Arial"/>
+                <w:color w:val="C00000"/>
+                <w:sz w:val="20"/>
+                <w:szCs w:val="20"/>
+              </w:rPr>
+            </w:pPr>
+            <w:r>
+              <w:rPr>
+                <w:rFonts w:ascii="Arial" w:hAnsi="Arial" w:cs="Arial"/>
+                <w:color w:val="C00000"/>
+                <w:sz w:val="20"/>
+                <w:szCs w:val="20"/>
+              </w:rPr>
+              <w:drawing>
+                <wp:inline distT="0" distB="0" distL="0" distR="0" wp14:anchorId="0F8766E1" wp14:editId="58826E59">
+                  <wp:extent cx="1169470" cy="1150515"/>
+                  <wp:effectExtent l="0" t="0" r="0" b="0"/>
+                  <wp:docPr id="1644176110" name="Picture 1"/>
+                  <wp:cNvGraphicFramePr>
+                    <a:graphicFrameLocks xmlns:a="http://schemas.openxmlformats.org/drawingml/2006/main" noChangeAspect="1"/>
+                  </wp:cNvGraphicFramePr>
+                  <a:graphic xmlns:a="http://schemas.openxmlformats.org/drawingml/2006/main">
+                    <a:graphicData uri="http://schemas.openxmlformats.org/drawingml/2006/picture">
+                      <pic:pic xmlns:pic="http://schemas.openxmlformats.org/drawingml/2006/picture">
+                        <pic:nvPicPr>
+                          <pic:cNvPr id="694224189" name=""/>
+                          <pic:cNvPicPr/>
+                        </pic:nvPicPr>
+                        <pic:blipFill>
+                          <a:blip r:embed="rId7"/>
+                          <a:stretch>
+                            <a:fillRect/>
+                          </a:stretch>
+                        </pic:blipFill>
+                        <pic:spPr>
+                          <a:xfrm>
+                            <a:off x="0" y="0"/>
+                            <a:ext cx="1180474" cy="1161341"/>
+                          </a:xfrm>
+                          <a:prstGeom prst="rect">
+                            <a:avLst/>
+                          </a:prstGeom>
+                        </pic:spPr>
+                      </pic:pic>
+                    </a:graphicData>
+                  </a:graphic>
+                </wp:inline>
+              </w:drawing>
+            </w:r>
+          </w:p>
+        </w:tc>
+      </w:tr>
+      <w:tr>
+        <w:trPr>
+          <w:trHeight w:val="350"/>
+        </w:trPr>
+        <w:tc>
+          <w:tcPr>
+            <w:tcW w:w="1250" w:type="dxa"/>
+          </w:tcPr>
+          <w:p>
+            <w:pPr>
+              <w:spacing w:before="80" w:after="80"/>
+              <w:rPr>
+                <w:rFonts w:ascii="Arial" w:hAnsi="Arial" w:cs="Arial"/>
+                <w:sz w:val="20"/>
+                <w:szCs w:val="20"/>
+              </w:rPr>
+            </w:pPr>
+            <w:r>
+              <w:rPr>
+                <w:rFonts w:ascii="Arial" w:hAnsi="Arial" w:cs="Arial"/>
+                <w:sz w:val="20"/>
+                <w:szCs w:val="20"/>
+              </w:rPr>
+              <w:t>2</w:t>
+            </w:r>
+          </w:p>
+        </w:tc>
+        <w:tc>
+          <w:tcPr>
+            <w:tcW w:w="3570" w:type="dxa"/>
+          </w:tcPr>
+          <w:p>
+            <w:pPr>
+              <w:spacing w:before="80" w:after="80"/>
+              <w:rPr>
+                <w:rFonts w:ascii="Arial" w:hAnsi="Arial" w:cs="Arial"/>
+                <w:color w:val="C00000"/>
+                <w:sz w:val="20"/>
+                <w:szCs w:val="20"/>
+              </w:rPr>
+            </w:pPr>
+            <w:r>
+              <w:rPr>
+                <w:rFonts w:ascii="Arial" w:hAnsi="Arial" w:cs="Arial"/>
+                <w:color w:val="C00000"/>
+                <w:sz w:val="20"/>
+                <w:szCs w:val="20"/>
+              </w:rPr>
+              <w:t xml:space="preserve">Enter an invalid reservation ID, such as </w:t>
+            </w:r>
+            <w:r>
+              <w:rPr>
+                <w:rFonts w:ascii="Arial" w:hAnsi="Arial" w:cs="Arial"/>
+                <w:color w:val="C00000"/>
+                <w:sz w:val="20"/>
+                <w:szCs w:val="20"/>
+              </w:rPr>
+              <w:t>0000</w:t>
+            </w:r>
+            <w:r>
+              <w:rPr>
+                <w:rFonts w:ascii="Arial" w:hAnsi="Arial" w:cs="Arial"/>
+                <w:color w:val="C00000"/>
+                <w:sz w:val="20"/>
+                <w:szCs w:val="20"/>
+              </w:rPr>
+              <w:t xml:space="preserve"> or another ID not in the database.</w:t>
+            </w:r>
+          </w:p>
+        </w:tc>
+        <w:tc>
+          <w:tcPr>
+            <w:tcW w:w="3930" w:type="dxa"/>
+          </w:tcPr>
+          <w:p>
+            <w:pPr>
+              <w:spacing w:before="80" w:after="80"/>
+              <w:rPr>
+                <w:rFonts w:ascii="Arial" w:hAnsi="Arial" w:cs="Arial"/>
+                <w:color w:val="C00000"/>
+                <w:sz w:val="20"/>
+                <w:szCs w:val="20"/>
+              </w:rPr>
+            </w:pPr>
+            <w:r>
+              <w:rPr>
+                <w:rFonts w:ascii="Arial" w:hAnsi="Arial" w:cs="Arial"/>
+                <w:color w:val="C00000"/>
+                <w:sz w:val="20"/>
+                <w:szCs w:val="20"/>
+              </w:rPr>
+              <w:t>The invalid reservation ID is entered into the field.</w:t>
+            </w:r>
+          </w:p>
+        </w:tc>
+        <w:tc>
+          <w:tcPr>
+            <w:tcW w:w="2148" w:type="dxa"/>
+          </w:tcPr>
+          <w:p>
+            <w:pPr>
+              <w:spacing w:before="80" w:after="80"/>
+              <w:rPr>
+                <w:rFonts w:ascii="Arial" w:hAnsi="Arial" w:cs="Arial"/>
+                <w:color w:val="C00000"/>
+                <w:sz w:val="20"/>
+                <w:szCs w:val="20"/>
+              </w:rPr>
+            </w:pPr>
+            <w:r>
+              <w:rPr>
+                <w:rFonts w:ascii="Arial" w:hAnsi="Arial" w:cs="Arial"/>
+                <w:color w:val="C00000"/>
+                <w:sz w:val="20"/>
+                <w:szCs w:val="20"/>
+              </w:rPr>
+              <w:t>Pass</w:t>
+            </w:r>
+          </w:p>
+        </w:tc>
+        <w:tc>
+          <w:tcPr>
+            <w:tcW w:w="2052" w:type="dxa"/>
+          </w:tcPr>
+          <w:p>
+            <w:pPr>
+              <w:spacing w:before="80" w:after="80"/>
+              <w:rPr>
+                <w:rFonts w:ascii="Arial" w:hAnsi="Arial" w:cs="Arial"/>
+                <w:color w:val="C00000"/>
+                <w:sz w:val="20"/>
+                <w:szCs w:val="20"/>
+              </w:rPr>
+            </w:pPr>
+            <w:r>
+              <w:rPr>
+                <w:rFonts w:ascii="Arial" w:hAnsi="Arial" w:cs="Arial"/>
+                <w:color w:val="C00000"/>
+                <w:sz w:val="20"/>
+                <w:szCs w:val="20"/>
+              </w:rPr>
+              <w:t>Pass</w:t>
+            </w:r>
+          </w:p>
+          <w:p>
+            <w:pPr>
+              <w:spacing w:before="80" w:after="80"/>
+              <w:rPr>
+                <w:rFonts w:ascii="Arial" w:hAnsi="Arial" w:cs="Arial"/>
+                <w:color w:val="C00000"/>
+                <w:sz w:val="20"/>
+                <w:szCs w:val="20"/>
+              </w:rPr>
+            </w:pPr>
+            <w:r>
+              <w:rPr>
+                <w:rFonts w:ascii="Arial" w:hAnsi="Arial" w:cs="Arial"/>
+                <w:color w:val="C00000"/>
+                <w:sz w:val="20"/>
+                <w:szCs w:val="20"/>
+              </w:rPr>
+              <w:drawing>
+                <wp:inline distT="0" distB="0" distL="0" distR="0" wp14:anchorId="29B5A42F" wp14:editId="6E96FC3C">
+                  <wp:extent cx="1394460" cy="1545859"/>
+                  <wp:effectExtent l="0" t="0" r="0" b="0"/>
+                  <wp:docPr id="1677579453" name="Picture 1"/>
+                  <wp:cNvGraphicFramePr>
+                    <a:graphicFrameLocks xmlns:a="http://schemas.openxmlformats.org/drawingml/2006/main" noChangeAspect="1"/>
+                  </wp:cNvGraphicFramePr>
+                  <a:graphic xmlns:a="http://schemas.openxmlformats.org/drawingml/2006/main">
+                    <a:graphicData uri="http://schemas.openxmlformats.org/drawingml/2006/picture">
+                      <pic:pic xmlns:pic="http://schemas.openxmlformats.org/drawingml/2006/picture">
+                        <pic:nvPicPr>
+                          <pic:cNvPr id="1677579453" name=""/>
+                          <pic:cNvPicPr/>
+                        </pic:nvPicPr>
+                        <pic:blipFill>
+                          <a:blip r:embed="rId11"/>
+                          <a:stretch>
+                            <a:fillRect/>
+                          </a:stretch>
+                        </pic:blipFill>
+                        <pic:spPr>
+                          <a:xfrm>
+                            <a:off x="0" y="0"/>
+                            <a:ext cx="1397772" cy="1549531"/>
+                          </a:xfrm>
+                          <a:prstGeom prst="rect">
+                            <a:avLst/>
+                          </a:prstGeom>
+                        </pic:spPr>
+                      </pic:pic>
+                    </a:graphicData>
+                  </a:graphic>
+                </wp:inline>
+              </w:drawing>
+            </w:r>
+          </w:p>
+        </w:tc>
+      </w:tr>
+      <w:tr>
+        <w:trPr>
+          <w:trHeight w:val="350"/>
+        </w:trPr>
+        <w:tc>
+          <w:tcPr>
+            <w:tcW w:w="1250" w:type="dxa"/>
+          </w:tcPr>
+          <w:p>
+            <w:pPr>
+              <w:spacing w:before="80" w:after="80"/>
+              <w:rPr>
+                <w:rFonts w:ascii="Arial" w:hAnsi="Arial" w:cs="Arial"/>
+                <w:sz w:val="20"/>
+                <w:szCs w:val="20"/>
+              </w:rPr>
+            </w:pPr>
+            <w:r>
+              <w:rPr>
+                <w:rFonts w:ascii="Arial" w:hAnsi="Arial" w:cs="Arial"/>
+                <w:sz w:val="20"/>
+                <w:szCs w:val="20"/>
+              </w:rPr>
+              <w:lastRenderedPageBreak/>
+              <w:t>3</w:t>
+            </w:r>
+          </w:p>
+        </w:tc>
+        <w:tc>
+          <w:tcPr>
+            <w:tcW w:w="3570" w:type="dxa"/>
+          </w:tcPr>
+          <w:p>
+            <w:pPr>
+              <w:spacing w:before="80" w:after="80"/>
+              <w:rPr>
+                <w:rFonts w:ascii="Arial" w:hAnsi="Arial" w:cs="Arial"/>
+                <w:color w:val="C00000"/>
+                <w:sz w:val="20"/>
+                <w:szCs w:val="20"/>
+              </w:rPr>
+            </w:pPr>
+            <w:r>
+              <w:rPr>
+                <w:rFonts w:ascii="Arial" w:hAnsi="Arial" w:cs="Arial"/>
+                <w:color w:val="C00000"/>
+                <w:sz w:val="20"/>
+                <w:szCs w:val="20"/>
+              </w:rPr>
+              <w:t>Click the Lookup/Search button.</w:t>
+            </w:r>
+          </w:p>
+        </w:tc>
+        <w:tc>
+          <w:tcPr>
+            <w:tcW w:w="3930" w:type="dxa"/>
+          </w:tcPr>
+          <w:p>
+            <w:pPr>
+              <w:spacing w:before="80" w:after="80"/>
+              <w:rPr>
+                <w:rFonts w:ascii="Arial" w:hAnsi="Arial" w:cs="Arial"/>
+                <w:color w:val="C00000"/>
+                <w:sz w:val="20"/>
+                <w:szCs w:val="20"/>
+              </w:rPr>
+            </w:pPr>
+            <w:r>
+              <w:rPr>
+                <w:rFonts w:ascii="Arial" w:hAnsi="Arial" w:cs="Arial"/>
+                <w:color w:val="C00000"/>
+                <w:sz w:val="20"/>
+                <w:szCs w:val="20"/>
+              </w:rPr>
+              <w:t>The system searches the database for the reservation ID.</w:t>
+            </w:r>
+          </w:p>
+        </w:tc>
+        <w:tc>
+          <w:tcPr>
+            <w:tcW w:w="2148" w:type="dxa"/>
+          </w:tcPr>
+          <w:p>
+            <w:pPr>
+              <w:spacing w:before="80" w:after="80"/>
+              <w:rPr>
+                <w:rFonts w:ascii="Arial" w:hAnsi="Arial" w:cs="Arial"/>
+                <w:color w:val="C00000"/>
+                <w:sz w:val="20"/>
+                <w:szCs w:val="20"/>
+              </w:rPr>
+            </w:pPr>
+            <w:r>
+              <w:rPr>
+                <w:rFonts w:ascii="Arial" w:hAnsi="Arial" w:cs="Arial"/>
+                <w:color w:val="C00000"/>
+                <w:sz w:val="20"/>
+                <w:szCs w:val="20"/>
+              </w:rPr>
+              <w:t>Pass</w:t>
+            </w:r>
+          </w:p>
+        </w:tc>
+        <w:tc>
+          <w:tcPr>
+            <w:tcW w:w="2052" w:type="dxa"/>
+          </w:tcPr>
+          <w:p>
+            <w:pPr>
+              <w:spacing w:before="80" w:after="80"/>
+              <w:rPr>
+                <w:rFonts w:ascii="Arial" w:hAnsi="Arial" w:cs="Arial"/>
+                <w:color w:val="C00000"/>
+                <w:sz w:val="20"/>
+                <w:szCs w:val="20"/>
+              </w:rPr>
+            </w:pPr>
+            <w:r>
+              <w:rPr>
+                <w:rFonts w:ascii="Arial" w:hAnsi="Arial" w:cs="Arial"/>
+                <w:color w:val="C00000"/>
+                <w:sz w:val="20"/>
+                <w:szCs w:val="20"/>
+              </w:rPr>
+              <w:t>Pass</w:t>
+            </w:r>
+          </w:p>
+          <w:p>
+            <w:pPr>
+              <w:spacing w:before="80" w:after="80"/>
+              <w:rPr>
+                <w:rFonts w:ascii="Arial" w:hAnsi="Arial" w:cs="Arial"/>
+                <w:color w:val="C00000"/>
+                <w:sz w:val="20"/>
+                <w:szCs w:val="20"/>
+              </w:rPr>
+            </w:pPr>
+            <w:r>
+              <w:rPr>
+                <w:rFonts w:ascii="Arial" w:hAnsi="Arial" w:cs="Arial"/>
+                <w:color w:val="C00000"/>
+                <w:sz w:val="20"/>
+                <w:szCs w:val="20"/>
+              </w:rPr>
+              <w:drawing>
+                <wp:inline distT="0" distB="0" distL="0" distR="0" wp14:anchorId="3546FC69" wp14:editId="37ECAF95">
+                  <wp:extent cx="1440180" cy="1701287"/>
+                  <wp:effectExtent l="0" t="0" r="7620" b="0"/>
+                  <wp:docPr id="796016770" name="Picture 1"/>
+                  <wp:cNvGraphicFramePr>
+                    <a:graphicFrameLocks xmlns:a="http://schemas.openxmlformats.org/drawingml/2006/main" noChangeAspect="1"/>
+                  </wp:cNvGraphicFramePr>
+                  <a:graphic xmlns:a="http://schemas.openxmlformats.org/drawingml/2006/main">
+                    <a:graphicData uri="http://schemas.openxmlformats.org/drawingml/2006/picture">
+                      <pic:pic xmlns:pic="http://schemas.openxmlformats.org/drawingml/2006/picture">
+                        <pic:nvPicPr>
+                          <pic:cNvPr id="796016770" name=""/>
+                          <pic:cNvPicPr/>
+                        </pic:nvPicPr>
+                        <pic:blipFill>
+                          <a:blip r:embed="rId12"/>
+                          <a:stretch>
+                            <a:fillRect/>
+                          </a:stretch>
+                        </pic:blipFill>
+                        <pic:spPr>
+                          <a:xfrm>
+                            <a:off x="0" y="0"/>
+                            <a:ext cx="1453231" cy="1716704"/>
+                          </a:xfrm>
+                          <a:prstGeom prst="rect">
+                            <a:avLst/>
+                          </a:prstGeom>
+                        </pic:spPr>
+                      </pic:pic>
+                    </a:graphicData>
+                  </a:graphic>
+                </wp:inline>
+              </w:drawing>
+            </w:r>
+          </w:p>
+        </w:tc>
+      </w:tr>
+      <w:tr>
+        <w:trPr>
+          <w:trHeight w:val="350"/>
+        </w:trPr>
+        <w:tc>
+          <w:tcPr>
+            <w:tcW w:w="1250" w:type="dxa"/>
+          </w:tcPr>
+          <w:p>
+            <w:pPr>
+              <w:spacing w:before="80" w:after="80"/>
+              <w:rPr>
+                <w:rFonts w:ascii="Arial" w:hAnsi="Arial" w:cs="Arial"/>
+                <w:sz w:val="20"/>
+                <w:szCs w:val="20"/>
+              </w:rPr>
+            </w:pPr>
+            <w:r>
+              <w:rPr>
+                <w:rFonts w:ascii="Arial" w:hAnsi="Arial" w:cs="Arial"/>
+                <w:sz w:val="20"/>
+                <w:szCs w:val="20"/>
+              </w:rPr>
+              <w:t>4</w:t>
+            </w:r>
+          </w:p>
+        </w:tc>
+        <w:tc>
+          <w:tcPr>
+            <w:tcW w:w="3570" w:type="dxa"/>
+          </w:tcPr>
+          <w:p>
+            <w:pPr>
+              <w:spacing w:before="80" w:after="80"/>
+              <w:rPr>
+                <w:rFonts w:ascii="Arial" w:hAnsi="Arial" w:cs="Arial"/>
+                <w:color w:val="C00000"/>
+                <w:sz w:val="20"/>
+                <w:szCs w:val="20"/>
+              </w:rPr>
+            </w:pPr>
+            <w:r>
+              <w:rPr>
+                <w:rFonts w:ascii="Arial" w:hAnsi="Arial" w:cs="Arial"/>
+                <w:color w:val="C00000"/>
+                <w:sz w:val="20"/>
+                <w:szCs w:val="20"/>
+              </w:rPr>
+              <w:t>Review the result message.</w:t>
+            </w:r>
+          </w:p>
+        </w:tc>
+        <w:tc>
+          <w:tcPr>
+            <w:tcW w:w="3930" w:type="dxa"/>
+          </w:tcPr>
+          <w:p>
+            <w:pPr>
+              <w:spacing w:before="80" w:after="80"/>
+              <w:rPr>
+                <w:rFonts w:ascii="Arial" w:hAnsi="Arial" w:cs="Arial"/>
+                <w:color w:val="C00000"/>
+                <w:sz w:val="20"/>
+                <w:szCs w:val="20"/>
+              </w:rPr>
+            </w:pPr>
+            <w:r>
+              <w:rPr>
+                <w:rFonts w:ascii="Arial" w:hAnsi="Arial" w:cs="Arial"/>
+                <w:color w:val="C00000"/>
+                <w:sz w:val="20"/>
+                <w:szCs w:val="20"/>
+              </w:rPr>
+              <w:t>The page displays a message saying the reservation was not found.</w:t>
+            </w:r>
+          </w:p>
+        </w:tc>
+        <w:tc>
+          <w:tcPr>
+            <w:tcW w:w="2148" w:type="dxa"/>
+          </w:tcPr>
+          <w:p>
+            <w:pPr>
+              <w:spacing w:before="80" w:after="80"/>
+              <w:rPr>
+                <w:rFonts w:ascii="Arial" w:hAnsi="Arial" w:cs="Arial"/>
+                <w:color w:val="C00000"/>
+                <w:sz w:val="20"/>
+                <w:szCs w:val="20"/>
+              </w:rPr>
+            </w:pPr>
+            <w:r>
+              <w:rPr>
+                <w:rFonts w:ascii="Arial" w:hAnsi="Arial" w:cs="Arial"/>
+                <w:color w:val="C00000"/>
+                <w:sz w:val="20"/>
+                <w:szCs w:val="20"/>
+              </w:rPr>
+              <w:t>Pass</w:t>
+            </w:r>
+          </w:p>
+        </w:tc>
+        <w:tc>
+          <w:tcPr>
+            <w:tcW w:w="2052" w:type="dxa"/>
+          </w:tcPr>
+          <w:p>
+            <w:pPr>
+              <w:spacing w:before="80" w:after="80"/>
+              <w:rPr>
+                <w:rFonts w:ascii="Arial" w:hAnsi="Arial" w:cs="Arial"/>
+                <w:color w:val="C00000"/>
+                <w:sz w:val="20"/>
+                <w:szCs w:val="20"/>
+              </w:rPr>
+            </w:pPr>
+            <w:r>
+              <w:rPr>
+                <w:rFonts w:ascii="Arial" w:hAnsi="Arial" w:cs="Arial"/>
+                <w:color w:val="C00000"/>
+                <w:sz w:val="20"/>
+                <w:szCs w:val="20"/>
+              </w:rPr>
+              <w:t>Pass</w:t>
+            </w:r>
+          </w:p>
+          <w:p>
+            <w:pPr>
+              <w:spacing w:before="80" w:after="80"/>
+              <w:rPr>
+                <w:rFonts w:ascii="Arial" w:hAnsi="Arial" w:cs="Arial"/>
+                <w:color w:val="C00000"/>
+                <w:sz w:val="20"/>
+                <w:szCs w:val="20"/>
+              </w:rPr>
+            </w:pPr>
+            <w:r>
+              <w:rPr>
+                <w:rFonts w:ascii="Arial" w:hAnsi="Arial" w:cs="Arial"/>
+                <w:color w:val="C00000"/>
+                <w:sz w:val="20"/>
+                <w:szCs w:val="20"/>
+              </w:rPr>
+              <w:drawing>
+                <wp:inline distT="0" distB="0" distL="0" distR="0" wp14:anchorId="5BD0386E" wp14:editId="5E11B6B7">
+                  <wp:extent cx="1440180" cy="1701287"/>
+                  <wp:effectExtent l="0" t="0" r="7620" b="0"/>
+                  <wp:docPr id="122525001" name="Picture 1"/>
+                  <wp:cNvGraphicFramePr>
+                    <a:graphicFrameLocks xmlns:a="http://schemas.openxmlformats.org/drawingml/2006/main" noChangeAspect="1"/>
+                  </wp:cNvGraphicFramePr>
+                  <a:graphic xmlns:a="http://schemas.openxmlformats.org/drawingml/2006/main">
+                    <a:graphicData uri="http://schemas.openxmlformats.org/drawingml/2006/picture">
+                      <pic:pic xmlns:pic="http://schemas.openxmlformats.org/drawingml/2006/picture">
+                        <pic:nvPicPr>
+                          <pic:cNvPr id="796016770" name=""/>
+                          <pic:cNvPicPr/>
+                        </pic:nvPicPr>
+                        <pic:blipFill>
+                          <a:blip r:embed="rId12"/>
+                          <a:stretch>
+                            <a:fillRect/>
+                          </a:stretch>
+                        </pic:blipFill>
+                        <pic:spPr>
+                          <a:xfrm>
+                            <a:off x="0" y="0"/>
+                            <a:ext cx="1453231" cy="1716704"/>
+                          </a:xfrm>
+                          <a:prstGeom prst="rect">
+                            <a:avLst/>
+                          </a:prstGeom>
+                        </pic:spPr>
+                      </pic:pic>
+                    </a:graphicData>
+                  </a:graphic>
+                </wp:inline>
+              </w:drawing>
+            </w:r>
+          </w:p>
+        </w:tc>
+      </w:tr>
+      <w:tr>
+        <w:trPr>
+          <w:trHeight w:val="350"/>
+        </w:trPr>
+        <w:tc>
+          <w:tcPr>
+            <w:tcW w:w="1250" w:type="dxa"/>
+          </w:tcPr>
+          <w:p>
+            <w:pPr>
+              <w:spacing w:before="80" w:after="80"/>
+              <w:rPr>
+                <w:rFonts w:ascii="Arial" w:hAnsi="Arial" w:cs="Arial"/>
+                <w:sz w:val="20"/>
+                <w:szCs w:val="20"/>
+              </w:rPr>
+            </w:pPr>
+            <w:r>
+              <w:rPr>
+                <w:rFonts w:ascii="Arial" w:hAnsi="Arial" w:cs="Arial"/>
+                <w:sz w:val="20"/>
+                <w:szCs w:val="20"/>
+              </w:rPr>
+              <w:t>5</w:t>
+            </w:r>
+          </w:p>
+        </w:tc>
+        <w:tc>
+          <w:tcPr>
+            <w:tcW w:w="3570" w:type="dxa"/>
+          </w:tcPr>
+          <w:p>
+            <w:pPr>
+              <w:spacing w:before="80" w:after="80"/>
+              <w:rPr>
+                <w:rFonts w:ascii="Arial" w:hAnsi="Arial" w:cs="Arial"/>
+                <w:color w:val="C00000"/>
+                <w:sz w:val="20"/>
+                <w:szCs w:val="20"/>
+              </w:rPr>
+            </w:pPr>
+            <w:r>
+              <w:rPr>
+                <w:rFonts w:ascii="Arial" w:hAnsi="Arial" w:cs="Arial"/>
+                <w:color w:val="C00000"/>
+                <w:sz w:val="20"/>
+                <w:szCs w:val="20"/>
+              </w:rPr>
+              <w:t>Enter another reservation ID to test again.</w:t>
+            </w:r>
+          </w:p>
+        </w:tc>
+        <w:tc>
+          <w:tcPr>
+            <w:tcW w:w="3930" w:type="dxa"/>
+          </w:tcPr>
+          <w:p>
+            <w:pPr>
+              <w:spacing w:before="80" w:after="80"/>
+              <w:rPr>
+                <w:rFonts w:ascii="Arial" w:hAnsi="Arial" w:cs="Arial"/>
+                <w:color w:val="C00000"/>
+                <w:sz w:val="20"/>
+                <w:szCs w:val="20"/>
+              </w:rPr>
+            </w:pPr>
+            <w:r>
+              <w:rPr>
+                <w:rFonts w:ascii="Arial" w:hAnsi="Arial" w:cs="Arial"/>
+                <w:color w:val="C00000"/>
+                <w:sz w:val="20"/>
+                <w:szCs w:val="20"/>
+              </w:rPr>
+              <w:t>The page allows another lookup without crashing or redirecting incorrectly.</w:t>
+            </w:r>
+          </w:p>
+        </w:tc>
+        <w:tc>
+          <w:tcPr>
+            <w:tcW w:w="2148" w:type="dxa"/>
+          </w:tcPr>
+          <w:p>
+            <w:pPr>
+              <w:spacing w:before="80" w:after="80"/>
+              <w:rPr>
+                <w:rFonts w:ascii="Arial" w:hAnsi="Arial" w:cs="Arial"/>
+                <w:color w:val="C00000"/>
+                <w:sz w:val="20"/>
+                <w:szCs w:val="20"/>
+              </w:rPr>
+            </w:pPr>
+            <w:r>
+              <w:rPr>
+                <w:rFonts w:ascii="Arial" w:hAnsi="Arial" w:cs="Arial"/>
+                <w:color w:val="C00000"/>
+                <w:sz w:val="20"/>
+                <w:szCs w:val="20"/>
+              </w:rPr>
+              <w:t>Pass</w:t>
+            </w:r>
+          </w:p>
+        </w:tc>
+        <w:tc>
+          <w:tcPr>
+            <w:tcW w:w="2052" w:type="dxa"/>
+          </w:tcPr>
+          <w:p>
+            <w:pPr>
+              <w:spacing w:before="80" w:after="80"/>
+              <w:rPr>
+                <w:rFonts w:ascii="Arial" w:hAnsi="Arial" w:cs="Arial"/>
+                <w:color w:val="C00000"/>
+                <w:sz w:val="20"/>
+                <w:szCs w:val="20"/>
+              </w:rPr>
+            </w:pPr>
+            <w:r>
+              <w:rPr>
+                <w:rFonts w:ascii="Arial" w:hAnsi="Arial" w:cs="Arial"/>
+                <w:color w:val="C00000"/>
+                <w:sz w:val="20"/>
+                <w:szCs w:val="20"/>
+              </w:rPr>
+              <w:t>Pass</w:t>
+            </w:r>
+          </w:p>
+          <w:p>
+            <w:pPr>
+              <w:spacing w:before="80" w:after="80"/>
+              <w:rPr>
+                <w:rFonts w:ascii="Arial" w:hAnsi="Arial" w:cs="Arial"/>
+                <w:color w:val="C00000"/>
+                <w:sz w:val="20"/>
+                <w:szCs w:val="20"/>
+              </w:rPr>
+            </w:pPr>
+            <w:r>
+              <w:rPr>
+                <w:rFonts w:ascii="Arial" w:hAnsi="Arial" w:cs="Arial"/>
+                <w:color w:val="C00000"/>
+                <w:sz w:val="20"/>
+                <w:szCs w:val="20"/>
+              </w:rPr>
+              <w:lastRenderedPageBreak/>
+              <w:drawing>
+                <wp:inline distT="0" distB="0" distL="0" distR="0" wp14:anchorId="463E83AA" wp14:editId="674DE3ED">
+                  <wp:extent cx="1440180" cy="1701287"/>
+                  <wp:effectExtent l="0" t="0" r="7620" b="0"/>
+                  <wp:docPr id="99496648" name="Picture 1"/>
+                  <wp:cNvGraphicFramePr>
+                    <a:graphicFrameLocks xmlns:a="http://schemas.openxmlformats.org/drawingml/2006/main" noChangeAspect="1"/>
+                  </wp:cNvGraphicFramePr>
+                  <a:graphic xmlns:a="http://schemas.openxmlformats.org/drawingml/2006/main">
+                    <a:graphicData uri="http://schemas.openxmlformats.org/drawingml/2006/picture">
+                      <pic:pic xmlns:pic="http://schemas.openxmlformats.org/drawingml/2006/picture">
+                        <pic:nvPicPr>
+                          <pic:cNvPr id="796016770" name=""/>
+                          <pic:cNvPicPr/>
+                        </pic:nvPicPr>
+                        <pic:blipFill>
+                          <a:blip r:embed="rId12"/>
+                          <a:stretch>
+                            <a:fillRect/>
+                          </a:stretch>
+                        </pic:blipFill>
+                        <pic:spPr>
+                          <a:xfrm>
+                            <a:off x="0" y="0"/>
+                            <a:ext cx="1453231" cy="1716704"/>
+                          </a:xfrm>
+                          <a:prstGeom prst="rect">
+                            <a:avLst/>
+                          </a:prstGeom>
+                        </pic:spPr>
+                      </pic:pic>
+                    </a:graphicData>
+                  </a:graphic>
+                </wp:inline>
+              </w:drawing>
+            </w:r>
+          </w:p>
+        </w:tc>
+      </w:tr>
+      <w:tr>
+        <w:trPr>
+          <w:trHeight w:val="350"/>
+        </w:trPr>
+        <w:tc>
+          <w:tcPr>
+            <w:tcW w:w="1250" w:type="dxa"/>
+          </w:tcPr>
+          <w:p>
+            <w:pPr>
+              <w:spacing w:before="80" w:after="80"/>
+              <w:rPr>
+                <w:rFonts w:ascii="Arial" w:hAnsi="Arial" w:cs="Arial"/>
+                <w:b/>
+                <w:bCs/>
+                <w:sz w:val="20"/>
+                <w:szCs w:val="20"/>
+              </w:rPr>
+            </w:pPr>
+            <w:r>
+              <w:rPr>
+                <w:rFonts w:ascii="Arial" w:hAnsi="Arial" w:cs="Arial"/>
+                <w:b/>
+                <w:bCs/>
+                <w:sz w:val="20"/>
+                <w:szCs w:val="20"/>
+              </w:rPr>
+              <w:lastRenderedPageBreak/>
+              <w:t>Comments</w:t>
+            </w:r>
+          </w:p>
+        </w:tc>
+        <w:tc>
+          <w:tcPr>
+            <w:tcW w:w="11700" w:type="dxa"/>
+            <w:gridSpan w:val="4"/>
+          </w:tcPr>
+          <w:p>
+            <w:pPr>
+              <w:spacing w:before="80" w:after="80"/>
+              <w:rPr>
+                <w:rFonts w:ascii="Arial" w:hAnsi="Arial" w:cs="Arial"/>
+                <w:color w:val="C00000"/>
+                <w:sz w:val="20"/>
+                <w:szCs w:val="20"/>
+              </w:rPr>
+            </w:pPr>
+            <w:r>
+              <w:rPr>
+                <w:rFonts w:ascii="Arial" w:hAnsi="Arial" w:cs="Arial"/>
+                <w:color w:val="C00000"/>
+                <w:sz w:val="20"/>
+                <w:szCs w:val="20"/>
+              </w:rPr>
+              <w:t>The invalid reservation lookup test passed successfully. When a reservation ID that does not exist was entered, the system did not display incorrect reservation information. Instead, it showed a clear not found message, which helps the user understand that the reservation could not be located.</w:t>
             </w:r>
           </w:p>
         </w:tc>
@@ -1848,7 +3385,7 @@
                 <w:sz w:val="24"/>
                 <w:szCs w:val="24"/>
               </w:rPr>
-              <w:t>2</w:t>
+              <w:t>3</w:t>
             </w:r>
           </w:p>
         </w:tc>
@@ -1866,6 +3403,7 @@
                 <w:bCs/>
               </w:rPr>
             </w:pPr>
+            <w:bookmarkStart w:id="0" w:name="_Toc132718197"/>
             <w:r>
               <w:rPr>
                 <w:rFonts w:ascii="Arial" w:hAnsi="Arial" w:cs="Arial"/>
@@ -1873,28 +3411,9 @@
                 <w:bCs/>
                 <w:color w:val="auto"/>
               </w:rPr>
-              <w:t xml:space="preserve">Reservation Lookup </w:t>
-            </w:r>
-            <w:proofErr w:type="gramStart"/>
-            <w:r>
-              <w:rPr>
-                <w:rFonts w:ascii="Arial" w:hAnsi="Arial" w:cs="Arial"/>
-                <w:b/>
-                <w:bCs/>
-                <w:color w:val="auto"/>
-              </w:rPr>
-              <w:t>With</w:t>
-            </w:r>
-            <w:proofErr w:type="gramEnd"/>
-            <w:r>
-              <w:rPr>
-                <w:rFonts w:ascii="Arial" w:hAnsi="Arial" w:cs="Arial"/>
-                <w:b/>
-                <w:bCs/>
-                <w:color w:val="auto"/>
-              </w:rPr>
-              <w:t xml:space="preserve"> Invalid Reservation ID</w:t>
-            </w:r>
+              <w:t>&lt;DESCRIPTION&gt;</w:t>
+            </w:r>
+            <w:bookmarkEnd w:id="0"/>
           </w:p>
         </w:tc>
       </w:tr>
@@ -1950,15 +3469,6 @@
               </w:rPr>
               <w:t xml:space="preserve">: </w:t>
             </w:r>
-            <w:r>
-              <w:rPr>
-                <w:rFonts w:ascii="Arial" w:hAnsi="Arial" w:cs="Arial"/>
-                <w:color w:val="EE0000"/>
-                <w:sz w:val="20"/>
-                <w:szCs w:val="20"/>
-              </w:rPr>
-              <w:t>Verifies that the system displays an error or not found message when a user enters a reservation ID that does not exist.</w:t>
-            </w:r>
           </w:p>
         </w:tc>
         <w:tc>
@@ -1975,8 +3485,6 @@
                 <w:szCs w:val="20"/>
               </w:rPr>
             </w:pPr>
-            <w:proofErr w:type="spellStart"/>
-            <w:proofErr w:type="gramStart"/>
             <w:r>
               <w:rPr>
                 <w:rFonts w:ascii="Arial" w:hAnsi="Arial" w:cs="Arial"/>
@@ -1987,28 +3495,6 @@
               </w:rPr>
               <w:t>Developer:</w:t>
             </w:r>
-            <w:r>
-              <w:rPr>
-                <w:rFonts w:ascii="Arial" w:hAnsi="Arial" w:cs="Arial"/>
-                <w:b/>
-                <w:bCs/>
-                <w:sz w:val="20"/>
-                <w:szCs w:val="20"/>
-              </w:rPr>
-              <w:t>Angela</w:t>
-            </w:r>
-            <w:proofErr w:type="spellEnd"/>
-            <w:proofErr w:type="gramEnd"/>
-            <w:r>
-              <w:rPr>
-                <w:rFonts w:ascii="Arial" w:hAnsi="Arial" w:cs="Arial"/>
-                <w:b/>
-                <w:bCs/>
-                <w:sz w:val="20"/>
-                <w:szCs w:val="20"/>
-              </w:rPr>
-              <w:t xml:space="preserve"> V</w:t>
-            </w:r>
           </w:p>
           <w:p>
             <w:pPr>
@@ -2043,16 +3529,7 @@
                 <w:sz w:val="20"/>
                 <w:szCs w:val="20"/>
               </w:rPr>
-              <w:t>04/29/2026</w:t>
-            </w:r>
-            <w:r>
-              <w:rPr>
-                <w:rFonts w:ascii="Arial" w:hAnsi="Arial" w:cs="Arial"/>
-                <w:color w:val="C00000"/>
-                <w:sz w:val="20"/>
-                <w:szCs w:val="20"/>
-              </w:rPr>
-              <w:t xml:space="preserve"> </w:t>
+              <w:t xml:space="preserve">&lt;yyyy/mm/dd&gt; </w:t>
             </w:r>
           </w:p>
         </w:tc>
@@ -2115,27 +3592,7 @@
                 <w:sz w:val="20"/>
                 <w:szCs w:val="20"/>
               </w:rPr>
-              <w:t>&lt;</w:t>
-            </w:r>
-            <w:proofErr w:type="spellStart"/>
-            <w:r>
-              <w:rPr>
-                <w:rFonts w:ascii="Arial" w:hAnsi="Arial" w:cs="Arial"/>
-                <w:color w:val="C00000"/>
-                <w:sz w:val="20"/>
-                <w:szCs w:val="20"/>
-              </w:rPr>
-              <w:t>yyyy</w:t>
-            </w:r>
-            <w:proofErr w:type="spellEnd"/>
-            <w:r>
-              <w:rPr>
-                <w:rFonts w:ascii="Arial" w:hAnsi="Arial" w:cs="Arial"/>
-                <w:color w:val="C00000"/>
-                <w:sz w:val="20"/>
-                <w:szCs w:val="20"/>
-              </w:rPr>
-              <w:t>/mm/dd&gt;</w:t>
+              <w:t>&lt;yyyy/mm/dd&gt;</w:t>
             </w:r>
           </w:p>
         </w:tc>
@@ -2328,7 +3785,7 @@
                 <w:sz w:val="20"/>
                 <w:szCs w:val="20"/>
               </w:rPr>
-              <w:t>Open the Reservation Lookup page.</w:t>
+              <w:t>&lt;Enter an action&gt;</w:t>
             </w:r>
           </w:p>
         </w:tc>
@@ -2353,7 +3810,7 @@
                 <w:sz w:val="20"/>
                 <w:szCs w:val="20"/>
               </w:rPr>
-              <w:t>The page loads successfully and displays the reservation ID input field.</w:t>
+              <w:t>&lt;Enter the expected results&gt;</w:t>
             </w:r>
           </w:p>
         </w:tc>
@@ -2378,7 +3835,7 @@
                 <w:sz w:val="20"/>
                 <w:szCs w:val="20"/>
               </w:rPr>
-              <w:t>Pass</w:t>
+              <w:t>&lt;yes/no&gt;</w:t>
             </w:r>
           </w:p>
         </w:tc>
@@ -2456,25 +3913,7 @@
                 <w:sz w:val="20"/>
                 <w:szCs w:val="20"/>
               </w:rPr>
-              <w:t xml:space="preserve">Enter an invalid reservation ID, such as </w:t>
-            </w:r>
-            <w:r>
-              <w:rPr>
-                <w:rFonts w:ascii="Arial" w:hAnsi="Arial" w:cs="Arial"/>
-                <w:color w:val="C00000"/>
-                <w:sz w:val="20"/>
-                <w:szCs w:val="20"/>
-              </w:rPr>
-              <w:t>0000</w:t>
-            </w:r>
-            <w:r>
-              <w:rPr>
-                <w:rFonts w:ascii="Arial" w:hAnsi="Arial" w:cs="Arial"/>
-                <w:color w:val="C00000"/>
-                <w:sz w:val="20"/>
-                <w:szCs w:val="20"/>
-              </w:rPr>
-              <w:t xml:space="preserve"> or another ID not in the database.</w:t>
+              <w:t>&lt;Enter an action&gt;</w:t>
             </w:r>
           </w:p>
         </w:tc>
@@ -2499,7 +3938,7 @@
                 <w:sz w:val="20"/>
                 <w:szCs w:val="20"/>
               </w:rPr>
-              <w:t>The invalid reservation ID is entered into the field.</w:t>
+              <w:t>&lt;Enter the expected results&gt;</w:t>
             </w:r>
           </w:p>
         </w:tc>
@@ -2524,7 +3963,7 @@
                 <w:sz w:val="20"/>
                 <w:szCs w:val="20"/>
               </w:rPr>
-              <w:t>Pass</w:t>
+              <w:t>&lt;yes/no&gt;</w:t>
             </w:r>
           </w:p>
         </w:tc>
@@ -2602,7 +4041,7 @@
                 <w:sz w:val="20"/>
                 <w:szCs w:val="20"/>
               </w:rPr>
-              <w:t>Click the Lookup/Search button.</w:t>
+              <w:t>&lt;Enter an action&gt;</w:t>
             </w:r>
           </w:p>
         </w:tc>
@@ -2627,7 +4066,7 @@
                 <w:sz w:val="20"/>
                 <w:szCs w:val="20"/>
               </w:rPr>
-              <w:t>The system searches the database for the reservation ID.</w:t>
+              <w:t>&lt;Enter the expected results&gt;</w:t>
             </w:r>
           </w:p>
         </w:tc>
@@ -2652,7 +4091,7 @@
                 <w:sz w:val="20"/>
                 <w:szCs w:val="20"/>
               </w:rPr>
-              <w:t>Pass</w:t>
+              <w:t>&lt;yes/no&gt;</w:t>
             </w:r>
           </w:p>
         </w:tc>
@@ -2730,7 +4169,7 @@
                 <w:sz w:val="20"/>
                 <w:szCs w:val="20"/>
               </w:rPr>
-              <w:t>Review the result message.</w:t>
+              <w:t>&lt;Enter an action&gt;</w:t>
             </w:r>
           </w:p>
         </w:tc>
@@ -2755,7 +4194,7 @@
                 <w:sz w:val="20"/>
                 <w:szCs w:val="20"/>
               </w:rPr>
-              <w:t>The page displays a message saying the reservation was not found.</w:t>
+              <w:t>&lt;Enter the expected results&gt;</w:t>
             </w:r>
           </w:p>
         </w:tc>
@@ -2780,7 +4219,7 @@
                 <w:sz w:val="20"/>
                 <w:szCs w:val="20"/>
               </w:rPr>
-              <w:t>Pass</w:t>
+              <w:t>&lt;yes/no&gt;</w:t>
             </w:r>
           </w:p>
         </w:tc>
@@ -2858,7 +4297,7 @@
                 <w:sz w:val="20"/>
                 <w:szCs w:val="20"/>
               </w:rPr>
-              <w:t>Enter another reservation ID to test again.</w:t>
+              <w:t>&lt;Enter an action&gt;</w:t>
             </w:r>
           </w:p>
         </w:tc>
@@ -2883,7 +4322,7 @@
                 <w:sz w:val="20"/>
                 <w:szCs w:val="20"/>
               </w:rPr>
-              <w:t>The page allows another lookup without crashing or redirecting incorrectly.</w:t>
+              <w:t>&lt;Enter the expected results&gt;</w:t>
             </w:r>
           </w:p>
         </w:tc>
@@ -2908,7 +4347,7 @@
                 <w:sz w:val="20"/>
                 <w:szCs w:val="20"/>
               </w:rPr>
-              <w:t>Pass</w:t>
+              <w:t>&lt;yes/no&gt;</w:t>
             </w:r>
           </w:p>
         </w:tc>
@@ -2991,7 +4430,7 @@
                 <w:sz w:val="20"/>
                 <w:szCs w:val="20"/>
               </w:rPr>
-              <w:t>The invalid reservation lookup test passed successfully. When a reservation ID that does not exist was entered, the system did not display incorrect reservation information. Instead, it showed a clear not found message, which helps the user understand that the reservation could not be located.</w:t>
+              <w:t>Comments should be substantive; this means there should be at least 2-3 well-structured sentences with constructive feedback.</w:t>
             </w:r>
           </w:p>
         </w:tc>
@@ -3044,15 +4483,7 @@
                 <w:sz w:val="24"/>
                 <w:szCs w:val="24"/>
               </w:rPr>
-              <w:t xml:space="preserve">Test </w:t>
-            </w:r>
-            <w:r>
-              <w:rPr>
-                <w:rFonts w:ascii="Arial" w:hAnsi="Arial" w:cs="Arial"/>
-                <w:sz w:val="24"/>
-                <w:szCs w:val="24"/>
-              </w:rPr>
-              <w:t>3</w:t>
+              <w:t>Test 4</w:t>
             </w:r>
           </w:p>
         </w:tc>
@@ -3070,7 +4501,6 @@
                 <w:bCs/>
               </w:rPr>
             </w:pPr>
-            <w:bookmarkStart w:id="0" w:name="_Toc132718197"/>
             <w:r>
               <w:rPr>
                 <w:rFonts w:ascii="Arial" w:hAnsi="Arial" w:cs="Arial"/>
@@ -3080,7 +4510,6 @@
               </w:rPr>
               <w:t>&lt;DESCRIPTION&gt;</w:t>
             </w:r>
-            <w:bookmarkEnd w:id="0"/>
           </w:p>
         </w:tc>
       </w:tr>
@@ -3196,27 +4625,7 @@
                 <w:sz w:val="20"/>
                 <w:szCs w:val="20"/>
               </w:rPr>
-              <w:t>&lt;</w:t>
-            </w:r>
-            <w:proofErr w:type="spellStart"/>
-            <w:r>
-              <w:rPr>
-                <w:rFonts w:ascii="Arial" w:hAnsi="Arial" w:cs="Arial"/>
-                <w:color w:val="C00000"/>
-                <w:sz w:val="20"/>
-                <w:szCs w:val="20"/>
-              </w:rPr>
-              <w:t>yyyy</w:t>
-            </w:r>
-            <w:proofErr w:type="spellEnd"/>
-            <w:r>
-              <w:rPr>
-                <w:rFonts w:ascii="Arial" w:hAnsi="Arial" w:cs="Arial"/>
-                <w:color w:val="C00000"/>
-                <w:sz w:val="20"/>
-                <w:szCs w:val="20"/>
-              </w:rPr>
-              <w:t xml:space="preserve">/mm/dd&gt; </w:t>
+              <w:t xml:space="preserve">&lt;yyyy/mm/dd&gt; </w:t>
             </w:r>
           </w:p>
         </w:tc>
@@ -3279,1164 +4688,7 @@
                 <w:sz w:val="20"/>
                 <w:szCs w:val="20"/>
               </w:rPr>
-              <w:t>&lt;</w:t>
-            </w:r>
-            <w:proofErr w:type="spellStart"/>
-            <w:r>
-              <w:rPr>
-                <w:rFonts w:ascii="Arial" w:hAnsi="Arial" w:cs="Arial"/>
-                <w:color w:val="C00000"/>
-                <w:sz w:val="20"/>
-                <w:szCs w:val="20"/>
-              </w:rPr>
-              <w:t>yyyy</w:t>
-            </w:r>
-            <w:proofErr w:type="spellEnd"/>
-            <w:r>
-              <w:rPr>
-                <w:rFonts w:ascii="Arial" w:hAnsi="Arial" w:cs="Arial"/>
-                <w:color w:val="C00000"/>
-                <w:sz w:val="20"/>
-                <w:szCs w:val="20"/>
-              </w:rPr>
-              <w:t>/mm/dd&gt;</w:t>
-            </w:r>
-          </w:p>
-        </w:tc>
-      </w:tr>
-      <w:tr>
-        <w:trPr>
-          <w:trHeight w:val="350"/>
-        </w:trPr>
-        <w:tc>
-          <w:tcPr>
-            <w:tcW w:w="1250" w:type="dxa"/>
-          </w:tcPr>
-          <w:p>
-            <w:pPr>
-              <w:spacing w:before="80" w:after="80"/>
-              <w:rPr>
-                <w:rFonts w:ascii="Arial" w:hAnsi="Arial" w:cs="Arial"/>
-                <w:b/>
-                <w:bCs/>
-                <w:sz w:val="20"/>
-                <w:szCs w:val="20"/>
-              </w:rPr>
-            </w:pPr>
-            <w:r>
-              <w:rPr>
-                <w:rFonts w:ascii="Arial" w:hAnsi="Arial" w:cs="Arial"/>
-                <w:b/>
-                <w:bCs/>
-                <w:sz w:val="20"/>
-                <w:szCs w:val="20"/>
-              </w:rPr>
-              <w:t>Step</w:t>
-            </w:r>
-          </w:p>
-        </w:tc>
-        <w:tc>
-          <w:tcPr>
-            <w:tcW w:w="3570" w:type="dxa"/>
-          </w:tcPr>
-          <w:p>
-            <w:pPr>
-              <w:spacing w:before="80" w:after="80"/>
-              <w:rPr>
-                <w:rFonts w:ascii="Arial" w:hAnsi="Arial" w:cs="Arial"/>
-                <w:b/>
-                <w:bCs/>
-                <w:sz w:val="20"/>
-                <w:szCs w:val="20"/>
-              </w:rPr>
-            </w:pPr>
-            <w:r>
-              <w:rPr>
-                <w:rFonts w:ascii="Arial" w:hAnsi="Arial" w:cs="Arial"/>
-                <w:b/>
-                <w:bCs/>
-                <w:sz w:val="20"/>
-                <w:szCs w:val="20"/>
-              </w:rPr>
-              <w:t>Action</w:t>
-            </w:r>
-          </w:p>
-        </w:tc>
-        <w:tc>
-          <w:tcPr>
-            <w:tcW w:w="3930" w:type="dxa"/>
-          </w:tcPr>
-          <w:p>
-            <w:pPr>
-              <w:spacing w:before="80" w:after="80"/>
-              <w:rPr>
-                <w:rFonts w:ascii="Arial" w:hAnsi="Arial" w:cs="Arial"/>
-                <w:b/>
-                <w:bCs/>
-                <w:sz w:val="20"/>
-                <w:szCs w:val="20"/>
-              </w:rPr>
-            </w:pPr>
-            <w:r>
-              <w:rPr>
-                <w:rFonts w:ascii="Arial" w:hAnsi="Arial" w:cs="Arial"/>
-                <w:b/>
-                <w:bCs/>
-                <w:sz w:val="20"/>
-                <w:szCs w:val="20"/>
-              </w:rPr>
-              <w:t>Expected results:</w:t>
-            </w:r>
-          </w:p>
-        </w:tc>
-        <w:tc>
-          <w:tcPr>
-            <w:tcW w:w="2148" w:type="dxa"/>
-          </w:tcPr>
-          <w:p>
-            <w:pPr>
-              <w:spacing w:before="80" w:after="80"/>
-              <w:rPr>
-                <w:rFonts w:ascii="Arial" w:hAnsi="Arial" w:cs="Arial"/>
-                <w:b/>
-                <w:bCs/>
-                <w:sz w:val="20"/>
-                <w:szCs w:val="20"/>
-              </w:rPr>
-            </w:pPr>
-            <w:r>
-              <w:rPr>
-                <w:rFonts w:ascii="Arial" w:hAnsi="Arial" w:cs="Arial"/>
-                <w:b/>
-                <w:bCs/>
-                <w:sz w:val="20"/>
-                <w:szCs w:val="20"/>
-              </w:rPr>
-              <w:t>Developer pass/fail</w:t>
-            </w:r>
-          </w:p>
-        </w:tc>
-        <w:tc>
-          <w:tcPr>
-            <w:tcW w:w="2052" w:type="dxa"/>
-          </w:tcPr>
-          <w:p>
-            <w:pPr>
-              <w:spacing w:before="80" w:after="80"/>
-              <w:rPr>
-                <w:rFonts w:ascii="Arial" w:hAnsi="Arial" w:cs="Arial"/>
-                <w:b/>
-                <w:bCs/>
-                <w:sz w:val="20"/>
-                <w:szCs w:val="20"/>
-              </w:rPr>
-            </w:pPr>
-            <w:r>
-              <w:rPr>
-                <w:rFonts w:ascii="Arial" w:hAnsi="Arial" w:cs="Arial"/>
-                <w:b/>
-                <w:bCs/>
-                <w:sz w:val="20"/>
-                <w:szCs w:val="20"/>
-              </w:rPr>
-              <w:t>Tester pass/fail</w:t>
-            </w:r>
-          </w:p>
-        </w:tc>
-      </w:tr>
-      <w:tr>
-        <w:trPr>
-          <w:trHeight w:val="350"/>
-        </w:trPr>
-        <w:tc>
-          <w:tcPr>
-            <w:tcW w:w="1250" w:type="dxa"/>
-          </w:tcPr>
-          <w:p>
-            <w:pPr>
-              <w:spacing w:before="80" w:after="80"/>
-              <w:rPr>
-                <w:rFonts w:ascii="Arial" w:hAnsi="Arial" w:cs="Arial"/>
-                <w:sz w:val="20"/>
-                <w:szCs w:val="20"/>
-              </w:rPr>
-            </w:pPr>
-            <w:r>
-              <w:rPr>
-                <w:rFonts w:ascii="Arial" w:hAnsi="Arial" w:cs="Arial"/>
-                <w:sz w:val="20"/>
-                <w:szCs w:val="20"/>
-              </w:rPr>
-              <w:t>1</w:t>
-            </w:r>
-          </w:p>
-        </w:tc>
-        <w:tc>
-          <w:tcPr>
-            <w:tcW w:w="3570" w:type="dxa"/>
-          </w:tcPr>
-          <w:p>
-            <w:pPr>
-              <w:spacing w:before="80" w:after="80"/>
-              <w:rPr>
-                <w:rFonts w:ascii="Arial" w:hAnsi="Arial" w:cs="Arial"/>
-                <w:color w:val="C00000"/>
-                <w:sz w:val="20"/>
-                <w:szCs w:val="20"/>
-              </w:rPr>
-            </w:pPr>
-            <w:r>
-              <w:rPr>
-                <w:rFonts w:ascii="Arial" w:hAnsi="Arial" w:cs="Arial"/>
-                <w:color w:val="C00000"/>
-                <w:sz w:val="20"/>
-                <w:szCs w:val="20"/>
-              </w:rPr>
-              <w:t>&lt;Enter an action&gt;</w:t>
-            </w:r>
-          </w:p>
-        </w:tc>
-        <w:tc>
-          <w:tcPr>
-            <w:tcW w:w="3930" w:type="dxa"/>
-          </w:tcPr>
-          <w:p>
-            <w:pPr>
-              <w:spacing w:before="80" w:after="80"/>
-              <w:rPr>
-                <w:rFonts w:ascii="Arial" w:hAnsi="Arial" w:cs="Arial"/>
-                <w:color w:val="C00000"/>
-                <w:sz w:val="20"/>
-                <w:szCs w:val="20"/>
-              </w:rPr>
-            </w:pPr>
-            <w:r>
-              <w:rPr>
-                <w:rFonts w:ascii="Arial" w:hAnsi="Arial" w:cs="Arial"/>
-                <w:color w:val="C00000"/>
-                <w:sz w:val="20"/>
-                <w:szCs w:val="20"/>
-              </w:rPr>
-              <w:t>&lt;Enter the expected results&gt;</w:t>
-            </w:r>
-          </w:p>
-        </w:tc>
-        <w:tc>
-          <w:tcPr>
-            <w:tcW w:w="2148" w:type="dxa"/>
-          </w:tcPr>
-          <w:p>
-            <w:pPr>
-              <w:spacing w:before="80" w:after="80"/>
-              <w:rPr>
-                <w:rFonts w:ascii="Arial" w:hAnsi="Arial" w:cs="Arial"/>
-                <w:color w:val="C00000"/>
-                <w:sz w:val="20"/>
-                <w:szCs w:val="20"/>
-              </w:rPr>
-            </w:pPr>
-            <w:r>
-              <w:rPr>
-                <w:rFonts w:ascii="Arial" w:hAnsi="Arial" w:cs="Arial"/>
-                <w:color w:val="C00000"/>
-                <w:sz w:val="20"/>
-                <w:szCs w:val="20"/>
-              </w:rPr>
-              <w:t>&lt;yes/no&gt;</w:t>
-            </w:r>
-          </w:p>
-        </w:tc>
-        <w:tc>
-          <w:tcPr>
-            <w:tcW w:w="2052" w:type="dxa"/>
-          </w:tcPr>
-          <w:p>
-            <w:pPr>
-              <w:spacing w:before="80" w:after="80"/>
-              <w:rPr>
-                <w:rFonts w:ascii="Arial" w:hAnsi="Arial" w:cs="Arial"/>
-                <w:color w:val="C00000"/>
-                <w:sz w:val="20"/>
-                <w:szCs w:val="20"/>
-              </w:rPr>
-            </w:pPr>
-            <w:r>
-              <w:rPr>
-                <w:rFonts w:ascii="Arial" w:hAnsi="Arial" w:cs="Arial"/>
-                <w:color w:val="C00000"/>
-                <w:sz w:val="20"/>
-                <w:szCs w:val="20"/>
-              </w:rPr>
-              <w:t>&lt;yes/no&gt;</w:t>
-            </w:r>
-          </w:p>
-        </w:tc>
-      </w:tr>
-      <w:tr>
-        <w:trPr>
-          <w:trHeight w:val="350"/>
-        </w:trPr>
-        <w:tc>
-          <w:tcPr>
-            <w:tcW w:w="1250" w:type="dxa"/>
-          </w:tcPr>
-          <w:p>
-            <w:pPr>
-              <w:spacing w:before="80" w:after="80"/>
-              <w:rPr>
-                <w:rFonts w:ascii="Arial" w:hAnsi="Arial" w:cs="Arial"/>
-                <w:sz w:val="20"/>
-                <w:szCs w:val="20"/>
-              </w:rPr>
-            </w:pPr>
-            <w:r>
-              <w:rPr>
-                <w:rFonts w:ascii="Arial" w:hAnsi="Arial" w:cs="Arial"/>
-                <w:sz w:val="20"/>
-                <w:szCs w:val="20"/>
-              </w:rPr>
-              <w:t>2</w:t>
-            </w:r>
-          </w:p>
-        </w:tc>
-        <w:tc>
-          <w:tcPr>
-            <w:tcW w:w="3570" w:type="dxa"/>
-          </w:tcPr>
-          <w:p>
-            <w:pPr>
-              <w:spacing w:before="80" w:after="80"/>
-              <w:rPr>
-                <w:rFonts w:ascii="Arial" w:hAnsi="Arial" w:cs="Arial"/>
-                <w:color w:val="C00000"/>
-                <w:sz w:val="20"/>
-                <w:szCs w:val="20"/>
-              </w:rPr>
-            </w:pPr>
-            <w:r>
-              <w:rPr>
-                <w:rFonts w:ascii="Arial" w:hAnsi="Arial" w:cs="Arial"/>
-                <w:color w:val="C00000"/>
-                <w:sz w:val="20"/>
-                <w:szCs w:val="20"/>
-              </w:rPr>
-              <w:t>&lt;Enter an action&gt;</w:t>
-            </w:r>
-          </w:p>
-        </w:tc>
-        <w:tc>
-          <w:tcPr>
-            <w:tcW w:w="3930" w:type="dxa"/>
-          </w:tcPr>
-          <w:p>
-            <w:pPr>
-              <w:spacing w:before="80" w:after="80"/>
-              <w:rPr>
-                <w:rFonts w:ascii="Arial" w:hAnsi="Arial" w:cs="Arial"/>
-                <w:color w:val="C00000"/>
-                <w:sz w:val="20"/>
-                <w:szCs w:val="20"/>
-              </w:rPr>
-            </w:pPr>
-            <w:r>
-              <w:rPr>
-                <w:rFonts w:ascii="Arial" w:hAnsi="Arial" w:cs="Arial"/>
-                <w:color w:val="C00000"/>
-                <w:sz w:val="20"/>
-                <w:szCs w:val="20"/>
-              </w:rPr>
-              <w:t>&lt;Enter the expected results&gt;</w:t>
-            </w:r>
-          </w:p>
-        </w:tc>
-        <w:tc>
-          <w:tcPr>
-            <w:tcW w:w="2148" w:type="dxa"/>
-          </w:tcPr>
-          <w:p>
-            <w:pPr>
-              <w:spacing w:before="80" w:after="80"/>
-              <w:rPr>
-                <w:rFonts w:ascii="Arial" w:hAnsi="Arial" w:cs="Arial"/>
-                <w:color w:val="C00000"/>
-                <w:sz w:val="20"/>
-                <w:szCs w:val="20"/>
-              </w:rPr>
-            </w:pPr>
-            <w:r>
-              <w:rPr>
-                <w:rFonts w:ascii="Arial" w:hAnsi="Arial" w:cs="Arial"/>
-                <w:color w:val="C00000"/>
-                <w:sz w:val="20"/>
-                <w:szCs w:val="20"/>
-              </w:rPr>
-              <w:t>&lt;yes/no&gt;</w:t>
-            </w:r>
-          </w:p>
-        </w:tc>
-        <w:tc>
-          <w:tcPr>
-            <w:tcW w:w="2052" w:type="dxa"/>
-          </w:tcPr>
-          <w:p>
-            <w:pPr>
-              <w:spacing w:before="80" w:after="80"/>
-              <w:rPr>
-                <w:rFonts w:ascii="Arial" w:hAnsi="Arial" w:cs="Arial"/>
-                <w:color w:val="C00000"/>
-                <w:sz w:val="20"/>
-                <w:szCs w:val="20"/>
-              </w:rPr>
-            </w:pPr>
-            <w:r>
-              <w:rPr>
-                <w:rFonts w:ascii="Arial" w:hAnsi="Arial" w:cs="Arial"/>
-                <w:color w:val="C00000"/>
-                <w:sz w:val="20"/>
-                <w:szCs w:val="20"/>
-              </w:rPr>
-              <w:t>&lt;yes/no&gt;</w:t>
-            </w:r>
-          </w:p>
-        </w:tc>
-      </w:tr>
-      <w:tr>
-        <w:trPr>
-          <w:trHeight w:val="350"/>
-        </w:trPr>
-        <w:tc>
-          <w:tcPr>
-            <w:tcW w:w="1250" w:type="dxa"/>
-          </w:tcPr>
-          <w:p>
-            <w:pPr>
-              <w:spacing w:before="80" w:after="80"/>
-              <w:rPr>
-                <w:rFonts w:ascii="Arial" w:hAnsi="Arial" w:cs="Arial"/>
-                <w:sz w:val="20"/>
-                <w:szCs w:val="20"/>
-              </w:rPr>
-            </w:pPr>
-            <w:r>
-              <w:rPr>
-                <w:rFonts w:ascii="Arial" w:hAnsi="Arial" w:cs="Arial"/>
-                <w:sz w:val="20"/>
-                <w:szCs w:val="20"/>
-              </w:rPr>
-              <w:t>3</w:t>
-            </w:r>
-          </w:p>
-        </w:tc>
-        <w:tc>
-          <w:tcPr>
-            <w:tcW w:w="3570" w:type="dxa"/>
-          </w:tcPr>
-          <w:p>
-            <w:pPr>
-              <w:spacing w:before="80" w:after="80"/>
-              <w:rPr>
-                <w:rFonts w:ascii="Arial" w:hAnsi="Arial" w:cs="Arial"/>
-                <w:color w:val="C00000"/>
-                <w:sz w:val="20"/>
-                <w:szCs w:val="20"/>
-              </w:rPr>
-            </w:pPr>
-            <w:r>
-              <w:rPr>
-                <w:rFonts w:ascii="Arial" w:hAnsi="Arial" w:cs="Arial"/>
-                <w:color w:val="C00000"/>
-                <w:sz w:val="20"/>
-                <w:szCs w:val="20"/>
-              </w:rPr>
-              <w:t>&lt;Enter an action&gt;</w:t>
-            </w:r>
-          </w:p>
-        </w:tc>
-        <w:tc>
-          <w:tcPr>
-            <w:tcW w:w="3930" w:type="dxa"/>
-          </w:tcPr>
-          <w:p>
-            <w:pPr>
-              <w:spacing w:before="80" w:after="80"/>
-              <w:rPr>
-                <w:rFonts w:ascii="Arial" w:hAnsi="Arial" w:cs="Arial"/>
-                <w:color w:val="C00000"/>
-                <w:sz w:val="20"/>
-                <w:szCs w:val="20"/>
-              </w:rPr>
-            </w:pPr>
-            <w:r>
-              <w:rPr>
-                <w:rFonts w:ascii="Arial" w:hAnsi="Arial" w:cs="Arial"/>
-                <w:color w:val="C00000"/>
-                <w:sz w:val="20"/>
-                <w:szCs w:val="20"/>
-              </w:rPr>
-              <w:t>&lt;Enter the expected results&gt;</w:t>
-            </w:r>
-          </w:p>
-        </w:tc>
-        <w:tc>
-          <w:tcPr>
-            <w:tcW w:w="2148" w:type="dxa"/>
-          </w:tcPr>
-          <w:p>
-            <w:pPr>
-              <w:spacing w:before="80" w:after="80"/>
-              <w:rPr>
-                <w:rFonts w:ascii="Arial" w:hAnsi="Arial" w:cs="Arial"/>
-                <w:color w:val="C00000"/>
-                <w:sz w:val="20"/>
-                <w:szCs w:val="20"/>
-              </w:rPr>
-            </w:pPr>
-            <w:r>
-              <w:rPr>
-                <w:rFonts w:ascii="Arial" w:hAnsi="Arial" w:cs="Arial"/>
-                <w:color w:val="C00000"/>
-                <w:sz w:val="20"/>
-                <w:szCs w:val="20"/>
-              </w:rPr>
-              <w:t>&lt;yes/no&gt;</w:t>
-            </w:r>
-          </w:p>
-        </w:tc>
-        <w:tc>
-          <w:tcPr>
-            <w:tcW w:w="2052" w:type="dxa"/>
-          </w:tcPr>
-          <w:p>
-            <w:pPr>
-              <w:spacing w:before="80" w:after="80"/>
-              <w:rPr>
-                <w:rFonts w:ascii="Arial" w:hAnsi="Arial" w:cs="Arial"/>
-                <w:color w:val="C00000"/>
-                <w:sz w:val="20"/>
-                <w:szCs w:val="20"/>
-              </w:rPr>
-            </w:pPr>
-            <w:r>
-              <w:rPr>
-                <w:rFonts w:ascii="Arial" w:hAnsi="Arial" w:cs="Arial"/>
-                <w:color w:val="C00000"/>
-                <w:sz w:val="20"/>
-                <w:szCs w:val="20"/>
-              </w:rPr>
-              <w:t>&lt;yes/no&gt;</w:t>
-            </w:r>
-          </w:p>
-        </w:tc>
-      </w:tr>
-      <w:tr>
-        <w:trPr>
-          <w:trHeight w:val="350"/>
-        </w:trPr>
-        <w:tc>
-          <w:tcPr>
-            <w:tcW w:w="1250" w:type="dxa"/>
-          </w:tcPr>
-          <w:p>
-            <w:pPr>
-              <w:spacing w:before="80" w:after="80"/>
-              <w:rPr>
-                <w:rFonts w:ascii="Arial" w:hAnsi="Arial" w:cs="Arial"/>
-                <w:sz w:val="20"/>
-                <w:szCs w:val="20"/>
-              </w:rPr>
-            </w:pPr>
-            <w:r>
-              <w:rPr>
-                <w:rFonts w:ascii="Arial" w:hAnsi="Arial" w:cs="Arial"/>
-                <w:sz w:val="20"/>
-                <w:szCs w:val="20"/>
-              </w:rPr>
-              <w:t>4</w:t>
-            </w:r>
-          </w:p>
-        </w:tc>
-        <w:tc>
-          <w:tcPr>
-            <w:tcW w:w="3570" w:type="dxa"/>
-          </w:tcPr>
-          <w:p>
-            <w:pPr>
-              <w:spacing w:before="80" w:after="80"/>
-              <w:rPr>
-                <w:rFonts w:ascii="Arial" w:hAnsi="Arial" w:cs="Arial"/>
-                <w:color w:val="C00000"/>
-                <w:sz w:val="20"/>
-                <w:szCs w:val="20"/>
-              </w:rPr>
-            </w:pPr>
-            <w:r>
-              <w:rPr>
-                <w:rFonts w:ascii="Arial" w:hAnsi="Arial" w:cs="Arial"/>
-                <w:color w:val="C00000"/>
-                <w:sz w:val="20"/>
-                <w:szCs w:val="20"/>
-              </w:rPr>
-              <w:t>&lt;Enter an action&gt;</w:t>
-            </w:r>
-          </w:p>
-        </w:tc>
-        <w:tc>
-          <w:tcPr>
-            <w:tcW w:w="3930" w:type="dxa"/>
-          </w:tcPr>
-          <w:p>
-            <w:pPr>
-              <w:spacing w:before="80" w:after="80"/>
-              <w:rPr>
-                <w:rFonts w:ascii="Arial" w:hAnsi="Arial" w:cs="Arial"/>
-                <w:color w:val="C00000"/>
-                <w:sz w:val="20"/>
-                <w:szCs w:val="20"/>
-              </w:rPr>
-            </w:pPr>
-            <w:r>
-              <w:rPr>
-                <w:rFonts w:ascii="Arial" w:hAnsi="Arial" w:cs="Arial"/>
-                <w:color w:val="C00000"/>
-                <w:sz w:val="20"/>
-                <w:szCs w:val="20"/>
-              </w:rPr>
-              <w:t>&lt;Enter the expected results&gt;</w:t>
-            </w:r>
-          </w:p>
-        </w:tc>
-        <w:tc>
-          <w:tcPr>
-            <w:tcW w:w="2148" w:type="dxa"/>
-          </w:tcPr>
-          <w:p>
-            <w:pPr>
-              <w:spacing w:before="80" w:after="80"/>
-              <w:rPr>
-                <w:rFonts w:ascii="Arial" w:hAnsi="Arial" w:cs="Arial"/>
-                <w:color w:val="C00000"/>
-                <w:sz w:val="20"/>
-                <w:szCs w:val="20"/>
-              </w:rPr>
-            </w:pPr>
-            <w:r>
-              <w:rPr>
-                <w:rFonts w:ascii="Arial" w:hAnsi="Arial" w:cs="Arial"/>
-                <w:color w:val="C00000"/>
-                <w:sz w:val="20"/>
-                <w:szCs w:val="20"/>
-              </w:rPr>
-              <w:t>&lt;yes/no&gt;</w:t>
-            </w:r>
-          </w:p>
-        </w:tc>
-        <w:tc>
-          <w:tcPr>
-            <w:tcW w:w="2052" w:type="dxa"/>
-          </w:tcPr>
-          <w:p>
-            <w:pPr>
-              <w:spacing w:before="80" w:after="80"/>
-              <w:rPr>
-                <w:rFonts w:ascii="Arial" w:hAnsi="Arial" w:cs="Arial"/>
-                <w:color w:val="C00000"/>
-                <w:sz w:val="20"/>
-                <w:szCs w:val="20"/>
-              </w:rPr>
-            </w:pPr>
-            <w:r>
-              <w:rPr>
-                <w:rFonts w:ascii="Arial" w:hAnsi="Arial" w:cs="Arial"/>
-                <w:color w:val="C00000"/>
-                <w:sz w:val="20"/>
-                <w:szCs w:val="20"/>
-              </w:rPr>
-              <w:t>&lt;yes/no&gt;</w:t>
-            </w:r>
-          </w:p>
-        </w:tc>
-      </w:tr>
-      <w:tr>
-        <w:trPr>
-          <w:trHeight w:val="350"/>
-        </w:trPr>
-        <w:tc>
-          <w:tcPr>
-            <w:tcW w:w="1250" w:type="dxa"/>
-          </w:tcPr>
-          <w:p>
-            <w:pPr>
-              <w:spacing w:before="80" w:after="80"/>
-              <w:rPr>
-                <w:rFonts w:ascii="Arial" w:hAnsi="Arial" w:cs="Arial"/>
-                <w:sz w:val="20"/>
-                <w:szCs w:val="20"/>
-              </w:rPr>
-            </w:pPr>
-            <w:r>
-              <w:rPr>
-                <w:rFonts w:ascii="Arial" w:hAnsi="Arial" w:cs="Arial"/>
-                <w:sz w:val="20"/>
-                <w:szCs w:val="20"/>
-              </w:rPr>
-              <w:lastRenderedPageBreak/>
-              <w:t>5</w:t>
-            </w:r>
-          </w:p>
-        </w:tc>
-        <w:tc>
-          <w:tcPr>
-            <w:tcW w:w="3570" w:type="dxa"/>
-          </w:tcPr>
-          <w:p>
-            <w:pPr>
-              <w:spacing w:before="80" w:after="80"/>
-              <w:rPr>
-                <w:rFonts w:ascii="Arial" w:hAnsi="Arial" w:cs="Arial"/>
-                <w:color w:val="C00000"/>
-                <w:sz w:val="20"/>
-                <w:szCs w:val="20"/>
-              </w:rPr>
-            </w:pPr>
-            <w:r>
-              <w:rPr>
-                <w:rFonts w:ascii="Arial" w:hAnsi="Arial" w:cs="Arial"/>
-                <w:color w:val="C00000"/>
-                <w:sz w:val="20"/>
-                <w:szCs w:val="20"/>
-              </w:rPr>
-              <w:t>&lt;Enter an action&gt;</w:t>
-            </w:r>
-          </w:p>
-        </w:tc>
-        <w:tc>
-          <w:tcPr>
-            <w:tcW w:w="3930" w:type="dxa"/>
-          </w:tcPr>
-          <w:p>
-            <w:pPr>
-              <w:spacing w:before="80" w:after="80"/>
-              <w:rPr>
-                <w:rFonts w:ascii="Arial" w:hAnsi="Arial" w:cs="Arial"/>
-                <w:color w:val="C00000"/>
-                <w:sz w:val="20"/>
-                <w:szCs w:val="20"/>
-              </w:rPr>
-            </w:pPr>
-            <w:r>
-              <w:rPr>
-                <w:rFonts w:ascii="Arial" w:hAnsi="Arial" w:cs="Arial"/>
-                <w:color w:val="C00000"/>
-                <w:sz w:val="20"/>
-                <w:szCs w:val="20"/>
-              </w:rPr>
-              <w:t>&lt;Enter the expected results&gt;</w:t>
-            </w:r>
-          </w:p>
-        </w:tc>
-        <w:tc>
-          <w:tcPr>
-            <w:tcW w:w="2148" w:type="dxa"/>
-          </w:tcPr>
-          <w:p>
-            <w:pPr>
-              <w:spacing w:before="80" w:after="80"/>
-              <w:rPr>
-                <w:rFonts w:ascii="Arial" w:hAnsi="Arial" w:cs="Arial"/>
-                <w:color w:val="C00000"/>
-                <w:sz w:val="20"/>
-                <w:szCs w:val="20"/>
-              </w:rPr>
-            </w:pPr>
-            <w:r>
-              <w:rPr>
-                <w:rFonts w:ascii="Arial" w:hAnsi="Arial" w:cs="Arial"/>
-                <w:color w:val="C00000"/>
-                <w:sz w:val="20"/>
-                <w:szCs w:val="20"/>
-              </w:rPr>
-              <w:t>&lt;yes/no&gt;</w:t>
-            </w:r>
-          </w:p>
-        </w:tc>
-        <w:tc>
-          <w:tcPr>
-            <w:tcW w:w="2052" w:type="dxa"/>
-          </w:tcPr>
-          <w:p>
-            <w:pPr>
-              <w:spacing w:before="80" w:after="80"/>
-              <w:rPr>
-                <w:rFonts w:ascii="Arial" w:hAnsi="Arial" w:cs="Arial"/>
-                <w:color w:val="C00000"/>
-                <w:sz w:val="20"/>
-                <w:szCs w:val="20"/>
-              </w:rPr>
-            </w:pPr>
-            <w:r>
-              <w:rPr>
-                <w:rFonts w:ascii="Arial" w:hAnsi="Arial" w:cs="Arial"/>
-                <w:color w:val="C00000"/>
-                <w:sz w:val="20"/>
-                <w:szCs w:val="20"/>
-              </w:rPr>
-              <w:t>&lt;yes/no&gt;</w:t>
-            </w:r>
-          </w:p>
-        </w:tc>
-      </w:tr>
-      <w:tr>
-        <w:trPr>
-          <w:trHeight w:val="350"/>
-        </w:trPr>
-        <w:tc>
-          <w:tcPr>
-            <w:tcW w:w="1250" w:type="dxa"/>
-          </w:tcPr>
-          <w:p>
-            <w:pPr>
-              <w:spacing w:before="80" w:after="80"/>
-              <w:rPr>
-                <w:rFonts w:ascii="Arial" w:hAnsi="Arial" w:cs="Arial"/>
-                <w:b/>
-                <w:bCs/>
-                <w:sz w:val="20"/>
-                <w:szCs w:val="20"/>
-              </w:rPr>
-            </w:pPr>
-            <w:r>
-              <w:rPr>
-                <w:rFonts w:ascii="Arial" w:hAnsi="Arial" w:cs="Arial"/>
-                <w:b/>
-                <w:bCs/>
-                <w:sz w:val="20"/>
-                <w:szCs w:val="20"/>
-              </w:rPr>
-              <w:t>Comments</w:t>
-            </w:r>
-          </w:p>
-        </w:tc>
-        <w:tc>
-          <w:tcPr>
-            <w:tcW w:w="11700" w:type="dxa"/>
-            <w:gridSpan w:val="4"/>
-          </w:tcPr>
-          <w:p>
-            <w:pPr>
-              <w:spacing w:before="80" w:after="80"/>
-              <w:rPr>
-                <w:rFonts w:ascii="Arial" w:hAnsi="Arial" w:cs="Arial"/>
-                <w:color w:val="C00000"/>
-                <w:sz w:val="20"/>
-                <w:szCs w:val="20"/>
-              </w:rPr>
-            </w:pPr>
-            <w:r>
-              <w:rPr>
-                <w:rFonts w:ascii="Arial" w:hAnsi="Arial" w:cs="Arial"/>
-                <w:color w:val="C00000"/>
-                <w:sz w:val="20"/>
-                <w:szCs w:val="20"/>
-              </w:rPr>
-              <w:t>Comments should be substantive; this means there should be at least 2-3 well-structured sentences with constructive feedback.</w:t>
-            </w:r>
-          </w:p>
-        </w:tc>
-      </w:tr>
-    </w:tbl>
-    <w:p>
-      <w:pPr>
-        <w:pStyle w:val="NoSpacing"/>
-        <w:rPr>
-          <w:rFonts w:ascii="Arial" w:hAnsi="Arial" w:cs="Arial"/>
-          <w:sz w:val="24"/>
-          <w:szCs w:val="24"/>
-        </w:rPr>
-      </w:pPr>
-    </w:p>
-    <w:tbl>
-      <w:tblPr>
-        <w:tblStyle w:val="TableGrid"/>
-        <w:tblW w:w="0" w:type="auto"/>
-        <w:tblLook w:val="04A0" w:firstRow="1" w:lastRow="0" w:firstColumn="1" w:lastColumn="0" w:noHBand="0" w:noVBand="1"/>
-      </w:tblPr>
-      <w:tblGrid>
-        <w:gridCol w:w="1250"/>
-        <w:gridCol w:w="3570"/>
-        <w:gridCol w:w="3930"/>
-        <w:gridCol w:w="2148"/>
-        <w:gridCol w:w="2052"/>
-      </w:tblGrid>
-      <w:tr>
-        <w:trPr>
-          <w:trHeight w:val="710"/>
-        </w:trPr>
-        <w:tc>
-          <w:tcPr>
-            <w:tcW w:w="1250" w:type="dxa"/>
-          </w:tcPr>
-          <w:p>
-            <w:pPr>
-              <w:pStyle w:val="NoSpacing"/>
-              <w:spacing w:before="80" w:after="80"/>
-              <w:rPr>
-                <w:rFonts w:ascii="Arial" w:hAnsi="Arial" w:cs="Arial"/>
-                <w:sz w:val="24"/>
-                <w:szCs w:val="24"/>
-              </w:rPr>
-            </w:pPr>
-            <w:r>
-              <w:rPr>
-                <w:rFonts w:ascii="Arial" w:hAnsi="Arial" w:cs="Arial"/>
-                <w:sz w:val="24"/>
-                <w:szCs w:val="24"/>
-              </w:rPr>
-              <w:t>Test 4</w:t>
-            </w:r>
-          </w:p>
-        </w:tc>
-        <w:tc>
-          <w:tcPr>
-            <w:tcW w:w="11700" w:type="dxa"/>
-            <w:gridSpan w:val="4"/>
-          </w:tcPr>
-          <w:p>
-            <w:pPr>
-              <w:pStyle w:val="Heading1"/>
-              <w:rPr>
-                <w:rFonts w:ascii="Arial" w:hAnsi="Arial" w:cs="Arial"/>
-                <w:b/>
-                <w:bCs/>
-              </w:rPr>
-            </w:pPr>
-            <w:r>
-              <w:rPr>
-                <w:rFonts w:ascii="Arial" w:hAnsi="Arial" w:cs="Arial"/>
-                <w:b/>
-                <w:bCs/>
-                <w:color w:val="auto"/>
-              </w:rPr>
-              <w:t>&lt;DESCRIPTION&gt;</w:t>
-            </w:r>
-          </w:p>
-        </w:tc>
-      </w:tr>
-      <w:tr>
-        <w:trPr>
-          <w:trHeight w:val="620"/>
-        </w:trPr>
-        <w:tc>
-          <w:tcPr>
-            <w:tcW w:w="1250" w:type="dxa"/>
-          </w:tcPr>
-          <w:p>
-            <w:pPr>
-              <w:pStyle w:val="NoSpacing"/>
-              <w:spacing w:before="80" w:after="80"/>
-              <w:rPr>
-                <w:rFonts w:ascii="Arial" w:hAnsi="Arial" w:cs="Arial"/>
-                <w:sz w:val="24"/>
-                <w:szCs w:val="24"/>
-              </w:rPr>
-            </w:pPr>
-          </w:p>
-        </w:tc>
-        <w:tc>
-          <w:tcPr>
-            <w:tcW w:w="3570" w:type="dxa"/>
-          </w:tcPr>
-          <w:p>
-            <w:pPr>
-              <w:rPr>
-                <w:rFonts w:ascii="Arial" w:hAnsi="Arial" w:cs="Arial"/>
-                <w:sz w:val="20"/>
-                <w:szCs w:val="20"/>
-              </w:rPr>
-            </w:pPr>
-            <w:r>
-              <w:rPr>
-                <w:rFonts w:ascii="Arial" w:hAnsi="Arial" w:cs="Arial"/>
-                <w:b/>
-                <w:bCs/>
-                <w:sz w:val="20"/>
-                <w:szCs w:val="20"/>
-              </w:rPr>
-              <w:t>Test Objective</w:t>
-            </w:r>
-            <w:r>
-              <w:rPr>
-                <w:rFonts w:ascii="Arial" w:hAnsi="Arial" w:cs="Arial"/>
-                <w:b/>
-                <w:bCs/>
-                <w:sz w:val="20"/>
-                <w:szCs w:val="20"/>
-              </w:rPr>
-              <w:t xml:space="preserve">: </w:t>
-            </w:r>
-          </w:p>
-        </w:tc>
-        <w:tc>
-          <w:tcPr>
-            <w:tcW w:w="3930" w:type="dxa"/>
-          </w:tcPr>
-          <w:p>
-            <w:pPr>
-              <w:rPr>
-                <w:rFonts w:ascii="Arial" w:hAnsi="Arial" w:cs="Arial"/>
-                <w:b/>
-                <w:bCs/>
-                <w:sz w:val="20"/>
-                <w:szCs w:val="20"/>
-              </w:rPr>
-            </w:pPr>
-            <w:r>
-              <w:rPr>
-                <w:rFonts w:ascii="Arial" w:hAnsi="Arial" w:cs="Arial"/>
-                <w:b/>
-                <w:bCs/>
-                <w:sz w:val="20"/>
-                <w:szCs w:val="20"/>
-              </w:rPr>
-              <w:t>Developer:</w:t>
-            </w:r>
-          </w:p>
-          <w:p>
-            <w:pPr>
-              <w:rPr>
-                <w:rFonts w:ascii="Arial" w:hAnsi="Arial" w:cs="Arial"/>
-                <w:sz w:val="20"/>
-                <w:szCs w:val="20"/>
-              </w:rPr>
-            </w:pPr>
-            <w:r>
-              <w:rPr>
-                <w:rFonts w:ascii="Arial" w:hAnsi="Arial" w:cs="Arial"/>
-                <w:b/>
-                <w:bCs/>
-                <w:sz w:val="20"/>
-                <w:szCs w:val="20"/>
-              </w:rPr>
-              <w:t>Date tested:</w:t>
-            </w:r>
-            <w:r>
-              <w:rPr>
-                <w:rFonts w:ascii="Arial" w:hAnsi="Arial" w:cs="Arial"/>
-                <w:sz w:val="20"/>
-                <w:szCs w:val="20"/>
-              </w:rPr>
-              <w:t xml:space="preserve"> </w:t>
-            </w:r>
-            <w:r>
-              <w:rPr>
-                <w:rFonts w:ascii="Arial" w:hAnsi="Arial" w:cs="Arial"/>
-                <w:color w:val="C00000"/>
-                <w:sz w:val="20"/>
-                <w:szCs w:val="20"/>
-              </w:rPr>
-              <w:t>&lt;</w:t>
-            </w:r>
-            <w:proofErr w:type="spellStart"/>
-            <w:r>
-              <w:rPr>
-                <w:rFonts w:ascii="Arial" w:hAnsi="Arial" w:cs="Arial"/>
-                <w:color w:val="C00000"/>
-                <w:sz w:val="20"/>
-                <w:szCs w:val="20"/>
-              </w:rPr>
-              <w:t>yyyy</w:t>
-            </w:r>
-            <w:proofErr w:type="spellEnd"/>
-            <w:r>
-              <w:rPr>
-                <w:rFonts w:ascii="Arial" w:hAnsi="Arial" w:cs="Arial"/>
-                <w:color w:val="C00000"/>
-                <w:sz w:val="20"/>
-                <w:szCs w:val="20"/>
-              </w:rPr>
-              <w:t xml:space="preserve">/mm/dd&gt; </w:t>
-            </w:r>
-          </w:p>
-        </w:tc>
-        <w:tc>
-          <w:tcPr>
-            <w:tcW w:w="4200" w:type="dxa"/>
-            <w:gridSpan w:val="2"/>
-          </w:tcPr>
-          <w:p>
-            <w:pPr>
-              <w:rPr>
-                <w:rFonts w:ascii="Arial" w:hAnsi="Arial" w:cs="Arial"/>
-                <w:b/>
-                <w:bCs/>
-                <w:sz w:val="20"/>
-                <w:szCs w:val="20"/>
-              </w:rPr>
-            </w:pPr>
-            <w:r>
-              <w:rPr>
-                <w:rFonts w:ascii="Arial" w:hAnsi="Arial" w:cs="Arial"/>
-                <w:b/>
-                <w:bCs/>
-                <w:sz w:val="20"/>
-                <w:szCs w:val="20"/>
-              </w:rPr>
-              <w:t xml:space="preserve">Peer tester: </w:t>
-            </w:r>
-          </w:p>
-          <w:p>
-            <w:pPr>
-              <w:rPr>
-                <w:rFonts w:ascii="Arial" w:hAnsi="Arial" w:cs="Arial"/>
-                <w:sz w:val="20"/>
-                <w:szCs w:val="20"/>
-              </w:rPr>
-            </w:pPr>
-            <w:r>
-              <w:rPr>
-                <w:rFonts w:ascii="Arial" w:hAnsi="Arial" w:cs="Arial"/>
-                <w:b/>
-                <w:bCs/>
-                <w:sz w:val="20"/>
-                <w:szCs w:val="20"/>
-              </w:rPr>
-              <w:t>Date tested:</w:t>
-            </w:r>
-            <w:r>
-              <w:rPr>
-                <w:rFonts w:ascii="Arial" w:hAnsi="Arial" w:cs="Arial"/>
-                <w:sz w:val="20"/>
-                <w:szCs w:val="20"/>
-              </w:rPr>
-              <w:t xml:space="preserve"> </w:t>
-            </w:r>
-            <w:r>
-              <w:rPr>
-                <w:rFonts w:ascii="Arial" w:hAnsi="Arial" w:cs="Arial"/>
-                <w:color w:val="C00000"/>
-                <w:sz w:val="20"/>
-                <w:szCs w:val="20"/>
-              </w:rPr>
-              <w:t>&lt;</w:t>
-            </w:r>
-            <w:proofErr w:type="spellStart"/>
-            <w:r>
-              <w:rPr>
-                <w:rFonts w:ascii="Arial" w:hAnsi="Arial" w:cs="Arial"/>
-                <w:color w:val="C00000"/>
-                <w:sz w:val="20"/>
-                <w:szCs w:val="20"/>
-              </w:rPr>
-              <w:t>yyyy</w:t>
-            </w:r>
-            <w:proofErr w:type="spellEnd"/>
-            <w:r>
-              <w:rPr>
-                <w:rFonts w:ascii="Arial" w:hAnsi="Arial" w:cs="Arial"/>
-                <w:color w:val="C00000"/>
-                <w:sz w:val="20"/>
-                <w:szCs w:val="20"/>
-              </w:rPr>
-              <w:t>/mm/dd&gt;</w:t>
+              <w:t>&lt;yyyy/mm/dd&gt;</w:t>
             </w:r>
           </w:p>
         </w:tc>
@@ -5291,8 +5543,8 @@
       </w:pPr>
     </w:p>
     <w:sectPr>
-      <w:headerReference w:type="default" r:id="rId7"/>
-      <w:footerReference w:type="default" r:id="rId8"/>
+      <w:headerReference w:type="default" r:id="rId13"/>
+      <w:footerReference w:type="default" r:id="rId14"/>
       <w:pgSz w:w="15840" w:h="12240" w:orient="landscape"/>
       <w:pgMar w:top="1440" w:right="1440" w:bottom="1440" w:left="1440" w:header="720" w:footer="720" w:gutter="0"/>
       <w:cols w:space="720"/>
@@ -5936,6 +6188,7 @@
   <w:style w:type="character" w:default="1" w:styleId="DefaultParagraphFont">
     <w:name w:val="Default Paragraph Font"/>
     <w:uiPriority w:val="1"/>
+    <w:semiHidden/>
     <w:unhideWhenUsed/>
   </w:style>
   <w:style w:type="table" w:default="1" w:styleId="TableNormal">

</xml_diff>

<commit_message>
Pushing 8.2 Test Plan & Files - Anderson 5/2/26
</commit_message>
<xml_diff>
--- a/MODULE-8/8.2 Assignment.docx
+++ b/MODULE-8/8.2 Assignment.docx
@@ -370,16 +370,7 @@
               <w:sz w:val="28"/>
               <w:szCs w:val="28"/>
             </w:rPr>
-            <w:t>Reservation Lookup With Valid Reservation ID</w:t>
-          </w:r>
-          <w:r>
-            <w:rPr>
-              <w:rFonts w:eastAsiaTheme="minorEastAsia"/>
-              <w:noProof/>
-              <w:sz w:val="28"/>
-              <w:szCs w:val="28"/>
-            </w:rPr>
-            <w:t>……………………………………………………………………………………………………………………………………………..1</w:t>
+            <w:t>Reservation Lookup With Valid Reservation ID……………………………………………………………………………………………………………………………………………..1</w:t>
           </w:r>
         </w:p>
         <w:p>
@@ -388,112 +379,11 @@
               <w:sz w:val="28"/>
               <w:szCs w:val="28"/>
             </w:rPr>
-            <w:t xml:space="preserve">Reservation Lookup </w:t>
-          </w:r>
-          <w:r>
-            <w:rPr>
-              <w:sz w:val="28"/>
-              <w:szCs w:val="28"/>
-            </w:rPr>
-            <w:t>with</w:t>
-          </w:r>
-          <w:r>
-            <w:rPr>
-              <w:sz w:val="28"/>
-              <w:szCs w:val="28"/>
-            </w:rPr>
-            <w:t xml:space="preserve"> Invalid Reservation ID</w:t>
-          </w:r>
-          <w:r>
-            <w:rPr>
-              <w:sz w:val="28"/>
-              <w:szCs w:val="28"/>
-            </w:rPr>
-            <w:t>……………………………………………………………………………………………………………………………………………1-2</w:t>
+            <w:t>Reservation Lookup with Invalid Reservation ID……………………………………………………………………………………………………………………………………………1-2</w:t>
           </w:r>
         </w:p>
       </w:sdtContent>
     </w:sdt>
-    <w:p>
-      <w:pPr>
-        <w:pStyle w:val="NoSpacing"/>
-        <w:rPr>
-          <w:rFonts w:ascii="Arial" w:hAnsi="Arial" w:cs="Arial"/>
-          <w:sz w:val="24"/>
-          <w:szCs w:val="24"/>
-        </w:rPr>
-      </w:pPr>
-    </w:p>
-    <w:p>
-      <w:pPr>
-        <w:pStyle w:val="NoSpacing"/>
-        <w:rPr>
-          <w:rFonts w:ascii="Arial" w:hAnsi="Arial" w:cs="Arial"/>
-          <w:sz w:val="24"/>
-          <w:szCs w:val="24"/>
-        </w:rPr>
-      </w:pPr>
-    </w:p>
-    <w:p>
-      <w:pPr>
-        <w:pStyle w:val="NoSpacing"/>
-        <w:rPr>
-          <w:rFonts w:ascii="Arial" w:hAnsi="Arial" w:cs="Arial"/>
-          <w:sz w:val="24"/>
-          <w:szCs w:val="24"/>
-        </w:rPr>
-      </w:pPr>
-    </w:p>
-    <w:p>
-      <w:pPr>
-        <w:pStyle w:val="NoSpacing"/>
-        <w:rPr>
-          <w:rFonts w:ascii="Arial" w:hAnsi="Arial" w:cs="Arial"/>
-          <w:sz w:val="24"/>
-          <w:szCs w:val="24"/>
-        </w:rPr>
-      </w:pPr>
-    </w:p>
-    <w:p>
-      <w:pPr>
-        <w:pStyle w:val="NoSpacing"/>
-        <w:rPr>
-          <w:rFonts w:ascii="Arial" w:hAnsi="Arial" w:cs="Arial"/>
-          <w:sz w:val="24"/>
-          <w:szCs w:val="24"/>
-        </w:rPr>
-      </w:pPr>
-    </w:p>
-    <w:p>
-      <w:pPr>
-        <w:pStyle w:val="NoSpacing"/>
-        <w:rPr>
-          <w:rFonts w:ascii="Arial" w:hAnsi="Arial" w:cs="Arial"/>
-          <w:sz w:val="24"/>
-          <w:szCs w:val="24"/>
-        </w:rPr>
-      </w:pPr>
-    </w:p>
-    <w:p>
-      <w:pPr>
-        <w:pStyle w:val="NoSpacing"/>
-        <w:rPr>
-          <w:rFonts w:ascii="Arial" w:hAnsi="Arial" w:cs="Arial"/>
-          <w:sz w:val="24"/>
-          <w:szCs w:val="24"/>
-        </w:rPr>
-      </w:pPr>
-    </w:p>
-    <w:p>
-      <w:pPr>
-        <w:pStyle w:val="NoSpacing"/>
-        <w:rPr>
-          <w:rFonts w:ascii="Arial" w:hAnsi="Arial" w:cs="Arial"/>
-          <w:sz w:val="24"/>
-          <w:szCs w:val="24"/>
-        </w:rPr>
-      </w:pPr>
-    </w:p>
     <w:p>
       <w:pPr>
         <w:pStyle w:val="NoSpacing"/>
@@ -590,11 +480,11 @@
         <w:tblLook w:val="04A0" w:firstRow="1" w:lastRow="0" w:firstColumn="1" w:lastColumn="0" w:noHBand="0" w:noVBand="1"/>
       </w:tblPr>
       <w:tblGrid>
-        <w:gridCol w:w="1250"/>
-        <w:gridCol w:w="3571"/>
-        <w:gridCol w:w="3929"/>
-        <w:gridCol w:w="2148"/>
-        <w:gridCol w:w="2052"/>
+        <w:gridCol w:w="898"/>
+        <w:gridCol w:w="1103"/>
+        <w:gridCol w:w="1337"/>
+        <w:gridCol w:w="854"/>
+        <w:gridCol w:w="8758"/>
       </w:tblGrid>
       <w:tr>
         <w:trPr>
@@ -620,6 +510,7 @@
                 <w:sz w:val="24"/>
                 <w:szCs w:val="24"/>
               </w:rPr>
+              <w:lastRenderedPageBreak/>
               <w:t>Test 1</w:t>
             </w:r>
           </w:p>
@@ -748,7 +639,6 @@
               </w:rPr>
             </w:pPr>
             <w:proofErr w:type="spellStart"/>
-            <w:proofErr w:type="gramStart"/>
             <w:r>
               <w:rPr>
                 <w:rFonts w:ascii="Arial" w:hAnsi="Arial" w:cs="Arial"/>
@@ -770,7 +660,6 @@
               <w:t>Angela</w:t>
             </w:r>
             <w:proofErr w:type="spellEnd"/>
-            <w:proofErr w:type="gramEnd"/>
             <w:r>
               <w:rPr>
                 <w:rFonts w:ascii="Arial" w:hAnsi="Arial" w:cs="Arial"/>
@@ -853,6 +742,16 @@
               </w:rPr>
               <w:t xml:space="preserve">Peer tester: </w:t>
             </w:r>
+            <w:r>
+              <w:rPr>
+                <w:rFonts w:ascii="Arial" w:hAnsi="Arial" w:cs="Arial"/>
+                <w:b/>
+                <w:bCs/>
+                <w:sz w:val="20"/>
+                <w:szCs w:val="20"/>
+              </w:rPr>
+              <w:t>Zachary Anderson</w:t>
+            </w:r>
           </w:p>
           <w:p>
             <w:pPr>
@@ -883,31 +782,10 @@
             <w:r>
               <w:rPr>
                 <w:rFonts w:ascii="Arial" w:hAnsi="Arial" w:cs="Arial"/>
-                <w:color w:val="C00000"/>
-                <w:sz w:val="20"/>
-                <w:szCs w:val="20"/>
-              </w:rPr>
-              <w:t>&lt;</w:t>
-            </w:r>
-            <w:proofErr w:type="spellStart"/>
-            <w:r>
-              <w:rPr>
-                <w:rFonts w:ascii="Arial" w:hAnsi="Arial" w:cs="Arial"/>
-                <w:color w:val="C00000"/>
-                <w:sz w:val="20"/>
-                <w:szCs w:val="20"/>
-              </w:rPr>
-              <w:t>yyyy</w:t>
-            </w:r>
-            <w:proofErr w:type="spellEnd"/>
-            <w:r>
-              <w:rPr>
-                <w:rFonts w:ascii="Arial" w:hAnsi="Arial" w:cs="Arial"/>
-                <w:color w:val="C00000"/>
-                <w:sz w:val="20"/>
-                <w:szCs w:val="20"/>
-              </w:rPr>
-              <w:t>/mm/dd&gt;</w:t>
+                <w:sz w:val="20"/>
+                <w:szCs w:val="20"/>
+              </w:rPr>
+              <w:t>5/2/26</w:t>
             </w:r>
           </w:p>
         </w:tc>
@@ -1122,7 +1000,25 @@
                 <w:sz w:val="20"/>
                 <w:szCs w:val="20"/>
               </w:rPr>
-              <w:t>Open the Reservation Lookup page.</w:t>
+              <w:t>Open the Reservation Lookup page</w:t>
+            </w:r>
+            <w:r>
+              <w:rPr>
+                <w:rFonts w:ascii="Arial" w:hAnsi="Arial" w:cs="Arial"/>
+                <w:color w:val="C00000"/>
+                <w:sz w:val="20"/>
+                <w:szCs w:val="20"/>
+              </w:rPr>
+              <w:t xml:space="preserve"> after logging in</w:t>
+            </w:r>
+            <w:r>
+              <w:rPr>
+                <w:rFonts w:ascii="Arial" w:hAnsi="Arial" w:cs="Arial"/>
+                <w:color w:val="C00000"/>
+                <w:sz w:val="20"/>
+                <w:szCs w:val="20"/>
+              </w:rPr>
+              <w:t>.</w:t>
             </w:r>
           </w:p>
         </w:tc>
@@ -1197,7 +1093,63 @@
                 <w:sz w:val="20"/>
                 <w:szCs w:val="20"/>
               </w:rPr>
-              <w:t>&lt;yes/no&gt;</w:t>
+              <w:t>Pass</w:t>
+            </w:r>
+          </w:p>
+          <w:p>
+            <w:pPr>
+              <w:spacing w:before="80" w:after="80"/>
+              <w:rPr>
+                <w:rFonts w:ascii="Arial" w:hAnsi="Arial" w:cs="Arial"/>
+                <w:color w:val="C00000"/>
+                <w:sz w:val="20"/>
+                <w:szCs w:val="20"/>
+              </w:rPr>
+            </w:pPr>
+            <w:r>
+              <w:rPr>
+                <w:rFonts w:ascii="Arial" w:hAnsi="Arial" w:cs="Arial"/>
+                <w:noProof/>
+                <w:color w:val="C00000"/>
+                <w:sz w:val="20"/>
+                <w:szCs w:val="20"/>
+              </w:rPr>
+              <w:lastRenderedPageBreak/>
+              <w:drawing>
+                <wp:inline distT="0" distB="0" distL="0" distR="0" wp14:anchorId="05714760" wp14:editId="59CCCDA7">
+                  <wp:extent cx="1885005" cy="1521922"/>
+                  <wp:effectExtent l="0" t="0" r="1270" b="2540"/>
+                  <wp:docPr id="677070305" name="Picture 1"/>
+                  <wp:cNvGraphicFramePr>
+                    <a:graphicFrameLocks xmlns:a="http://schemas.openxmlformats.org/drawingml/2006/main" noChangeAspect="1"/>
+                  </wp:cNvGraphicFramePr>
+                  <a:graphic xmlns:a="http://schemas.openxmlformats.org/drawingml/2006/main">
+                    <a:graphicData uri="http://schemas.openxmlformats.org/drawingml/2006/picture">
+                      <pic:pic xmlns:pic="http://schemas.openxmlformats.org/drawingml/2006/picture">
+                        <pic:nvPicPr>
+                          <pic:cNvPr id="677070305" name=""/>
+                          <pic:cNvPicPr/>
+                        </pic:nvPicPr>
+                        <pic:blipFill>
+                          <a:blip r:embed="rId7"/>
+                          <a:stretch>
+                            <a:fillRect/>
+                          </a:stretch>
+                        </pic:blipFill>
+                        <pic:spPr>
+                          <a:xfrm>
+                            <a:off x="0" y="0"/>
+                            <a:ext cx="1891991" cy="1527563"/>
+                          </a:xfrm>
+                          <a:prstGeom prst="rect">
+                            <a:avLst/>
+                          </a:prstGeom>
+                        </pic:spPr>
+                      </pic:pic>
+                    </a:graphicData>
+                  </a:graphic>
+                </wp:inline>
+              </w:drawing>
             </w:r>
           </w:p>
         </w:tc>
@@ -1225,6 +1177,7 @@
                 <w:sz w:val="20"/>
                 <w:szCs w:val="20"/>
               </w:rPr>
+              <w:lastRenderedPageBreak/>
               <w:t>2</w:t>
             </w:r>
           </w:p>
@@ -1325,7 +1278,62 @@
                 <w:sz w:val="20"/>
                 <w:szCs w:val="20"/>
               </w:rPr>
-              <w:t>&lt;yes/no&gt;</w:t>
+              <w:t>Pass</w:t>
+            </w:r>
+          </w:p>
+          <w:p>
+            <w:pPr>
+              <w:spacing w:before="80" w:after="80"/>
+              <w:rPr>
+                <w:rFonts w:ascii="Arial" w:hAnsi="Arial" w:cs="Arial"/>
+                <w:color w:val="C00000"/>
+                <w:sz w:val="20"/>
+                <w:szCs w:val="20"/>
+              </w:rPr>
+            </w:pPr>
+            <w:r>
+              <w:rPr>
+                <w:rFonts w:ascii="Arial" w:hAnsi="Arial" w:cs="Arial"/>
+                <w:noProof/>
+                <w:color w:val="C00000"/>
+                <w:sz w:val="20"/>
+                <w:szCs w:val="20"/>
+              </w:rPr>
+              <w:drawing>
+                <wp:inline distT="0" distB="0" distL="0" distR="0" wp14:anchorId="3C1D49EC" wp14:editId="6A2773C0">
+                  <wp:extent cx="1866258" cy="2385060"/>
+                  <wp:effectExtent l="0" t="0" r="1270" b="0"/>
+                  <wp:docPr id="208105274" name="Picture 1"/>
+                  <wp:cNvGraphicFramePr>
+                    <a:graphicFrameLocks xmlns:a="http://schemas.openxmlformats.org/drawingml/2006/main" noChangeAspect="1"/>
+                  </wp:cNvGraphicFramePr>
+                  <a:graphic xmlns:a="http://schemas.openxmlformats.org/drawingml/2006/main">
+                    <a:graphicData uri="http://schemas.openxmlformats.org/drawingml/2006/picture">
+                      <pic:pic xmlns:pic="http://schemas.openxmlformats.org/drawingml/2006/picture">
+                        <pic:nvPicPr>
+                          <pic:cNvPr id="208105274" name=""/>
+                          <pic:cNvPicPr/>
+                        </pic:nvPicPr>
+                        <pic:blipFill>
+                          <a:blip r:embed="rId8"/>
+                          <a:stretch>
+                            <a:fillRect/>
+                          </a:stretch>
+                        </pic:blipFill>
+                        <pic:spPr>
+                          <a:xfrm>
+                            <a:off x="0" y="0"/>
+                            <a:ext cx="1870702" cy="2390740"/>
+                          </a:xfrm>
+                          <a:prstGeom prst="rect">
+                            <a:avLst/>
+                          </a:prstGeom>
+                        </pic:spPr>
+                      </pic:pic>
+                    </a:graphicData>
+                  </a:graphic>
+                </wp:inline>
+              </w:drawing>
             </w:r>
           </w:p>
         </w:tc>
@@ -1453,7 +1461,63 @@
                 <w:sz w:val="20"/>
                 <w:szCs w:val="20"/>
               </w:rPr>
-              <w:t>&lt;yes/no&gt;</w:t>
+              <w:t>Pass</w:t>
+            </w:r>
+          </w:p>
+          <w:p>
+            <w:pPr>
+              <w:spacing w:before="80" w:after="80"/>
+              <w:rPr>
+                <w:rFonts w:ascii="Arial" w:hAnsi="Arial" w:cs="Arial"/>
+                <w:color w:val="C00000"/>
+                <w:sz w:val="20"/>
+                <w:szCs w:val="20"/>
+              </w:rPr>
+            </w:pPr>
+            <w:r>
+              <w:rPr>
+                <w:rFonts w:ascii="Arial" w:hAnsi="Arial" w:cs="Arial"/>
+                <w:noProof/>
+                <w:color w:val="C00000"/>
+                <w:sz w:val="20"/>
+                <w:szCs w:val="20"/>
+              </w:rPr>
+              <w:lastRenderedPageBreak/>
+              <w:drawing>
+                <wp:inline distT="0" distB="0" distL="0" distR="0" wp14:anchorId="1B337D2F" wp14:editId="4C66D16D">
+                  <wp:extent cx="1357989" cy="1767840"/>
+                  <wp:effectExtent l="0" t="0" r="0" b="3810"/>
+                  <wp:docPr id="729284753" name="Picture 1"/>
+                  <wp:cNvGraphicFramePr>
+                    <a:graphicFrameLocks xmlns:a="http://schemas.openxmlformats.org/drawingml/2006/main" noChangeAspect="1"/>
+                  </wp:cNvGraphicFramePr>
+                  <a:graphic xmlns:a="http://schemas.openxmlformats.org/drawingml/2006/main">
+                    <a:graphicData uri="http://schemas.openxmlformats.org/drawingml/2006/picture">
+                      <pic:pic xmlns:pic="http://schemas.openxmlformats.org/drawingml/2006/picture">
+                        <pic:nvPicPr>
+                          <pic:cNvPr id="729284753" name=""/>
+                          <pic:cNvPicPr/>
+                        </pic:nvPicPr>
+                        <pic:blipFill>
+                          <a:blip r:embed="rId9"/>
+                          <a:stretch>
+                            <a:fillRect/>
+                          </a:stretch>
+                        </pic:blipFill>
+                        <pic:spPr>
+                          <a:xfrm>
+                            <a:off x="0" y="0"/>
+                            <a:ext cx="1364397" cy="1776182"/>
+                          </a:xfrm>
+                          <a:prstGeom prst="rect">
+                            <a:avLst/>
+                          </a:prstGeom>
+                        </pic:spPr>
+                      </pic:pic>
+                    </a:graphicData>
+                  </a:graphic>
+                </wp:inline>
+              </w:drawing>
             </w:r>
           </w:p>
         </w:tc>
@@ -1481,6 +1545,7 @@
                 <w:sz w:val="20"/>
                 <w:szCs w:val="20"/>
               </w:rPr>
+              <w:lastRenderedPageBreak/>
               <w:t>4</w:t>
             </w:r>
           </w:p>
@@ -1581,7 +1646,62 @@
                 <w:sz w:val="20"/>
                 <w:szCs w:val="20"/>
               </w:rPr>
-              <w:t>&lt;yes/no&gt;</w:t>
+              <w:t>Pass</w:t>
+            </w:r>
+          </w:p>
+          <w:p>
+            <w:pPr>
+              <w:spacing w:before="80" w:after="80"/>
+              <w:rPr>
+                <w:rFonts w:ascii="Arial" w:hAnsi="Arial" w:cs="Arial"/>
+                <w:color w:val="C00000"/>
+                <w:sz w:val="20"/>
+                <w:szCs w:val="20"/>
+              </w:rPr>
+            </w:pPr>
+            <w:r>
+              <w:rPr>
+                <w:rFonts w:ascii="Arial" w:hAnsi="Arial" w:cs="Arial"/>
+                <w:noProof/>
+                <w:color w:val="C00000"/>
+                <w:sz w:val="20"/>
+                <w:szCs w:val="20"/>
+              </w:rPr>
+              <w:drawing>
+                <wp:inline distT="0" distB="0" distL="0" distR="0" wp14:anchorId="7F333C0C" wp14:editId="6B93A3CC">
+                  <wp:extent cx="8229600" cy="351155"/>
+                  <wp:effectExtent l="0" t="0" r="0" b="0"/>
+                  <wp:docPr id="649417500" name="Picture 1"/>
+                  <wp:cNvGraphicFramePr>
+                    <a:graphicFrameLocks xmlns:a="http://schemas.openxmlformats.org/drawingml/2006/main" noChangeAspect="1"/>
+                  </wp:cNvGraphicFramePr>
+                  <a:graphic xmlns:a="http://schemas.openxmlformats.org/drawingml/2006/main">
+                    <a:graphicData uri="http://schemas.openxmlformats.org/drawingml/2006/picture">
+                      <pic:pic xmlns:pic="http://schemas.openxmlformats.org/drawingml/2006/picture">
+                        <pic:nvPicPr>
+                          <pic:cNvPr id="649417500" name=""/>
+                          <pic:cNvPicPr/>
+                        </pic:nvPicPr>
+                        <pic:blipFill>
+                          <a:blip r:embed="rId10"/>
+                          <a:stretch>
+                            <a:fillRect/>
+                          </a:stretch>
+                        </pic:blipFill>
+                        <pic:spPr>
+                          <a:xfrm>
+                            <a:off x="0" y="0"/>
+                            <a:ext cx="8229600" cy="351155"/>
+                          </a:xfrm>
+                          <a:prstGeom prst="rect">
+                            <a:avLst/>
+                          </a:prstGeom>
+                        </pic:spPr>
+                      </pic:pic>
+                    </a:graphicData>
+                  </a:graphic>
+                </wp:inline>
+              </w:drawing>
             </w:r>
           </w:p>
         </w:tc>
@@ -1729,7 +1849,62 @@
                 <w:sz w:val="20"/>
                 <w:szCs w:val="20"/>
               </w:rPr>
-              <w:t>&lt;yes/no&gt;</w:t>
+              <w:t>Pass</w:t>
+            </w:r>
+          </w:p>
+          <w:p>
+            <w:pPr>
+              <w:spacing w:before="80" w:after="80"/>
+              <w:rPr>
+                <w:rFonts w:ascii="Arial" w:hAnsi="Arial" w:cs="Arial"/>
+                <w:color w:val="C00000"/>
+                <w:sz w:val="20"/>
+                <w:szCs w:val="20"/>
+              </w:rPr>
+            </w:pPr>
+            <w:r>
+              <w:rPr>
+                <w:rFonts w:ascii="Arial" w:hAnsi="Arial" w:cs="Arial"/>
+                <w:noProof/>
+                <w:color w:val="C00000"/>
+                <w:sz w:val="20"/>
+                <w:szCs w:val="20"/>
+              </w:rPr>
+              <w:drawing>
+                <wp:inline distT="0" distB="0" distL="0" distR="0" wp14:anchorId="4C794C7E" wp14:editId="4149FC2E">
+                  <wp:extent cx="1226057" cy="1660525"/>
+                  <wp:effectExtent l="0" t="0" r="0" b="0"/>
+                  <wp:docPr id="1595664700" name="Picture 1"/>
+                  <wp:cNvGraphicFramePr>
+                    <a:graphicFrameLocks xmlns:a="http://schemas.openxmlformats.org/drawingml/2006/main" noChangeAspect="1"/>
+                  </wp:cNvGraphicFramePr>
+                  <a:graphic xmlns:a="http://schemas.openxmlformats.org/drawingml/2006/main">
+                    <a:graphicData uri="http://schemas.openxmlformats.org/drawingml/2006/picture">
+                      <pic:pic xmlns:pic="http://schemas.openxmlformats.org/drawingml/2006/picture">
+                        <pic:nvPicPr>
+                          <pic:cNvPr id="1595664700" name=""/>
+                          <pic:cNvPicPr/>
+                        </pic:nvPicPr>
+                        <pic:blipFill>
+                          <a:blip r:embed="rId11"/>
+                          <a:stretch>
+                            <a:fillRect/>
+                          </a:stretch>
+                        </pic:blipFill>
+                        <pic:spPr>
+                          <a:xfrm>
+                            <a:off x="0" y="0"/>
+                            <a:ext cx="1231800" cy="1668304"/>
+                          </a:xfrm>
+                          <a:prstGeom prst="rect">
+                            <a:avLst/>
+                          </a:prstGeom>
+                        </pic:spPr>
+                      </pic:pic>
+                    </a:graphicData>
+                  </a:graphic>
+                </wp:inline>
+              </w:drawing>
             </w:r>
           </w:p>
         </w:tc>
@@ -1761,6 +1936,7 @@
                 <w:sz w:val="20"/>
                 <w:szCs w:val="20"/>
               </w:rPr>
+              <w:lastRenderedPageBreak/>
               <w:t>Comments</w:t>
             </w:r>
           </w:p>
@@ -1788,6 +1964,1475 @@
                 <w:szCs w:val="20"/>
               </w:rPr>
               <w:t>The valid reservation lookup test passed successfully. The page was able to accept an existing reservation ID and display the matching reservation information from the database. This confirms that the lookup page and backend connection are working correctly for valid reservation records.</w:t>
+            </w:r>
+          </w:p>
+        </w:tc>
+      </w:tr>
+    </w:tbl>
+    <w:p>
+      <w:pPr>
+        <w:pStyle w:val="NoSpacing"/>
+        <w:rPr>
+          <w:rFonts w:ascii="Arial" w:hAnsi="Arial" w:cs="Arial"/>
+          <w:sz w:val="24"/>
+          <w:szCs w:val="24"/>
+        </w:rPr>
+      </w:pPr>
+    </w:p>
+    <w:tbl>
+      <w:tblPr>
+        <w:tblStyle w:val="TableGrid"/>
+        <w:tblW w:w="0" w:type="auto"/>
+        <w:tblLook w:val="04A0" w:firstRow="1" w:lastRow="0" w:firstColumn="1" w:lastColumn="0" w:noHBand="0" w:noVBand="1"/>
+      </w:tblPr>
+      <w:tblGrid>
+        <w:gridCol w:w="1251"/>
+        <w:gridCol w:w="2702"/>
+        <w:gridCol w:w="3060"/>
+        <w:gridCol w:w="1731"/>
+        <w:gridCol w:w="4206"/>
+      </w:tblGrid>
+      <w:tr>
+        <w:trPr>
+          <w:trHeight w:val="710"/>
+        </w:trPr>
+        <w:tc>
+          <w:tcPr>
+            <w:tcW w:w="1250" w:type="dxa"/>
+          </w:tcPr>
+          <w:p>
+            <w:pPr>
+              <w:pStyle w:val="NoSpacing"/>
+              <w:spacing w:before="80" w:after="80"/>
+              <w:rPr>
+                <w:rFonts w:ascii="Arial" w:hAnsi="Arial" w:cs="Arial"/>
+                <w:sz w:val="24"/>
+                <w:szCs w:val="24"/>
+              </w:rPr>
+            </w:pPr>
+            <w:r>
+              <w:rPr>
+                <w:rFonts w:ascii="Arial" w:hAnsi="Arial" w:cs="Arial"/>
+                <w:sz w:val="24"/>
+                <w:szCs w:val="24"/>
+              </w:rPr>
+              <w:t xml:space="preserve">Test </w:t>
+            </w:r>
+            <w:r>
+              <w:rPr>
+                <w:rFonts w:ascii="Arial" w:hAnsi="Arial" w:cs="Arial"/>
+                <w:sz w:val="24"/>
+                <w:szCs w:val="24"/>
+              </w:rPr>
+              <w:t>2</w:t>
+            </w:r>
+          </w:p>
+        </w:tc>
+        <w:tc>
+          <w:tcPr>
+            <w:tcW w:w="11700" w:type="dxa"/>
+            <w:gridSpan w:val="4"/>
+          </w:tcPr>
+          <w:p>
+            <w:pPr>
+              <w:pStyle w:val="Heading1"/>
+              <w:rPr>
+                <w:rFonts w:ascii="Arial" w:hAnsi="Arial" w:cs="Arial"/>
+                <w:b/>
+                <w:bCs/>
+              </w:rPr>
+            </w:pPr>
+            <w:r>
+              <w:rPr>
+                <w:rFonts w:ascii="Arial" w:hAnsi="Arial" w:cs="Arial"/>
+                <w:b/>
+                <w:bCs/>
+                <w:color w:val="auto"/>
+              </w:rPr>
+              <w:t xml:space="preserve">Reservation Lookup </w:t>
+            </w:r>
+            <w:proofErr w:type="gramStart"/>
+            <w:r>
+              <w:rPr>
+                <w:rFonts w:ascii="Arial" w:hAnsi="Arial" w:cs="Arial"/>
+                <w:b/>
+                <w:bCs/>
+                <w:color w:val="auto"/>
+              </w:rPr>
+              <w:t>With</w:t>
+            </w:r>
+            <w:proofErr w:type="gramEnd"/>
+            <w:r>
+              <w:rPr>
+                <w:rFonts w:ascii="Arial" w:hAnsi="Arial" w:cs="Arial"/>
+                <w:b/>
+                <w:bCs/>
+                <w:color w:val="auto"/>
+              </w:rPr>
+              <w:t xml:space="preserve"> Invalid Reservation ID</w:t>
+            </w:r>
+          </w:p>
+        </w:tc>
+      </w:tr>
+      <w:tr>
+        <w:trPr>
+          <w:trHeight w:val="620"/>
+        </w:trPr>
+        <w:tc>
+          <w:tcPr>
+            <w:tcW w:w="1250" w:type="dxa"/>
+          </w:tcPr>
+          <w:p>
+            <w:pPr>
+              <w:pStyle w:val="NoSpacing"/>
+              <w:spacing w:before="80" w:after="80"/>
+              <w:rPr>
+                <w:rFonts w:ascii="Arial" w:hAnsi="Arial" w:cs="Arial"/>
+                <w:sz w:val="24"/>
+                <w:szCs w:val="24"/>
+              </w:rPr>
+            </w:pPr>
+          </w:p>
+        </w:tc>
+        <w:tc>
+          <w:tcPr>
+            <w:tcW w:w="3570" w:type="dxa"/>
+          </w:tcPr>
+          <w:p>
+            <w:pPr>
+              <w:rPr>
+                <w:rFonts w:ascii="Arial" w:hAnsi="Arial" w:cs="Arial"/>
+                <w:sz w:val="20"/>
+                <w:szCs w:val="20"/>
+              </w:rPr>
+            </w:pPr>
+            <w:r>
+              <w:rPr>
+                <w:rFonts w:ascii="Arial" w:hAnsi="Arial" w:cs="Arial"/>
+                <w:b/>
+                <w:bCs/>
+                <w:sz w:val="20"/>
+                <w:szCs w:val="20"/>
+              </w:rPr>
+              <w:t>Test Objective</w:t>
+            </w:r>
+            <w:r>
+              <w:rPr>
+                <w:rFonts w:ascii="Arial" w:hAnsi="Arial" w:cs="Arial"/>
+                <w:b/>
+                <w:bCs/>
+                <w:sz w:val="20"/>
+                <w:szCs w:val="20"/>
+              </w:rPr>
+              <w:t xml:space="preserve">: </w:t>
+            </w:r>
+            <w:r>
+              <w:rPr>
+                <w:rFonts w:ascii="Arial" w:hAnsi="Arial" w:cs="Arial"/>
+                <w:color w:val="EE0000"/>
+                <w:sz w:val="20"/>
+                <w:szCs w:val="20"/>
+              </w:rPr>
+              <w:t>Verifies that the system displays an error or not found message when a user enters a reservation ID that does not exist.</w:t>
+            </w:r>
+          </w:p>
+        </w:tc>
+        <w:tc>
+          <w:tcPr>
+            <w:tcW w:w="3930" w:type="dxa"/>
+          </w:tcPr>
+          <w:p>
+            <w:pPr>
+              <w:rPr>
+                <w:rFonts w:ascii="Arial" w:hAnsi="Arial" w:cs="Arial"/>
+                <w:b/>
+                <w:bCs/>
+                <w:sz w:val="20"/>
+                <w:szCs w:val="20"/>
+              </w:rPr>
+            </w:pPr>
+            <w:proofErr w:type="spellStart"/>
+            <w:r>
+              <w:rPr>
+                <w:rFonts w:ascii="Arial" w:hAnsi="Arial" w:cs="Arial"/>
+                <w:b/>
+                <w:bCs/>
+                <w:sz w:val="20"/>
+                <w:szCs w:val="20"/>
+              </w:rPr>
+              <w:t>Developer:</w:t>
+            </w:r>
+            <w:r>
+              <w:rPr>
+                <w:rFonts w:ascii="Arial" w:hAnsi="Arial" w:cs="Arial"/>
+                <w:b/>
+                <w:bCs/>
+                <w:sz w:val="20"/>
+                <w:szCs w:val="20"/>
+              </w:rPr>
+              <w:t>Angela</w:t>
+            </w:r>
+            <w:proofErr w:type="spellEnd"/>
+            <w:r>
+              <w:rPr>
+                <w:rFonts w:ascii="Arial" w:hAnsi="Arial" w:cs="Arial"/>
+                <w:b/>
+                <w:bCs/>
+                <w:sz w:val="20"/>
+                <w:szCs w:val="20"/>
+              </w:rPr>
+              <w:t xml:space="preserve"> V</w:t>
+            </w:r>
+          </w:p>
+          <w:p>
+            <w:pPr>
+              <w:rPr>
+                <w:rFonts w:ascii="Arial" w:hAnsi="Arial" w:cs="Arial"/>
+                <w:sz w:val="20"/>
+                <w:szCs w:val="20"/>
+              </w:rPr>
+            </w:pPr>
+            <w:r>
+              <w:rPr>
+                <w:rFonts w:ascii="Arial" w:hAnsi="Arial" w:cs="Arial"/>
+                <w:b/>
+                <w:bCs/>
+                <w:sz w:val="20"/>
+                <w:szCs w:val="20"/>
+              </w:rPr>
+              <w:t>Date tested:</w:t>
+            </w:r>
+            <w:r>
+              <w:rPr>
+                <w:rFonts w:ascii="Arial" w:hAnsi="Arial" w:cs="Arial"/>
+                <w:sz w:val="20"/>
+                <w:szCs w:val="20"/>
+              </w:rPr>
+              <w:t xml:space="preserve"> </w:t>
+            </w:r>
+            <w:r>
+              <w:rPr>
+                <w:rFonts w:ascii="Arial" w:hAnsi="Arial" w:cs="Arial"/>
+                <w:color w:val="C00000"/>
+                <w:sz w:val="20"/>
+                <w:szCs w:val="20"/>
+              </w:rPr>
+              <w:t>04/29/2026</w:t>
+            </w:r>
+            <w:r>
+              <w:rPr>
+                <w:rFonts w:ascii="Arial" w:hAnsi="Arial" w:cs="Arial"/>
+                <w:color w:val="C00000"/>
+                <w:sz w:val="20"/>
+                <w:szCs w:val="20"/>
+              </w:rPr>
+              <w:t xml:space="preserve"> </w:t>
+            </w:r>
+          </w:p>
+        </w:tc>
+        <w:tc>
+          <w:tcPr>
+            <w:tcW w:w="4200" w:type="dxa"/>
+            <w:gridSpan w:val="2"/>
+          </w:tcPr>
+          <w:p>
+            <w:pPr>
+              <w:rPr>
+                <w:rFonts w:ascii="Arial" w:hAnsi="Arial" w:cs="Arial"/>
+                <w:b/>
+                <w:bCs/>
+                <w:sz w:val="20"/>
+                <w:szCs w:val="20"/>
+              </w:rPr>
+            </w:pPr>
+            <w:r>
+              <w:rPr>
+                <w:rFonts w:ascii="Arial" w:hAnsi="Arial" w:cs="Arial"/>
+                <w:b/>
+                <w:bCs/>
+                <w:sz w:val="20"/>
+                <w:szCs w:val="20"/>
+              </w:rPr>
+              <w:t xml:space="preserve">Peer tester: </w:t>
+            </w:r>
+            <w:r>
+              <w:rPr>
+                <w:rFonts w:ascii="Arial" w:hAnsi="Arial" w:cs="Arial"/>
+                <w:b/>
+                <w:bCs/>
+                <w:sz w:val="20"/>
+                <w:szCs w:val="20"/>
+              </w:rPr>
+              <w:t>Zachary Anderson</w:t>
+            </w:r>
+          </w:p>
+          <w:p>
+            <w:pPr>
+              <w:rPr>
+                <w:rFonts w:ascii="Arial" w:hAnsi="Arial" w:cs="Arial"/>
+                <w:sz w:val="20"/>
+                <w:szCs w:val="20"/>
+              </w:rPr>
+            </w:pPr>
+            <w:r>
+              <w:rPr>
+                <w:rFonts w:ascii="Arial" w:hAnsi="Arial" w:cs="Arial"/>
+                <w:b/>
+                <w:bCs/>
+                <w:sz w:val="20"/>
+                <w:szCs w:val="20"/>
+              </w:rPr>
+              <w:t>Date tested:</w:t>
+            </w:r>
+            <w:r>
+              <w:rPr>
+                <w:rFonts w:ascii="Arial" w:hAnsi="Arial" w:cs="Arial"/>
+                <w:sz w:val="20"/>
+                <w:szCs w:val="20"/>
+              </w:rPr>
+              <w:t xml:space="preserve"> </w:t>
+            </w:r>
+            <w:r>
+              <w:rPr>
+                <w:rFonts w:ascii="Arial" w:hAnsi="Arial" w:cs="Arial"/>
+                <w:color w:val="C00000"/>
+                <w:sz w:val="20"/>
+                <w:szCs w:val="20"/>
+              </w:rPr>
+              <w:t>5/2/2026</w:t>
+            </w:r>
+          </w:p>
+        </w:tc>
+      </w:tr>
+      <w:tr>
+        <w:trPr>
+          <w:trHeight w:val="350"/>
+        </w:trPr>
+        <w:tc>
+          <w:tcPr>
+            <w:tcW w:w="1250" w:type="dxa"/>
+          </w:tcPr>
+          <w:p>
+            <w:pPr>
+              <w:spacing w:before="80" w:after="80"/>
+              <w:rPr>
+                <w:rFonts w:ascii="Arial" w:hAnsi="Arial" w:cs="Arial"/>
+                <w:b/>
+                <w:bCs/>
+                <w:sz w:val="20"/>
+                <w:szCs w:val="20"/>
+              </w:rPr>
+            </w:pPr>
+            <w:r>
+              <w:rPr>
+                <w:rFonts w:ascii="Arial" w:hAnsi="Arial" w:cs="Arial"/>
+                <w:b/>
+                <w:bCs/>
+                <w:sz w:val="20"/>
+                <w:szCs w:val="20"/>
+              </w:rPr>
+              <w:t>Step</w:t>
+            </w:r>
+          </w:p>
+        </w:tc>
+        <w:tc>
+          <w:tcPr>
+            <w:tcW w:w="3570" w:type="dxa"/>
+          </w:tcPr>
+          <w:p>
+            <w:pPr>
+              <w:spacing w:before="80" w:after="80"/>
+              <w:rPr>
+                <w:rFonts w:ascii="Arial" w:hAnsi="Arial" w:cs="Arial"/>
+                <w:b/>
+                <w:bCs/>
+                <w:sz w:val="20"/>
+                <w:szCs w:val="20"/>
+              </w:rPr>
+            </w:pPr>
+            <w:r>
+              <w:rPr>
+                <w:rFonts w:ascii="Arial" w:hAnsi="Arial" w:cs="Arial"/>
+                <w:b/>
+                <w:bCs/>
+                <w:sz w:val="20"/>
+                <w:szCs w:val="20"/>
+              </w:rPr>
+              <w:t>Action</w:t>
+            </w:r>
+          </w:p>
+        </w:tc>
+        <w:tc>
+          <w:tcPr>
+            <w:tcW w:w="3930" w:type="dxa"/>
+          </w:tcPr>
+          <w:p>
+            <w:pPr>
+              <w:spacing w:before="80" w:after="80"/>
+              <w:rPr>
+                <w:rFonts w:ascii="Arial" w:hAnsi="Arial" w:cs="Arial"/>
+                <w:b/>
+                <w:bCs/>
+                <w:sz w:val="20"/>
+                <w:szCs w:val="20"/>
+              </w:rPr>
+            </w:pPr>
+            <w:r>
+              <w:rPr>
+                <w:rFonts w:ascii="Arial" w:hAnsi="Arial" w:cs="Arial"/>
+                <w:b/>
+                <w:bCs/>
+                <w:sz w:val="20"/>
+                <w:szCs w:val="20"/>
+              </w:rPr>
+              <w:t>Expected results:</w:t>
+            </w:r>
+          </w:p>
+        </w:tc>
+        <w:tc>
+          <w:tcPr>
+            <w:tcW w:w="2148" w:type="dxa"/>
+          </w:tcPr>
+          <w:p>
+            <w:pPr>
+              <w:spacing w:before="80" w:after="80"/>
+              <w:rPr>
+                <w:rFonts w:ascii="Arial" w:hAnsi="Arial" w:cs="Arial"/>
+                <w:b/>
+                <w:bCs/>
+                <w:sz w:val="20"/>
+                <w:szCs w:val="20"/>
+              </w:rPr>
+            </w:pPr>
+            <w:r>
+              <w:rPr>
+                <w:rFonts w:ascii="Arial" w:hAnsi="Arial" w:cs="Arial"/>
+                <w:b/>
+                <w:bCs/>
+                <w:sz w:val="20"/>
+                <w:szCs w:val="20"/>
+              </w:rPr>
+              <w:t>Developer pass/fail</w:t>
+            </w:r>
+          </w:p>
+        </w:tc>
+        <w:tc>
+          <w:tcPr>
+            <w:tcW w:w="2052" w:type="dxa"/>
+          </w:tcPr>
+          <w:p>
+            <w:pPr>
+              <w:spacing w:before="80" w:after="80"/>
+              <w:rPr>
+                <w:rFonts w:ascii="Arial" w:hAnsi="Arial" w:cs="Arial"/>
+                <w:b/>
+                <w:bCs/>
+                <w:sz w:val="20"/>
+                <w:szCs w:val="20"/>
+              </w:rPr>
+            </w:pPr>
+            <w:r>
+              <w:rPr>
+                <w:rFonts w:ascii="Arial" w:hAnsi="Arial" w:cs="Arial"/>
+                <w:b/>
+                <w:bCs/>
+                <w:sz w:val="20"/>
+                <w:szCs w:val="20"/>
+              </w:rPr>
+              <w:t>Tester pass/fail</w:t>
+            </w:r>
+          </w:p>
+        </w:tc>
+      </w:tr>
+      <w:tr>
+        <w:trPr>
+          <w:trHeight w:val="350"/>
+        </w:trPr>
+        <w:tc>
+          <w:tcPr>
+            <w:tcW w:w="1250" w:type="dxa"/>
+          </w:tcPr>
+          <w:p>
+            <w:pPr>
+              <w:spacing w:before="80" w:after="80"/>
+              <w:rPr>
+                <w:rFonts w:ascii="Arial" w:hAnsi="Arial" w:cs="Arial"/>
+                <w:sz w:val="20"/>
+                <w:szCs w:val="20"/>
+              </w:rPr>
+            </w:pPr>
+            <w:r>
+              <w:rPr>
+                <w:rFonts w:ascii="Arial" w:hAnsi="Arial" w:cs="Arial"/>
+                <w:sz w:val="20"/>
+                <w:szCs w:val="20"/>
+              </w:rPr>
+              <w:t>1</w:t>
+            </w:r>
+          </w:p>
+        </w:tc>
+        <w:tc>
+          <w:tcPr>
+            <w:tcW w:w="3570" w:type="dxa"/>
+          </w:tcPr>
+          <w:p>
+            <w:pPr>
+              <w:spacing w:before="80" w:after="80"/>
+              <w:rPr>
+                <w:rFonts w:ascii="Arial" w:hAnsi="Arial" w:cs="Arial"/>
+                <w:color w:val="C00000"/>
+                <w:sz w:val="20"/>
+                <w:szCs w:val="20"/>
+              </w:rPr>
+            </w:pPr>
+            <w:r>
+              <w:rPr>
+                <w:rFonts w:ascii="Arial" w:hAnsi="Arial" w:cs="Arial"/>
+                <w:color w:val="C00000"/>
+                <w:sz w:val="20"/>
+                <w:szCs w:val="20"/>
+              </w:rPr>
+              <w:t>Open the Reservation Lookup page</w:t>
+            </w:r>
+            <w:r>
+              <w:rPr>
+                <w:rFonts w:ascii="Arial" w:hAnsi="Arial" w:cs="Arial"/>
+                <w:color w:val="C00000"/>
+                <w:sz w:val="20"/>
+                <w:szCs w:val="20"/>
+              </w:rPr>
+              <w:t xml:space="preserve"> after logging in</w:t>
+            </w:r>
+            <w:r>
+              <w:rPr>
+                <w:rFonts w:ascii="Arial" w:hAnsi="Arial" w:cs="Arial"/>
+                <w:color w:val="C00000"/>
+                <w:sz w:val="20"/>
+                <w:szCs w:val="20"/>
+              </w:rPr>
+              <w:t>.</w:t>
+            </w:r>
+          </w:p>
+        </w:tc>
+        <w:tc>
+          <w:tcPr>
+            <w:tcW w:w="3930" w:type="dxa"/>
+          </w:tcPr>
+          <w:p>
+            <w:pPr>
+              <w:spacing w:before="80" w:after="80"/>
+              <w:rPr>
+                <w:rFonts w:ascii="Arial" w:hAnsi="Arial" w:cs="Arial"/>
+                <w:color w:val="C00000"/>
+                <w:sz w:val="20"/>
+                <w:szCs w:val="20"/>
+              </w:rPr>
+            </w:pPr>
+            <w:r>
+              <w:rPr>
+                <w:rFonts w:ascii="Arial" w:hAnsi="Arial" w:cs="Arial"/>
+                <w:color w:val="C00000"/>
+                <w:sz w:val="20"/>
+                <w:szCs w:val="20"/>
+              </w:rPr>
+              <w:t>The page loads successfully and displays the reservation ID input field.</w:t>
+            </w:r>
+          </w:p>
+        </w:tc>
+        <w:tc>
+          <w:tcPr>
+            <w:tcW w:w="2148" w:type="dxa"/>
+          </w:tcPr>
+          <w:p>
+            <w:pPr>
+              <w:spacing w:before="80" w:after="80"/>
+              <w:rPr>
+                <w:rFonts w:ascii="Arial" w:hAnsi="Arial" w:cs="Arial"/>
+                <w:color w:val="C00000"/>
+                <w:sz w:val="20"/>
+                <w:szCs w:val="20"/>
+              </w:rPr>
+            </w:pPr>
+            <w:r>
+              <w:rPr>
+                <w:rFonts w:ascii="Arial" w:hAnsi="Arial" w:cs="Arial"/>
+                <w:color w:val="C00000"/>
+                <w:sz w:val="20"/>
+                <w:szCs w:val="20"/>
+              </w:rPr>
+              <w:t>Pass</w:t>
+            </w:r>
+          </w:p>
+        </w:tc>
+        <w:tc>
+          <w:tcPr>
+            <w:tcW w:w="2052" w:type="dxa"/>
+          </w:tcPr>
+          <w:p>
+            <w:pPr>
+              <w:spacing w:before="80" w:after="80"/>
+              <w:rPr>
+                <w:rFonts w:ascii="Arial" w:hAnsi="Arial" w:cs="Arial"/>
+                <w:color w:val="C00000"/>
+                <w:sz w:val="20"/>
+                <w:szCs w:val="20"/>
+              </w:rPr>
+            </w:pPr>
+            <w:r>
+              <w:rPr>
+                <w:rFonts w:ascii="Arial" w:hAnsi="Arial" w:cs="Arial"/>
+                <w:color w:val="C00000"/>
+                <w:sz w:val="20"/>
+                <w:szCs w:val="20"/>
+              </w:rPr>
+              <w:t>Pass</w:t>
+            </w:r>
+          </w:p>
+          <w:p>
+            <w:pPr>
+              <w:spacing w:before="80" w:after="80"/>
+              <w:rPr>
+                <w:rFonts w:ascii="Arial" w:hAnsi="Arial" w:cs="Arial"/>
+                <w:color w:val="C00000"/>
+                <w:sz w:val="20"/>
+                <w:szCs w:val="20"/>
+              </w:rPr>
+            </w:pPr>
+            <w:r>
+              <w:rPr>
+                <w:rFonts w:ascii="Arial" w:hAnsi="Arial" w:cs="Arial"/>
+                <w:noProof/>
+                <w:color w:val="C00000"/>
+                <w:sz w:val="20"/>
+                <w:szCs w:val="20"/>
+              </w:rPr>
+              <w:drawing>
+                <wp:inline distT="0" distB="0" distL="0" distR="0" wp14:anchorId="199BD26A" wp14:editId="09E3E9F4">
+                  <wp:extent cx="2529355" cy="2042160"/>
+                  <wp:effectExtent l="0" t="0" r="4445" b="0"/>
+                  <wp:docPr id="1193201968" name="Picture 1"/>
+                  <wp:cNvGraphicFramePr>
+                    <a:graphicFrameLocks xmlns:a="http://schemas.openxmlformats.org/drawingml/2006/main" noChangeAspect="1"/>
+                  </wp:cNvGraphicFramePr>
+                  <a:graphic xmlns:a="http://schemas.openxmlformats.org/drawingml/2006/main">
+                    <a:graphicData uri="http://schemas.openxmlformats.org/drawingml/2006/picture">
+                      <pic:pic xmlns:pic="http://schemas.openxmlformats.org/drawingml/2006/picture">
+                        <pic:nvPicPr>
+                          <pic:cNvPr id="677070305" name=""/>
+                          <pic:cNvPicPr/>
+                        </pic:nvPicPr>
+                        <pic:blipFill>
+                          <a:blip r:embed="rId7"/>
+                          <a:stretch>
+                            <a:fillRect/>
+                          </a:stretch>
+                        </pic:blipFill>
+                        <pic:spPr>
+                          <a:xfrm>
+                            <a:off x="0" y="0"/>
+                            <a:ext cx="2536797" cy="2048169"/>
+                          </a:xfrm>
+                          <a:prstGeom prst="rect">
+                            <a:avLst/>
+                          </a:prstGeom>
+                        </pic:spPr>
+                      </pic:pic>
+                    </a:graphicData>
+                  </a:graphic>
+                </wp:inline>
+              </w:drawing>
+            </w:r>
+          </w:p>
+        </w:tc>
+      </w:tr>
+      <w:tr>
+        <w:trPr>
+          <w:trHeight w:val="350"/>
+        </w:trPr>
+        <w:tc>
+          <w:tcPr>
+            <w:tcW w:w="1250" w:type="dxa"/>
+          </w:tcPr>
+          <w:p>
+            <w:pPr>
+              <w:spacing w:before="80" w:after="80"/>
+              <w:rPr>
+                <w:rFonts w:ascii="Arial" w:hAnsi="Arial" w:cs="Arial"/>
+                <w:sz w:val="20"/>
+                <w:szCs w:val="20"/>
+              </w:rPr>
+            </w:pPr>
+            <w:r>
+              <w:rPr>
+                <w:rFonts w:ascii="Arial" w:hAnsi="Arial" w:cs="Arial"/>
+                <w:sz w:val="20"/>
+                <w:szCs w:val="20"/>
+              </w:rPr>
+              <w:t>2</w:t>
+            </w:r>
+          </w:p>
+        </w:tc>
+        <w:tc>
+          <w:tcPr>
+            <w:tcW w:w="3570" w:type="dxa"/>
+          </w:tcPr>
+          <w:p>
+            <w:pPr>
+              <w:spacing w:before="80" w:after="80"/>
+              <w:rPr>
+                <w:rFonts w:ascii="Arial" w:hAnsi="Arial" w:cs="Arial"/>
+                <w:color w:val="C00000"/>
+                <w:sz w:val="20"/>
+                <w:szCs w:val="20"/>
+              </w:rPr>
+            </w:pPr>
+            <w:r>
+              <w:rPr>
+                <w:rFonts w:ascii="Arial" w:hAnsi="Arial" w:cs="Arial"/>
+                <w:color w:val="C00000"/>
+                <w:sz w:val="20"/>
+                <w:szCs w:val="20"/>
+              </w:rPr>
+              <w:t xml:space="preserve">Enter an invalid reservation ID, such as </w:t>
+            </w:r>
+            <w:r>
+              <w:rPr>
+                <w:rFonts w:ascii="Arial" w:hAnsi="Arial" w:cs="Arial"/>
+                <w:color w:val="C00000"/>
+                <w:sz w:val="20"/>
+                <w:szCs w:val="20"/>
+              </w:rPr>
+              <w:t>0000</w:t>
+            </w:r>
+            <w:r>
+              <w:rPr>
+                <w:rFonts w:ascii="Arial" w:hAnsi="Arial" w:cs="Arial"/>
+                <w:color w:val="C00000"/>
+                <w:sz w:val="20"/>
+                <w:szCs w:val="20"/>
+              </w:rPr>
+              <w:t xml:space="preserve"> or another ID not in the database.</w:t>
+            </w:r>
+          </w:p>
+        </w:tc>
+        <w:tc>
+          <w:tcPr>
+            <w:tcW w:w="3930" w:type="dxa"/>
+          </w:tcPr>
+          <w:p>
+            <w:pPr>
+              <w:spacing w:before="80" w:after="80"/>
+              <w:rPr>
+                <w:rFonts w:ascii="Arial" w:hAnsi="Arial" w:cs="Arial"/>
+                <w:color w:val="C00000"/>
+                <w:sz w:val="20"/>
+                <w:szCs w:val="20"/>
+              </w:rPr>
+            </w:pPr>
+            <w:r>
+              <w:rPr>
+                <w:rFonts w:ascii="Arial" w:hAnsi="Arial" w:cs="Arial"/>
+                <w:color w:val="C00000"/>
+                <w:sz w:val="20"/>
+                <w:szCs w:val="20"/>
+              </w:rPr>
+              <w:t>The invalid reservation ID is entered into the field.</w:t>
+            </w:r>
+          </w:p>
+        </w:tc>
+        <w:tc>
+          <w:tcPr>
+            <w:tcW w:w="2148" w:type="dxa"/>
+          </w:tcPr>
+          <w:p>
+            <w:pPr>
+              <w:spacing w:before="80" w:after="80"/>
+              <w:rPr>
+                <w:rFonts w:ascii="Arial" w:hAnsi="Arial" w:cs="Arial"/>
+                <w:color w:val="C00000"/>
+                <w:sz w:val="20"/>
+                <w:szCs w:val="20"/>
+              </w:rPr>
+            </w:pPr>
+            <w:r>
+              <w:rPr>
+                <w:rFonts w:ascii="Arial" w:hAnsi="Arial" w:cs="Arial"/>
+                <w:color w:val="C00000"/>
+                <w:sz w:val="20"/>
+                <w:szCs w:val="20"/>
+              </w:rPr>
+              <w:t>Pass</w:t>
+            </w:r>
+          </w:p>
+        </w:tc>
+        <w:tc>
+          <w:tcPr>
+            <w:tcW w:w="2052" w:type="dxa"/>
+          </w:tcPr>
+          <w:p>
+            <w:pPr>
+              <w:spacing w:before="80" w:after="80"/>
+              <w:rPr>
+                <w:rFonts w:ascii="Arial" w:hAnsi="Arial" w:cs="Arial"/>
+                <w:color w:val="C00000"/>
+                <w:sz w:val="20"/>
+                <w:szCs w:val="20"/>
+              </w:rPr>
+            </w:pPr>
+            <w:r>
+              <w:rPr>
+                <w:rFonts w:ascii="Arial" w:hAnsi="Arial" w:cs="Arial"/>
+                <w:color w:val="C00000"/>
+                <w:sz w:val="20"/>
+                <w:szCs w:val="20"/>
+              </w:rPr>
+              <w:t>Pass</w:t>
+            </w:r>
+          </w:p>
+          <w:p>
+            <w:pPr>
+              <w:spacing w:before="80" w:after="80"/>
+              <w:rPr>
+                <w:rFonts w:ascii="Arial" w:hAnsi="Arial" w:cs="Arial"/>
+                <w:color w:val="C00000"/>
+                <w:sz w:val="20"/>
+                <w:szCs w:val="20"/>
+              </w:rPr>
+            </w:pPr>
+            <w:r>
+              <w:rPr>
+                <w:rFonts w:ascii="Arial" w:hAnsi="Arial" w:cs="Arial"/>
+                <w:noProof/>
+                <w:color w:val="C00000"/>
+                <w:sz w:val="20"/>
+                <w:szCs w:val="20"/>
+              </w:rPr>
+              <w:lastRenderedPageBreak/>
+              <w:drawing>
+                <wp:inline distT="0" distB="0" distL="0" distR="0" wp14:anchorId="07163F1B" wp14:editId="05415BF0">
+                  <wp:extent cx="1555022" cy="1830705"/>
+                  <wp:effectExtent l="0" t="0" r="7620" b="0"/>
+                  <wp:docPr id="2057275480" name="Picture 1"/>
+                  <wp:cNvGraphicFramePr>
+                    <a:graphicFrameLocks xmlns:a="http://schemas.openxmlformats.org/drawingml/2006/main" noChangeAspect="1"/>
+                  </wp:cNvGraphicFramePr>
+                  <a:graphic xmlns:a="http://schemas.openxmlformats.org/drawingml/2006/main">
+                    <a:graphicData uri="http://schemas.openxmlformats.org/drawingml/2006/picture">
+                      <pic:pic xmlns:pic="http://schemas.openxmlformats.org/drawingml/2006/picture">
+                        <pic:nvPicPr>
+                          <pic:cNvPr id="2057275480" name=""/>
+                          <pic:cNvPicPr/>
+                        </pic:nvPicPr>
+                        <pic:blipFill>
+                          <a:blip r:embed="rId12"/>
+                          <a:stretch>
+                            <a:fillRect/>
+                          </a:stretch>
+                        </pic:blipFill>
+                        <pic:spPr>
+                          <a:xfrm>
+                            <a:off x="0" y="0"/>
+                            <a:ext cx="1558817" cy="1835173"/>
+                          </a:xfrm>
+                          <a:prstGeom prst="rect">
+                            <a:avLst/>
+                          </a:prstGeom>
+                        </pic:spPr>
+                      </pic:pic>
+                    </a:graphicData>
+                  </a:graphic>
+                </wp:inline>
+              </w:drawing>
+            </w:r>
+          </w:p>
+        </w:tc>
+      </w:tr>
+      <w:tr>
+        <w:trPr>
+          <w:trHeight w:val="350"/>
+        </w:trPr>
+        <w:tc>
+          <w:tcPr>
+            <w:tcW w:w="1250" w:type="dxa"/>
+          </w:tcPr>
+          <w:p>
+            <w:pPr>
+              <w:spacing w:before="80" w:after="80"/>
+              <w:rPr>
+                <w:rFonts w:ascii="Arial" w:hAnsi="Arial" w:cs="Arial"/>
+                <w:sz w:val="20"/>
+                <w:szCs w:val="20"/>
+              </w:rPr>
+            </w:pPr>
+            <w:r>
+              <w:rPr>
+                <w:rFonts w:ascii="Arial" w:hAnsi="Arial" w:cs="Arial"/>
+                <w:sz w:val="20"/>
+                <w:szCs w:val="20"/>
+              </w:rPr>
+              <w:lastRenderedPageBreak/>
+              <w:t>3</w:t>
+            </w:r>
+          </w:p>
+        </w:tc>
+        <w:tc>
+          <w:tcPr>
+            <w:tcW w:w="3570" w:type="dxa"/>
+          </w:tcPr>
+          <w:p>
+            <w:pPr>
+              <w:spacing w:before="80" w:after="80"/>
+              <w:rPr>
+                <w:rFonts w:ascii="Arial" w:hAnsi="Arial" w:cs="Arial"/>
+                <w:color w:val="C00000"/>
+                <w:sz w:val="20"/>
+                <w:szCs w:val="20"/>
+              </w:rPr>
+            </w:pPr>
+            <w:r>
+              <w:rPr>
+                <w:rFonts w:ascii="Arial" w:hAnsi="Arial" w:cs="Arial"/>
+                <w:color w:val="C00000"/>
+                <w:sz w:val="20"/>
+                <w:szCs w:val="20"/>
+              </w:rPr>
+              <w:t>Click the Lookup/Search button.</w:t>
+            </w:r>
+          </w:p>
+        </w:tc>
+        <w:tc>
+          <w:tcPr>
+            <w:tcW w:w="3930" w:type="dxa"/>
+          </w:tcPr>
+          <w:p>
+            <w:pPr>
+              <w:spacing w:before="80" w:after="80"/>
+              <w:rPr>
+                <w:rFonts w:ascii="Arial" w:hAnsi="Arial" w:cs="Arial"/>
+                <w:color w:val="C00000"/>
+                <w:sz w:val="20"/>
+                <w:szCs w:val="20"/>
+              </w:rPr>
+            </w:pPr>
+            <w:r>
+              <w:rPr>
+                <w:rFonts w:ascii="Arial" w:hAnsi="Arial" w:cs="Arial"/>
+                <w:color w:val="C00000"/>
+                <w:sz w:val="20"/>
+                <w:szCs w:val="20"/>
+              </w:rPr>
+              <w:t>The system searches the database for the reservation ID.</w:t>
+            </w:r>
+          </w:p>
+        </w:tc>
+        <w:tc>
+          <w:tcPr>
+            <w:tcW w:w="2148" w:type="dxa"/>
+          </w:tcPr>
+          <w:p>
+            <w:pPr>
+              <w:spacing w:before="80" w:after="80"/>
+              <w:rPr>
+                <w:rFonts w:ascii="Arial" w:hAnsi="Arial" w:cs="Arial"/>
+                <w:color w:val="C00000"/>
+                <w:sz w:val="20"/>
+                <w:szCs w:val="20"/>
+              </w:rPr>
+            </w:pPr>
+            <w:r>
+              <w:rPr>
+                <w:rFonts w:ascii="Arial" w:hAnsi="Arial" w:cs="Arial"/>
+                <w:color w:val="C00000"/>
+                <w:sz w:val="20"/>
+                <w:szCs w:val="20"/>
+              </w:rPr>
+              <w:t>Pass</w:t>
+            </w:r>
+          </w:p>
+        </w:tc>
+        <w:tc>
+          <w:tcPr>
+            <w:tcW w:w="2052" w:type="dxa"/>
+          </w:tcPr>
+          <w:p>
+            <w:pPr>
+              <w:spacing w:before="80" w:after="80"/>
+              <w:rPr>
+                <w:rFonts w:ascii="Arial" w:hAnsi="Arial" w:cs="Arial"/>
+                <w:color w:val="C00000"/>
+                <w:sz w:val="20"/>
+                <w:szCs w:val="20"/>
+              </w:rPr>
+            </w:pPr>
+            <w:r>
+              <w:rPr>
+                <w:rFonts w:ascii="Arial" w:hAnsi="Arial" w:cs="Arial"/>
+                <w:noProof/>
+                <w:color w:val="C00000"/>
+                <w:sz w:val="20"/>
+                <w:szCs w:val="20"/>
+              </w:rPr>
+              <w:drawing>
+                <wp:inline distT="0" distB="0" distL="0" distR="0" wp14:anchorId="21A3AF5D" wp14:editId="547B0807">
+                  <wp:extent cx="1665074" cy="1992629"/>
+                  <wp:effectExtent l="0" t="0" r="0" b="8255"/>
+                  <wp:docPr id="196980164" name="Picture 1"/>
+                  <wp:cNvGraphicFramePr>
+                    <a:graphicFrameLocks xmlns:a="http://schemas.openxmlformats.org/drawingml/2006/main" noChangeAspect="1"/>
+                  </wp:cNvGraphicFramePr>
+                  <a:graphic xmlns:a="http://schemas.openxmlformats.org/drawingml/2006/main">
+                    <a:graphicData uri="http://schemas.openxmlformats.org/drawingml/2006/picture">
+                      <pic:pic xmlns:pic="http://schemas.openxmlformats.org/drawingml/2006/picture">
+                        <pic:nvPicPr>
+                          <pic:cNvPr id="196980164" name=""/>
+                          <pic:cNvPicPr/>
+                        </pic:nvPicPr>
+                        <pic:blipFill>
+                          <a:blip r:embed="rId13"/>
+                          <a:stretch>
+                            <a:fillRect/>
+                          </a:stretch>
+                        </pic:blipFill>
+                        <pic:spPr>
+                          <a:xfrm>
+                            <a:off x="0" y="0"/>
+                            <a:ext cx="1670057" cy="1998592"/>
+                          </a:xfrm>
+                          <a:prstGeom prst="rect">
+                            <a:avLst/>
+                          </a:prstGeom>
+                        </pic:spPr>
+                      </pic:pic>
+                    </a:graphicData>
+                  </a:graphic>
+                </wp:inline>
+              </w:drawing>
+            </w:r>
+          </w:p>
+        </w:tc>
+      </w:tr>
+      <w:tr>
+        <w:trPr>
+          <w:trHeight w:val="350"/>
+        </w:trPr>
+        <w:tc>
+          <w:tcPr>
+            <w:tcW w:w="1250" w:type="dxa"/>
+          </w:tcPr>
+          <w:p>
+            <w:pPr>
+              <w:spacing w:before="80" w:after="80"/>
+              <w:rPr>
+                <w:rFonts w:ascii="Arial" w:hAnsi="Arial" w:cs="Arial"/>
+                <w:sz w:val="20"/>
+                <w:szCs w:val="20"/>
+              </w:rPr>
+            </w:pPr>
+            <w:r>
+              <w:rPr>
+                <w:rFonts w:ascii="Arial" w:hAnsi="Arial" w:cs="Arial"/>
+                <w:sz w:val="20"/>
+                <w:szCs w:val="20"/>
+              </w:rPr>
+              <w:t>4</w:t>
+            </w:r>
+          </w:p>
+        </w:tc>
+        <w:tc>
+          <w:tcPr>
+            <w:tcW w:w="3570" w:type="dxa"/>
+          </w:tcPr>
+          <w:p>
+            <w:pPr>
+              <w:spacing w:before="80" w:after="80"/>
+              <w:rPr>
+                <w:rFonts w:ascii="Arial" w:hAnsi="Arial" w:cs="Arial"/>
+                <w:color w:val="C00000"/>
+                <w:sz w:val="20"/>
+                <w:szCs w:val="20"/>
+              </w:rPr>
+            </w:pPr>
+            <w:r>
+              <w:rPr>
+                <w:rFonts w:ascii="Arial" w:hAnsi="Arial" w:cs="Arial"/>
+                <w:color w:val="C00000"/>
+                <w:sz w:val="20"/>
+                <w:szCs w:val="20"/>
+              </w:rPr>
+              <w:t>Review the result message.</w:t>
+            </w:r>
+          </w:p>
+        </w:tc>
+        <w:tc>
+          <w:tcPr>
+            <w:tcW w:w="3930" w:type="dxa"/>
+          </w:tcPr>
+          <w:p>
+            <w:pPr>
+              <w:spacing w:before="80" w:after="80"/>
+              <w:rPr>
+                <w:rFonts w:ascii="Arial" w:hAnsi="Arial" w:cs="Arial"/>
+                <w:color w:val="C00000"/>
+                <w:sz w:val="20"/>
+                <w:szCs w:val="20"/>
+              </w:rPr>
+            </w:pPr>
+            <w:r>
+              <w:rPr>
+                <w:rFonts w:ascii="Arial" w:hAnsi="Arial" w:cs="Arial"/>
+                <w:color w:val="C00000"/>
+                <w:sz w:val="20"/>
+                <w:szCs w:val="20"/>
+              </w:rPr>
+              <w:t>The page displays a message saying the reservation was not found.</w:t>
+            </w:r>
+          </w:p>
+        </w:tc>
+        <w:tc>
+          <w:tcPr>
+            <w:tcW w:w="2148" w:type="dxa"/>
+          </w:tcPr>
+          <w:p>
+            <w:pPr>
+              <w:spacing w:before="80" w:after="80"/>
+              <w:rPr>
+                <w:rFonts w:ascii="Arial" w:hAnsi="Arial" w:cs="Arial"/>
+                <w:color w:val="C00000"/>
+                <w:sz w:val="20"/>
+                <w:szCs w:val="20"/>
+              </w:rPr>
+            </w:pPr>
+            <w:r>
+              <w:rPr>
+                <w:rFonts w:ascii="Arial" w:hAnsi="Arial" w:cs="Arial"/>
+                <w:color w:val="C00000"/>
+                <w:sz w:val="20"/>
+                <w:szCs w:val="20"/>
+              </w:rPr>
+              <w:t>Pass</w:t>
+            </w:r>
+          </w:p>
+        </w:tc>
+        <w:tc>
+          <w:tcPr>
+            <w:tcW w:w="2052" w:type="dxa"/>
+          </w:tcPr>
+          <w:p>
+            <w:pPr>
+              <w:spacing w:before="80" w:after="80"/>
+              <w:rPr>
+                <w:rFonts w:ascii="Arial" w:hAnsi="Arial" w:cs="Arial"/>
+                <w:color w:val="C00000"/>
+                <w:sz w:val="20"/>
+                <w:szCs w:val="20"/>
+              </w:rPr>
+            </w:pPr>
+            <w:r>
+              <w:rPr>
+                <w:rFonts w:ascii="Arial" w:hAnsi="Arial" w:cs="Arial"/>
+                <w:color w:val="C00000"/>
+                <w:sz w:val="20"/>
+                <w:szCs w:val="20"/>
+              </w:rPr>
+              <w:t>Pass</w:t>
+            </w:r>
+          </w:p>
+          <w:p>
+            <w:pPr>
+              <w:spacing w:before="80" w:after="80"/>
+              <w:rPr>
+                <w:rFonts w:ascii="Arial" w:hAnsi="Arial" w:cs="Arial"/>
+                <w:color w:val="C00000"/>
+                <w:sz w:val="20"/>
+                <w:szCs w:val="20"/>
+              </w:rPr>
+            </w:pPr>
+            <w:r>
+              <w:rPr>
+                <w:rFonts w:ascii="Arial" w:hAnsi="Arial" w:cs="Arial"/>
+                <w:noProof/>
+                <w:color w:val="C00000"/>
+                <w:sz w:val="20"/>
+                <w:szCs w:val="20"/>
+              </w:rPr>
+              <w:lastRenderedPageBreak/>
+              <w:drawing>
+                <wp:inline distT="0" distB="0" distL="0" distR="0" wp14:anchorId="5F67E54D" wp14:editId="2FD4A453">
+                  <wp:extent cx="1665074" cy="1992629"/>
+                  <wp:effectExtent l="0" t="0" r="0" b="8255"/>
+                  <wp:docPr id="347925980" name="Picture 1"/>
+                  <wp:cNvGraphicFramePr>
+                    <a:graphicFrameLocks xmlns:a="http://schemas.openxmlformats.org/drawingml/2006/main" noChangeAspect="1"/>
+                  </wp:cNvGraphicFramePr>
+                  <a:graphic xmlns:a="http://schemas.openxmlformats.org/drawingml/2006/main">
+                    <a:graphicData uri="http://schemas.openxmlformats.org/drawingml/2006/picture">
+                      <pic:pic xmlns:pic="http://schemas.openxmlformats.org/drawingml/2006/picture">
+                        <pic:nvPicPr>
+                          <pic:cNvPr id="196980164" name=""/>
+                          <pic:cNvPicPr/>
+                        </pic:nvPicPr>
+                        <pic:blipFill>
+                          <a:blip r:embed="rId13"/>
+                          <a:stretch>
+                            <a:fillRect/>
+                          </a:stretch>
+                        </pic:blipFill>
+                        <pic:spPr>
+                          <a:xfrm>
+                            <a:off x="0" y="0"/>
+                            <a:ext cx="1670057" cy="1998592"/>
+                          </a:xfrm>
+                          <a:prstGeom prst="rect">
+                            <a:avLst/>
+                          </a:prstGeom>
+                        </pic:spPr>
+                      </pic:pic>
+                    </a:graphicData>
+                  </a:graphic>
+                </wp:inline>
+              </w:drawing>
+            </w:r>
+          </w:p>
+        </w:tc>
+      </w:tr>
+      <w:tr>
+        <w:trPr>
+          <w:trHeight w:val="350"/>
+        </w:trPr>
+        <w:tc>
+          <w:tcPr>
+            <w:tcW w:w="1250" w:type="dxa"/>
+          </w:tcPr>
+          <w:p>
+            <w:pPr>
+              <w:spacing w:before="80" w:after="80"/>
+              <w:rPr>
+                <w:rFonts w:ascii="Arial" w:hAnsi="Arial" w:cs="Arial"/>
+                <w:sz w:val="20"/>
+                <w:szCs w:val="20"/>
+              </w:rPr>
+            </w:pPr>
+            <w:r>
+              <w:rPr>
+                <w:rFonts w:ascii="Arial" w:hAnsi="Arial" w:cs="Arial"/>
+                <w:sz w:val="20"/>
+                <w:szCs w:val="20"/>
+              </w:rPr>
+              <w:lastRenderedPageBreak/>
+              <w:t>5</w:t>
+            </w:r>
+          </w:p>
+        </w:tc>
+        <w:tc>
+          <w:tcPr>
+            <w:tcW w:w="3570" w:type="dxa"/>
+          </w:tcPr>
+          <w:p>
+            <w:pPr>
+              <w:spacing w:before="80" w:after="80"/>
+              <w:rPr>
+                <w:rFonts w:ascii="Arial" w:hAnsi="Arial" w:cs="Arial"/>
+                <w:color w:val="C00000"/>
+                <w:sz w:val="20"/>
+                <w:szCs w:val="20"/>
+              </w:rPr>
+            </w:pPr>
+            <w:r>
+              <w:rPr>
+                <w:rFonts w:ascii="Arial" w:hAnsi="Arial" w:cs="Arial"/>
+                <w:color w:val="C00000"/>
+                <w:sz w:val="20"/>
+                <w:szCs w:val="20"/>
+              </w:rPr>
+              <w:t>Enter another reservation ID to test again.</w:t>
+            </w:r>
+          </w:p>
+        </w:tc>
+        <w:tc>
+          <w:tcPr>
+            <w:tcW w:w="3930" w:type="dxa"/>
+          </w:tcPr>
+          <w:p>
+            <w:pPr>
+              <w:spacing w:before="80" w:after="80"/>
+              <w:rPr>
+                <w:rFonts w:ascii="Arial" w:hAnsi="Arial" w:cs="Arial"/>
+                <w:color w:val="C00000"/>
+                <w:sz w:val="20"/>
+                <w:szCs w:val="20"/>
+              </w:rPr>
+            </w:pPr>
+            <w:r>
+              <w:rPr>
+                <w:rFonts w:ascii="Arial" w:hAnsi="Arial" w:cs="Arial"/>
+                <w:color w:val="C00000"/>
+                <w:sz w:val="20"/>
+                <w:szCs w:val="20"/>
+              </w:rPr>
+              <w:t>The page allows another lookup without crashing or redirecting incorrectly.</w:t>
+            </w:r>
+          </w:p>
+        </w:tc>
+        <w:tc>
+          <w:tcPr>
+            <w:tcW w:w="2148" w:type="dxa"/>
+          </w:tcPr>
+          <w:p>
+            <w:pPr>
+              <w:spacing w:before="80" w:after="80"/>
+              <w:rPr>
+                <w:rFonts w:ascii="Arial" w:hAnsi="Arial" w:cs="Arial"/>
+                <w:color w:val="C00000"/>
+                <w:sz w:val="20"/>
+                <w:szCs w:val="20"/>
+              </w:rPr>
+            </w:pPr>
+            <w:r>
+              <w:rPr>
+                <w:rFonts w:ascii="Arial" w:hAnsi="Arial" w:cs="Arial"/>
+                <w:color w:val="C00000"/>
+                <w:sz w:val="20"/>
+                <w:szCs w:val="20"/>
+              </w:rPr>
+              <w:t>Pass</w:t>
+            </w:r>
+          </w:p>
+        </w:tc>
+        <w:tc>
+          <w:tcPr>
+            <w:tcW w:w="2052" w:type="dxa"/>
+          </w:tcPr>
+          <w:p>
+            <w:pPr>
+              <w:spacing w:before="80" w:after="80"/>
+              <w:rPr>
+                <w:rFonts w:ascii="Arial" w:hAnsi="Arial" w:cs="Arial"/>
+                <w:color w:val="C00000"/>
+                <w:sz w:val="20"/>
+                <w:szCs w:val="20"/>
+              </w:rPr>
+            </w:pPr>
+            <w:r>
+              <w:rPr>
+                <w:rFonts w:ascii="Arial" w:hAnsi="Arial" w:cs="Arial"/>
+                <w:color w:val="C00000"/>
+                <w:sz w:val="20"/>
+                <w:szCs w:val="20"/>
+              </w:rPr>
+              <w:t>Pass</w:t>
+            </w:r>
+          </w:p>
+          <w:p>
+            <w:pPr>
+              <w:spacing w:before="80" w:after="80"/>
+              <w:rPr>
+                <w:rFonts w:ascii="Arial" w:hAnsi="Arial" w:cs="Arial"/>
+                <w:color w:val="C00000"/>
+                <w:sz w:val="20"/>
+                <w:szCs w:val="20"/>
+              </w:rPr>
+            </w:pPr>
+            <w:r>
+              <w:rPr>
+                <w:rFonts w:ascii="Arial" w:hAnsi="Arial" w:cs="Arial"/>
+                <w:noProof/>
+                <w:color w:val="C00000"/>
+                <w:sz w:val="20"/>
+                <w:szCs w:val="20"/>
+              </w:rPr>
+              <w:drawing>
+                <wp:inline distT="0" distB="0" distL="0" distR="0" wp14:anchorId="15DD6A1D" wp14:editId="79F107EB">
+                  <wp:extent cx="1306830" cy="2406912"/>
+                  <wp:effectExtent l="0" t="0" r="7620" b="0"/>
+                  <wp:docPr id="1449955108" name="Picture 1"/>
+                  <wp:cNvGraphicFramePr>
+                    <a:graphicFrameLocks xmlns:a="http://schemas.openxmlformats.org/drawingml/2006/main" noChangeAspect="1"/>
+                  </wp:cNvGraphicFramePr>
+                  <a:graphic xmlns:a="http://schemas.openxmlformats.org/drawingml/2006/main">
+                    <a:graphicData uri="http://schemas.openxmlformats.org/drawingml/2006/picture">
+                      <pic:pic xmlns:pic="http://schemas.openxmlformats.org/drawingml/2006/picture">
+                        <pic:nvPicPr>
+                          <pic:cNvPr id="1449955108" name=""/>
+                          <pic:cNvPicPr/>
+                        </pic:nvPicPr>
+                        <pic:blipFill>
+                          <a:blip r:embed="rId14"/>
+                          <a:stretch>
+                            <a:fillRect/>
+                          </a:stretch>
+                        </pic:blipFill>
+                        <pic:spPr>
+                          <a:xfrm>
+                            <a:off x="0" y="0"/>
+                            <a:ext cx="1312498" cy="2417352"/>
+                          </a:xfrm>
+                          <a:prstGeom prst="rect">
+                            <a:avLst/>
+                          </a:prstGeom>
+                        </pic:spPr>
+                      </pic:pic>
+                    </a:graphicData>
+                  </a:graphic>
+                </wp:inline>
+              </w:drawing>
+            </w:r>
+          </w:p>
+        </w:tc>
+      </w:tr>
+      <w:tr>
+        <w:trPr>
+          <w:trHeight w:val="350"/>
+        </w:trPr>
+        <w:tc>
+          <w:tcPr>
+            <w:tcW w:w="1250" w:type="dxa"/>
+          </w:tcPr>
+          <w:p>
+            <w:pPr>
+              <w:spacing w:before="80" w:after="80"/>
+              <w:rPr>
+                <w:rFonts w:ascii="Arial" w:hAnsi="Arial" w:cs="Arial"/>
+                <w:b/>
+                <w:bCs/>
+                <w:sz w:val="20"/>
+                <w:szCs w:val="20"/>
+              </w:rPr>
+            </w:pPr>
+            <w:r>
+              <w:rPr>
+                <w:rFonts w:ascii="Arial" w:hAnsi="Arial" w:cs="Arial"/>
+                <w:b/>
+                <w:bCs/>
+                <w:sz w:val="20"/>
+                <w:szCs w:val="20"/>
+              </w:rPr>
+              <w:t>Comments</w:t>
+            </w:r>
+          </w:p>
+        </w:tc>
+        <w:tc>
+          <w:tcPr>
+            <w:tcW w:w="11700" w:type="dxa"/>
+            <w:gridSpan w:val="4"/>
+          </w:tcPr>
+          <w:p>
+            <w:pPr>
+              <w:spacing w:before="80" w:after="80"/>
+              <w:rPr>
+                <w:rFonts w:ascii="Arial" w:hAnsi="Arial" w:cs="Arial"/>
+                <w:color w:val="C00000"/>
+                <w:sz w:val="20"/>
+                <w:szCs w:val="20"/>
+              </w:rPr>
+            </w:pPr>
+            <w:r>
+              <w:rPr>
+                <w:rFonts w:ascii="Arial" w:hAnsi="Arial" w:cs="Arial"/>
+                <w:color w:val="C00000"/>
+                <w:sz w:val="20"/>
+                <w:szCs w:val="20"/>
+              </w:rPr>
+              <w:t>The invalid reservation lookup test passed successfully. When a reservation ID that does not exist was entered, the system did not display incorrect reservation information. Instead, it showed a clear not found message, which helps the user understand that the reservation could not be located.</w:t>
             </w:r>
           </w:p>
         </w:tc>
@@ -1840,6 +3485,7 @@
                 <w:sz w:val="24"/>
                 <w:szCs w:val="24"/>
               </w:rPr>
+              <w:lastRenderedPageBreak/>
               <w:t xml:space="preserve">Test </w:t>
             </w:r>
             <w:r>
@@ -1848,7 +3494,7 @@
                 <w:sz w:val="24"/>
                 <w:szCs w:val="24"/>
               </w:rPr>
-              <w:t>2</w:t>
+              <w:t>3</w:t>
             </w:r>
           </w:p>
         </w:tc>
@@ -1873,27 +3519,7 @@
                 <w:bCs/>
                 <w:color w:val="auto"/>
               </w:rPr>
-              <w:t xml:space="preserve">Reservation Lookup </w:t>
-            </w:r>
-            <w:proofErr w:type="gramStart"/>
-            <w:r>
-              <w:rPr>
-                <w:rFonts w:ascii="Arial" w:hAnsi="Arial" w:cs="Arial"/>
-                <w:b/>
-                <w:bCs/>
-                <w:color w:val="auto"/>
-              </w:rPr>
-              <w:t>With</w:t>
-            </w:r>
-            <w:proofErr w:type="gramEnd"/>
-            <w:r>
-              <w:rPr>
-                <w:rFonts w:ascii="Arial" w:hAnsi="Arial" w:cs="Arial"/>
-                <w:b/>
-                <w:bCs/>
-                <w:color w:val="auto"/>
-              </w:rPr>
-              <w:t xml:space="preserve"> Invalid Reservation ID</w:t>
+              <w:t>Making a reservation &amp; looking it up</w:t>
             </w:r>
           </w:p>
         </w:tc>
@@ -1953,11 +3579,12 @@
             <w:r>
               <w:rPr>
                 <w:rFonts w:ascii="Arial" w:hAnsi="Arial" w:cs="Arial"/>
-                <w:color w:val="EE0000"/>
-                <w:sz w:val="20"/>
-                <w:szCs w:val="20"/>
-              </w:rPr>
-              <w:t>Verifies that the system displays an error or not found message when a user enters a reservation ID that does not exist.</w:t>
+                <w:b/>
+                <w:bCs/>
+                <w:sz w:val="20"/>
+                <w:szCs w:val="20"/>
+              </w:rPr>
+              <w:t>Test database update with new reservation and lookup feature</w:t>
             </w:r>
           </w:p>
         </w:tc>
@@ -1975,8 +3602,6 @@
                 <w:szCs w:val="20"/>
               </w:rPr>
             </w:pPr>
-            <w:proofErr w:type="spellStart"/>
-            <w:proofErr w:type="gramStart"/>
             <w:r>
               <w:rPr>
                 <w:rFonts w:ascii="Arial" w:hAnsi="Arial" w:cs="Arial"/>
@@ -1995,19 +3620,7 @@
                 <w:sz w:val="20"/>
                 <w:szCs w:val="20"/>
               </w:rPr>
-              <w:t>Angela</w:t>
-            </w:r>
-            <w:proofErr w:type="spellEnd"/>
-            <w:proofErr w:type="gramEnd"/>
-            <w:r>
-              <w:rPr>
-                <w:rFonts w:ascii="Arial" w:hAnsi="Arial" w:cs="Arial"/>
-                <w:b/>
-                <w:bCs/>
-                <w:sz w:val="20"/>
-                <w:szCs w:val="20"/>
-              </w:rPr>
-              <w:t xml:space="preserve"> V</w:t>
+              <w:t xml:space="preserve"> Zachary Anderson</w:t>
             </w:r>
           </w:p>
           <w:p>
@@ -2043,7 +3656,7 @@
                 <w:sz w:val="20"/>
                 <w:szCs w:val="20"/>
               </w:rPr>
-              <w:t>04/29/2026</w:t>
+              <w:t>5/2/26</w:t>
             </w:r>
             <w:r>
               <w:rPr>
@@ -2196,6 +3809,16 @@
               </w:rPr>
               <w:t>Action</w:t>
             </w:r>
+            <w:r>
+              <w:rPr>
+                <w:rFonts w:ascii="Arial" w:hAnsi="Arial" w:cs="Arial"/>
+                <w:b/>
+                <w:bCs/>
+                <w:sz w:val="20"/>
+                <w:szCs w:val="20"/>
+              </w:rPr>
+              <w:t>\</w:t>
+            </w:r>
           </w:p>
         </w:tc>
         <w:tc>
@@ -2321,15 +3944,73 @@
                 <w:szCs w:val="20"/>
               </w:rPr>
             </w:pPr>
-            <w:r>
-              <w:rPr>
-                <w:rFonts w:ascii="Arial" w:hAnsi="Arial" w:cs="Arial"/>
-                <w:color w:val="C00000"/>
-                <w:sz w:val="20"/>
-                <w:szCs w:val="20"/>
-              </w:rPr>
-              <w:t>Open the Reservation Lookup page.</w:t>
-            </w:r>
+            <w:proofErr w:type="gramStart"/>
+            <w:r>
+              <w:rPr>
+                <w:rFonts w:ascii="Arial" w:hAnsi="Arial" w:cs="Arial"/>
+                <w:color w:val="C00000"/>
+                <w:sz w:val="20"/>
+                <w:szCs w:val="20"/>
+              </w:rPr>
+              <w:t>Open up</w:t>
+            </w:r>
+            <w:proofErr w:type="gramEnd"/>
+            <w:r>
+              <w:rPr>
+                <w:rFonts w:ascii="Arial" w:hAnsi="Arial" w:cs="Arial"/>
+                <w:color w:val="C00000"/>
+                <w:sz w:val="20"/>
+                <w:szCs w:val="20"/>
+              </w:rPr>
+              <w:t xml:space="preserve"> the login page and </w:t>
+            </w:r>
+            <w:r>
+              <w:rPr>
+                <w:rFonts w:ascii="Arial" w:hAnsi="Arial" w:cs="Arial"/>
+                <w:color w:val="C00000"/>
+                <w:sz w:val="20"/>
+                <w:szCs w:val="20"/>
+              </w:rPr>
+              <w:t>log in</w:t>
+            </w:r>
+            <w:r>
+              <w:rPr>
+                <w:rFonts w:ascii="Arial" w:hAnsi="Arial" w:cs="Arial"/>
+                <w:color w:val="C00000"/>
+                <w:sz w:val="20"/>
+                <w:szCs w:val="20"/>
+              </w:rPr>
+              <w:t xml:space="preserve"> </w:t>
+            </w:r>
+            <w:r>
+              <w:rPr>
+                <w:rFonts w:ascii="Arial" w:hAnsi="Arial" w:cs="Arial"/>
+                <w:color w:val="C00000"/>
+                <w:sz w:val="20"/>
+                <w:szCs w:val="20"/>
+              </w:rPr>
+              <w:t>as</w:t>
+            </w:r>
+            <w:r>
+              <w:rPr>
+                <w:rFonts w:ascii="Arial" w:hAnsi="Arial" w:cs="Arial"/>
+                <w:color w:val="C00000"/>
+                <w:sz w:val="20"/>
+                <w:szCs w:val="20"/>
+              </w:rPr>
+              <w:t xml:space="preserve"> a valid user</w:t>
+            </w:r>
+          </w:p>
+          <w:p>
+            <w:pPr>
+              <w:spacing w:before="80" w:after="80"/>
+              <w:rPr>
+                <w:rFonts w:ascii="Arial" w:hAnsi="Arial" w:cs="Arial"/>
+                <w:color w:val="C00000"/>
+                <w:sz w:val="20"/>
+                <w:szCs w:val="20"/>
+              </w:rPr>
+            </w:pPr>
           </w:p>
         </w:tc>
         <w:tc>
@@ -2353,7 +4034,16 @@
                 <w:sz w:val="20"/>
                 <w:szCs w:val="20"/>
               </w:rPr>
-              <w:t>The page loads successfully and displays the reservation ID input field.</w:t>
+              <w:t xml:space="preserve">Page loads and </w:t>
+            </w:r>
+            <w:r>
+              <w:rPr>
+                <w:rFonts w:ascii="Arial" w:hAnsi="Arial" w:cs="Arial"/>
+                <w:color w:val="C00000"/>
+                <w:sz w:val="20"/>
+                <w:szCs w:val="20"/>
+              </w:rPr>
+              <w:t>login credentials are accepted with a welcome message</w:t>
             </w:r>
           </w:p>
         </w:tc>
@@ -2449,32 +4139,25 @@
                 <w:szCs w:val="20"/>
               </w:rPr>
             </w:pPr>
-            <w:r>
-              <w:rPr>
-                <w:rFonts w:ascii="Arial" w:hAnsi="Arial" w:cs="Arial"/>
-                <w:color w:val="C00000"/>
-                <w:sz w:val="20"/>
-                <w:szCs w:val="20"/>
-              </w:rPr>
-              <w:t xml:space="preserve">Enter an invalid reservation ID, such as </w:t>
-            </w:r>
-            <w:r>
-              <w:rPr>
-                <w:rFonts w:ascii="Arial" w:hAnsi="Arial" w:cs="Arial"/>
-                <w:color w:val="C00000"/>
-                <w:sz w:val="20"/>
-                <w:szCs w:val="20"/>
-              </w:rPr>
-              <w:t>0000</w:t>
-            </w:r>
-            <w:r>
-              <w:rPr>
-                <w:rFonts w:ascii="Arial" w:hAnsi="Arial" w:cs="Arial"/>
-                <w:color w:val="C00000"/>
-                <w:sz w:val="20"/>
-                <w:szCs w:val="20"/>
-              </w:rPr>
-              <w:t xml:space="preserve"> or another ID not in the database.</w:t>
+            <w:proofErr w:type="gramStart"/>
+            <w:r>
+              <w:rPr>
+                <w:rFonts w:ascii="Arial" w:hAnsi="Arial" w:cs="Arial"/>
+                <w:color w:val="C00000"/>
+                <w:sz w:val="20"/>
+                <w:szCs w:val="20"/>
+              </w:rPr>
+              <w:t>Open up</w:t>
+            </w:r>
+            <w:proofErr w:type="gramEnd"/>
+            <w:r>
+              <w:rPr>
+                <w:rFonts w:ascii="Arial" w:hAnsi="Arial" w:cs="Arial"/>
+                <w:color w:val="C00000"/>
+                <w:sz w:val="20"/>
+                <w:szCs w:val="20"/>
+              </w:rPr>
+              <w:t xml:space="preserve"> the reservation page and make a new reservation</w:t>
             </w:r>
           </w:p>
         </w:tc>
@@ -2499,7 +4182,43 @@
                 <w:sz w:val="20"/>
                 <w:szCs w:val="20"/>
               </w:rPr>
-              <w:t>The invalid reservation ID is entered into the field.</w:t>
+              <w:t xml:space="preserve">Reservation summary is displayed (note down </w:t>
+            </w:r>
+            <w:r>
+              <w:rPr>
+                <w:rFonts w:ascii="Arial" w:hAnsi="Arial" w:cs="Arial"/>
+                <w:color w:val="C00000"/>
+                <w:sz w:val="20"/>
+                <w:szCs w:val="20"/>
+              </w:rPr>
+              <w:t xml:space="preserve">the </w:t>
+            </w:r>
+            <w:r>
+              <w:rPr>
+                <w:rFonts w:ascii="Arial" w:hAnsi="Arial" w:cs="Arial"/>
+                <w:color w:val="C00000"/>
+                <w:sz w:val="20"/>
+                <w:szCs w:val="20"/>
+              </w:rPr>
+              <w:t xml:space="preserve">reservation </w:t>
+            </w:r>
+            <w:r>
+              <w:rPr>
+                <w:rFonts w:ascii="Arial" w:hAnsi="Arial" w:cs="Arial"/>
+                <w:color w:val="C00000"/>
+                <w:sz w:val="20"/>
+                <w:szCs w:val="20"/>
+              </w:rPr>
+              <w:t>ID</w:t>
+            </w:r>
+            <w:r>
+              <w:rPr>
+                <w:rFonts w:ascii="Arial" w:hAnsi="Arial" w:cs="Arial"/>
+                <w:color w:val="C00000"/>
+                <w:sz w:val="20"/>
+                <w:szCs w:val="20"/>
+              </w:rPr>
+              <w:t>)</w:t>
             </w:r>
           </w:p>
         </w:tc>
@@ -2602,7 +4321,7 @@
                 <w:sz w:val="20"/>
                 <w:szCs w:val="20"/>
               </w:rPr>
-              <w:t>Click the Lookup/Search button.</w:t>
+              <w:t>Navigate to the reservation Lookup page</w:t>
             </w:r>
           </w:p>
         </w:tc>
@@ -2627,7 +4346,7 @@
                 <w:sz w:val="20"/>
                 <w:szCs w:val="20"/>
               </w:rPr>
-              <w:t>The system searches the database for the reservation ID.</w:t>
+              <w:t>Page loads without issue</w:t>
             </w:r>
           </w:p>
         </w:tc>
@@ -2730,7 +4449,25 @@
                 <w:sz w:val="20"/>
                 <w:szCs w:val="20"/>
               </w:rPr>
-              <w:t>Review the result message.</w:t>
+              <w:t xml:space="preserve">Type the reservation </w:t>
+            </w:r>
+            <w:r>
+              <w:rPr>
+                <w:rFonts w:ascii="Arial" w:hAnsi="Arial" w:cs="Arial"/>
+                <w:color w:val="C00000"/>
+                <w:sz w:val="20"/>
+                <w:szCs w:val="20"/>
+              </w:rPr>
+              <w:t>ID</w:t>
+            </w:r>
+            <w:r>
+              <w:rPr>
+                <w:rFonts w:ascii="Arial" w:hAnsi="Arial" w:cs="Arial"/>
+                <w:color w:val="C00000"/>
+                <w:sz w:val="20"/>
+                <w:szCs w:val="20"/>
+              </w:rPr>
+              <w:t xml:space="preserve"> from the recently created reservation</w:t>
             </w:r>
           </w:p>
         </w:tc>
@@ -2755,7 +4492,7 @@
                 <w:sz w:val="20"/>
                 <w:szCs w:val="20"/>
               </w:rPr>
-              <w:t>The page displays a message saying the reservation was not found.</w:t>
+              <w:t>The page displays a summary of the reservation</w:t>
             </w:r>
           </w:p>
         </w:tc>
@@ -2858,7 +4595,16 @@
                 <w:sz w:val="20"/>
                 <w:szCs w:val="20"/>
               </w:rPr>
-              <w:t>Enter another reservation ID to test again.</w:t>
+              <w:t>Log out</w:t>
+            </w:r>
+            <w:r>
+              <w:rPr>
+                <w:rFonts w:ascii="Arial" w:hAnsi="Arial" w:cs="Arial"/>
+                <w:color w:val="C00000"/>
+                <w:sz w:val="20"/>
+                <w:szCs w:val="20"/>
+              </w:rPr>
+              <w:t xml:space="preserve"> of the system</w:t>
             </w:r>
           </w:p>
         </w:tc>
@@ -2883,7 +4629,25 @@
                 <w:sz w:val="20"/>
                 <w:szCs w:val="20"/>
               </w:rPr>
-              <w:t>The page allows another lookup without crashing or redirecting incorrectly.</w:t>
+              <w:t xml:space="preserve">Page returns to </w:t>
+            </w:r>
+            <w:r>
+              <w:rPr>
+                <w:rFonts w:ascii="Arial" w:hAnsi="Arial" w:cs="Arial"/>
+                <w:color w:val="C00000"/>
+                <w:sz w:val="20"/>
+                <w:szCs w:val="20"/>
+              </w:rPr>
+              <w:t xml:space="preserve">the </w:t>
+            </w:r>
+            <w:r>
+              <w:rPr>
+                <w:rFonts w:ascii="Arial" w:hAnsi="Arial" w:cs="Arial"/>
+                <w:color w:val="C00000"/>
+                <w:sz w:val="20"/>
+                <w:szCs w:val="20"/>
+              </w:rPr>
+              <w:t>landing page</w:t>
             </w:r>
           </w:p>
         </w:tc>
@@ -2991,7 +4755,7 @@
                 <w:sz w:val="20"/>
                 <w:szCs w:val="20"/>
               </w:rPr>
-              <w:t>The invalid reservation lookup test passed successfully. When a reservation ID that does not exist was entered, the system did not display incorrect reservation information. Instead, it showed a clear not found message, which helps the user understand that the reservation could not be located.</w:t>
+              <w:t>Comments should be substantive; this means there should be at least 2-3 well-structured sentences with constructive feedback.</w:t>
             </w:r>
           </w:p>
         </w:tc>
@@ -3044,15 +4808,7 @@
                 <w:sz w:val="24"/>
                 <w:szCs w:val="24"/>
               </w:rPr>
-              <w:t xml:space="preserve">Test </w:t>
-            </w:r>
-            <w:r>
-              <w:rPr>
-                <w:rFonts w:ascii="Arial" w:hAnsi="Arial" w:cs="Arial"/>
-                <w:sz w:val="24"/>
-                <w:szCs w:val="24"/>
-              </w:rPr>
-              <w:t>3</w:t>
+              <w:t>Test 4</w:t>
             </w:r>
           </w:p>
         </w:tc>
@@ -3068,19 +4824,27 @@
                 <w:rFonts w:ascii="Arial" w:hAnsi="Arial" w:cs="Arial"/>
                 <w:b/>
                 <w:bCs/>
-              </w:rPr>
-            </w:pPr>
-            <w:bookmarkStart w:id="0" w:name="_Toc132718197"/>
-            <w:r>
-              <w:rPr>
-                <w:rFonts w:ascii="Arial" w:hAnsi="Arial" w:cs="Arial"/>
-                <w:b/>
-                <w:bCs/>
                 <w:color w:val="auto"/>
               </w:rPr>
-              <w:t>&lt;DESCRIPTION&gt;</w:t>
-            </w:r>
-            <w:bookmarkEnd w:id="0"/>
+            </w:pPr>
+            <w:r>
+              <w:rPr>
+                <w:rFonts w:ascii="Arial" w:hAnsi="Arial" w:cs="Arial"/>
+                <w:b/>
+                <w:bCs/>
+                <w:color w:val="auto"/>
+              </w:rPr>
+              <w:t>L</w:t>
+            </w:r>
+            <w:r>
+              <w:rPr>
+                <w:rFonts w:ascii="Arial" w:hAnsi="Arial" w:cs="Arial"/>
+                <w:b/>
+                <w:bCs/>
+                <w:color w:val="auto"/>
+              </w:rPr>
+              <w:t>ookup Reservation w/ Attractions</w:t>
+            </w:r>
           </w:p>
         </w:tc>
       </w:tr>
@@ -3136,6 +4900,16 @@
               </w:rPr>
               <w:t xml:space="preserve">: </w:t>
             </w:r>
+            <w:r>
+              <w:rPr>
+                <w:rFonts w:ascii="Arial" w:hAnsi="Arial" w:cs="Arial"/>
+                <w:b/>
+                <w:bCs/>
+                <w:sz w:val="20"/>
+                <w:szCs w:val="20"/>
+              </w:rPr>
+              <w:t xml:space="preserve">Test lookup features when the reservation includes attractions </w:t>
+            </w:r>
           </w:p>
         </w:tc>
         <w:tc>
@@ -3162,6 +4936,16 @@
               </w:rPr>
               <w:t>Developer:</w:t>
             </w:r>
+            <w:r>
+              <w:rPr>
+                <w:rFonts w:ascii="Arial" w:hAnsi="Arial" w:cs="Arial"/>
+                <w:b/>
+                <w:bCs/>
+                <w:sz w:val="20"/>
+                <w:szCs w:val="20"/>
+              </w:rPr>
+              <w:t xml:space="preserve"> Zachary Anderson</w:t>
+            </w:r>
           </w:p>
           <w:p>
             <w:pPr>
@@ -3192,31 +4976,10 @@
             <w:r>
               <w:rPr>
                 <w:rFonts w:ascii="Arial" w:hAnsi="Arial" w:cs="Arial"/>
-                <w:color w:val="C00000"/>
-                <w:sz w:val="20"/>
-                <w:szCs w:val="20"/>
-              </w:rPr>
-              <w:t>&lt;</w:t>
-            </w:r>
-            <w:proofErr w:type="spellStart"/>
-            <w:r>
-              <w:rPr>
-                <w:rFonts w:ascii="Arial" w:hAnsi="Arial" w:cs="Arial"/>
-                <w:color w:val="C00000"/>
-                <w:sz w:val="20"/>
-                <w:szCs w:val="20"/>
-              </w:rPr>
-              <w:t>yyyy</w:t>
-            </w:r>
-            <w:proofErr w:type="spellEnd"/>
-            <w:r>
-              <w:rPr>
-                <w:rFonts w:ascii="Arial" w:hAnsi="Arial" w:cs="Arial"/>
-                <w:color w:val="C00000"/>
-                <w:sz w:val="20"/>
-                <w:szCs w:val="20"/>
-              </w:rPr>
-              <w:t xml:space="preserve">/mm/dd&gt; </w:t>
+                <w:sz w:val="20"/>
+                <w:szCs w:val="20"/>
+              </w:rPr>
+              <w:t>5/2/26</w:t>
             </w:r>
           </w:p>
         </w:tc>
@@ -3492,7 +5255,7 @@
                 <w:sz w:val="20"/>
                 <w:szCs w:val="20"/>
               </w:rPr>
-              <w:t>&lt;Enter an action&gt;</w:t>
+              <w:t>Open the login page and log in as a valid user</w:t>
             </w:r>
           </w:p>
         </w:tc>
@@ -3517,7 +5280,7 @@
                 <w:sz w:val="20"/>
                 <w:szCs w:val="20"/>
               </w:rPr>
-              <w:t>&lt;Enter the expected results&gt;</w:t>
+              <w:t>Page loads with no issues, and login credentials are accepted</w:t>
             </w:r>
           </w:p>
         </w:tc>
@@ -3542,7 +5305,7 @@
                 <w:sz w:val="20"/>
                 <w:szCs w:val="20"/>
               </w:rPr>
-              <w:t>&lt;yes/no&gt;</w:t>
+              <w:t>Pass</w:t>
             </w:r>
           </w:p>
         </w:tc>
@@ -3620,7 +5383,7 @@
                 <w:sz w:val="20"/>
                 <w:szCs w:val="20"/>
               </w:rPr>
-              <w:t>&lt;Enter an action&gt;</w:t>
+              <w:t xml:space="preserve">Navigate to the reservation page </w:t>
             </w:r>
           </w:p>
         </w:tc>
@@ -3645,7 +5408,7 @@
                 <w:sz w:val="20"/>
                 <w:szCs w:val="20"/>
               </w:rPr>
-              <w:t>&lt;Enter the expected results&gt;</w:t>
+              <w:t>Page displays without issues</w:t>
             </w:r>
           </w:p>
         </w:tc>
@@ -3670,7 +5433,7 @@
                 <w:sz w:val="20"/>
                 <w:szCs w:val="20"/>
               </w:rPr>
-              <w:t>&lt;yes/no&gt;</w:t>
+              <w:t>Pass</w:t>
             </w:r>
           </w:p>
         </w:tc>
@@ -3723,6 +5486,7 @@
                 <w:sz w:val="20"/>
                 <w:szCs w:val="20"/>
               </w:rPr>
+              <w:lastRenderedPageBreak/>
               <w:t>3</w:t>
             </w:r>
           </w:p>
@@ -3748,7 +5512,7 @@
                 <w:sz w:val="20"/>
                 <w:szCs w:val="20"/>
               </w:rPr>
-              <w:t>&lt;Enter an action&gt;</w:t>
+              <w:t>Make a reservation that includes attractions</w:t>
             </w:r>
           </w:p>
         </w:tc>
@@ -3773,7 +5537,7 @@
                 <w:sz w:val="20"/>
                 <w:szCs w:val="20"/>
               </w:rPr>
-              <w:t>&lt;Enter the expected results&gt;</w:t>
+              <w:t>Attractions are displayed in the reservation summary (note the reservation ID for lookup)</w:t>
             </w:r>
           </w:p>
         </w:tc>
@@ -3798,7 +5562,7 @@
                 <w:sz w:val="20"/>
                 <w:szCs w:val="20"/>
               </w:rPr>
-              <w:t>&lt;yes/no&gt;</w:t>
+              <w:t>Pass</w:t>
             </w:r>
           </w:p>
         </w:tc>
@@ -3876,7 +5640,7 @@
                 <w:sz w:val="20"/>
                 <w:szCs w:val="20"/>
               </w:rPr>
-              <w:t>&lt;Enter an action&gt;</w:t>
+              <w:t>Navigate to the reservation lookup page</w:t>
             </w:r>
           </w:p>
         </w:tc>
@@ -3901,7 +5665,7 @@
                 <w:sz w:val="20"/>
                 <w:szCs w:val="20"/>
               </w:rPr>
-              <w:t>&lt;Enter the expected results&gt;</w:t>
+              <w:t>Page loads without issue</w:t>
             </w:r>
           </w:p>
         </w:tc>
@@ -3926,7 +5690,7 @@
                 <w:sz w:val="20"/>
                 <w:szCs w:val="20"/>
               </w:rPr>
-              <w:t>&lt;yes/no&gt;</w:t>
+              <w:t>Pass</w:t>
             </w:r>
           </w:p>
         </w:tc>
@@ -3979,7 +5743,6 @@
                 <w:sz w:val="20"/>
                 <w:szCs w:val="20"/>
               </w:rPr>
-              <w:lastRenderedPageBreak/>
               <w:t>5</w:t>
             </w:r>
           </w:p>
@@ -3998,14 +5761,25 @@
                 <w:szCs w:val="20"/>
               </w:rPr>
             </w:pPr>
-            <w:r>
-              <w:rPr>
-                <w:rFonts w:ascii="Arial" w:hAnsi="Arial" w:cs="Arial"/>
-                <w:color w:val="C00000"/>
-                <w:sz w:val="20"/>
-                <w:szCs w:val="20"/>
-              </w:rPr>
-              <w:t>&lt;Enter an action&gt;</w:t>
+            <w:proofErr w:type="gramStart"/>
+            <w:r>
+              <w:rPr>
+                <w:rFonts w:ascii="Arial" w:hAnsi="Arial" w:cs="Arial"/>
+                <w:color w:val="C00000"/>
+                <w:sz w:val="20"/>
+                <w:szCs w:val="20"/>
+              </w:rPr>
+              <w:t>Lookup</w:t>
+            </w:r>
+            <w:proofErr w:type="gramEnd"/>
+            <w:r>
+              <w:rPr>
+                <w:rFonts w:ascii="Arial" w:hAnsi="Arial" w:cs="Arial"/>
+                <w:color w:val="C00000"/>
+                <w:sz w:val="20"/>
+                <w:szCs w:val="20"/>
+              </w:rPr>
+              <w:t xml:space="preserve"> reservation and ensure the attractions selected are displayed</w:t>
             </w:r>
           </w:p>
         </w:tc>
@@ -4030,7 +5804,7 @@
                 <w:sz w:val="20"/>
                 <w:szCs w:val="20"/>
               </w:rPr>
-              <w:t>&lt;Enter the expected results&gt;</w:t>
+              <w:t>The attractions section in the lookup is displayed</w:t>
             </w:r>
           </w:p>
         </w:tc>
@@ -4055,1143 +5829,7 @@
                 <w:sz w:val="20"/>
                 <w:szCs w:val="20"/>
               </w:rPr>
-              <w:t>&lt;yes/no&gt;</w:t>
-            </w:r>
-          </w:p>
-        </w:tc>
-        <w:tc>
-          <w:tcPr>
-            <w:tcW w:w="2052" w:type="dxa"/>
-          </w:tcPr>
-          <w:p>
-            <w:pPr>
-              <w:spacing w:before="80" w:after="80"/>
-              <w:rPr>
-                <w:rFonts w:ascii="Arial" w:hAnsi="Arial" w:cs="Arial"/>
-                <w:color w:val="C00000"/>
-                <w:sz w:val="20"/>
-                <w:szCs w:val="20"/>
-              </w:rPr>
-            </w:pPr>
-            <w:r>
-              <w:rPr>
-                <w:rFonts w:ascii="Arial" w:hAnsi="Arial" w:cs="Arial"/>
-                <w:color w:val="C00000"/>
-                <w:sz w:val="20"/>
-                <w:szCs w:val="20"/>
-              </w:rPr>
-              <w:t>&lt;yes/no&gt;</w:t>
-            </w:r>
-          </w:p>
-        </w:tc>
-      </w:tr>
-      <w:tr>
-        <w:trPr>
-          <w:trHeight w:val="350"/>
-        </w:trPr>
-        <w:tc>
-          <w:tcPr>
-            <w:tcW w:w="1250" w:type="dxa"/>
-          </w:tcPr>
-          <w:p>
-            <w:pPr>
-              <w:spacing w:before="80" w:after="80"/>
-              <w:rPr>
-                <w:rFonts w:ascii="Arial" w:hAnsi="Arial" w:cs="Arial"/>
-                <w:b/>
-                <w:bCs/>
-                <w:sz w:val="20"/>
-                <w:szCs w:val="20"/>
-              </w:rPr>
-            </w:pPr>
-            <w:r>
-              <w:rPr>
-                <w:rFonts w:ascii="Arial" w:hAnsi="Arial" w:cs="Arial"/>
-                <w:b/>
-                <w:bCs/>
-                <w:sz w:val="20"/>
-                <w:szCs w:val="20"/>
-              </w:rPr>
-              <w:t>Comments</w:t>
-            </w:r>
-          </w:p>
-        </w:tc>
-        <w:tc>
-          <w:tcPr>
-            <w:tcW w:w="11700" w:type="dxa"/>
-            <w:gridSpan w:val="4"/>
-          </w:tcPr>
-          <w:p>
-            <w:pPr>
-              <w:spacing w:before="80" w:after="80"/>
-              <w:rPr>
-                <w:rFonts w:ascii="Arial" w:hAnsi="Arial" w:cs="Arial"/>
-                <w:color w:val="C00000"/>
-                <w:sz w:val="20"/>
-                <w:szCs w:val="20"/>
-              </w:rPr>
-            </w:pPr>
-            <w:r>
-              <w:rPr>
-                <w:rFonts w:ascii="Arial" w:hAnsi="Arial" w:cs="Arial"/>
-                <w:color w:val="C00000"/>
-                <w:sz w:val="20"/>
-                <w:szCs w:val="20"/>
-              </w:rPr>
-              <w:t>Comments should be substantive; this means there should be at least 2-3 well-structured sentences with constructive feedback.</w:t>
-            </w:r>
-          </w:p>
-        </w:tc>
-      </w:tr>
-    </w:tbl>
-    <w:p>
-      <w:pPr>
-        <w:pStyle w:val="NoSpacing"/>
-        <w:rPr>
-          <w:rFonts w:ascii="Arial" w:hAnsi="Arial" w:cs="Arial"/>
-          <w:sz w:val="24"/>
-          <w:szCs w:val="24"/>
-        </w:rPr>
-      </w:pPr>
-    </w:p>
-    <w:tbl>
-      <w:tblPr>
-        <w:tblStyle w:val="TableGrid"/>
-        <w:tblW w:w="0" w:type="auto"/>
-        <w:tblLook w:val="04A0" w:firstRow="1" w:lastRow="0" w:firstColumn="1" w:lastColumn="0" w:noHBand="0" w:noVBand="1"/>
-      </w:tblPr>
-      <w:tblGrid>
-        <w:gridCol w:w="1250"/>
-        <w:gridCol w:w="3570"/>
-        <w:gridCol w:w="3930"/>
-        <w:gridCol w:w="2148"/>
-        <w:gridCol w:w="2052"/>
-      </w:tblGrid>
-      <w:tr>
-        <w:trPr>
-          <w:trHeight w:val="710"/>
-        </w:trPr>
-        <w:tc>
-          <w:tcPr>
-            <w:tcW w:w="1250" w:type="dxa"/>
-          </w:tcPr>
-          <w:p>
-            <w:pPr>
-              <w:pStyle w:val="NoSpacing"/>
-              <w:spacing w:before="80" w:after="80"/>
-              <w:rPr>
-                <w:rFonts w:ascii="Arial" w:hAnsi="Arial" w:cs="Arial"/>
-                <w:sz w:val="24"/>
-                <w:szCs w:val="24"/>
-              </w:rPr>
-            </w:pPr>
-            <w:r>
-              <w:rPr>
-                <w:rFonts w:ascii="Arial" w:hAnsi="Arial" w:cs="Arial"/>
-                <w:sz w:val="24"/>
-                <w:szCs w:val="24"/>
-              </w:rPr>
-              <w:t>Test 4</w:t>
-            </w:r>
-          </w:p>
-        </w:tc>
-        <w:tc>
-          <w:tcPr>
-            <w:tcW w:w="11700" w:type="dxa"/>
-            <w:gridSpan w:val="4"/>
-          </w:tcPr>
-          <w:p>
-            <w:pPr>
-              <w:pStyle w:val="Heading1"/>
-              <w:rPr>
-                <w:rFonts w:ascii="Arial" w:hAnsi="Arial" w:cs="Arial"/>
-                <w:b/>
-                <w:bCs/>
-              </w:rPr>
-            </w:pPr>
-            <w:r>
-              <w:rPr>
-                <w:rFonts w:ascii="Arial" w:hAnsi="Arial" w:cs="Arial"/>
-                <w:b/>
-                <w:bCs/>
-                <w:color w:val="auto"/>
-              </w:rPr>
-              <w:t>&lt;DESCRIPTION&gt;</w:t>
-            </w:r>
-          </w:p>
-        </w:tc>
-      </w:tr>
-      <w:tr>
-        <w:trPr>
-          <w:trHeight w:val="620"/>
-        </w:trPr>
-        <w:tc>
-          <w:tcPr>
-            <w:tcW w:w="1250" w:type="dxa"/>
-          </w:tcPr>
-          <w:p>
-            <w:pPr>
-              <w:pStyle w:val="NoSpacing"/>
-              <w:spacing w:before="80" w:after="80"/>
-              <w:rPr>
-                <w:rFonts w:ascii="Arial" w:hAnsi="Arial" w:cs="Arial"/>
-                <w:sz w:val="24"/>
-                <w:szCs w:val="24"/>
-              </w:rPr>
-            </w:pPr>
-          </w:p>
-        </w:tc>
-        <w:tc>
-          <w:tcPr>
-            <w:tcW w:w="3570" w:type="dxa"/>
-          </w:tcPr>
-          <w:p>
-            <w:pPr>
-              <w:rPr>
-                <w:rFonts w:ascii="Arial" w:hAnsi="Arial" w:cs="Arial"/>
-                <w:sz w:val="20"/>
-                <w:szCs w:val="20"/>
-              </w:rPr>
-            </w:pPr>
-            <w:r>
-              <w:rPr>
-                <w:rFonts w:ascii="Arial" w:hAnsi="Arial" w:cs="Arial"/>
-                <w:b/>
-                <w:bCs/>
-                <w:sz w:val="20"/>
-                <w:szCs w:val="20"/>
-              </w:rPr>
-              <w:t>Test Objective</w:t>
-            </w:r>
-            <w:r>
-              <w:rPr>
-                <w:rFonts w:ascii="Arial" w:hAnsi="Arial" w:cs="Arial"/>
-                <w:b/>
-                <w:bCs/>
-                <w:sz w:val="20"/>
-                <w:szCs w:val="20"/>
-              </w:rPr>
-              <w:t xml:space="preserve">: </w:t>
-            </w:r>
-          </w:p>
-        </w:tc>
-        <w:tc>
-          <w:tcPr>
-            <w:tcW w:w="3930" w:type="dxa"/>
-          </w:tcPr>
-          <w:p>
-            <w:pPr>
-              <w:rPr>
-                <w:rFonts w:ascii="Arial" w:hAnsi="Arial" w:cs="Arial"/>
-                <w:b/>
-                <w:bCs/>
-                <w:sz w:val="20"/>
-                <w:szCs w:val="20"/>
-              </w:rPr>
-            </w:pPr>
-            <w:r>
-              <w:rPr>
-                <w:rFonts w:ascii="Arial" w:hAnsi="Arial" w:cs="Arial"/>
-                <w:b/>
-                <w:bCs/>
-                <w:sz w:val="20"/>
-                <w:szCs w:val="20"/>
-              </w:rPr>
-              <w:t>Developer:</w:t>
-            </w:r>
-          </w:p>
-          <w:p>
-            <w:pPr>
-              <w:rPr>
-                <w:rFonts w:ascii="Arial" w:hAnsi="Arial" w:cs="Arial"/>
-                <w:sz w:val="20"/>
-                <w:szCs w:val="20"/>
-              </w:rPr>
-            </w:pPr>
-            <w:r>
-              <w:rPr>
-                <w:rFonts w:ascii="Arial" w:hAnsi="Arial" w:cs="Arial"/>
-                <w:b/>
-                <w:bCs/>
-                <w:sz w:val="20"/>
-                <w:szCs w:val="20"/>
-              </w:rPr>
-              <w:t>Date tested:</w:t>
-            </w:r>
-            <w:r>
-              <w:rPr>
-                <w:rFonts w:ascii="Arial" w:hAnsi="Arial" w:cs="Arial"/>
-                <w:sz w:val="20"/>
-                <w:szCs w:val="20"/>
-              </w:rPr>
-              <w:t xml:space="preserve"> </w:t>
-            </w:r>
-            <w:r>
-              <w:rPr>
-                <w:rFonts w:ascii="Arial" w:hAnsi="Arial" w:cs="Arial"/>
-                <w:color w:val="C00000"/>
-                <w:sz w:val="20"/>
-                <w:szCs w:val="20"/>
-              </w:rPr>
-              <w:t>&lt;</w:t>
-            </w:r>
-            <w:proofErr w:type="spellStart"/>
-            <w:r>
-              <w:rPr>
-                <w:rFonts w:ascii="Arial" w:hAnsi="Arial" w:cs="Arial"/>
-                <w:color w:val="C00000"/>
-                <w:sz w:val="20"/>
-                <w:szCs w:val="20"/>
-              </w:rPr>
-              <w:t>yyyy</w:t>
-            </w:r>
-            <w:proofErr w:type="spellEnd"/>
-            <w:r>
-              <w:rPr>
-                <w:rFonts w:ascii="Arial" w:hAnsi="Arial" w:cs="Arial"/>
-                <w:color w:val="C00000"/>
-                <w:sz w:val="20"/>
-                <w:szCs w:val="20"/>
-              </w:rPr>
-              <w:t xml:space="preserve">/mm/dd&gt; </w:t>
-            </w:r>
-          </w:p>
-        </w:tc>
-        <w:tc>
-          <w:tcPr>
-            <w:tcW w:w="4200" w:type="dxa"/>
-            <w:gridSpan w:val="2"/>
-          </w:tcPr>
-          <w:p>
-            <w:pPr>
-              <w:rPr>
-                <w:rFonts w:ascii="Arial" w:hAnsi="Arial" w:cs="Arial"/>
-                <w:b/>
-                <w:bCs/>
-                <w:sz w:val="20"/>
-                <w:szCs w:val="20"/>
-              </w:rPr>
-            </w:pPr>
-            <w:r>
-              <w:rPr>
-                <w:rFonts w:ascii="Arial" w:hAnsi="Arial" w:cs="Arial"/>
-                <w:b/>
-                <w:bCs/>
-                <w:sz w:val="20"/>
-                <w:szCs w:val="20"/>
-              </w:rPr>
-              <w:t xml:space="preserve">Peer tester: </w:t>
-            </w:r>
-          </w:p>
-          <w:p>
-            <w:pPr>
-              <w:rPr>
-                <w:rFonts w:ascii="Arial" w:hAnsi="Arial" w:cs="Arial"/>
-                <w:sz w:val="20"/>
-                <w:szCs w:val="20"/>
-              </w:rPr>
-            </w:pPr>
-            <w:r>
-              <w:rPr>
-                <w:rFonts w:ascii="Arial" w:hAnsi="Arial" w:cs="Arial"/>
-                <w:b/>
-                <w:bCs/>
-                <w:sz w:val="20"/>
-                <w:szCs w:val="20"/>
-              </w:rPr>
-              <w:t>Date tested:</w:t>
-            </w:r>
-            <w:r>
-              <w:rPr>
-                <w:rFonts w:ascii="Arial" w:hAnsi="Arial" w:cs="Arial"/>
-                <w:sz w:val="20"/>
-                <w:szCs w:val="20"/>
-              </w:rPr>
-              <w:t xml:space="preserve"> </w:t>
-            </w:r>
-            <w:r>
-              <w:rPr>
-                <w:rFonts w:ascii="Arial" w:hAnsi="Arial" w:cs="Arial"/>
-                <w:color w:val="C00000"/>
-                <w:sz w:val="20"/>
-                <w:szCs w:val="20"/>
-              </w:rPr>
-              <w:t>&lt;</w:t>
-            </w:r>
-            <w:proofErr w:type="spellStart"/>
-            <w:r>
-              <w:rPr>
-                <w:rFonts w:ascii="Arial" w:hAnsi="Arial" w:cs="Arial"/>
-                <w:color w:val="C00000"/>
-                <w:sz w:val="20"/>
-                <w:szCs w:val="20"/>
-              </w:rPr>
-              <w:t>yyyy</w:t>
-            </w:r>
-            <w:proofErr w:type="spellEnd"/>
-            <w:r>
-              <w:rPr>
-                <w:rFonts w:ascii="Arial" w:hAnsi="Arial" w:cs="Arial"/>
-                <w:color w:val="C00000"/>
-                <w:sz w:val="20"/>
-                <w:szCs w:val="20"/>
-              </w:rPr>
-              <w:t>/mm/dd&gt;</w:t>
-            </w:r>
-          </w:p>
-        </w:tc>
-      </w:tr>
-      <w:tr>
-        <w:trPr>
-          <w:trHeight w:val="350"/>
-        </w:trPr>
-        <w:tc>
-          <w:tcPr>
-            <w:tcW w:w="1250" w:type="dxa"/>
-          </w:tcPr>
-          <w:p>
-            <w:pPr>
-              <w:spacing w:before="80" w:after="80"/>
-              <w:rPr>
-                <w:rFonts w:ascii="Arial" w:hAnsi="Arial" w:cs="Arial"/>
-                <w:b/>
-                <w:bCs/>
-                <w:sz w:val="20"/>
-                <w:szCs w:val="20"/>
-              </w:rPr>
-            </w:pPr>
-            <w:r>
-              <w:rPr>
-                <w:rFonts w:ascii="Arial" w:hAnsi="Arial" w:cs="Arial"/>
-                <w:b/>
-                <w:bCs/>
-                <w:sz w:val="20"/>
-                <w:szCs w:val="20"/>
-              </w:rPr>
-              <w:t>Step</w:t>
-            </w:r>
-          </w:p>
-        </w:tc>
-        <w:tc>
-          <w:tcPr>
-            <w:tcW w:w="3570" w:type="dxa"/>
-          </w:tcPr>
-          <w:p>
-            <w:pPr>
-              <w:spacing w:before="80" w:after="80"/>
-              <w:rPr>
-                <w:rFonts w:ascii="Arial" w:hAnsi="Arial" w:cs="Arial"/>
-                <w:b/>
-                <w:bCs/>
-                <w:sz w:val="20"/>
-                <w:szCs w:val="20"/>
-              </w:rPr>
-            </w:pPr>
-            <w:r>
-              <w:rPr>
-                <w:rFonts w:ascii="Arial" w:hAnsi="Arial" w:cs="Arial"/>
-                <w:b/>
-                <w:bCs/>
-                <w:sz w:val="20"/>
-                <w:szCs w:val="20"/>
-              </w:rPr>
-              <w:t>Action</w:t>
-            </w:r>
-          </w:p>
-        </w:tc>
-        <w:tc>
-          <w:tcPr>
-            <w:tcW w:w="3930" w:type="dxa"/>
-          </w:tcPr>
-          <w:p>
-            <w:pPr>
-              <w:spacing w:before="80" w:after="80"/>
-              <w:rPr>
-                <w:rFonts w:ascii="Arial" w:hAnsi="Arial" w:cs="Arial"/>
-                <w:b/>
-                <w:bCs/>
-                <w:sz w:val="20"/>
-                <w:szCs w:val="20"/>
-              </w:rPr>
-            </w:pPr>
-            <w:r>
-              <w:rPr>
-                <w:rFonts w:ascii="Arial" w:hAnsi="Arial" w:cs="Arial"/>
-                <w:b/>
-                <w:bCs/>
-                <w:sz w:val="20"/>
-                <w:szCs w:val="20"/>
-              </w:rPr>
-              <w:t>Expected results:</w:t>
-            </w:r>
-          </w:p>
-        </w:tc>
-        <w:tc>
-          <w:tcPr>
-            <w:tcW w:w="2148" w:type="dxa"/>
-          </w:tcPr>
-          <w:p>
-            <w:pPr>
-              <w:spacing w:before="80" w:after="80"/>
-              <w:rPr>
-                <w:rFonts w:ascii="Arial" w:hAnsi="Arial" w:cs="Arial"/>
-                <w:b/>
-                <w:bCs/>
-                <w:sz w:val="20"/>
-                <w:szCs w:val="20"/>
-              </w:rPr>
-            </w:pPr>
-            <w:r>
-              <w:rPr>
-                <w:rFonts w:ascii="Arial" w:hAnsi="Arial" w:cs="Arial"/>
-                <w:b/>
-                <w:bCs/>
-                <w:sz w:val="20"/>
-                <w:szCs w:val="20"/>
-              </w:rPr>
-              <w:t>Developer pass/fail</w:t>
-            </w:r>
-          </w:p>
-        </w:tc>
-        <w:tc>
-          <w:tcPr>
-            <w:tcW w:w="2052" w:type="dxa"/>
-          </w:tcPr>
-          <w:p>
-            <w:pPr>
-              <w:spacing w:before="80" w:after="80"/>
-              <w:rPr>
-                <w:rFonts w:ascii="Arial" w:hAnsi="Arial" w:cs="Arial"/>
-                <w:b/>
-                <w:bCs/>
-                <w:sz w:val="20"/>
-                <w:szCs w:val="20"/>
-              </w:rPr>
-            </w:pPr>
-            <w:r>
-              <w:rPr>
-                <w:rFonts w:ascii="Arial" w:hAnsi="Arial" w:cs="Arial"/>
-                <w:b/>
-                <w:bCs/>
-                <w:sz w:val="20"/>
-                <w:szCs w:val="20"/>
-              </w:rPr>
-              <w:t>Tester pass/fail</w:t>
-            </w:r>
-          </w:p>
-        </w:tc>
-      </w:tr>
-      <w:tr>
-        <w:trPr>
-          <w:trHeight w:val="350"/>
-        </w:trPr>
-        <w:tc>
-          <w:tcPr>
-            <w:tcW w:w="1250" w:type="dxa"/>
-          </w:tcPr>
-          <w:p>
-            <w:pPr>
-              <w:spacing w:before="80" w:after="80"/>
-              <w:rPr>
-                <w:rFonts w:ascii="Arial" w:hAnsi="Arial" w:cs="Arial"/>
-                <w:sz w:val="20"/>
-                <w:szCs w:val="20"/>
-              </w:rPr>
-            </w:pPr>
-            <w:r>
-              <w:rPr>
-                <w:rFonts w:ascii="Arial" w:hAnsi="Arial" w:cs="Arial"/>
-                <w:sz w:val="20"/>
-                <w:szCs w:val="20"/>
-              </w:rPr>
-              <w:t>1</w:t>
-            </w:r>
-          </w:p>
-        </w:tc>
-        <w:tc>
-          <w:tcPr>
-            <w:tcW w:w="3570" w:type="dxa"/>
-          </w:tcPr>
-          <w:p>
-            <w:pPr>
-              <w:spacing w:before="80" w:after="80"/>
-              <w:rPr>
-                <w:rFonts w:ascii="Arial" w:hAnsi="Arial" w:cs="Arial"/>
-                <w:color w:val="C00000"/>
-                <w:sz w:val="20"/>
-                <w:szCs w:val="20"/>
-              </w:rPr>
-            </w:pPr>
-            <w:r>
-              <w:rPr>
-                <w:rFonts w:ascii="Arial" w:hAnsi="Arial" w:cs="Arial"/>
-                <w:color w:val="C00000"/>
-                <w:sz w:val="20"/>
-                <w:szCs w:val="20"/>
-              </w:rPr>
-              <w:t>&lt;Enter an action&gt;</w:t>
-            </w:r>
-          </w:p>
-        </w:tc>
-        <w:tc>
-          <w:tcPr>
-            <w:tcW w:w="3930" w:type="dxa"/>
-          </w:tcPr>
-          <w:p>
-            <w:pPr>
-              <w:spacing w:before="80" w:after="80"/>
-              <w:rPr>
-                <w:rFonts w:ascii="Arial" w:hAnsi="Arial" w:cs="Arial"/>
-                <w:color w:val="C00000"/>
-                <w:sz w:val="20"/>
-                <w:szCs w:val="20"/>
-              </w:rPr>
-            </w:pPr>
-            <w:r>
-              <w:rPr>
-                <w:rFonts w:ascii="Arial" w:hAnsi="Arial" w:cs="Arial"/>
-                <w:color w:val="C00000"/>
-                <w:sz w:val="20"/>
-                <w:szCs w:val="20"/>
-              </w:rPr>
-              <w:t>&lt;Enter the expected results&gt;</w:t>
-            </w:r>
-          </w:p>
-        </w:tc>
-        <w:tc>
-          <w:tcPr>
-            <w:tcW w:w="2148" w:type="dxa"/>
-          </w:tcPr>
-          <w:p>
-            <w:pPr>
-              <w:spacing w:before="80" w:after="80"/>
-              <w:rPr>
-                <w:rFonts w:ascii="Arial" w:hAnsi="Arial" w:cs="Arial"/>
-                <w:color w:val="C00000"/>
-                <w:sz w:val="20"/>
-                <w:szCs w:val="20"/>
-              </w:rPr>
-            </w:pPr>
-            <w:r>
-              <w:rPr>
-                <w:rFonts w:ascii="Arial" w:hAnsi="Arial" w:cs="Arial"/>
-                <w:color w:val="C00000"/>
-                <w:sz w:val="20"/>
-                <w:szCs w:val="20"/>
-              </w:rPr>
-              <w:t>&lt;yes/no&gt;</w:t>
-            </w:r>
-          </w:p>
-        </w:tc>
-        <w:tc>
-          <w:tcPr>
-            <w:tcW w:w="2052" w:type="dxa"/>
-          </w:tcPr>
-          <w:p>
-            <w:pPr>
-              <w:spacing w:before="80" w:after="80"/>
-              <w:rPr>
-                <w:rFonts w:ascii="Arial" w:hAnsi="Arial" w:cs="Arial"/>
-                <w:color w:val="C00000"/>
-                <w:sz w:val="20"/>
-                <w:szCs w:val="20"/>
-              </w:rPr>
-            </w:pPr>
-            <w:r>
-              <w:rPr>
-                <w:rFonts w:ascii="Arial" w:hAnsi="Arial" w:cs="Arial"/>
-                <w:color w:val="C00000"/>
-                <w:sz w:val="20"/>
-                <w:szCs w:val="20"/>
-              </w:rPr>
-              <w:t>&lt;yes/no&gt;</w:t>
-            </w:r>
-          </w:p>
-        </w:tc>
-      </w:tr>
-      <w:tr>
-        <w:trPr>
-          <w:trHeight w:val="350"/>
-        </w:trPr>
-        <w:tc>
-          <w:tcPr>
-            <w:tcW w:w="1250" w:type="dxa"/>
-          </w:tcPr>
-          <w:p>
-            <w:pPr>
-              <w:spacing w:before="80" w:after="80"/>
-              <w:rPr>
-                <w:rFonts w:ascii="Arial" w:hAnsi="Arial" w:cs="Arial"/>
-                <w:sz w:val="20"/>
-                <w:szCs w:val="20"/>
-              </w:rPr>
-            </w:pPr>
-            <w:r>
-              <w:rPr>
-                <w:rFonts w:ascii="Arial" w:hAnsi="Arial" w:cs="Arial"/>
-                <w:sz w:val="20"/>
-                <w:szCs w:val="20"/>
-              </w:rPr>
-              <w:t>2</w:t>
-            </w:r>
-          </w:p>
-        </w:tc>
-        <w:tc>
-          <w:tcPr>
-            <w:tcW w:w="3570" w:type="dxa"/>
-          </w:tcPr>
-          <w:p>
-            <w:pPr>
-              <w:spacing w:before="80" w:after="80"/>
-              <w:rPr>
-                <w:rFonts w:ascii="Arial" w:hAnsi="Arial" w:cs="Arial"/>
-                <w:color w:val="C00000"/>
-                <w:sz w:val="20"/>
-                <w:szCs w:val="20"/>
-              </w:rPr>
-            </w:pPr>
-            <w:r>
-              <w:rPr>
-                <w:rFonts w:ascii="Arial" w:hAnsi="Arial" w:cs="Arial"/>
-                <w:color w:val="C00000"/>
-                <w:sz w:val="20"/>
-                <w:szCs w:val="20"/>
-              </w:rPr>
-              <w:t>&lt;Enter an action&gt;</w:t>
-            </w:r>
-          </w:p>
-        </w:tc>
-        <w:tc>
-          <w:tcPr>
-            <w:tcW w:w="3930" w:type="dxa"/>
-          </w:tcPr>
-          <w:p>
-            <w:pPr>
-              <w:spacing w:before="80" w:after="80"/>
-              <w:rPr>
-                <w:rFonts w:ascii="Arial" w:hAnsi="Arial" w:cs="Arial"/>
-                <w:color w:val="C00000"/>
-                <w:sz w:val="20"/>
-                <w:szCs w:val="20"/>
-              </w:rPr>
-            </w:pPr>
-            <w:r>
-              <w:rPr>
-                <w:rFonts w:ascii="Arial" w:hAnsi="Arial" w:cs="Arial"/>
-                <w:color w:val="C00000"/>
-                <w:sz w:val="20"/>
-                <w:szCs w:val="20"/>
-              </w:rPr>
-              <w:t>&lt;Enter the expected results&gt;</w:t>
-            </w:r>
-          </w:p>
-        </w:tc>
-        <w:tc>
-          <w:tcPr>
-            <w:tcW w:w="2148" w:type="dxa"/>
-          </w:tcPr>
-          <w:p>
-            <w:pPr>
-              <w:spacing w:before="80" w:after="80"/>
-              <w:rPr>
-                <w:rFonts w:ascii="Arial" w:hAnsi="Arial" w:cs="Arial"/>
-                <w:color w:val="C00000"/>
-                <w:sz w:val="20"/>
-                <w:szCs w:val="20"/>
-              </w:rPr>
-            </w:pPr>
-            <w:r>
-              <w:rPr>
-                <w:rFonts w:ascii="Arial" w:hAnsi="Arial" w:cs="Arial"/>
-                <w:color w:val="C00000"/>
-                <w:sz w:val="20"/>
-                <w:szCs w:val="20"/>
-              </w:rPr>
-              <w:t>&lt;yes/no&gt;</w:t>
-            </w:r>
-          </w:p>
-        </w:tc>
-        <w:tc>
-          <w:tcPr>
-            <w:tcW w:w="2052" w:type="dxa"/>
-          </w:tcPr>
-          <w:p>
-            <w:pPr>
-              <w:spacing w:before="80" w:after="80"/>
-              <w:rPr>
-                <w:rFonts w:ascii="Arial" w:hAnsi="Arial" w:cs="Arial"/>
-                <w:color w:val="C00000"/>
-                <w:sz w:val="20"/>
-                <w:szCs w:val="20"/>
-              </w:rPr>
-            </w:pPr>
-            <w:r>
-              <w:rPr>
-                <w:rFonts w:ascii="Arial" w:hAnsi="Arial" w:cs="Arial"/>
-                <w:color w:val="C00000"/>
-                <w:sz w:val="20"/>
-                <w:szCs w:val="20"/>
-              </w:rPr>
-              <w:t>&lt;yes/no&gt;</w:t>
-            </w:r>
-          </w:p>
-        </w:tc>
-      </w:tr>
-      <w:tr>
-        <w:trPr>
-          <w:trHeight w:val="350"/>
-        </w:trPr>
-        <w:tc>
-          <w:tcPr>
-            <w:tcW w:w="1250" w:type="dxa"/>
-          </w:tcPr>
-          <w:p>
-            <w:pPr>
-              <w:spacing w:before="80" w:after="80"/>
-              <w:rPr>
-                <w:rFonts w:ascii="Arial" w:hAnsi="Arial" w:cs="Arial"/>
-                <w:sz w:val="20"/>
-                <w:szCs w:val="20"/>
-              </w:rPr>
-            </w:pPr>
-            <w:r>
-              <w:rPr>
-                <w:rFonts w:ascii="Arial" w:hAnsi="Arial" w:cs="Arial"/>
-                <w:sz w:val="20"/>
-                <w:szCs w:val="20"/>
-              </w:rPr>
-              <w:t>3</w:t>
-            </w:r>
-          </w:p>
-        </w:tc>
-        <w:tc>
-          <w:tcPr>
-            <w:tcW w:w="3570" w:type="dxa"/>
-          </w:tcPr>
-          <w:p>
-            <w:pPr>
-              <w:spacing w:before="80" w:after="80"/>
-              <w:rPr>
-                <w:rFonts w:ascii="Arial" w:hAnsi="Arial" w:cs="Arial"/>
-                <w:color w:val="C00000"/>
-                <w:sz w:val="20"/>
-                <w:szCs w:val="20"/>
-              </w:rPr>
-            </w:pPr>
-            <w:r>
-              <w:rPr>
-                <w:rFonts w:ascii="Arial" w:hAnsi="Arial" w:cs="Arial"/>
-                <w:color w:val="C00000"/>
-                <w:sz w:val="20"/>
-                <w:szCs w:val="20"/>
-              </w:rPr>
-              <w:t>&lt;Enter an action&gt;</w:t>
-            </w:r>
-          </w:p>
-        </w:tc>
-        <w:tc>
-          <w:tcPr>
-            <w:tcW w:w="3930" w:type="dxa"/>
-          </w:tcPr>
-          <w:p>
-            <w:pPr>
-              <w:spacing w:before="80" w:after="80"/>
-              <w:rPr>
-                <w:rFonts w:ascii="Arial" w:hAnsi="Arial" w:cs="Arial"/>
-                <w:color w:val="C00000"/>
-                <w:sz w:val="20"/>
-                <w:szCs w:val="20"/>
-              </w:rPr>
-            </w:pPr>
-            <w:r>
-              <w:rPr>
-                <w:rFonts w:ascii="Arial" w:hAnsi="Arial" w:cs="Arial"/>
-                <w:color w:val="C00000"/>
-                <w:sz w:val="20"/>
-                <w:szCs w:val="20"/>
-              </w:rPr>
-              <w:t>&lt;Enter the expected results&gt;</w:t>
-            </w:r>
-          </w:p>
-        </w:tc>
-        <w:tc>
-          <w:tcPr>
-            <w:tcW w:w="2148" w:type="dxa"/>
-          </w:tcPr>
-          <w:p>
-            <w:pPr>
-              <w:spacing w:before="80" w:after="80"/>
-              <w:rPr>
-                <w:rFonts w:ascii="Arial" w:hAnsi="Arial" w:cs="Arial"/>
-                <w:color w:val="C00000"/>
-                <w:sz w:val="20"/>
-                <w:szCs w:val="20"/>
-              </w:rPr>
-            </w:pPr>
-            <w:r>
-              <w:rPr>
-                <w:rFonts w:ascii="Arial" w:hAnsi="Arial" w:cs="Arial"/>
-                <w:color w:val="C00000"/>
-                <w:sz w:val="20"/>
-                <w:szCs w:val="20"/>
-              </w:rPr>
-              <w:t>&lt;yes/no&gt;</w:t>
-            </w:r>
-          </w:p>
-        </w:tc>
-        <w:tc>
-          <w:tcPr>
-            <w:tcW w:w="2052" w:type="dxa"/>
-          </w:tcPr>
-          <w:p>
-            <w:pPr>
-              <w:spacing w:before="80" w:after="80"/>
-              <w:rPr>
-                <w:rFonts w:ascii="Arial" w:hAnsi="Arial" w:cs="Arial"/>
-                <w:color w:val="C00000"/>
-                <w:sz w:val="20"/>
-                <w:szCs w:val="20"/>
-              </w:rPr>
-            </w:pPr>
-            <w:r>
-              <w:rPr>
-                <w:rFonts w:ascii="Arial" w:hAnsi="Arial" w:cs="Arial"/>
-                <w:color w:val="C00000"/>
-                <w:sz w:val="20"/>
-                <w:szCs w:val="20"/>
-              </w:rPr>
-              <w:t>&lt;yes/no&gt;</w:t>
-            </w:r>
-          </w:p>
-        </w:tc>
-      </w:tr>
-      <w:tr>
-        <w:trPr>
-          <w:trHeight w:val="350"/>
-        </w:trPr>
-        <w:tc>
-          <w:tcPr>
-            <w:tcW w:w="1250" w:type="dxa"/>
-          </w:tcPr>
-          <w:p>
-            <w:pPr>
-              <w:spacing w:before="80" w:after="80"/>
-              <w:rPr>
-                <w:rFonts w:ascii="Arial" w:hAnsi="Arial" w:cs="Arial"/>
-                <w:sz w:val="20"/>
-                <w:szCs w:val="20"/>
-              </w:rPr>
-            </w:pPr>
-            <w:r>
-              <w:rPr>
-                <w:rFonts w:ascii="Arial" w:hAnsi="Arial" w:cs="Arial"/>
-                <w:sz w:val="20"/>
-                <w:szCs w:val="20"/>
-              </w:rPr>
-              <w:t>4</w:t>
-            </w:r>
-          </w:p>
-        </w:tc>
-        <w:tc>
-          <w:tcPr>
-            <w:tcW w:w="3570" w:type="dxa"/>
-          </w:tcPr>
-          <w:p>
-            <w:pPr>
-              <w:spacing w:before="80" w:after="80"/>
-              <w:rPr>
-                <w:rFonts w:ascii="Arial" w:hAnsi="Arial" w:cs="Arial"/>
-                <w:color w:val="C00000"/>
-                <w:sz w:val="20"/>
-                <w:szCs w:val="20"/>
-              </w:rPr>
-            </w:pPr>
-            <w:r>
-              <w:rPr>
-                <w:rFonts w:ascii="Arial" w:hAnsi="Arial" w:cs="Arial"/>
-                <w:color w:val="C00000"/>
-                <w:sz w:val="20"/>
-                <w:szCs w:val="20"/>
-              </w:rPr>
-              <w:t>&lt;Enter an action&gt;</w:t>
-            </w:r>
-          </w:p>
-        </w:tc>
-        <w:tc>
-          <w:tcPr>
-            <w:tcW w:w="3930" w:type="dxa"/>
-          </w:tcPr>
-          <w:p>
-            <w:pPr>
-              <w:spacing w:before="80" w:after="80"/>
-              <w:rPr>
-                <w:rFonts w:ascii="Arial" w:hAnsi="Arial" w:cs="Arial"/>
-                <w:color w:val="C00000"/>
-                <w:sz w:val="20"/>
-                <w:szCs w:val="20"/>
-              </w:rPr>
-            </w:pPr>
-            <w:r>
-              <w:rPr>
-                <w:rFonts w:ascii="Arial" w:hAnsi="Arial" w:cs="Arial"/>
-                <w:color w:val="C00000"/>
-                <w:sz w:val="20"/>
-                <w:szCs w:val="20"/>
-              </w:rPr>
-              <w:t>&lt;Enter the expected results&gt;</w:t>
-            </w:r>
-          </w:p>
-        </w:tc>
-        <w:tc>
-          <w:tcPr>
-            <w:tcW w:w="2148" w:type="dxa"/>
-          </w:tcPr>
-          <w:p>
-            <w:pPr>
-              <w:spacing w:before="80" w:after="80"/>
-              <w:rPr>
-                <w:rFonts w:ascii="Arial" w:hAnsi="Arial" w:cs="Arial"/>
-                <w:color w:val="C00000"/>
-                <w:sz w:val="20"/>
-                <w:szCs w:val="20"/>
-              </w:rPr>
-            </w:pPr>
-            <w:r>
-              <w:rPr>
-                <w:rFonts w:ascii="Arial" w:hAnsi="Arial" w:cs="Arial"/>
-                <w:color w:val="C00000"/>
-                <w:sz w:val="20"/>
-                <w:szCs w:val="20"/>
-              </w:rPr>
-              <w:t>&lt;yes/no&gt;</w:t>
-            </w:r>
-          </w:p>
-        </w:tc>
-        <w:tc>
-          <w:tcPr>
-            <w:tcW w:w="2052" w:type="dxa"/>
-          </w:tcPr>
-          <w:p>
-            <w:pPr>
-              <w:spacing w:before="80" w:after="80"/>
-              <w:rPr>
-                <w:rFonts w:ascii="Arial" w:hAnsi="Arial" w:cs="Arial"/>
-                <w:color w:val="C00000"/>
-                <w:sz w:val="20"/>
-                <w:szCs w:val="20"/>
-              </w:rPr>
-            </w:pPr>
-            <w:r>
-              <w:rPr>
-                <w:rFonts w:ascii="Arial" w:hAnsi="Arial" w:cs="Arial"/>
-                <w:color w:val="C00000"/>
-                <w:sz w:val="20"/>
-                <w:szCs w:val="20"/>
-              </w:rPr>
-              <w:t>&lt;yes/no&gt;</w:t>
-            </w:r>
-          </w:p>
-        </w:tc>
-      </w:tr>
-      <w:tr>
-        <w:trPr>
-          <w:trHeight w:val="350"/>
-        </w:trPr>
-        <w:tc>
-          <w:tcPr>
-            <w:tcW w:w="1250" w:type="dxa"/>
-          </w:tcPr>
-          <w:p>
-            <w:pPr>
-              <w:spacing w:before="80" w:after="80"/>
-              <w:rPr>
-                <w:rFonts w:ascii="Arial" w:hAnsi="Arial" w:cs="Arial"/>
-                <w:sz w:val="20"/>
-                <w:szCs w:val="20"/>
-              </w:rPr>
-            </w:pPr>
-            <w:r>
-              <w:rPr>
-                <w:rFonts w:ascii="Arial" w:hAnsi="Arial" w:cs="Arial"/>
-                <w:sz w:val="20"/>
-                <w:szCs w:val="20"/>
-              </w:rPr>
-              <w:t>5</w:t>
-            </w:r>
-          </w:p>
-        </w:tc>
-        <w:tc>
-          <w:tcPr>
-            <w:tcW w:w="3570" w:type="dxa"/>
-          </w:tcPr>
-          <w:p>
-            <w:pPr>
-              <w:spacing w:before="80" w:after="80"/>
-              <w:rPr>
-                <w:rFonts w:ascii="Arial" w:hAnsi="Arial" w:cs="Arial"/>
-                <w:color w:val="C00000"/>
-                <w:sz w:val="20"/>
-                <w:szCs w:val="20"/>
-              </w:rPr>
-            </w:pPr>
-            <w:r>
-              <w:rPr>
-                <w:rFonts w:ascii="Arial" w:hAnsi="Arial" w:cs="Arial"/>
-                <w:color w:val="C00000"/>
-                <w:sz w:val="20"/>
-                <w:szCs w:val="20"/>
-              </w:rPr>
-              <w:t>&lt;Enter an action&gt;</w:t>
-            </w:r>
-          </w:p>
-        </w:tc>
-        <w:tc>
-          <w:tcPr>
-            <w:tcW w:w="3930" w:type="dxa"/>
-          </w:tcPr>
-          <w:p>
-            <w:pPr>
-              <w:spacing w:before="80" w:after="80"/>
-              <w:rPr>
-                <w:rFonts w:ascii="Arial" w:hAnsi="Arial" w:cs="Arial"/>
-                <w:color w:val="C00000"/>
-                <w:sz w:val="20"/>
-                <w:szCs w:val="20"/>
-              </w:rPr>
-            </w:pPr>
-            <w:r>
-              <w:rPr>
-                <w:rFonts w:ascii="Arial" w:hAnsi="Arial" w:cs="Arial"/>
-                <w:color w:val="C00000"/>
-                <w:sz w:val="20"/>
-                <w:szCs w:val="20"/>
-              </w:rPr>
-              <w:t>&lt;Enter the expected results&gt;</w:t>
-            </w:r>
-          </w:p>
-        </w:tc>
-        <w:tc>
-          <w:tcPr>
-            <w:tcW w:w="2148" w:type="dxa"/>
-          </w:tcPr>
-          <w:p>
-            <w:pPr>
-              <w:spacing w:before="80" w:after="80"/>
-              <w:rPr>
-                <w:rFonts w:ascii="Arial" w:hAnsi="Arial" w:cs="Arial"/>
-                <w:color w:val="C00000"/>
-                <w:sz w:val="20"/>
-                <w:szCs w:val="20"/>
-              </w:rPr>
-            </w:pPr>
-            <w:r>
-              <w:rPr>
-                <w:rFonts w:ascii="Arial" w:hAnsi="Arial" w:cs="Arial"/>
-                <w:color w:val="C00000"/>
-                <w:sz w:val="20"/>
-                <w:szCs w:val="20"/>
-              </w:rPr>
-              <w:t>&lt;yes/no&gt;</w:t>
+              <w:t>Pass</w:t>
             </w:r>
           </w:p>
         </w:tc>
@@ -5291,8 +5929,8 @@
       </w:pPr>
     </w:p>
     <w:sectPr>
-      <w:headerReference w:type="default" r:id="rId7"/>
-      <w:footerReference w:type="default" r:id="rId8"/>
+      <w:headerReference w:type="default" r:id="rId15"/>
+      <w:footerReference w:type="default" r:id="rId16"/>
       <w:pgSz w:w="15840" w:h="12240" w:orient="landscape"/>
       <w:pgMar w:top="1440" w:right="1440" w:bottom="1440" w:left="1440" w:header="720" w:footer="720" w:gutter="0"/>
       <w:cols w:space="720"/>
@@ -5936,6 +6574,7 @@
   <w:style w:type="character" w:default="1" w:styleId="DefaultParagraphFont">
     <w:name w:val="Default Paragraph Font"/>
     <w:uiPriority w:val="1"/>
+    <w:semiHidden/>
     <w:unhideWhenUsed/>
   </w:style>
   <w:style w:type="table" w:default="1" w:styleId="TableNormal">

</xml_diff>

<commit_message>
Updated DB password, completed Module 8 tests, added reservation lookup screenshots
</commit_message>
<xml_diff>
--- a/MODULE-8/8.2 Assignment.docx
+++ b/MODULE-8/8.2 Assignment.docx
@@ -536,27 +536,7 @@
                 <w:bCs/>
                 <w:color w:val="auto"/>
               </w:rPr>
-              <w:t xml:space="preserve">Reservation Lookup </w:t>
-            </w:r>
-            <w:proofErr w:type="gramStart"/>
-            <w:r>
-              <w:rPr>
-                <w:rFonts w:ascii="Arial" w:hAnsi="Arial" w:cs="Arial"/>
-                <w:b/>
-                <w:bCs/>
-                <w:color w:val="auto"/>
-              </w:rPr>
-              <w:t>With</w:t>
-            </w:r>
-            <w:proofErr w:type="gramEnd"/>
-            <w:r>
-              <w:rPr>
-                <w:rFonts w:ascii="Arial" w:hAnsi="Arial" w:cs="Arial"/>
-                <w:b/>
-                <w:bCs/>
-                <w:color w:val="auto"/>
-              </w:rPr>
-              <w:t xml:space="preserve"> Valid Reservation ID</w:t>
+              <w:t>Reservation Lookup With Valid Reservation ID</w:t>
             </w:r>
           </w:p>
         </w:tc>
@@ -638,7 +618,6 @@
                 <w:szCs w:val="20"/>
               </w:rPr>
             </w:pPr>
-            <w:proofErr w:type="spellStart"/>
             <w:r>
               <w:rPr>
                 <w:rFonts w:ascii="Arial" w:hAnsi="Arial" w:cs="Arial"/>
@@ -657,18 +636,7 @@
                 <w:sz w:val="20"/>
                 <w:szCs w:val="20"/>
               </w:rPr>
-              <w:t>Angela</w:t>
-            </w:r>
-            <w:proofErr w:type="spellEnd"/>
-            <w:r>
-              <w:rPr>
-                <w:rFonts w:ascii="Arial" w:hAnsi="Arial" w:cs="Arial"/>
-                <w:b/>
-                <w:bCs/>
-                <w:sz w:val="20"/>
-                <w:szCs w:val="20"/>
-              </w:rPr>
-              <w:t xml:space="preserve"> V</w:t>
+              <w:t>Angela V</w:t>
             </w:r>
           </w:p>
           <w:p>
@@ -1779,27 +1747,7 @@
                 <w:sz w:val="20"/>
                 <w:szCs w:val="20"/>
               </w:rPr>
-              <w:t xml:space="preserve">The user remains on the lookup page and can </w:t>
-            </w:r>
-            <w:proofErr w:type="gramStart"/>
-            <w:r>
-              <w:rPr>
-                <w:rFonts w:ascii="Arial" w:hAnsi="Arial" w:cs="Arial"/>
-                <w:color w:val="C00000"/>
-                <w:sz w:val="20"/>
-                <w:szCs w:val="20"/>
-              </w:rPr>
-              <w:t>search</w:t>
-            </w:r>
-            <w:proofErr w:type="gramEnd"/>
-            <w:r>
-              <w:rPr>
-                <w:rFonts w:ascii="Arial" w:hAnsi="Arial" w:cs="Arial"/>
-                <w:color w:val="C00000"/>
-                <w:sz w:val="20"/>
-                <w:szCs w:val="20"/>
-              </w:rPr>
-              <w:t xml:space="preserve"> another reservation if needed.</w:t>
+              <w:t>The user remains on the lookup page and can search another reservation if needed.</w:t>
             </w:r>
           </w:p>
         </w:tc>
@@ -2049,27 +1997,7 @@
                 <w:bCs/>
                 <w:color w:val="auto"/>
               </w:rPr>
-              <w:t xml:space="preserve">Reservation Lookup </w:t>
-            </w:r>
-            <w:proofErr w:type="gramStart"/>
-            <w:r>
-              <w:rPr>
-                <w:rFonts w:ascii="Arial" w:hAnsi="Arial" w:cs="Arial"/>
-                <w:b/>
-                <w:bCs/>
-                <w:color w:val="auto"/>
-              </w:rPr>
-              <w:t>With</w:t>
-            </w:r>
-            <w:proofErr w:type="gramEnd"/>
-            <w:r>
-              <w:rPr>
-                <w:rFonts w:ascii="Arial" w:hAnsi="Arial" w:cs="Arial"/>
-                <w:b/>
-                <w:bCs/>
-                <w:color w:val="auto"/>
-              </w:rPr>
-              <w:t xml:space="preserve"> Invalid Reservation ID</w:t>
+              <w:t>Reservation Lookup With Invalid Reservation ID</w:t>
             </w:r>
           </w:p>
         </w:tc>
@@ -2151,7 +2079,6 @@
                 <w:szCs w:val="20"/>
               </w:rPr>
             </w:pPr>
-            <w:proofErr w:type="spellStart"/>
             <w:r>
               <w:rPr>
                 <w:rFonts w:ascii="Arial" w:hAnsi="Arial" w:cs="Arial"/>
@@ -2170,18 +2097,7 @@
                 <w:sz w:val="20"/>
                 <w:szCs w:val="20"/>
               </w:rPr>
-              <w:t>Angela</w:t>
-            </w:r>
-            <w:proofErr w:type="spellEnd"/>
-            <w:r>
-              <w:rPr>
-                <w:rFonts w:ascii="Arial" w:hAnsi="Arial" w:cs="Arial"/>
-                <w:b/>
-                <w:bCs/>
-                <w:sz w:val="20"/>
-                <w:szCs w:val="20"/>
-              </w:rPr>
-              <w:t xml:space="preserve"> V</w:t>
+              <w:t>Angela V</w:t>
             </w:r>
           </w:p>
           <w:p>
@@ -3456,10 +3372,10 @@
       </w:tblPr>
       <w:tblGrid>
         <w:gridCol w:w="1250"/>
-        <w:gridCol w:w="3570"/>
-        <w:gridCol w:w="3930"/>
-        <w:gridCol w:w="2148"/>
-        <w:gridCol w:w="2052"/>
+        <w:gridCol w:w="2273"/>
+        <w:gridCol w:w="2422"/>
+        <w:gridCol w:w="1599"/>
+        <w:gridCol w:w="5406"/>
       </w:tblGrid>
       <w:tr>
         <w:trPr>
@@ -3694,6 +3610,16 @@
               </w:rPr>
               <w:t xml:space="preserve">Peer tester: </w:t>
             </w:r>
+            <w:r>
+              <w:rPr>
+                <w:rFonts w:ascii="Arial" w:hAnsi="Arial" w:cs="Arial"/>
+                <w:b/>
+                <w:bCs/>
+                <w:sz w:val="20"/>
+                <w:szCs w:val="20"/>
+              </w:rPr>
+              <w:t>Angela V</w:t>
+            </w:r>
           </w:p>
           <w:p>
             <w:pPr>
@@ -3728,27 +3654,7 @@
                 <w:sz w:val="20"/>
                 <w:szCs w:val="20"/>
               </w:rPr>
-              <w:t>&lt;</w:t>
-            </w:r>
-            <w:proofErr w:type="spellStart"/>
-            <w:r>
-              <w:rPr>
-                <w:rFonts w:ascii="Arial" w:hAnsi="Arial" w:cs="Arial"/>
-                <w:color w:val="C00000"/>
-                <w:sz w:val="20"/>
-                <w:szCs w:val="20"/>
-              </w:rPr>
-              <w:t>yyyy</w:t>
-            </w:r>
-            <w:proofErr w:type="spellEnd"/>
-            <w:r>
-              <w:rPr>
-                <w:rFonts w:ascii="Arial" w:hAnsi="Arial" w:cs="Arial"/>
-                <w:color w:val="C00000"/>
-                <w:sz w:val="20"/>
-                <w:szCs w:val="20"/>
-              </w:rPr>
-              <w:t>/mm/dd&gt;</w:t>
+              <w:t>05/02/2026</w:t>
             </w:r>
           </w:p>
         </w:tc>
@@ -3944,25 +3850,14 @@
                 <w:szCs w:val="20"/>
               </w:rPr>
             </w:pPr>
-            <w:proofErr w:type="gramStart"/>
-            <w:r>
-              <w:rPr>
-                <w:rFonts w:ascii="Arial" w:hAnsi="Arial" w:cs="Arial"/>
-                <w:color w:val="C00000"/>
-                <w:sz w:val="20"/>
-                <w:szCs w:val="20"/>
-              </w:rPr>
-              <w:t>Open up</w:t>
-            </w:r>
-            <w:proofErr w:type="gramEnd"/>
-            <w:r>
-              <w:rPr>
-                <w:rFonts w:ascii="Arial" w:hAnsi="Arial" w:cs="Arial"/>
-                <w:color w:val="C00000"/>
-                <w:sz w:val="20"/>
-                <w:szCs w:val="20"/>
-              </w:rPr>
-              <w:t xml:space="preserve"> the login page and </w:t>
+            <w:r>
+              <w:rPr>
+                <w:rFonts w:ascii="Arial" w:hAnsi="Arial" w:cs="Arial"/>
+                <w:color w:val="C00000"/>
+                <w:sz w:val="20"/>
+                <w:szCs w:val="20"/>
+              </w:rPr>
+              <w:t xml:space="preserve">Open up the login page and </w:t>
             </w:r>
             <w:r>
               <w:rPr>
@@ -4093,7 +3988,61 @@
                 <w:sz w:val="20"/>
                 <w:szCs w:val="20"/>
               </w:rPr>
-              <w:t>&lt;yes/no&gt;</w:t>
+              <w:t>Pass</w:t>
+            </w:r>
+          </w:p>
+          <w:p>
+            <w:pPr>
+              <w:spacing w:before="80" w:after="80"/>
+              <w:rPr>
+                <w:rFonts w:ascii="Arial" w:hAnsi="Arial" w:cs="Arial"/>
+                <w:color w:val="C00000"/>
+                <w:sz w:val="20"/>
+                <w:szCs w:val="20"/>
+              </w:rPr>
+            </w:pPr>
+            <w:r>
+              <w:rPr>
+                <w:rFonts w:ascii="Arial" w:hAnsi="Arial" w:cs="Arial"/>
+                <w:color w:val="C00000"/>
+                <w:sz w:val="20"/>
+                <w:szCs w:val="20"/>
+              </w:rPr>
+              <w:drawing>
+                <wp:inline distT="0" distB="0" distL="0" distR="0" wp14:anchorId="1A590B7E" wp14:editId="614B6478">
+                  <wp:extent cx="3291840" cy="3273653"/>
+                  <wp:effectExtent l="0" t="0" r="3810" b="3175"/>
+                  <wp:docPr id="1619868857" name="Picture 1"/>
+                  <wp:cNvGraphicFramePr>
+                    <a:graphicFrameLocks xmlns:a="http://schemas.openxmlformats.org/drawingml/2006/main" noChangeAspect="1"/>
+                  </wp:cNvGraphicFramePr>
+                  <a:graphic xmlns:a="http://schemas.openxmlformats.org/drawingml/2006/main">
+                    <a:graphicData uri="http://schemas.openxmlformats.org/drawingml/2006/picture">
+                      <pic:pic xmlns:pic="http://schemas.openxmlformats.org/drawingml/2006/picture">
+                        <pic:nvPicPr>
+                          <pic:cNvPr id="1619868857" name=""/>
+                          <pic:cNvPicPr/>
+                        </pic:nvPicPr>
+                        <pic:blipFill>
+                          <a:blip r:embed="rId15"/>
+                          <a:stretch>
+                            <a:fillRect/>
+                          </a:stretch>
+                        </pic:blipFill>
+                        <pic:spPr>
+                          <a:xfrm>
+                            <a:off x="0" y="0"/>
+                            <a:ext cx="3296932" cy="3278717"/>
+                          </a:xfrm>
+                          <a:prstGeom prst="rect">
+                            <a:avLst/>
+                          </a:prstGeom>
+                        </pic:spPr>
+                      </pic:pic>
+                    </a:graphicData>
+                  </a:graphic>
+                </wp:inline>
+              </w:drawing>
             </w:r>
           </w:p>
         </w:tc>
@@ -4139,25 +4088,14 @@
                 <w:szCs w:val="20"/>
               </w:rPr>
             </w:pPr>
-            <w:proofErr w:type="gramStart"/>
-            <w:r>
-              <w:rPr>
-                <w:rFonts w:ascii="Arial" w:hAnsi="Arial" w:cs="Arial"/>
-                <w:color w:val="C00000"/>
-                <w:sz w:val="20"/>
-                <w:szCs w:val="20"/>
-              </w:rPr>
-              <w:t>Open up</w:t>
-            </w:r>
-            <w:proofErr w:type="gramEnd"/>
-            <w:r>
-              <w:rPr>
-                <w:rFonts w:ascii="Arial" w:hAnsi="Arial" w:cs="Arial"/>
-                <w:color w:val="C00000"/>
-                <w:sz w:val="20"/>
-                <w:szCs w:val="20"/>
-              </w:rPr>
-              <w:t xml:space="preserve"> the reservation page and make a new reservation</w:t>
+            <w:r>
+              <w:rPr>
+                <w:rFonts w:ascii="Arial" w:hAnsi="Arial" w:cs="Arial"/>
+                <w:color w:val="C00000"/>
+                <w:sz w:val="20"/>
+                <w:szCs w:val="20"/>
+              </w:rPr>
+              <w:t>Open up the reservation page and make a new reservation</w:t>
             </w:r>
           </w:p>
         </w:tc>
@@ -4268,7 +4206,62 @@
                 <w:sz w:val="20"/>
                 <w:szCs w:val="20"/>
               </w:rPr>
-              <w:t>&lt;yes/no&gt;</w:t>
+              <w:t>Pass</w:t>
+            </w:r>
+          </w:p>
+          <w:p>
+            <w:pPr>
+              <w:spacing w:before="80" w:after="80"/>
+              <w:rPr>
+                <w:rFonts w:ascii="Arial" w:hAnsi="Arial" w:cs="Arial"/>
+                <w:color w:val="C00000"/>
+                <w:sz w:val="20"/>
+                <w:szCs w:val="20"/>
+              </w:rPr>
+            </w:pPr>
+            <w:r>
+              <w:rPr>
+                <w:rFonts w:ascii="Arial" w:hAnsi="Arial" w:cs="Arial"/>
+                <w:color w:val="C00000"/>
+                <w:sz w:val="20"/>
+                <w:szCs w:val="20"/>
+              </w:rPr>
+              <w:lastRenderedPageBreak/>
+              <w:drawing>
+                <wp:inline distT="0" distB="0" distL="0" distR="0" wp14:anchorId="4B244369" wp14:editId="1D9C83A7">
+                  <wp:extent cx="2994660" cy="1924685"/>
+                  <wp:effectExtent l="0" t="0" r="0" b="0"/>
+                  <wp:docPr id="23661440" name="Picture 1"/>
+                  <wp:cNvGraphicFramePr>
+                    <a:graphicFrameLocks xmlns:a="http://schemas.openxmlformats.org/drawingml/2006/main" noChangeAspect="1"/>
+                  </wp:cNvGraphicFramePr>
+                  <a:graphic xmlns:a="http://schemas.openxmlformats.org/drawingml/2006/main">
+                    <a:graphicData uri="http://schemas.openxmlformats.org/drawingml/2006/picture">
+                      <pic:pic xmlns:pic="http://schemas.openxmlformats.org/drawingml/2006/picture">
+                        <pic:nvPicPr>
+                          <pic:cNvPr id="23661440" name=""/>
+                          <pic:cNvPicPr/>
+                        </pic:nvPicPr>
+                        <pic:blipFill>
+                          <a:blip r:embed="rId16"/>
+                          <a:stretch>
+                            <a:fillRect/>
+                          </a:stretch>
+                        </pic:blipFill>
+                        <pic:spPr>
+                          <a:xfrm>
+                            <a:off x="0" y="0"/>
+                            <a:ext cx="3006283" cy="1932155"/>
+                          </a:xfrm>
+                          <a:prstGeom prst="rect">
+                            <a:avLst/>
+                          </a:prstGeom>
+                        </pic:spPr>
+                      </pic:pic>
+                    </a:graphicData>
+                  </a:graphic>
+                </wp:inline>
+              </w:drawing>
             </w:r>
           </w:p>
         </w:tc>
@@ -4296,6 +4289,7 @@
                 <w:sz w:val="20"/>
                 <w:szCs w:val="20"/>
               </w:rPr>
+              <w:lastRenderedPageBreak/>
               <w:t>3</w:t>
             </w:r>
           </w:p>
@@ -4396,7 +4390,61 @@
                 <w:sz w:val="20"/>
                 <w:szCs w:val="20"/>
               </w:rPr>
-              <w:t>&lt;yes/no&gt;</w:t>
+              <w:t>Pass</w:t>
+            </w:r>
+          </w:p>
+          <w:p>
+            <w:pPr>
+              <w:spacing w:before="80" w:after="80"/>
+              <w:rPr>
+                <w:rFonts w:ascii="Arial" w:hAnsi="Arial" w:cs="Arial"/>
+                <w:color w:val="C00000"/>
+                <w:sz w:val="20"/>
+                <w:szCs w:val="20"/>
+              </w:rPr>
+            </w:pPr>
+            <w:r>
+              <w:rPr>
+                <w:rFonts w:ascii="Arial" w:hAnsi="Arial" w:cs="Arial"/>
+                <w:color w:val="C00000"/>
+                <w:sz w:val="20"/>
+                <w:szCs w:val="20"/>
+              </w:rPr>
+              <w:drawing>
+                <wp:inline distT="0" distB="0" distL="0" distR="0" wp14:anchorId="3E95AE9D" wp14:editId="6D1398E2">
+                  <wp:extent cx="2994660" cy="1937385"/>
+                  <wp:effectExtent l="0" t="0" r="0" b="5715"/>
+                  <wp:docPr id="1106976328" name="Picture 1"/>
+                  <wp:cNvGraphicFramePr>
+                    <a:graphicFrameLocks xmlns:a="http://schemas.openxmlformats.org/drawingml/2006/main" noChangeAspect="1"/>
+                  </wp:cNvGraphicFramePr>
+                  <a:graphic xmlns:a="http://schemas.openxmlformats.org/drawingml/2006/main">
+                    <a:graphicData uri="http://schemas.openxmlformats.org/drawingml/2006/picture">
+                      <pic:pic xmlns:pic="http://schemas.openxmlformats.org/drawingml/2006/picture">
+                        <pic:nvPicPr>
+                          <pic:cNvPr id="1106976328" name=""/>
+                          <pic:cNvPicPr/>
+                        </pic:nvPicPr>
+                        <pic:blipFill>
+                          <a:blip r:embed="rId17"/>
+                          <a:stretch>
+                            <a:fillRect/>
+                          </a:stretch>
+                        </pic:blipFill>
+                        <pic:spPr>
+                          <a:xfrm>
+                            <a:off x="0" y="0"/>
+                            <a:ext cx="3002651" cy="1942555"/>
+                          </a:xfrm>
+                          <a:prstGeom prst="rect">
+                            <a:avLst/>
+                          </a:prstGeom>
+                        </pic:spPr>
+                      </pic:pic>
+                    </a:graphicData>
+                  </a:graphic>
+                </wp:inline>
+              </w:drawing>
             </w:r>
           </w:p>
         </w:tc>
@@ -4542,7 +4590,62 @@
                 <w:sz w:val="20"/>
                 <w:szCs w:val="20"/>
               </w:rPr>
-              <w:t>&lt;yes/no&gt;</w:t>
+              <w:t>Pass</w:t>
+            </w:r>
+          </w:p>
+          <w:p>
+            <w:pPr>
+              <w:spacing w:before="80" w:after="80"/>
+              <w:rPr>
+                <w:rFonts w:ascii="Arial" w:hAnsi="Arial" w:cs="Arial"/>
+                <w:color w:val="C00000"/>
+                <w:sz w:val="20"/>
+                <w:szCs w:val="20"/>
+              </w:rPr>
+            </w:pPr>
+            <w:r>
+              <w:rPr>
+                <w:rFonts w:ascii="Arial" w:hAnsi="Arial" w:cs="Arial"/>
+                <w:color w:val="C00000"/>
+                <w:sz w:val="20"/>
+                <w:szCs w:val="20"/>
+              </w:rPr>
+              <w:lastRenderedPageBreak/>
+              <w:drawing>
+                <wp:inline distT="0" distB="0" distL="0" distR="0" wp14:anchorId="32F12AA5" wp14:editId="5358E3F6">
+                  <wp:extent cx="2606040" cy="2608827"/>
+                  <wp:effectExtent l="0" t="0" r="3810" b="1270"/>
+                  <wp:docPr id="2123601419" name="Picture 1"/>
+                  <wp:cNvGraphicFramePr>
+                    <a:graphicFrameLocks xmlns:a="http://schemas.openxmlformats.org/drawingml/2006/main" noChangeAspect="1"/>
+                  </wp:cNvGraphicFramePr>
+                  <a:graphic xmlns:a="http://schemas.openxmlformats.org/drawingml/2006/main">
+                    <a:graphicData uri="http://schemas.openxmlformats.org/drawingml/2006/picture">
+                      <pic:pic xmlns:pic="http://schemas.openxmlformats.org/drawingml/2006/picture">
+                        <pic:nvPicPr>
+                          <pic:cNvPr id="2123601419" name=""/>
+                          <pic:cNvPicPr/>
+                        </pic:nvPicPr>
+                        <pic:blipFill>
+                          <a:blip r:embed="rId17"/>
+                          <a:stretch>
+                            <a:fillRect/>
+                          </a:stretch>
+                        </pic:blipFill>
+                        <pic:spPr>
+                          <a:xfrm>
+                            <a:off x="0" y="0"/>
+                            <a:ext cx="2609382" cy="2612172"/>
+                          </a:xfrm>
+                          <a:prstGeom prst="rect">
+                            <a:avLst/>
+                          </a:prstGeom>
+                        </pic:spPr>
+                      </pic:pic>
+                    </a:graphicData>
+                  </a:graphic>
+                </wp:inline>
+              </w:drawing>
             </w:r>
           </w:p>
         </w:tc>
@@ -4570,6 +4673,7 @@
                 <w:sz w:val="20"/>
                 <w:szCs w:val="20"/>
               </w:rPr>
+              <w:lastRenderedPageBreak/>
               <w:t>5</w:t>
             </w:r>
           </w:p>
@@ -4697,7 +4801,61 @@
                 <w:sz w:val="20"/>
                 <w:szCs w:val="20"/>
               </w:rPr>
-              <w:t>&lt;yes/no&gt;</w:t>
+              <w:t>Pass</w:t>
+            </w:r>
+          </w:p>
+          <w:p>
+            <w:pPr>
+              <w:spacing w:before="80" w:after="80"/>
+              <w:rPr>
+                <w:rFonts w:ascii="Arial" w:hAnsi="Arial" w:cs="Arial"/>
+                <w:color w:val="C00000"/>
+                <w:sz w:val="20"/>
+                <w:szCs w:val="20"/>
+              </w:rPr>
+            </w:pPr>
+            <w:r>
+              <w:rPr>
+                <w:rFonts w:ascii="Arial" w:hAnsi="Arial" w:cs="Arial"/>
+                <w:color w:val="C00000"/>
+                <w:sz w:val="20"/>
+                <w:szCs w:val="20"/>
+              </w:rPr>
+              <w:drawing>
+                <wp:inline distT="0" distB="0" distL="0" distR="0" wp14:anchorId="31138D18" wp14:editId="4D6D043C">
+                  <wp:extent cx="2667000" cy="2655086"/>
+                  <wp:effectExtent l="0" t="0" r="0" b="0"/>
+                  <wp:docPr id="1854015038" name="Picture 1"/>
+                  <wp:cNvGraphicFramePr>
+                    <a:graphicFrameLocks xmlns:a="http://schemas.openxmlformats.org/drawingml/2006/main" noChangeAspect="1"/>
+                  </wp:cNvGraphicFramePr>
+                  <a:graphic xmlns:a="http://schemas.openxmlformats.org/drawingml/2006/main">
+                    <a:graphicData uri="http://schemas.openxmlformats.org/drawingml/2006/picture">
+                      <pic:pic xmlns:pic="http://schemas.openxmlformats.org/drawingml/2006/picture">
+                        <pic:nvPicPr>
+                          <pic:cNvPr id="1854015038" name=""/>
+                          <pic:cNvPicPr/>
+                        </pic:nvPicPr>
+                        <pic:blipFill>
+                          <a:blip r:embed="rId18"/>
+                          <a:stretch>
+                            <a:fillRect/>
+                          </a:stretch>
+                        </pic:blipFill>
+                        <pic:spPr>
+                          <a:xfrm>
+                            <a:off x="0" y="0"/>
+                            <a:ext cx="2670444" cy="2658514"/>
+                          </a:xfrm>
+                          <a:prstGeom prst="rect">
+                            <a:avLst/>
+                          </a:prstGeom>
+                        </pic:spPr>
+                      </pic:pic>
+                    </a:graphicData>
+                  </a:graphic>
+                </wp:inline>
+              </w:drawing>
             </w:r>
           </w:p>
         </w:tc>
@@ -4729,6 +4887,7 @@
                 <w:sz w:val="20"/>
                 <w:szCs w:val="20"/>
               </w:rPr>
+              <w:lastRenderedPageBreak/>
               <w:t>Comments</w:t>
             </w:r>
           </w:p>
@@ -4755,7 +4914,7 @@
                 <w:sz w:val="20"/>
                 <w:szCs w:val="20"/>
               </w:rPr>
-              <w:t>Comments should be substantive; this means there should be at least 2-3 well-structured sentences with constructive feedback.</w:t>
+              <w:t>The reservation creation and lookup test passed successfully. The system allowed a valid user to log in, create a new reservation, and view the reservation summary with a reservation ID. The same reservation ID was then used on the Reservation Lookup page, and the correct reservation details displayed without errors.</w:t>
             </w:r>
           </w:p>
         </w:tc>
@@ -4778,11 +4937,11 @@
         <w:tblLook w:val="04A0" w:firstRow="1" w:lastRow="0" w:firstColumn="1" w:lastColumn="0" w:noHBand="0" w:noVBand="1"/>
       </w:tblPr>
       <w:tblGrid>
-        <w:gridCol w:w="1250"/>
-        <w:gridCol w:w="3570"/>
-        <w:gridCol w:w="3930"/>
-        <w:gridCol w:w="2148"/>
-        <w:gridCol w:w="2052"/>
+        <w:gridCol w:w="1251"/>
+        <w:gridCol w:w="2126"/>
+        <w:gridCol w:w="2229"/>
+        <w:gridCol w:w="1536"/>
+        <w:gridCol w:w="5808"/>
       </w:tblGrid>
       <w:tr>
         <w:trPr>
@@ -5008,6 +5167,16 @@
               </w:rPr>
               <w:t xml:space="preserve">Peer tester: </w:t>
             </w:r>
+            <w:r>
+              <w:rPr>
+                <w:rFonts w:ascii="Arial" w:hAnsi="Arial" w:cs="Arial"/>
+                <w:b/>
+                <w:bCs/>
+                <w:sz w:val="20"/>
+                <w:szCs w:val="20"/>
+              </w:rPr>
+              <w:t>Angela V</w:t>
+            </w:r>
           </w:p>
           <w:p>
             <w:pPr>
@@ -5042,27 +5211,7 @@
                 <w:sz w:val="20"/>
                 <w:szCs w:val="20"/>
               </w:rPr>
-              <w:t>&lt;</w:t>
-            </w:r>
-            <w:proofErr w:type="spellStart"/>
-            <w:r>
-              <w:rPr>
-                <w:rFonts w:ascii="Arial" w:hAnsi="Arial" w:cs="Arial"/>
-                <w:color w:val="C00000"/>
-                <w:sz w:val="20"/>
-                <w:szCs w:val="20"/>
-              </w:rPr>
-              <w:t>yyyy</w:t>
-            </w:r>
-            <w:proofErr w:type="spellEnd"/>
-            <w:r>
-              <w:rPr>
-                <w:rFonts w:ascii="Arial" w:hAnsi="Arial" w:cs="Arial"/>
-                <w:color w:val="C00000"/>
-                <w:sz w:val="20"/>
-                <w:szCs w:val="20"/>
-              </w:rPr>
-              <w:t>/mm/dd&gt;</w:t>
+              <w:t>05/02/2026</w:t>
             </w:r>
           </w:p>
         </w:tc>
@@ -5330,7 +5479,115 @@
                 <w:sz w:val="20"/>
                 <w:szCs w:val="20"/>
               </w:rPr>
-              <w:t>&lt;yes/no&gt;</w:t>
+              <w:t>Pass</w:t>
+            </w:r>
+          </w:p>
+          <w:p>
+            <w:pPr>
+              <w:spacing w:before="80" w:after="80"/>
+              <w:rPr>
+                <w:rFonts w:ascii="Arial" w:hAnsi="Arial" w:cs="Arial"/>
+                <w:color w:val="C00000"/>
+                <w:sz w:val="20"/>
+                <w:szCs w:val="20"/>
+              </w:rPr>
+            </w:pPr>
+            <w:r>
+              <w:rPr>
+                <w:rFonts w:ascii="Arial" w:hAnsi="Arial" w:cs="Arial"/>
+                <w:color w:val="C00000"/>
+                <w:sz w:val="20"/>
+                <w:szCs w:val="20"/>
+              </w:rPr>
+              <w:drawing>
+                <wp:inline distT="0" distB="0" distL="0" distR="0" wp14:anchorId="588DF51D" wp14:editId="04A047DC">
+                  <wp:extent cx="3451860" cy="1529931"/>
+                  <wp:effectExtent l="0" t="0" r="0" b="0"/>
+                  <wp:docPr id="779625466" name="Picture 1"/>
+                  <wp:cNvGraphicFramePr>
+                    <a:graphicFrameLocks xmlns:a="http://schemas.openxmlformats.org/drawingml/2006/main" noChangeAspect="1"/>
+                  </wp:cNvGraphicFramePr>
+                  <a:graphic xmlns:a="http://schemas.openxmlformats.org/drawingml/2006/main">
+                    <a:graphicData uri="http://schemas.openxmlformats.org/drawingml/2006/picture">
+                      <pic:pic xmlns:pic="http://schemas.openxmlformats.org/drawingml/2006/picture">
+                        <pic:nvPicPr>
+                          <pic:cNvPr id="779625466" name=""/>
+                          <pic:cNvPicPr/>
+                        </pic:nvPicPr>
+                        <pic:blipFill>
+                          <a:blip r:embed="rId19"/>
+                          <a:stretch>
+                            <a:fillRect/>
+                          </a:stretch>
+                        </pic:blipFill>
+                        <pic:spPr>
+                          <a:xfrm>
+                            <a:off x="0" y="0"/>
+                            <a:ext cx="3472374" cy="1539023"/>
+                          </a:xfrm>
+                          <a:prstGeom prst="rect">
+                            <a:avLst/>
+                          </a:prstGeom>
+                        </pic:spPr>
+                      </pic:pic>
+                    </a:graphicData>
+                  </a:graphic>
+                </wp:inline>
+              </w:drawing>
+            </w:r>
+          </w:p>
+          <w:p>
+            <w:pPr>
+              <w:spacing w:before="80" w:after="80"/>
+              <w:rPr>
+                <w:rFonts w:ascii="Arial" w:hAnsi="Arial" w:cs="Arial"/>
+                <w:color w:val="C00000"/>
+                <w:sz w:val="20"/>
+                <w:szCs w:val="20"/>
+              </w:rPr>
+            </w:pPr>
+            <w:r>
+              <w:rPr>
+                <w:rFonts w:ascii="Arial" w:hAnsi="Arial" w:cs="Arial"/>
+                <w:color w:val="C00000"/>
+                <w:sz w:val="20"/>
+                <w:szCs w:val="20"/>
+              </w:rPr>
+              <w:drawing>
+                <wp:inline distT="0" distB="0" distL="0" distR="0" wp14:anchorId="22CE63B5" wp14:editId="66A5A615">
+                  <wp:extent cx="1257300" cy="1173312"/>
+                  <wp:effectExtent l="0" t="0" r="0" b="8255"/>
+                  <wp:docPr id="1169704661" name="Picture 1"/>
+                  <wp:cNvGraphicFramePr>
+                    <a:graphicFrameLocks xmlns:a="http://schemas.openxmlformats.org/drawingml/2006/main" noChangeAspect="1"/>
+                  </wp:cNvGraphicFramePr>
+                  <a:graphic xmlns:a="http://schemas.openxmlformats.org/drawingml/2006/main">
+                    <a:graphicData uri="http://schemas.openxmlformats.org/drawingml/2006/picture">
+                      <pic:pic xmlns:pic="http://schemas.openxmlformats.org/drawingml/2006/picture">
+                        <pic:nvPicPr>
+                          <pic:cNvPr id="1169704661" name=""/>
+                          <pic:cNvPicPr/>
+                        </pic:nvPicPr>
+                        <pic:blipFill>
+                          <a:blip r:embed="rId20"/>
+                          <a:stretch>
+                            <a:fillRect/>
+                          </a:stretch>
+                        </pic:blipFill>
+                        <pic:spPr>
+                          <a:xfrm>
+                            <a:off x="0" y="0"/>
+                            <a:ext cx="1263005" cy="1178636"/>
+                          </a:xfrm>
+                          <a:prstGeom prst="rect">
+                            <a:avLst/>
+                          </a:prstGeom>
+                        </pic:spPr>
+                      </pic:pic>
+                    </a:graphicData>
+                  </a:graphic>
+                </wp:inline>
+              </w:drawing>
             </w:r>
           </w:p>
         </w:tc>
@@ -5458,7 +5715,62 @@
                 <w:sz w:val="20"/>
                 <w:szCs w:val="20"/>
               </w:rPr>
-              <w:t>&lt;yes/no&gt;</w:t>
+              <w:t>Pass</w:t>
+            </w:r>
+          </w:p>
+          <w:p>
+            <w:pPr>
+              <w:spacing w:before="80" w:after="80"/>
+              <w:rPr>
+                <w:rFonts w:ascii="Arial" w:hAnsi="Arial" w:cs="Arial"/>
+                <w:color w:val="C00000"/>
+                <w:sz w:val="20"/>
+                <w:szCs w:val="20"/>
+              </w:rPr>
+            </w:pPr>
+            <w:r>
+              <w:rPr>
+                <w:rFonts w:ascii="Arial" w:hAnsi="Arial" w:cs="Arial"/>
+                <w:color w:val="C00000"/>
+                <w:sz w:val="20"/>
+                <w:szCs w:val="20"/>
+              </w:rPr>
+              <w:lastRenderedPageBreak/>
+              <w:drawing>
+                <wp:inline distT="0" distB="0" distL="0" distR="0" wp14:anchorId="1A06EEFA" wp14:editId="1E57568A">
+                  <wp:extent cx="3550920" cy="2364740"/>
+                  <wp:effectExtent l="0" t="0" r="0" b="0"/>
+                  <wp:docPr id="1899398751" name="Picture 1"/>
+                  <wp:cNvGraphicFramePr>
+                    <a:graphicFrameLocks xmlns:a="http://schemas.openxmlformats.org/drawingml/2006/main" noChangeAspect="1"/>
+                  </wp:cNvGraphicFramePr>
+                  <a:graphic xmlns:a="http://schemas.openxmlformats.org/drawingml/2006/main">
+                    <a:graphicData uri="http://schemas.openxmlformats.org/drawingml/2006/picture">
+                      <pic:pic xmlns:pic="http://schemas.openxmlformats.org/drawingml/2006/picture">
+                        <pic:nvPicPr>
+                          <pic:cNvPr id="1899398751" name=""/>
+                          <pic:cNvPicPr/>
+                        </pic:nvPicPr>
+                        <pic:blipFill>
+                          <a:blip r:embed="rId21"/>
+                          <a:stretch>
+                            <a:fillRect/>
+                          </a:stretch>
+                        </pic:blipFill>
+                        <pic:spPr>
+                          <a:xfrm>
+                            <a:off x="0" y="0"/>
+                            <a:ext cx="3555961" cy="2368097"/>
+                          </a:xfrm>
+                          <a:prstGeom prst="rect">
+                            <a:avLst/>
+                          </a:prstGeom>
+                        </pic:spPr>
+                      </pic:pic>
+                    </a:graphicData>
+                  </a:graphic>
+                </wp:inline>
+              </w:drawing>
             </w:r>
           </w:p>
         </w:tc>
@@ -5587,7 +5899,61 @@
                 <w:sz w:val="20"/>
                 <w:szCs w:val="20"/>
               </w:rPr>
-              <w:t>&lt;yes/no&gt;</w:t>
+              <w:t>Pass</w:t>
+            </w:r>
+          </w:p>
+          <w:p>
+            <w:pPr>
+              <w:spacing w:before="80" w:after="80"/>
+              <w:rPr>
+                <w:rFonts w:ascii="Arial" w:hAnsi="Arial" w:cs="Arial"/>
+                <w:color w:val="C00000"/>
+                <w:sz w:val="20"/>
+                <w:szCs w:val="20"/>
+              </w:rPr>
+            </w:pPr>
+            <w:r>
+              <w:rPr>
+                <w:rFonts w:ascii="Arial" w:hAnsi="Arial" w:cs="Arial"/>
+                <w:color w:val="C00000"/>
+                <w:sz w:val="20"/>
+                <w:szCs w:val="20"/>
+              </w:rPr>
+              <w:drawing>
+                <wp:inline distT="0" distB="0" distL="0" distR="0" wp14:anchorId="385780B6" wp14:editId="4220BB89">
+                  <wp:extent cx="2301240" cy="2266849"/>
+                  <wp:effectExtent l="0" t="0" r="3810" b="635"/>
+                  <wp:docPr id="162899831" name="Picture 1"/>
+                  <wp:cNvGraphicFramePr>
+                    <a:graphicFrameLocks xmlns:a="http://schemas.openxmlformats.org/drawingml/2006/main" noChangeAspect="1"/>
+                  </wp:cNvGraphicFramePr>
+                  <a:graphic xmlns:a="http://schemas.openxmlformats.org/drawingml/2006/main">
+                    <a:graphicData uri="http://schemas.openxmlformats.org/drawingml/2006/picture">
+                      <pic:pic xmlns:pic="http://schemas.openxmlformats.org/drawingml/2006/picture">
+                        <pic:nvPicPr>
+                          <pic:cNvPr id="162899831" name=""/>
+                          <pic:cNvPicPr/>
+                        </pic:nvPicPr>
+                        <pic:blipFill>
+                          <a:blip r:embed="rId22"/>
+                          <a:stretch>
+                            <a:fillRect/>
+                          </a:stretch>
+                        </pic:blipFill>
+                        <pic:spPr>
+                          <a:xfrm>
+                            <a:off x="0" y="0"/>
+                            <a:ext cx="2308270" cy="2273774"/>
+                          </a:xfrm>
+                          <a:prstGeom prst="rect">
+                            <a:avLst/>
+                          </a:prstGeom>
+                        </pic:spPr>
+                      </pic:pic>
+                    </a:graphicData>
+                  </a:graphic>
+                </wp:inline>
+              </w:drawing>
             </w:r>
           </w:p>
         </w:tc>
@@ -5715,7 +6081,62 @@
                 <w:sz w:val="20"/>
                 <w:szCs w:val="20"/>
               </w:rPr>
-              <w:t>&lt;yes/no&gt;</w:t>
+              <w:t>Pass</w:t>
+            </w:r>
+          </w:p>
+          <w:p>
+            <w:pPr>
+              <w:spacing w:before="80" w:after="80"/>
+              <w:rPr>
+                <w:rFonts w:ascii="Arial" w:hAnsi="Arial" w:cs="Arial"/>
+                <w:color w:val="C00000"/>
+                <w:sz w:val="20"/>
+                <w:szCs w:val="20"/>
+              </w:rPr>
+            </w:pPr>
+            <w:r>
+              <w:rPr>
+                <w:rFonts w:ascii="Arial" w:hAnsi="Arial" w:cs="Arial"/>
+                <w:color w:val="C00000"/>
+                <w:sz w:val="20"/>
+                <w:szCs w:val="20"/>
+              </w:rPr>
+              <w:lastRenderedPageBreak/>
+              <w:drawing>
+                <wp:inline distT="0" distB="0" distL="0" distR="0" wp14:anchorId="221103BB" wp14:editId="0C66549E">
+                  <wp:extent cx="3253740" cy="2580640"/>
+                  <wp:effectExtent l="0" t="0" r="3810" b="0"/>
+                  <wp:docPr id="2031464338" name="Picture 1"/>
+                  <wp:cNvGraphicFramePr>
+                    <a:graphicFrameLocks xmlns:a="http://schemas.openxmlformats.org/drawingml/2006/main" noChangeAspect="1"/>
+                  </wp:cNvGraphicFramePr>
+                  <a:graphic xmlns:a="http://schemas.openxmlformats.org/drawingml/2006/main">
+                    <a:graphicData uri="http://schemas.openxmlformats.org/drawingml/2006/picture">
+                      <pic:pic xmlns:pic="http://schemas.openxmlformats.org/drawingml/2006/picture">
+                        <pic:nvPicPr>
+                          <pic:cNvPr id="2031464338" name=""/>
+                          <pic:cNvPicPr/>
+                        </pic:nvPicPr>
+                        <pic:blipFill>
+                          <a:blip r:embed="rId23"/>
+                          <a:stretch>
+                            <a:fillRect/>
+                          </a:stretch>
+                        </pic:blipFill>
+                        <pic:spPr>
+                          <a:xfrm>
+                            <a:off x="0" y="0"/>
+                            <a:ext cx="3257889" cy="2583931"/>
+                          </a:xfrm>
+                          <a:prstGeom prst="rect">
+                            <a:avLst/>
+                          </a:prstGeom>
+                        </pic:spPr>
+                      </pic:pic>
+                    </a:graphicData>
+                  </a:graphic>
+                </wp:inline>
+              </w:drawing>
             </w:r>
           </w:p>
         </w:tc>
@@ -5743,6 +6164,7 @@
                 <w:sz w:val="20"/>
                 <w:szCs w:val="20"/>
               </w:rPr>
+              <w:lastRenderedPageBreak/>
               <w:t>5</w:t>
             </w:r>
           </w:p>
@@ -5761,25 +6183,14 @@
                 <w:szCs w:val="20"/>
               </w:rPr>
             </w:pPr>
-            <w:proofErr w:type="gramStart"/>
-            <w:r>
-              <w:rPr>
-                <w:rFonts w:ascii="Arial" w:hAnsi="Arial" w:cs="Arial"/>
-                <w:color w:val="C00000"/>
-                <w:sz w:val="20"/>
-                <w:szCs w:val="20"/>
-              </w:rPr>
-              <w:t>Lookup</w:t>
-            </w:r>
-            <w:proofErr w:type="gramEnd"/>
-            <w:r>
-              <w:rPr>
-                <w:rFonts w:ascii="Arial" w:hAnsi="Arial" w:cs="Arial"/>
-                <w:color w:val="C00000"/>
-                <w:sz w:val="20"/>
-                <w:szCs w:val="20"/>
-              </w:rPr>
-              <w:t xml:space="preserve"> reservation and ensure the attractions selected are displayed</w:t>
+            <w:r>
+              <w:rPr>
+                <w:rFonts w:ascii="Arial" w:hAnsi="Arial" w:cs="Arial"/>
+                <w:color w:val="C00000"/>
+                <w:sz w:val="20"/>
+                <w:szCs w:val="20"/>
+              </w:rPr>
+              <w:t>Lookup reservation and ensure the attractions selected are displayed</w:t>
             </w:r>
           </w:p>
         </w:tc>
@@ -5854,7 +6265,61 @@
                 <w:sz w:val="20"/>
                 <w:szCs w:val="20"/>
               </w:rPr>
-              <w:t>&lt;yes/no&gt;</w:t>
+              <w:t>Pass</w:t>
+            </w:r>
+          </w:p>
+          <w:p>
+            <w:pPr>
+              <w:spacing w:before="80" w:after="80"/>
+              <w:rPr>
+                <w:rFonts w:ascii="Arial" w:hAnsi="Arial" w:cs="Arial"/>
+                <w:color w:val="C00000"/>
+                <w:sz w:val="20"/>
+                <w:szCs w:val="20"/>
+              </w:rPr>
+            </w:pPr>
+            <w:r>
+              <w:rPr>
+                <w:rFonts w:ascii="Arial" w:hAnsi="Arial" w:cs="Arial"/>
+                <w:color w:val="C00000"/>
+                <w:sz w:val="20"/>
+                <w:szCs w:val="20"/>
+              </w:rPr>
+              <w:drawing>
+                <wp:inline distT="0" distB="0" distL="0" distR="0" wp14:anchorId="6FC3DDFB" wp14:editId="24794FFB">
+                  <wp:extent cx="2613660" cy="2616455"/>
+                  <wp:effectExtent l="0" t="0" r="0" b="0"/>
+                  <wp:docPr id="682131219" name="Picture 1"/>
+                  <wp:cNvGraphicFramePr>
+                    <a:graphicFrameLocks xmlns:a="http://schemas.openxmlformats.org/drawingml/2006/main" noChangeAspect="1"/>
+                  </wp:cNvGraphicFramePr>
+                  <a:graphic xmlns:a="http://schemas.openxmlformats.org/drawingml/2006/main">
+                    <a:graphicData uri="http://schemas.openxmlformats.org/drawingml/2006/picture">
+                      <pic:pic xmlns:pic="http://schemas.openxmlformats.org/drawingml/2006/picture">
+                        <pic:nvPicPr>
+                          <pic:cNvPr id="682131219" name=""/>
+                          <pic:cNvPicPr/>
+                        </pic:nvPicPr>
+                        <pic:blipFill>
+                          <a:blip r:embed="rId24"/>
+                          <a:stretch>
+                            <a:fillRect/>
+                          </a:stretch>
+                        </pic:blipFill>
+                        <pic:spPr>
+                          <a:xfrm>
+                            <a:off x="0" y="0"/>
+                            <a:ext cx="2618130" cy="2620929"/>
+                          </a:xfrm>
+                          <a:prstGeom prst="rect">
+                            <a:avLst/>
+                          </a:prstGeom>
+                        </pic:spPr>
+                      </pic:pic>
+                    </a:graphicData>
+                  </a:graphic>
+                </wp:inline>
+              </w:drawing>
             </w:r>
           </w:p>
         </w:tc>
@@ -5886,6 +6351,7 @@
                 <w:sz w:val="20"/>
                 <w:szCs w:val="20"/>
               </w:rPr>
+              <w:lastRenderedPageBreak/>
               <w:t>Comments</w:t>
             </w:r>
           </w:p>
@@ -5912,7 +6378,7 @@
                 <w:sz w:val="20"/>
                 <w:szCs w:val="20"/>
               </w:rPr>
-              <w:t>Comments should be substantive; this means there should be at least 2-3 well-structured sentences with constructive feedback.</w:t>
+              <w:t>The reservation lookup with attractions test passed successfully. After creating a reservation with selected attractions, the reservation summary displayed the chosen attractions correctly. When the reservation ID was searched on the lookup page, the attractions section also appeared, confirming that the reservation and attraction information connected properly in the database.</w:t>
             </w:r>
           </w:p>
         </w:tc>
@@ -5929,8 +6395,8 @@
       </w:pPr>
     </w:p>
     <w:sectPr>
-      <w:headerReference w:type="default" r:id="rId15"/>
-      <w:footerReference w:type="default" r:id="rId16"/>
+      <w:headerReference w:type="default" r:id="rId25"/>
+      <w:footerReference w:type="default" r:id="rId26"/>
       <w:pgSz w:w="15840" w:h="12240" w:orient="landscape"/>
       <w:pgMar w:top="1440" w:right="1440" w:bottom="1440" w:left="1440" w:header="720" w:footer="720" w:gutter="0"/>
       <w:cols w:space="720"/>
@@ -6574,7 +7040,6 @@
   <w:style w:type="character" w:default="1" w:styleId="DefaultParagraphFont">
     <w:name w:val="Default Paragraph Font"/>
     <w:uiPriority w:val="1"/>
-    <w:semiHidden/>
     <w:unhideWhenUsed/>
   </w:style>
   <w:style w:type="table" w:default="1" w:styleId="TableNormal">

</xml_diff>

<commit_message>
Added names to Test Plan - Anderson 5/2/26
</commit_message>
<xml_diff>
--- a/MODULE-8/8.2 Assignment.docx
+++ b/MODULE-8/8.2 Assignment.docx
@@ -74,6 +74,14 @@
                 <w:szCs w:val="20"/>
               </w:rPr>
             </w:pPr>
+            <w:r>
+              <w:rPr>
+                <w:rFonts w:ascii="Arial" w:hAnsi="Arial" w:cs="Arial"/>
+                <w:sz w:val="20"/>
+                <w:szCs w:val="20"/>
+              </w:rPr>
+              <w:t>Zachary Anderson, Tevyah Hanley, Angela Vargas, Cameron Mendez</w:t>
+            </w:r>
           </w:p>
         </w:tc>
       </w:tr>
@@ -370,7 +378,53 @@
               <w:sz w:val="28"/>
               <w:szCs w:val="28"/>
             </w:rPr>
-            <w:t>Reservation Lookup With Valid Reservation ID……………………………………………………………………………………………………………………………………………..1</w:t>
+            <w:t>Reservation Lookup With Valid Reservation ID……………………………………………………………………………………………………………………………………………..</w:t>
+          </w:r>
+          <w:r>
+            <w:rPr>
+              <w:rFonts w:eastAsiaTheme="minorEastAsia"/>
+              <w:noProof/>
+              <w:sz w:val="28"/>
+              <w:szCs w:val="28"/>
+            </w:rPr>
+            <w:t>2-4</w:t>
+          </w:r>
+        </w:p>
+        <w:p>
+          <w:pPr>
+            <w:rPr>
+              <w:sz w:val="28"/>
+              <w:szCs w:val="28"/>
+            </w:rPr>
+          </w:pPr>
+          <w:r>
+            <w:rPr>
+              <w:sz w:val="28"/>
+              <w:szCs w:val="28"/>
+            </w:rPr>
+            <w:t>Reservation Lookup with Invalid Reservation ID……………………………………………………………………………………………………………………………………………</w:t>
+          </w:r>
+          <w:r>
+            <w:rPr>
+              <w:sz w:val="28"/>
+              <w:szCs w:val="28"/>
+            </w:rPr>
+            <w:t>5-7</w:t>
+          </w:r>
+        </w:p>
+        <w:p>
+          <w:pPr>
+            <w:rPr>
+              <w:sz w:val="28"/>
+              <w:szCs w:val="28"/>
+            </w:rPr>
+          </w:pPr>
+          <w:r>
+            <w:rPr>
+              <w:sz w:val="28"/>
+              <w:szCs w:val="28"/>
+            </w:rPr>
+            <w:t>Making a reservation &amp; Looking it up………………………………………………………………………………………8-10</w:t>
           </w:r>
         </w:p>
         <w:p>
@@ -379,7 +433,7 @@
               <w:sz w:val="28"/>
               <w:szCs w:val="28"/>
             </w:rPr>
-            <w:t>Reservation Lookup with Invalid Reservation ID……………………………………………………………………………………………………………………………………………1-2</w:t>
+            <w:t>Lookup reservation w/ attractions……………………………………………………………………………………………11-14</w:t>
           </w:r>
         </w:p>
       </w:sdtContent>
@@ -4004,6 +4058,7 @@
             <w:r>
               <w:rPr>
                 <w:rFonts w:ascii="Arial" w:hAnsi="Arial" w:cs="Arial"/>
+                <w:noProof/>
                 <w:color w:val="C00000"/>
                 <w:sz w:val="20"/>
                 <w:szCs w:val="20"/>
@@ -4222,6 +4277,7 @@
             <w:r>
               <w:rPr>
                 <w:rFonts w:ascii="Arial" w:hAnsi="Arial" w:cs="Arial"/>
+                <w:noProof/>
                 <w:color w:val="C00000"/>
                 <w:sz w:val="20"/>
                 <w:szCs w:val="20"/>
@@ -4406,6 +4462,7 @@
             <w:r>
               <w:rPr>
                 <w:rFonts w:ascii="Arial" w:hAnsi="Arial" w:cs="Arial"/>
+                <w:noProof/>
                 <w:color w:val="C00000"/>
                 <w:sz w:val="20"/>
                 <w:szCs w:val="20"/>
@@ -4606,6 +4663,7 @@
             <w:r>
               <w:rPr>
                 <w:rFonts w:ascii="Arial" w:hAnsi="Arial" w:cs="Arial"/>
+                <w:noProof/>
                 <w:color w:val="C00000"/>
                 <w:sz w:val="20"/>
                 <w:szCs w:val="20"/>
@@ -4817,6 +4875,7 @@
             <w:r>
               <w:rPr>
                 <w:rFonts w:ascii="Arial" w:hAnsi="Arial" w:cs="Arial"/>
+                <w:noProof/>
                 <w:color w:val="C00000"/>
                 <w:sz w:val="20"/>
                 <w:szCs w:val="20"/>
@@ -5495,6 +5554,7 @@
             <w:r>
               <w:rPr>
                 <w:rFonts w:ascii="Arial" w:hAnsi="Arial" w:cs="Arial"/>
+                <w:noProof/>
                 <w:color w:val="C00000"/>
                 <w:sz w:val="20"/>
                 <w:szCs w:val="20"/>
@@ -5549,6 +5609,7 @@
             <w:r>
               <w:rPr>
                 <w:rFonts w:ascii="Arial" w:hAnsi="Arial" w:cs="Arial"/>
+                <w:noProof/>
                 <w:color w:val="C00000"/>
                 <w:sz w:val="20"/>
                 <w:szCs w:val="20"/>
@@ -5731,6 +5792,7 @@
             <w:r>
               <w:rPr>
                 <w:rFonts w:ascii="Arial" w:hAnsi="Arial" w:cs="Arial"/>
+                <w:noProof/>
                 <w:color w:val="C00000"/>
                 <w:sz w:val="20"/>
                 <w:szCs w:val="20"/>
@@ -5915,6 +5977,7 @@
             <w:r>
               <w:rPr>
                 <w:rFonts w:ascii="Arial" w:hAnsi="Arial" w:cs="Arial"/>
+                <w:noProof/>
                 <w:color w:val="C00000"/>
                 <w:sz w:val="20"/>
                 <w:szCs w:val="20"/>
@@ -6097,6 +6160,7 @@
             <w:r>
               <w:rPr>
                 <w:rFonts w:ascii="Arial" w:hAnsi="Arial" w:cs="Arial"/>
+                <w:noProof/>
                 <w:color w:val="C00000"/>
                 <w:sz w:val="20"/>
                 <w:szCs w:val="20"/>
@@ -6281,6 +6345,7 @@
             <w:r>
               <w:rPr>
                 <w:rFonts w:ascii="Arial" w:hAnsi="Arial" w:cs="Arial"/>
+                <w:noProof/>
                 <w:color w:val="C00000"/>
                 <w:sz w:val="20"/>
                 <w:szCs w:val="20"/>
@@ -7040,6 +7105,7 @@
   <w:style w:type="character" w:default="1" w:styleId="DefaultParagraphFont">
     <w:name w:val="Default Paragraph Font"/>
     <w:uiPriority w:val="1"/>
+    <w:semiHidden/>
     <w:unhideWhenUsed/>
   </w:style>
   <w:style w:type="table" w:default="1" w:styleId="TableNormal">

</xml_diff>